<commit_message>
Update project report: revised title, author Pravallika Kalangi 24VV1F0044, 15-page structure
</commit_message>
<xml_diff>
--- a/docs/SentinelGPT_Project_Report.docx
+++ b/docs/SentinelGPT_Project_Report.docx
@@ -4,36 +4,144 @@
   <w:body>
     <w:p>
       <w:pPr>
+        <w:spacing w:before="2400" w:after="400"/>
         <w:jc w:val="center"/>
       </w:pPr>
       <w:r>
         <w:rPr>
-          <w:rFonts w:ascii="Calibri" w:hAnsi="Calibri"/>
+          <w:rFonts w:ascii="Times New Roman" w:hAnsi="Times New Roman"/>
           <w:b/>
-          <w:color w:val="003366"/>
-          <w:sz w:val="52"/>
+          <w:sz w:val="48"/>
         </w:rPr>
-        <w:t>PROJECT TECHNICAL REPORT</w:t>
+        <w:t>SentinelGPT: An AI-Powered Large Language Model Framework for Advanced Cyber Threat Detection and Analysis</w:t>
       </w:r>
     </w:p>
     <w:p>
       <w:pPr>
-        <w:jc w:val="center"/>
+        <w:spacing w:before="2800" w:line="360" w:lineRule="auto"/>
+        <w:jc w:val="right"/>
       </w:pPr>
       <w:r>
         <w:rPr>
-          <w:rFonts w:ascii="Calibri" w:hAnsi="Calibri"/>
-          <w:i/>
-          <w:color w:val="555555"/>
-          <w:sz w:val="32"/>
+          <w:rFonts w:ascii="Times New Roman" w:hAnsi="Times New Roman"/>
+          <w:b/>
+          <w:sz w:val="28"/>
         </w:rPr>
-        <w:t>SentinelGPT — Autonomous Cyber Defense Platform</w:t>
+        <w:t>Pravallika Kalangi</w:t>
+        <w:br/>
+      </w:r>
+      <w:r>
+        <w:rPr>
+          <w:rFonts w:ascii="Times New Roman" w:hAnsi="Times New Roman"/>
+          <w:sz w:val="28"/>
+        </w:rPr>
+        <w:t>24VV1F0044</w:t>
+        <w:br/>
+      </w:r>
+      <w:r>
+        <w:rPr>
+          <w:rFonts w:ascii="Times New Roman" w:hAnsi="Times New Roman"/>
+          <w:sz w:val="28"/>
+        </w:rPr>
+        <w:t>MCA 2nd year</w:t>
+        <w:br/>
+      </w:r>
+    </w:p>
+    <w:p>
+      <w:r>
+        <w:br w:type="page"/>
       </w:r>
     </w:p>
     <w:p>
       <w:pPr>
-        <w:spacing w:after="240"/>
+        <w:spacing w:before="360" w:after="160"/>
       </w:pPr>
+      <w:r>
+        <w:rPr>
+          <w:rFonts w:ascii="Times New Roman" w:hAnsi="Times New Roman"/>
+          <w:b/>
+          <w:sz w:val="32"/>
+        </w:rPr>
+        <w:t>Problem statement</w:t>
+      </w:r>
+    </w:p>
+    <w:p>
+      <w:pPr>
+        <w:spacing w:after="120" w:line="360" w:lineRule="auto"/>
+        <w:jc w:val="both"/>
+      </w:pPr>
+      <w:r>
+        <w:rPr>
+          <w:rFonts w:ascii="Times New Roman" w:hAnsi="Times New Roman"/>
+        </w:rPr>
+        <w:t>Modern cybersecurity operations face severe challenges in managing the overwhelming volume of network telemetry and security alerts generated by enterprise IT infrastructure. Every day, security information and event management (SIEM) systems process millions of event logs, network probes, and API requests across complex cloud environments. In many organizations, security operations centers (SOC) still rely heavily on manual log inspection, static firewall rules, and fragmented monitoring tools. This traditional approach creates significant operational bottlenecks, leads to severe analyst alert fatigue, and drastically increases incident response time, allowing malicious cyber threats to propagate unchecked.</w:t>
+      </w:r>
+    </w:p>
+    <w:p>
+      <w:pPr>
+        <w:spacing w:after="120" w:line="360" w:lineRule="auto"/>
+        <w:jc w:val="both"/>
+      </w:pPr>
+      <w:r>
+        <w:rPr>
+          <w:rFonts w:ascii="Times New Roman" w:hAnsi="Times New Roman"/>
+        </w:rPr>
+        <w:t>One of the major challenges in contemporary cyber defense is identifying sophisticated multi-stage attacks such as credential stuffing, distributed denial of service (DDoS) vectors, SQL injection payloads, and brute-force authentication spikes. Traditional rule-based intrusion detection systems often generate high rates of false positives while failing to correlate anomalous network behavior with recognized attack frameworks like MITRE ATT&amp;CK. Furthermore, when a critical threat is detected, manual quarantine procedures require administrators to manually update firewall rules and isolate compromised IP addresses, a delayed process that exposes internal networks to lateral movement and unauthorized data exfiltration.</w:t>
+      </w:r>
+    </w:p>
+    <w:p>
+      <w:pPr>
+        <w:spacing w:after="120" w:line="360" w:lineRule="auto"/>
+        <w:jc w:val="both"/>
+      </w:pPr>
+      <w:r>
+        <w:rPr>
+          <w:rFonts w:ascii="Times New Roman" w:hAnsi="Times New Roman"/>
+        </w:rPr>
+        <w:t>Existing security dashboards also lack transparent decision-making explanations, intelligent payload analysis, and real-time visualization capabilities. Security operators are frequently left without instant remediation guidance, making it difficult to understand why a specific threat score was assigned or what immediate countermeasures should be executed.</w:t>
+      </w:r>
+    </w:p>
+    <w:p>
+      <w:pPr>
+        <w:spacing w:after="120" w:line="360" w:lineRule="auto"/>
+        <w:jc w:val="both"/>
+      </w:pPr>
+      <w:r>
+        <w:rPr>
+          <w:rFonts w:ascii="Times New Roman" w:hAnsi="Times New Roman"/>
+        </w:rPr>
+        <w:t>To address these critical challenges, this project proposes SentinelGPT: An AI-Powered Large Language Model Framework for Advanced Cyber Threat Detection and Analysis. The system utilizes intelligent software agents to automatically monitor network telemetry, calculate risk scores using heuristic anomaly algorithms, dynamically map threats to MITRE ATT&amp;CK techniques, and autonomously quarantine high-risk IP addresses. Featuring a responsive dashboard, real-time streaming, interactive analytics, an AI triage assistant, and static payload scanning, SentinelGPT minimizes manual effort, eliminates response latency, and provides a scalable, reliable solution for modern enterprise cyber defense.</w:t>
+      </w:r>
+    </w:p>
+    <w:p>
+      <w:r>
+        <w:br w:type="page"/>
+      </w:r>
+    </w:p>
+    <w:p>
+      <w:pPr>
+        <w:spacing w:before="360" w:after="160"/>
+      </w:pPr>
+      <w:r>
+        <w:rPr>
+          <w:rFonts w:ascii="Times New Roman" w:hAnsi="Times New Roman"/>
+          <w:b/>
+          <w:sz w:val="32"/>
+        </w:rPr>
+        <w:t>Difference Between Traditional Security Operations and the Proposed System</w:t>
+      </w:r>
+    </w:p>
+    <w:p>
+      <w:pPr>
+        <w:spacing w:after="120" w:line="360" w:lineRule="auto"/>
+        <w:jc w:val="both"/>
+      </w:pPr>
+      <w:r>
+        <w:rPr>
+          <w:rFonts w:ascii="Times New Roman" w:hAnsi="Times New Roman"/>
+        </w:rPr>
+        <w:t>Traditional security operations rely on manual log review, static rules, and delayed human response. The proposed SentinelGPT System automates threat detection, anomaly scoring, MITRE ATT&amp;CK mapping, and firewall quarantine using intelligent software agents. The table below highlights the major differences between traditional security management and the proposed AI-based system:</w:t>
+      </w:r>
     </w:p>
     <w:tbl>
       <w:tblPr>
@@ -49,23 +157,38 @@
         <w:tc>
           <w:tcPr>
             <w:tcW w:type="dxa" w:w="4680"/>
+            <w:tcBorders>
+              <w:top w:val="single" w:sz="4" w:space="0" w:color="CCCCCC"/>
+              <w:bottom w:val="single" w:sz="4" w:space="0" w:color="CCCCCC"/>
+              <w:left w:val="single" w:sz="4" w:space="0" w:color="CCCCCC"/>
+              <w:right w:val="single" w:sz="4" w:space="0" w:color="CCCCCC"/>
+            </w:tcBorders>
           </w:tcPr>
           <w:p>
             <w:r>
               <w:rPr>
                 <w:b/>
               </w:rPr>
-              <w:t>Project Title:</w:t>
+              <w:t>Traditional Security Operations System</w:t>
             </w:r>
           </w:p>
         </w:tc>
         <w:tc>
           <w:tcPr>
             <w:tcW w:type="dxa" w:w="4680"/>
+            <w:tcBorders>
+              <w:top w:val="single" w:sz="4" w:space="0" w:color="CCCCCC"/>
+              <w:bottom w:val="single" w:sz="4" w:space="0" w:color="CCCCCC"/>
+              <w:left w:val="single" w:sz="4" w:space="0" w:color="CCCCCC"/>
+              <w:right w:val="single" w:sz="4" w:space="0" w:color="CCCCCC"/>
+            </w:tcBorders>
           </w:tcPr>
           <w:p>
             <w:r>
-              <w:t>SentinelGPT Autonomous Cyber Defense Platform</w:t>
+              <w:rPr>
+                <w:b/>
+              </w:rPr>
+              <w:t>Proposed SentinelGPT System</w:t>
             </w:r>
           </w:p>
         </w:tc>
@@ -74,23 +197,32 @@
         <w:tc>
           <w:tcPr>
             <w:tcW w:type="dxa" w:w="4680"/>
+            <w:tcBorders>
+              <w:top w:val="single" w:sz="4" w:space="0" w:color="CCCCCC"/>
+              <w:bottom w:val="single" w:sz="4" w:space="0" w:color="CCCCCC"/>
+              <w:left w:val="single" w:sz="4" w:space="0" w:color="CCCCCC"/>
+              <w:right w:val="single" w:sz="4" w:space="0" w:color="CCCCCC"/>
+            </w:tcBorders>
           </w:tcPr>
           <w:p>
             <w:r>
-              <w:rPr>
-                <w:b/>
-              </w:rPr>
-              <w:t>Live Deployment Link:</w:t>
+              <w:t>Security monitoring relies on manual log inspection and static firewall rules.</w:t>
             </w:r>
           </w:p>
         </w:tc>
         <w:tc>
           <w:tcPr>
             <w:tcW w:type="dxa" w:w="4680"/>
+            <w:tcBorders>
+              <w:top w:val="single" w:sz="4" w:space="0" w:color="CCCCCC"/>
+              <w:bottom w:val="single" w:sz="4" w:space="0" w:color="CCCCCC"/>
+              <w:left w:val="single" w:sz="4" w:space="0" w:color="CCCCCC"/>
+              <w:right w:val="single" w:sz="4" w:space="0" w:color="CCCCCC"/>
+            </w:tcBorders>
           </w:tcPr>
           <w:p>
             <w:r>
-              <w:t>https://sentinelgpt-ai.vercel.app</w:t>
+              <w:t>Threat monitoring is performed automatically using intelligent software agents running 24/7.</w:t>
             </w:r>
           </w:p>
         </w:tc>
@@ -99,23 +231,32 @@
         <w:tc>
           <w:tcPr>
             <w:tcW w:type="dxa" w:w="4680"/>
+            <w:tcBorders>
+              <w:top w:val="single" w:sz="4" w:space="0" w:color="CCCCCC"/>
+              <w:bottom w:val="single" w:sz="4" w:space="0" w:color="CCCCCC"/>
+              <w:left w:val="single" w:sz="4" w:space="0" w:color="CCCCCC"/>
+              <w:right w:val="single" w:sz="4" w:space="0" w:color="CCCCCC"/>
+            </w:tcBorders>
           </w:tcPr>
           <w:p>
             <w:r>
-              <w:rPr>
-                <w:b/>
-              </w:rPr>
-              <w:t>GitHub Repository:</w:t>
+              <w:t>High rate of alert fatigue and delayed incident detection.</w:t>
             </w:r>
           </w:p>
         </w:tc>
         <w:tc>
           <w:tcPr>
             <w:tcW w:type="dxa" w:w="4680"/>
+            <w:tcBorders>
+              <w:top w:val="single" w:sz="4" w:space="0" w:color="CCCCCC"/>
+              <w:bottom w:val="single" w:sz="4" w:space="0" w:color="CCCCCC"/>
+              <w:left w:val="single" w:sz="4" w:space="0" w:color="CCCCCC"/>
+              <w:right w:val="single" w:sz="4" w:space="0" w:color="CCCCCC"/>
+            </w:tcBorders>
           </w:tcPr>
           <w:p>
             <w:r>
-              <w:t>https://github.com/Pravallika2025/sentigraud-ai-.git</w:t>
+              <w:t>Real-time heuristic anomaly scoring (0-100) eliminates alert fatigue and detects threats instantly.</w:t>
             </w:r>
           </w:p>
         </w:tc>
@@ -124,23 +265,32 @@
         <w:tc>
           <w:tcPr>
             <w:tcW w:type="dxa" w:w="4680"/>
+            <w:tcBorders>
+              <w:top w:val="single" w:sz="4" w:space="0" w:color="CCCCCC"/>
+              <w:bottom w:val="single" w:sz="4" w:space="0" w:color="CCCCCC"/>
+              <w:left w:val="single" w:sz="4" w:space="0" w:color="CCCCCC"/>
+              <w:right w:val="single" w:sz="4" w:space="0" w:color="CCCCCC"/>
+            </w:tcBorders>
           </w:tcPr>
           <w:p>
             <w:r>
-              <w:rPr>
-                <w:b/>
-              </w:rPr>
-              <w:t>Technology Stack:</w:t>
+              <w:t>Firewall IP blocking requires manual administrative intervention and rule updates.</w:t>
             </w:r>
           </w:p>
         </w:tc>
         <w:tc>
           <w:tcPr>
             <w:tcW w:type="dxa" w:w="4680"/>
+            <w:tcBorders>
+              <w:top w:val="single" w:sz="4" w:space="0" w:color="CCCCCC"/>
+              <w:bottom w:val="single" w:sz="4" w:space="0" w:color="CCCCCC"/>
+              <w:left w:val="single" w:sz="4" w:space="0" w:color="CCCCCC"/>
+              <w:right w:val="single" w:sz="4" w:space="0" w:color="CCCCCC"/>
+            </w:tcBorders>
           </w:tcPr>
           <w:p>
             <w:r>
-              <w:t>React 19, Vite 5.4, FastAPI, SQLAlchemy, SQLite, JWT</w:t>
+              <w:t>Autonomous Quarantine Agent automatically isolates high-risk IPs (score &gt;= 75) in real time.</w:t>
             </w:r>
           </w:p>
         </w:tc>
@@ -149,23 +299,202 @@
         <w:tc>
           <w:tcPr>
             <w:tcW w:type="dxa" w:w="4680"/>
+            <w:tcBorders>
+              <w:top w:val="single" w:sz="4" w:space="0" w:color="CCCCCC"/>
+              <w:bottom w:val="single" w:sz="4" w:space="0" w:color="CCCCCC"/>
+              <w:left w:val="single" w:sz="4" w:space="0" w:color="CCCCCC"/>
+              <w:right w:val="single" w:sz="4" w:space="0" w:color="CCCCCC"/>
+            </w:tcBorders>
           </w:tcPr>
           <w:p>
             <w:r>
-              <w:rPr>
-                <w:b/>
-              </w:rPr>
-              <w:t>Documentation Date:</w:t>
+              <w:t>Lacks standardized threat classification and attack framework alignment.</w:t>
             </w:r>
           </w:p>
         </w:tc>
         <w:tc>
           <w:tcPr>
             <w:tcW w:type="dxa" w:w="4680"/>
+            <w:tcBorders>
+              <w:top w:val="single" w:sz="4" w:space="0" w:color="CCCCCC"/>
+              <w:bottom w:val="single" w:sz="4" w:space="0" w:color="CCCCCC"/>
+              <w:left w:val="single" w:sz="4" w:space="0" w:color="CCCCCC"/>
+              <w:right w:val="single" w:sz="4" w:space="0" w:color="CCCCCC"/>
+            </w:tcBorders>
           </w:tcPr>
           <w:p>
             <w:r>
-              <w:t>July 2026</w:t>
+              <w:t>Automatically maps all detected incidents to MITRE ATT&amp;CK tactics and techniques.</w:t>
+            </w:r>
+          </w:p>
+        </w:tc>
+      </w:tr>
+      <w:tr>
+        <w:tc>
+          <w:tcPr>
+            <w:tcW w:type="dxa" w:w="4680"/>
+            <w:tcBorders>
+              <w:top w:val="single" w:sz="4" w:space="0" w:color="CCCCCC"/>
+              <w:bottom w:val="single" w:sz="4" w:space="0" w:color="CCCCCC"/>
+              <w:left w:val="single" w:sz="4" w:space="0" w:color="CCCCCC"/>
+              <w:right w:val="single" w:sz="4" w:space="0" w:color="CCCCCC"/>
+            </w:tcBorders>
+          </w:tcPr>
+          <w:p>
+            <w:r>
+              <w:t>Incident triage requires extensive manual research by security analysts.</w:t>
+            </w:r>
+          </w:p>
+        </w:tc>
+        <w:tc>
+          <w:tcPr>
+            <w:tcW w:type="dxa" w:w="4680"/>
+            <w:tcBorders>
+              <w:top w:val="single" w:sz="4" w:space="0" w:color="CCCCCC"/>
+              <w:bottom w:val="single" w:sz="4" w:space="0" w:color="CCCCCC"/>
+              <w:left w:val="single" w:sz="4" w:space="0" w:color="CCCCCC"/>
+              <w:right w:val="single" w:sz="4" w:space="0" w:color="CCCCCC"/>
+            </w:tcBorders>
+          </w:tcPr>
+          <w:p>
+            <w:r>
+              <w:t>Integrated AI Triage Assistant provides instant remediation guidance and remediation steps.</w:t>
+            </w:r>
+          </w:p>
+        </w:tc>
+      </w:tr>
+      <w:tr>
+        <w:tc>
+          <w:tcPr>
+            <w:tcW w:type="dxa" w:w="4680"/>
+            <w:tcBorders>
+              <w:top w:val="single" w:sz="4" w:space="0" w:color="CCCCCC"/>
+              <w:bottom w:val="single" w:sz="4" w:space="0" w:color="CCCCCC"/>
+              <w:left w:val="single" w:sz="4" w:space="0" w:color="CCCCCC"/>
+              <w:right w:val="single" w:sz="4" w:space="0" w:color="CCCCCC"/>
+            </w:tcBorders>
+          </w:tcPr>
+          <w:p>
+            <w:r>
+              <w:t>Limited real-time visualization of network perimeter threat velocity.</w:t>
+            </w:r>
+          </w:p>
+        </w:tc>
+        <w:tc>
+          <w:tcPr>
+            <w:tcW w:type="dxa" w:w="4680"/>
+            <w:tcBorders>
+              <w:top w:val="single" w:sz="4" w:space="0" w:color="CCCCCC"/>
+              <w:bottom w:val="single" w:sz="4" w:space="0" w:color="CCCCCC"/>
+              <w:left w:val="single" w:sz="4" w:space="0" w:color="CCCCCC"/>
+              <w:right w:val="single" w:sz="4" w:space="0" w:color="CCCCCC"/>
+            </w:tcBorders>
+          </w:tcPr>
+          <w:p>
+            <w:r>
+              <w:t>Interactive glassmorphic dashboard with live telemetry velocity charts and perimeter heatmaps.</w:t>
+            </w:r>
+          </w:p>
+        </w:tc>
+      </w:tr>
+      <w:tr>
+        <w:tc>
+          <w:tcPr>
+            <w:tcW w:type="dxa" w:w="4680"/>
+            <w:tcBorders>
+              <w:top w:val="single" w:sz="4" w:space="0" w:color="CCCCCC"/>
+              <w:bottom w:val="single" w:sz="4" w:space="0" w:color="CCCCCC"/>
+              <w:left w:val="single" w:sz="4" w:space="0" w:color="CCCCCC"/>
+              <w:right w:val="single" w:sz="4" w:space="0" w:color="CCCCCC"/>
+            </w:tcBorders>
+          </w:tcPr>
+          <w:p>
+            <w:r>
+              <w:t>Payload and log file analysis is performed manually using external tools.</w:t>
+            </w:r>
+          </w:p>
+        </w:tc>
+        <w:tc>
+          <w:tcPr>
+            <w:tcW w:type="dxa" w:w="4680"/>
+            <w:tcBorders>
+              <w:top w:val="single" w:sz="4" w:space="0" w:color="CCCCCC"/>
+              <w:bottom w:val="single" w:sz="4" w:space="0" w:color="CCCCCC"/>
+              <w:left w:val="single" w:sz="4" w:space="0" w:color="CCCCCC"/>
+              <w:right w:val="single" w:sz="4" w:space="0" w:color="CCCCCC"/>
+            </w:tcBorders>
+          </w:tcPr>
+          <w:p>
+            <w:r>
+              <w:t>Built-in Payload Scanner analyzes log files and static signatures with automatic verdict reports.</w:t>
+            </w:r>
+          </w:p>
+        </w:tc>
+      </w:tr>
+      <w:tr>
+        <w:tc>
+          <w:tcPr>
+            <w:tcW w:type="dxa" w:w="4680"/>
+            <w:tcBorders>
+              <w:top w:val="single" w:sz="4" w:space="0" w:color="CCCCCC"/>
+              <w:bottom w:val="single" w:sz="4" w:space="0" w:color="CCCCCC"/>
+              <w:left w:val="single" w:sz="4" w:space="0" w:color="CCCCCC"/>
+              <w:right w:val="single" w:sz="4" w:space="0" w:color="CCCCCC"/>
+            </w:tcBorders>
+          </w:tcPr>
+          <w:p>
+            <w:r>
+              <w:t>Data export and incident reporting require manual log gathering.</w:t>
+            </w:r>
+          </w:p>
+        </w:tc>
+        <w:tc>
+          <w:tcPr>
+            <w:tcW w:type="dxa" w:w="4680"/>
+            <w:tcBorders>
+              <w:top w:val="single" w:sz="4" w:space="0" w:color="CCCCCC"/>
+              <w:bottom w:val="single" w:sz="4" w:space="0" w:color="CCCCCC"/>
+              <w:left w:val="single" w:sz="4" w:space="0" w:color="CCCCCC"/>
+              <w:right w:val="single" w:sz="4" w:space="0" w:color="CCCCCC"/>
+            </w:tcBorders>
+          </w:tcPr>
+          <w:p>
+            <w:r>
+              <w:t>Supports instant JSON incident log export and RESTful API data access.</w:t>
+            </w:r>
+          </w:p>
+        </w:tc>
+      </w:tr>
+      <w:tr>
+        <w:tc>
+          <w:tcPr>
+            <w:tcW w:type="dxa" w:w="4680"/>
+            <w:tcBorders>
+              <w:top w:val="single" w:sz="4" w:space="0" w:color="CCCCCC"/>
+              <w:bottom w:val="single" w:sz="4" w:space="0" w:color="CCCCCC"/>
+              <w:left w:val="single" w:sz="4" w:space="0" w:color="CCCCCC"/>
+              <w:right w:val="single" w:sz="4" w:space="0" w:color="CCCCCC"/>
+            </w:tcBorders>
+          </w:tcPr>
+          <w:p>
+            <w:r>
+              <w:t>Difficult to scale across distributed cloud and multi-tenant environments.</w:t>
+            </w:r>
+          </w:p>
+        </w:tc>
+        <w:tc>
+          <w:tcPr>
+            <w:tcW w:type="dxa" w:w="4680"/>
+            <w:tcBorders>
+              <w:top w:val="single" w:sz="4" w:space="0" w:color="CCCCCC"/>
+              <w:bottom w:val="single" w:sz="4" w:space="0" w:color="CCCCCC"/>
+              <w:left w:val="single" w:sz="4" w:space="0" w:color="CCCCCC"/>
+              <w:right w:val="single" w:sz="4" w:space="0" w:color="CCCCCC"/>
+            </w:tcBorders>
+          </w:tcPr>
+          <w:p>
+            <w:r>
+              <w:t>Serverless cloud architecture (FastAPI + Vercel) provides seamless scalability and high availability.</w:t>
             </w:r>
           </w:p>
         </w:tc>
@@ -178,177 +507,1127 @@
     </w:p>
     <w:p>
       <w:pPr>
-        <w:spacing w:before="360" w:after="120"/>
+        <w:spacing w:before="360" w:after="160"/>
       </w:pPr>
       <w:r>
         <w:rPr>
-          <w:rFonts w:ascii="Calibri" w:hAnsi="Calibri"/>
+          <w:rFonts w:ascii="Times New Roman" w:hAnsi="Times New Roman"/>
           <w:b/>
-          <w:color w:val="003366"/>
-          <w:sz w:val="36"/>
+          <w:sz w:val="32"/>
         </w:rPr>
-        <w:t>1. Executive Summary &amp; Abstract</w:t>
+        <w:t>Proposed System</w:t>
       </w:r>
     </w:p>
     <w:p>
       <w:pPr>
-        <w:spacing w:after="120" w:line="276" w:lineRule="auto"/>
+        <w:spacing w:after="120" w:line="360" w:lineRule="auto"/>
+        <w:jc w:val="both"/>
       </w:pPr>
       <w:r>
-        <w:t>SentinelGPT is an enterprise-grade, full-stack autonomous Security Operations Center (SOC) platform designed for continuous network threat monitoring, real-time telemetry processing, heuristic vulnerability analysis, and automated quarantine response.</w:t>
+        <w:rPr>
+          <w:rFonts w:ascii="Times New Roman" w:hAnsi="Times New Roman"/>
+        </w:rPr>
+        <w:t>The proposed SentinelGPT system is an intelligent web-based cyber defense application developed to automate threat detection, security monitoring, and incident mitigation. Designed to overcome the limitations of traditional security management, the system utilizes intelligent software agents that continuously evaluate network telemetry against heuristic scoring models and security policies.</w:t>
       </w:r>
     </w:p>
     <w:p>
       <w:pPr>
-        <w:spacing w:after="120" w:line="276" w:lineRule="auto"/>
+        <w:spacing w:after="120" w:line="360" w:lineRule="auto"/>
+        <w:jc w:val="both"/>
       </w:pPr>
       <w:r>
-        <w:t>Built to bridge real-time cybersecurity operations with cloud-native serverless architecture, SentinelGPT processes network anomalies, maps them dynamically against MITRE ATT&amp;CK tactics, and renders actionable AI remediation recommendations for security analysts.</w:t>
+        <w:rPr>
+          <w:rFonts w:ascii="Times New Roman" w:hAnsi="Times New Roman"/>
+        </w:rPr>
+        <w:t>The application features a modern dashboard built with React 19 and Vite 5.4, connected to a high-performance FastAPI Python backend controller. When telemetry data arrives, the Telemetry Monitor Agent analyzes packet rates, IP origins, and request patterns to calculate a risk score (0 to 100). Incidents exceeding risk thresholds are immediately mapped to MITRE ATT&amp;CK techniques (e.g., T1078 Valid Accounts, T1498 Network DoS, T1190 Exploit Public App) and formatted with AI-driven remediation guidance.</w:t>
       </w:r>
     </w:p>
     <w:p>
       <w:pPr>
-        <w:spacing w:before="360" w:after="120"/>
+        <w:spacing w:after="120" w:line="360" w:lineRule="auto"/>
+        <w:jc w:val="both"/>
       </w:pPr>
       <w:r>
         <w:rPr>
-          <w:rFonts w:ascii="Calibri" w:hAnsi="Calibri"/>
-          <w:b/>
-          <w:color w:val="003366"/>
-          <w:sz w:val="36"/>
+          <w:rFonts w:ascii="Times New Roman" w:hAnsi="Times New Roman"/>
         </w:rPr>
-        <w:t>2. System Architecture &amp; Technical Stack</w:t>
+        <w:t>Simultaneously, the Autonomous Quarantine Agent monitors incident severity. If an anomaly score reaches or exceeds 75 (Critical/High threat), the agent automatically adds the offending IP address to the active quarantine database table, blocking further unauthorized access. Administrators retain full visibility and control through interactive dashboard toggles, enabling manual threat simulation, log clearing, and instant quarantine revocation.</w:t>
       </w:r>
     </w:p>
     <w:p>
       <w:pPr>
-        <w:spacing w:after="120" w:line="276" w:lineRule="auto"/>
+        <w:spacing w:after="120" w:line="360" w:lineRule="auto"/>
+        <w:jc w:val="both"/>
       </w:pPr>
       <w:r>
-        <w:t>The application follows a decoupled monorepo architecture, leveraging React 19 for rendering dynamic glassmorphic telemetry components and FastAPI (Python) for asynchronous microservices and serverless database interaction.</w:t>
+        <w:rPr>
+          <w:rFonts w:ascii="Times New Roman" w:hAnsi="Times New Roman"/>
+        </w:rPr>
+        <w:t>By integrating real-time telemetry streaming, autonomous quarantine execution, interactive chart analytics, a conversational AI triage assistant, and static payload scanning into a unified serverless environment, SentinelGPT offers a highly reliable, efficient, and scalable solution for modern enterprise cybersecurity operations.</w:t>
+      </w:r>
+    </w:p>
+    <w:p>
+      <w:r>
+        <w:br w:type="page"/>
       </w:r>
     </w:p>
     <w:p>
       <w:pPr>
-        <w:spacing w:before="280" w:after="80"/>
+        <w:spacing w:before="360" w:after="160"/>
       </w:pPr>
       <w:r>
         <w:rPr>
-          <w:rFonts w:ascii="Calibri" w:hAnsi="Calibri"/>
+          <w:rFonts w:ascii="Times New Roman" w:hAnsi="Times New Roman"/>
           <w:b/>
-          <w:color w:val="006699"/>
-          <w:sz w:val="28"/>
+          <w:sz w:val="32"/>
         </w:rPr>
-        <w:t>Key Technology Components:</w:t>
+        <w:t>System Architecture</w:t>
       </w:r>
     </w:p>
     <w:p>
       <w:pPr>
-        <w:spacing w:after="120" w:line="276" w:lineRule="auto"/>
+        <w:spacing w:after="120" w:line="360" w:lineRule="auto"/>
+        <w:jc w:val="both"/>
       </w:pPr>
       <w:r>
         <w:rPr>
-          <w:b/>
-          <w:color w:val="003366"/>
+          <w:rFonts w:ascii="Times New Roman" w:hAnsi="Times New Roman"/>
         </w:rPr>
-        <w:t xml:space="preserve">• Frontend (React 19 + Vite 5.4): </w:t>
-      </w:r>
-      <w:r>
-        <w:t xml:space="preserve"> Modern single-page application framework providing fast Virtual DOM reconciliation and responsive glassmorphic dark theme components.</w:t>
+        <w:t>SentinelGPT follows a modular, decoupled architecture where each component performs a specialized task. The system starts when an operator authenticates through the React frontend interface. Upon login, the dashboard establishes communication with the FastAPI backend controller to fetch telemetry snapshots and establish WebSocket streaming.</w:t>
       </w:r>
     </w:p>
     <w:p>
       <w:pPr>
-        <w:spacing w:after="120" w:line="276" w:lineRule="auto"/>
+        <w:spacing w:after="120" w:line="360" w:lineRule="auto"/>
+        <w:jc w:val="both"/>
       </w:pPr>
       <w:r>
         <w:rPr>
-          <w:b/>
-          <w:color w:val="003366"/>
+          <w:rFonts w:ascii="Times New Roman" w:hAnsi="Times New Roman"/>
         </w:rPr>
-        <w:t xml:space="preserve">• Backend (FastAPI + Python 3.11): </w:t>
-      </w:r>
-      <w:r>
-        <w:t xml:space="preserve"> Asynchronous Python framework managing RESTful JSON APIs (`/api/*`), OpenAPI schemas, and WebSockets.</w:t>
+        <w:t>The FastAPI backend processes inbound telemetry using two intelligent agents: the Telemetry Monitor Agent (responsible for anomaly scoring and MITRE ATT&amp;CK mapping) and the Autonomous Quarantine Agent (responsible for automated firewall IP isolation and quarantine validation). All incident logs, user credentials, and quarantined IPs are securely managed by SQLAlchemy ORM connected to SQLite (or cloud database). The complete architecture flow is shown in the diagram below:</w:t>
       </w:r>
     </w:p>
     <w:p>
       <w:pPr>
-        <w:spacing w:after="120" w:line="276" w:lineRule="auto"/>
+        <w:spacing w:before="200" w:after="240"/>
+        <w:jc w:val="center"/>
       </w:pPr>
       <w:r>
-        <w:rPr>
-          <w:b/>
-          <w:color w:val="003366"/>
-        </w:rPr>
-        <w:t xml:space="preserve">• Database &amp; Storage: </w:t>
+        <w:drawing>
+          <wp:inline xmlns:a="http://schemas.openxmlformats.org/drawingml/2006/main" xmlns:pic="http://schemas.openxmlformats.org/drawingml/2006/picture">
+            <wp:extent cx="5486400" cy="4572000"/>
+            <wp:docPr id="1" name="Picture 1"/>
+            <wp:cNvGraphicFramePr>
+              <a:graphicFrameLocks noChangeAspect="1"/>
+            </wp:cNvGraphicFramePr>
+            <a:graphic>
+              <a:graphicData uri="http://schemas.openxmlformats.org/drawingml/2006/picture">
+                <pic:pic>
+                  <pic:nvPicPr>
+                    <pic:cNvPr id="0" name="architecture_diagram.png"/>
+                    <pic:cNvPicPr/>
+                  </pic:nvPicPr>
+                  <pic:blipFill>
+                    <a:blip r:embed="rId9"/>
+                    <a:stretch>
+                      <a:fillRect/>
+                    </a:stretch>
+                  </pic:blipFill>
+                  <pic:spPr>
+                    <a:xfrm>
+                      <a:off x="0" y="0"/>
+                      <a:ext cx="5486400" cy="4572000"/>
+                    </a:xfrm>
+                    <a:prstGeom prst="rect"/>
+                  </pic:spPr>
+                </pic:pic>
+              </a:graphicData>
+            </a:graphic>
+          </wp:inline>
+        </w:drawing>
       </w:r>
+    </w:p>
+    <w:p>
       <w:r>
-        <w:t xml:space="preserve"> SQLAlchemy ORM interfacing with SQLite (`/tmp/sentinel_vercel.db` on Vercel) for persistent incident logging.</w:t>
+        <w:br w:type="page"/>
       </w:r>
     </w:p>
     <w:p>
       <w:pPr>
-        <w:spacing w:after="120" w:line="276" w:lineRule="auto"/>
+        <w:spacing w:before="360" w:after="160"/>
       </w:pPr>
       <w:r>
         <w:rPr>
+          <w:rFonts w:ascii="Times New Roman" w:hAnsi="Times New Roman"/>
           <w:b/>
-          <w:color w:val="003366"/>
+          <w:sz w:val="32"/>
         </w:rPr>
-        <w:t xml:space="preserve">• Authentication: </w:t>
-      </w:r>
-      <w:r>
-        <w:t xml:space="preserve"> Expiring HS256 JWT tokens with SHA-256 password hashing and role-based access control.</w:t>
+        <w:t>Technologies Used</w:t>
       </w:r>
     </w:p>
     <w:p>
       <w:pPr>
-        <w:spacing w:after="120" w:line="276" w:lineRule="auto"/>
+        <w:spacing w:after="120" w:line="360" w:lineRule="auto"/>
+        <w:jc w:val="both"/>
       </w:pPr>
       <w:r>
         <w:rPr>
-          <w:b/>
-          <w:color w:val="003366"/>
+          <w:rFonts w:ascii="Times New Roman" w:hAnsi="Times New Roman"/>
         </w:rPr>
-        <w:t xml:space="preserve">• Cloud Hosting: </w:t>
-      </w:r>
-      <w:r>
-        <w:t xml:space="preserve"> Multi-stage Vercel serverless deployment (`vercel.json`) serving static assets from `/dist` and dynamic API handlers.</w:t>
-      </w:r>
-    </w:p>
-    <w:p>
-      <w:pPr>
-        <w:spacing w:before="360" w:after="120"/>
-      </w:pPr>
-      <w:r>
-        <w:rPr>
-          <w:rFonts w:ascii="Calibri" w:hAnsi="Calibri"/>
-          <w:b/>
-          <w:color w:val="003366"/>
-          <w:sz w:val="36"/>
-        </w:rPr>
-        <w:t>3. Core Operations Dashboard Interface</w:t>
-      </w:r>
-    </w:p>
-    <w:p>
-      <w:pPr>
-        <w:spacing w:after="120" w:line="276" w:lineRule="auto"/>
-      </w:pPr>
-      <w:r>
-        <w:t>The main Security Operations Center (SOC) dashboard consolidates live perimeter telemetry into real-time KPI cards, threat velocity area charts, severity distribution donuts, sector heatmap matrices, and an automated quarantine management list.</w:t>
+        <w:t>SentinelGPT is developed using a powerful combination of modern frontend, backend, database, and AI technologies. These technologies collaborate to automate threat monitoring, ensure real-time data streaming, and deliver an intuitive security operations dashboard.</w:t>
       </w:r>
     </w:p>
     <w:p>
       <w:pPr>
         <w:spacing w:before="240" w:after="80"/>
+      </w:pPr>
+      <w:r>
+        <w:rPr>
+          <w:rFonts w:ascii="Times New Roman" w:hAnsi="Times New Roman"/>
+          <w:b/>
+          <w:sz w:val="26"/>
+        </w:rPr>
+        <w:t>1. Frontend Technologies</w:t>
+      </w:r>
+    </w:p>
+    <w:p>
+      <w:pPr>
+        <w:spacing w:after="120" w:line="360" w:lineRule="auto"/>
+        <w:jc w:val="both"/>
+      </w:pPr>
+      <w:r>
+        <w:rPr>
+          <w:rFonts w:ascii="Times New Roman" w:hAnsi="Times New Roman"/>
+          <w:b/>
+        </w:rPr>
+        <w:t xml:space="preserve">• React 19: </w:t>
+      </w:r>
+      <w:r>
+        <w:rPr>
+          <w:rFonts w:ascii="Times New Roman" w:hAnsi="Times New Roman"/>
+        </w:rPr>
+        <w:t xml:space="preserve"> Modern UI library for building dynamic component trees and managing real-time state updates. It allows for efficient rendering of complex dashboards.</w:t>
+      </w:r>
+    </w:p>
+    <w:p>
+      <w:pPr>
+        <w:spacing w:after="120" w:line="360" w:lineRule="auto"/>
+        <w:jc w:val="both"/>
+      </w:pPr>
+      <w:r>
+        <w:rPr>
+          <w:rFonts w:ascii="Times New Roman" w:hAnsi="Times New Roman"/>
+          <w:b/>
+        </w:rPr>
+        <w:t xml:space="preserve">• Vite 5.4: </w:t>
+      </w:r>
+      <w:r>
+        <w:rPr>
+          <w:rFonts w:ascii="Times New Roman" w:hAnsi="Times New Roman"/>
+        </w:rPr>
+        <w:t xml:space="preserve"> Next-generation frontend build tool providing fast Hot Module Replacement (HMR) and optimized production bundles.</w:t>
+      </w:r>
+    </w:p>
+    <w:p>
+      <w:pPr>
+        <w:spacing w:after="120" w:line="360" w:lineRule="auto"/>
+        <w:jc w:val="both"/>
+      </w:pPr>
+      <w:r>
+        <w:rPr>
+          <w:rFonts w:ascii="Times New Roman" w:hAnsi="Times New Roman"/>
+          <w:b/>
+        </w:rPr>
+        <w:t xml:space="preserve">• Recharts: </w:t>
+      </w:r>
+      <w:r>
+        <w:rPr>
+          <w:rFonts w:ascii="Times New Roman" w:hAnsi="Times New Roman"/>
+        </w:rPr>
+        <w:t xml:space="preserve"> A composability library used to render live threat velocity charts, risk gauges, and severity donuts.</w:t>
+      </w:r>
+    </w:p>
+    <w:p>
+      <w:pPr>
+        <w:spacing w:after="120" w:line="360" w:lineRule="auto"/>
+        <w:jc w:val="both"/>
+      </w:pPr>
+      <w:r>
+        <w:rPr>
+          <w:rFonts w:ascii="Times New Roman" w:hAnsi="Times New Roman"/>
+          <w:b/>
+        </w:rPr>
+        <w:t xml:space="preserve">• HTML5 &amp; CSS3: </w:t>
+      </w:r>
+      <w:r>
+        <w:rPr>
+          <w:rFonts w:ascii="Times New Roman" w:hAnsi="Times New Roman"/>
+        </w:rPr>
+        <w:t xml:space="preserve"> Provides the foundation for the visual structure and responsive layouts.</w:t>
+      </w:r>
+    </w:p>
+    <w:p>
+      <w:pPr>
+        <w:spacing w:after="120" w:line="360" w:lineRule="auto"/>
+        <w:jc w:val="both"/>
+      </w:pPr>
+      <w:r>
+        <w:rPr>
+          <w:rFonts w:ascii="Times New Roman" w:hAnsi="Times New Roman"/>
+          <w:b/>
+        </w:rPr>
+        <w:t xml:space="preserve">• JavaScript: </w:t>
+      </w:r>
+      <w:r>
+        <w:rPr>
+          <w:rFonts w:ascii="Times New Roman" w:hAnsi="Times New Roman"/>
+        </w:rPr>
+        <w:t xml:space="preserve"> The core scripting language handling client-side logic, API calls, and state management.</w:t>
+      </w:r>
+    </w:p>
+    <w:p>
+      <w:pPr>
+        <w:spacing w:before="240" w:after="80"/>
+      </w:pPr>
+      <w:r>
+        <w:rPr>
+          <w:rFonts w:ascii="Times New Roman" w:hAnsi="Times New Roman"/>
+          <w:b/>
+          <w:sz w:val="26"/>
+        </w:rPr>
+        <w:t>2. Backend Technologies</w:t>
+      </w:r>
+    </w:p>
+    <w:p>
+      <w:pPr>
+        <w:spacing w:after="120" w:line="360" w:lineRule="auto"/>
+        <w:jc w:val="both"/>
+      </w:pPr>
+      <w:r>
+        <w:rPr>
+          <w:rFonts w:ascii="Times New Roman" w:hAnsi="Times New Roman"/>
+          <w:b/>
+        </w:rPr>
+        <w:t xml:space="preserve">• Python 3.11+: </w:t>
+      </w:r>
+      <w:r>
+        <w:rPr>
+          <w:rFonts w:ascii="Times New Roman" w:hAnsi="Times New Roman"/>
+        </w:rPr>
+        <w:t xml:space="preserve"> Primary language for implementing threat algorithms, agent workflows, and database models.</w:t>
+      </w:r>
+    </w:p>
+    <w:p>
+      <w:pPr>
+        <w:spacing w:after="120" w:line="360" w:lineRule="auto"/>
+        <w:jc w:val="both"/>
+      </w:pPr>
+      <w:r>
+        <w:rPr>
+          <w:rFonts w:ascii="Times New Roman" w:hAnsi="Times New Roman"/>
+          <w:b/>
+        </w:rPr>
+        <w:t xml:space="preserve">• FastAPI: </w:t>
+      </w:r>
+      <w:r>
+        <w:rPr>
+          <w:rFonts w:ascii="Times New Roman" w:hAnsi="Times New Roman"/>
+        </w:rPr>
+        <w:t xml:space="preserve"> Asynchronous, high-performance web framework for handling RESTful APIs, WebSockets, and generating OpenAPI documentation automatically.</w:t>
+      </w:r>
+    </w:p>
+    <w:p>
+      <w:pPr>
+        <w:spacing w:after="120" w:line="360" w:lineRule="auto"/>
+        <w:jc w:val="both"/>
+      </w:pPr>
+      <w:r>
+        <w:rPr>
+          <w:rFonts w:ascii="Times New Roman" w:hAnsi="Times New Roman"/>
+          <w:b/>
+        </w:rPr>
+        <w:t xml:space="preserve">• Uvicorn: </w:t>
+      </w:r>
+      <w:r>
+        <w:rPr>
+          <w:rFonts w:ascii="Times New Roman" w:hAnsi="Times New Roman"/>
+        </w:rPr>
+        <w:t xml:space="preserve"> High-speed ASGI server powering local development execution and serverless request routing.</w:t>
+      </w:r>
+    </w:p>
+    <w:p>
+      <w:r>
+        <w:br w:type="page"/>
+      </w:r>
+    </w:p>
+    <w:p>
+      <w:pPr>
+        <w:spacing w:before="240" w:after="80"/>
+      </w:pPr>
+      <w:r>
+        <w:rPr>
+          <w:rFonts w:ascii="Times New Roman" w:hAnsi="Times New Roman"/>
+          <w:b/>
+          <w:sz w:val="26"/>
+        </w:rPr>
+        <w:t>3. Database &amp; Storage Technologies</w:t>
+      </w:r>
+    </w:p>
+    <w:p>
+      <w:pPr>
+        <w:spacing w:after="120" w:line="360" w:lineRule="auto"/>
+        <w:jc w:val="both"/>
+      </w:pPr>
+      <w:r>
+        <w:rPr>
+          <w:rFonts w:ascii="Times New Roman" w:hAnsi="Times New Roman"/>
+          <w:b/>
+        </w:rPr>
+        <w:t xml:space="preserve">• SQLAlchemy ORM: </w:t>
+      </w:r>
+      <w:r>
+        <w:rPr>
+          <w:rFonts w:ascii="Times New Roman" w:hAnsi="Times New Roman"/>
+        </w:rPr>
+        <w:t xml:space="preserve"> Python Object-Relational Mapping (ORM) library that allows secure and efficient database interactions without writing raw SQL queries.</w:t>
+      </w:r>
+    </w:p>
+    <w:p>
+      <w:pPr>
+        <w:spacing w:after="120" w:line="360" w:lineRule="auto"/>
+        <w:jc w:val="both"/>
+      </w:pPr>
+      <w:r>
+        <w:rPr>
+          <w:rFonts w:ascii="Times New Roman" w:hAnsi="Times New Roman"/>
+          <w:b/>
+        </w:rPr>
+        <w:t xml:space="preserve">• SQLite: </w:t>
+      </w:r>
+      <w:r>
+        <w:rPr>
+          <w:rFonts w:ascii="Times New Roman" w:hAnsi="Times New Roman"/>
+        </w:rPr>
+        <w:t xml:space="preserve"> Lightweight, zero-configuration relational database used for local testing and Vercel ephemeral storage.</w:t>
+      </w:r>
+    </w:p>
+    <w:p>
+      <w:pPr>
+        <w:spacing w:before="240" w:after="80"/>
+      </w:pPr>
+      <w:r>
+        <w:rPr>
+          <w:rFonts w:ascii="Times New Roman" w:hAnsi="Times New Roman"/>
+          <w:b/>
+          <w:sz w:val="26"/>
+        </w:rPr>
+        <w:t>4. Deployment Technologies</w:t>
+      </w:r>
+    </w:p>
+    <w:p>
+      <w:pPr>
+        <w:spacing w:after="120" w:line="360" w:lineRule="auto"/>
+        <w:jc w:val="both"/>
+      </w:pPr>
+      <w:r>
+        <w:rPr>
+          <w:rFonts w:ascii="Times New Roman" w:hAnsi="Times New Roman"/>
+          <w:b/>
+        </w:rPr>
+        <w:t xml:space="preserve">• Vercel: </w:t>
+      </w:r>
+      <w:r>
+        <w:rPr>
+          <w:rFonts w:ascii="Times New Roman" w:hAnsi="Times New Roman"/>
+        </w:rPr>
+        <w:t xml:space="preserve"> Cloud serverless deployment platform hosting the static React build and executing Python API functions on the edge.</w:t>
+      </w:r>
+    </w:p>
+    <w:p>
+      <w:pPr>
+        <w:spacing w:after="120" w:line="360" w:lineRule="auto"/>
+        <w:jc w:val="both"/>
+      </w:pPr>
+      <w:r>
+        <w:rPr>
+          <w:rFonts w:ascii="Times New Roman" w:hAnsi="Times New Roman"/>
+          <w:b/>
+        </w:rPr>
+        <w:t xml:space="preserve">• Git &amp; GitHub: </w:t>
+      </w:r>
+      <w:r>
+        <w:rPr>
+          <w:rFonts w:ascii="Times New Roman" w:hAnsi="Times New Roman"/>
+        </w:rPr>
+        <w:t xml:space="preserve"> Used for version control and automated deployment pipelines.</w:t>
+      </w:r>
+    </w:p>
+    <w:p>
+      <w:pPr>
+        <w:spacing w:before="360" w:after="160"/>
+      </w:pPr>
+      <w:r>
+        <w:rPr>
+          <w:rFonts w:ascii="Times New Roman" w:hAnsi="Times New Roman"/>
+          <w:b/>
+          <w:sz w:val="32"/>
+        </w:rPr>
+        <w:t>Algorithms Used</w:t>
+      </w:r>
+    </w:p>
+    <w:p>
+      <w:pPr>
+        <w:spacing w:after="120" w:line="360" w:lineRule="auto"/>
+        <w:jc w:val="both"/>
+      </w:pPr>
+      <w:r>
+        <w:rPr>
+          <w:rFonts w:ascii="Times New Roman" w:hAnsi="Times New Roman"/>
+          <w:b/>
+        </w:rPr>
+        <w:t xml:space="preserve">1. Heuristic Threat Scoring Algorithm: </w:t>
+      </w:r>
+      <w:r>
+        <w:rPr>
+          <w:rFonts w:ascii="Times New Roman" w:hAnsi="Times New Roman"/>
+        </w:rPr>
+        <w:t xml:space="preserve"> Evaluates incoming request velocity, payload anomaly patterns, and IP reputation to generate a normalized risk score ranging from 0 to 100. This heuristic approach identifies unknown threats without relying solely on static signatures.</w:t>
+      </w:r>
+    </w:p>
+    <w:p>
+      <w:pPr>
+        <w:spacing w:after="120" w:line="360" w:lineRule="auto"/>
+        <w:jc w:val="both"/>
+      </w:pPr>
+      <w:r>
+        <w:rPr>
+          <w:rFonts w:ascii="Times New Roman" w:hAnsi="Times New Roman"/>
+          <w:b/>
+        </w:rPr>
+        <w:t xml:space="preserve">2. Severity Matrix Classifier: </w:t>
+      </w:r>
+      <w:r>
+        <w:rPr>
+          <w:rFonts w:ascii="Times New Roman" w:hAnsi="Times New Roman"/>
+        </w:rPr>
+        <w:t xml:space="preserve"> Categorizes risk scores into distinct priority tiers: Critical (&gt;=75), High (60-74), Medium (40-59), and Low (&lt;40). This matrix drives the automated response logic.</w:t>
+      </w:r>
+    </w:p>
+    <w:p>
+      <w:pPr>
+        <w:spacing w:after="120" w:line="360" w:lineRule="auto"/>
+        <w:jc w:val="both"/>
+      </w:pPr>
+      <w:r>
+        <w:rPr>
+          <w:rFonts w:ascii="Times New Roman" w:hAnsi="Times New Roman"/>
+          <w:b/>
+        </w:rPr>
+        <w:t xml:space="preserve">3. Velocity Rate Anomaly Detector: </w:t>
+      </w:r>
+      <w:r>
+        <w:rPr>
+          <w:rFonts w:ascii="Times New Roman" w:hAnsi="Times New Roman"/>
+        </w:rPr>
+        <w:t xml:space="preserve"> Monitors burst traffic spikes per IP address over sliding time windows to detect active Distributed Denial of Service (DDoS) attempts or port scan sweeps.</w:t>
+      </w:r>
+    </w:p>
+    <w:p>
+      <w:r>
+        <w:br w:type="page"/>
+      </w:r>
+    </w:p>
+    <w:p>
+      <w:pPr>
+        <w:spacing w:before="360" w:after="160"/>
+      </w:pPr>
+      <w:r>
+        <w:rPr>
+          <w:rFonts w:ascii="Times New Roman" w:hAnsi="Times New Roman"/>
+          <w:b/>
+          <w:sz w:val="32"/>
+        </w:rPr>
+        <w:t>Architecture Flow &amp; Technology Layers</w:t>
+      </w:r>
+    </w:p>
+    <w:p>
+      <w:pPr>
+        <w:spacing w:after="120" w:line="360" w:lineRule="auto"/>
+        <w:jc w:val="both"/>
+      </w:pPr>
+      <w:r>
+        <w:rPr>
+          <w:rFonts w:ascii="Times New Roman" w:hAnsi="Times New Roman"/>
+        </w:rPr>
+        <w:t>The diagram below summarizes the technology stack layers and workflow, starting from the network traffic telemetry feed down to the Database and Output Report Generation layers:</w:t>
+      </w:r>
+    </w:p>
+    <w:p>
+      <w:pPr>
+        <w:spacing w:before="200" w:after="240"/>
         <w:jc w:val="center"/>
       </w:pPr>
       <w:r>
         <w:drawing>
           <wp:inline xmlns:a="http://schemas.openxmlformats.org/drawingml/2006/main" xmlns:pic="http://schemas.openxmlformats.org/drawingml/2006/picture">
-            <wp:extent cx="5669280" cy="2692908"/>
-            <wp:docPr id="1" name="Picture 1"/>
+            <wp:extent cx="5943600" cy="5034579"/>
+            <wp:docPr id="2" name="Picture 2"/>
+            <wp:cNvGraphicFramePr>
+              <a:graphicFrameLocks noChangeAspect="1"/>
+            </wp:cNvGraphicFramePr>
+            <a:graphic>
+              <a:graphicData uri="http://schemas.openxmlformats.org/drawingml/2006/picture">
+                <pic:pic>
+                  <pic:nvPicPr>
+                    <pic:cNvPr id="0" name="agent_workflow_diagram.png"/>
+                    <pic:cNvPicPr/>
+                  </pic:nvPicPr>
+                  <pic:blipFill>
+                    <a:blip r:embed="rId10"/>
+                    <a:stretch>
+                      <a:fillRect/>
+                    </a:stretch>
+                  </pic:blipFill>
+                  <pic:spPr>
+                    <a:xfrm>
+                      <a:off x="0" y="0"/>
+                      <a:ext cx="5943600" cy="5034579"/>
+                    </a:xfrm>
+                    <a:prstGeom prst="rect"/>
+                  </pic:spPr>
+                </pic:pic>
+              </a:graphicData>
+            </a:graphic>
+          </wp:inline>
+        </w:drawing>
+      </w:r>
+    </w:p>
+    <w:p>
+      <w:r>
+        <w:br w:type="page"/>
+      </w:r>
+    </w:p>
+    <w:p>
+      <w:pPr>
+        <w:spacing w:before="360" w:after="160"/>
+      </w:pPr>
+      <w:r>
+        <w:rPr>
+          <w:rFonts w:ascii="Times New Roman" w:hAnsi="Times New Roman"/>
+          <w:b/>
+          <w:sz w:val="32"/>
+        </w:rPr>
+        <w:t>Agents Used</w:t>
+      </w:r>
+    </w:p>
+    <w:p>
+      <w:pPr>
+        <w:spacing w:after="120" w:line="360" w:lineRule="auto"/>
+        <w:jc w:val="both"/>
+      </w:pPr>
+      <w:r>
+        <w:rPr>
+          <w:rFonts w:ascii="Times New Roman" w:hAnsi="Times New Roman"/>
+        </w:rPr>
+        <w:t>SentinelGPT utilizes intelligent software agents to automate the security monitoring workflow. Each agent operates independently to evaluate telemetry, classify risks, and execute response actions, significantly reducing the manual workload on human analysts.</w:t>
+      </w:r>
+    </w:p>
+    <w:p>
+      <w:pPr>
+        <w:spacing w:before="240" w:after="80"/>
+      </w:pPr>
+      <w:r>
+        <w:rPr>
+          <w:rFonts w:ascii="Times New Roman" w:hAnsi="Times New Roman"/>
+          <w:b/>
+          <w:sz w:val="26"/>
+        </w:rPr>
+        <w:t>1. Telemetry Monitor &amp; Threat Detection Agent</w:t>
+      </w:r>
+    </w:p>
+    <w:p>
+      <w:pPr>
+        <w:spacing w:after="120" w:line="360" w:lineRule="auto"/>
+        <w:jc w:val="both"/>
+      </w:pPr>
+      <w:r>
+        <w:rPr>
+          <w:rFonts w:ascii="Times New Roman" w:hAnsi="Times New Roman"/>
+        </w:rPr>
+        <w:t>The Telemetry Monitor Agent continuously inspects incoming network log events, extracts IP details, calculates risk scores using heuristic algorithms, and dynamically assigns MITRE ATT&amp;CK tactic and technique metadata based on the observed behavior.</w:t>
+      </w:r>
+    </w:p>
+    <w:p>
+      <w:pPr>
+        <w:spacing w:after="120" w:line="360" w:lineRule="auto"/>
+        <w:jc w:val="both"/>
+      </w:pPr>
+      <w:r>
+        <w:rPr>
+          <w:rFonts w:ascii="Times New Roman" w:hAnsi="Times New Roman"/>
+          <w:b/>
+        </w:rPr>
+        <w:t xml:space="preserve">• Responsibilities: </w:t>
+      </w:r>
+      <w:r>
+        <w:rPr>
+          <w:rFonts w:ascii="Times New Roman" w:hAnsi="Times New Roman"/>
+        </w:rPr>
+        <w:t>Reads network telemetry logs; Calculates priority risk scores; Maps threats to specific MITRE ATT&amp;CK techniques; Generates structured incident payloads for the dashboard.</w:t>
+      </w:r>
+    </w:p>
+    <w:p>
+      <w:pPr>
+        <w:spacing w:before="240" w:after="80"/>
+      </w:pPr>
+      <w:r>
+        <w:rPr>
+          <w:rFonts w:ascii="Times New Roman" w:hAnsi="Times New Roman"/>
+          <w:b/>
+          <w:sz w:val="26"/>
+        </w:rPr>
+        <w:t>2. Autonomous Quarantine &amp; Validation Agent</w:t>
+      </w:r>
+    </w:p>
+    <w:p>
+      <w:pPr>
+        <w:spacing w:after="120" w:line="360" w:lineRule="auto"/>
+        <w:jc w:val="both"/>
+      </w:pPr>
+      <w:r>
+        <w:rPr>
+          <w:rFonts w:ascii="Times New Roman" w:hAnsi="Times New Roman"/>
+        </w:rPr>
+        <w:t>The Autonomous Quarantine Agent evaluates detected incidents against defined safety policies. If an incident risk score reaches or exceeds the threshold of 75, the agent automatically isolates the offending IP address into the quarantine database, effectively blocking it. It also provides security operators with manual revoke controls and AI-driven remediation advice.</w:t>
+      </w:r>
+    </w:p>
+    <w:p>
+      <w:pPr>
+        <w:spacing w:after="120" w:line="360" w:lineRule="auto"/>
+        <w:jc w:val="both"/>
+      </w:pPr>
+      <w:r>
+        <w:rPr>
+          <w:rFonts w:ascii="Times New Roman" w:hAnsi="Times New Roman"/>
+          <w:b/>
+        </w:rPr>
+        <w:t xml:space="preserve">• Responsibilities: </w:t>
+      </w:r>
+      <w:r>
+        <w:rPr>
+          <w:rFonts w:ascii="Times New Roman" w:hAnsi="Times New Roman"/>
+        </w:rPr>
+        <w:t>Validates threat severity; Enforces automated IP quarantine rules; Prevents false-positive lockouts through validation checks; Generates contextual AI remediation advice.</w:t>
+      </w:r>
+    </w:p>
+    <w:p>
+      <w:r>
+        <w:br w:type="page"/>
+      </w:r>
+    </w:p>
+    <w:p>
+      <w:pPr>
+        <w:spacing w:before="360" w:after="160"/>
+      </w:pPr>
+      <w:r>
+        <w:rPr>
+          <w:rFonts w:ascii="Times New Roman" w:hAnsi="Times New Roman"/>
+          <w:b/>
+          <w:sz w:val="32"/>
+        </w:rPr>
+        <w:t>Implementation</w:t>
+      </w:r>
+    </w:p>
+    <w:p>
+      <w:pPr>
+        <w:spacing w:after="120" w:line="360" w:lineRule="auto"/>
+        <w:jc w:val="both"/>
+      </w:pPr>
+      <w:r>
+        <w:rPr>
+          <w:rFonts w:ascii="Times New Roman" w:hAnsi="Times New Roman"/>
+        </w:rPr>
+        <w:t>The development of the SentinelGPT system was executed in structured phases to ensure robustness, security, scalability, and high performance:</w:t>
+      </w:r>
+    </w:p>
+    <w:p>
+      <w:pPr>
+        <w:spacing w:before="240" w:after="80"/>
+      </w:pPr>
+      <w:r>
+        <w:rPr>
+          <w:rFonts w:ascii="Times New Roman" w:hAnsi="Times New Roman"/>
+          <w:b/>
+          <w:sz w:val="26"/>
+        </w:rPr>
+        <w:t>Phase 1: Requirement Analysis &amp; Threat Modeling</w:t>
+      </w:r>
+    </w:p>
+    <w:p>
+      <w:pPr>
+        <w:spacing w:after="120" w:line="360" w:lineRule="auto"/>
+        <w:jc w:val="both"/>
+      </w:pPr>
+      <w:r>
+        <w:rPr>
+          <w:rFonts w:ascii="Times New Roman" w:hAnsi="Times New Roman"/>
+        </w:rPr>
+        <w:t>The initial phase involved identifying the pain points in traditional Security Operations Centers (SOC). Requirements for real-time monitoring, automated quarantine, and intelligent triage were gathered. Threat scoring metrics were defined, and a mapping strategy for MITRE ATT&amp;CK techniques was established.</w:t>
+      </w:r>
+    </w:p>
+    <w:p>
+      <w:pPr>
+        <w:spacing w:before="240" w:after="80"/>
+      </w:pPr>
+      <w:r>
+        <w:rPr>
+          <w:rFonts w:ascii="Times New Roman" w:hAnsi="Times New Roman"/>
+          <w:b/>
+          <w:sz w:val="26"/>
+        </w:rPr>
+        <w:t>Phase 2: System Design &amp; Architecture</w:t>
+      </w:r>
+    </w:p>
+    <w:p>
+      <w:pPr>
+        <w:spacing w:after="120" w:line="360" w:lineRule="auto"/>
+        <w:jc w:val="both"/>
+      </w:pPr>
+      <w:r>
+        <w:rPr>
+          <w:rFonts w:ascii="Times New Roman" w:hAnsi="Times New Roman"/>
+        </w:rPr>
+        <w:t>In this phase, the overall system architecture was designed. The decoupled approach utilizing a React Single Page Application (SPA) for the frontend and a FastAPI serverless backend was planned. API routing and agent workflows were also finalized.</w:t>
+      </w:r>
+    </w:p>
+    <w:p>
+      <w:pPr>
+        <w:spacing w:before="240" w:after="80"/>
+      </w:pPr>
+      <w:r>
+        <w:rPr>
+          <w:rFonts w:ascii="Times New Roman" w:hAnsi="Times New Roman"/>
+          <w:b/>
+          <w:sz w:val="26"/>
+        </w:rPr>
+        <w:t>Phase 3: Database &amp; Schema Design</w:t>
+      </w:r>
+    </w:p>
+    <w:p>
+      <w:pPr>
+        <w:spacing w:after="120" w:line="360" w:lineRule="auto"/>
+        <w:jc w:val="both"/>
+      </w:pPr>
+      <w:r>
+        <w:rPr>
+          <w:rFonts w:ascii="Times New Roman" w:hAnsi="Times New Roman"/>
+        </w:rPr>
+        <w:t>The database was designed using SQLAlchemy ORM to ensure secure and efficient data handling. Tables were created for Users (authentication), SOC Incidents (threat logs), Perimeter Logs (traffic), and Blocked IPs (quarantine list).</w:t>
+      </w:r>
+    </w:p>
+    <w:p>
+      <w:pPr>
+        <w:spacing w:before="240" w:after="80"/>
+      </w:pPr>
+      <w:r>
+        <w:rPr>
+          <w:rFonts w:ascii="Times New Roman" w:hAnsi="Times New Roman"/>
+          <w:b/>
+          <w:sz w:val="26"/>
+        </w:rPr>
+        <w:t>Phase 4: Frontend Component Development</w:t>
+      </w:r>
+    </w:p>
+    <w:p>
+      <w:pPr>
+        <w:spacing w:after="120" w:line="360" w:lineRule="auto"/>
+        <w:jc w:val="both"/>
+      </w:pPr>
+      <w:r>
+        <w:rPr>
+          <w:rFonts w:ascii="Times New Roman" w:hAnsi="Times New Roman"/>
+        </w:rPr>
+        <w:t>The user interface was constructed using React and Tailwind CSS principles. Glassmorphic components were developed to provide a modern aesthetic. Key components like the ThreatChart, RiskGaugeChart, BlockedIPs manager, and Login portal were implemented.</w:t>
+      </w:r>
+    </w:p>
+    <w:p>
+      <w:r>
+        <w:br w:type="page"/>
+      </w:r>
+    </w:p>
+    <w:p>
+      <w:pPr>
+        <w:spacing w:before="240" w:after="80"/>
+      </w:pPr>
+      <w:r>
+        <w:rPr>
+          <w:rFonts w:ascii="Times New Roman" w:hAnsi="Times New Roman"/>
+          <w:b/>
+          <w:sz w:val="26"/>
+        </w:rPr>
+        <w:t>Phase 5: Backend API &amp; Heuristics Implementation</w:t>
+      </w:r>
+    </w:p>
+    <w:p>
+      <w:pPr>
+        <w:spacing w:after="120" w:line="360" w:lineRule="auto"/>
+        <w:jc w:val="both"/>
+      </w:pPr>
+      <w:r>
+        <w:rPr>
+          <w:rFonts w:ascii="Times New Roman" w:hAnsi="Times New Roman"/>
+        </w:rPr>
+        <w:t>The backend logic was implemented using Python and FastAPI. RESTful routes such as `/api/snapshot`, `/api/block_ip`, and `/api/sim_threat` were developed. Secure authentication using JSON Web Tokens (JWT) was integrated to protect endpoints.</w:t>
+      </w:r>
+    </w:p>
+    <w:p>
+      <w:pPr>
+        <w:spacing w:before="240" w:after="80"/>
+      </w:pPr>
+      <w:r>
+        <w:rPr>
+          <w:rFonts w:ascii="Times New Roman" w:hAnsi="Times New Roman"/>
+          <w:b/>
+          <w:sz w:val="26"/>
+        </w:rPr>
+        <w:t>Phase 6: Agentic AI Development</w:t>
+      </w:r>
+    </w:p>
+    <w:p>
+      <w:pPr>
+        <w:spacing w:after="120" w:line="360" w:lineRule="auto"/>
+        <w:jc w:val="both"/>
+      </w:pPr>
+      <w:r>
+        <w:rPr>
+          <w:rFonts w:ascii="Times New Roman" w:hAnsi="Times New Roman"/>
+        </w:rPr>
+        <w:t>The intelligent software agents were programmed. The Telemetry Monitor Agent was built to calculate risk scores and assign MITRE ATT&amp;CK tags. The Autonomous Quarantine Agent was developed to enforce firewall rules based on the severity thresholds.</w:t>
+      </w:r>
+    </w:p>
+    <w:p>
+      <w:pPr>
+        <w:spacing w:before="240" w:after="80"/>
+      </w:pPr>
+      <w:r>
+        <w:rPr>
+          <w:rFonts w:ascii="Times New Roman" w:hAnsi="Times New Roman"/>
+          <w:b/>
+          <w:sz w:val="26"/>
+        </w:rPr>
+        <w:t>Phase 7: Real-Time Telemetry &amp; Alert Testing</w:t>
+      </w:r>
+    </w:p>
+    <w:p>
+      <w:pPr>
+        <w:spacing w:after="120" w:line="360" w:lineRule="auto"/>
+        <w:jc w:val="both"/>
+      </w:pPr>
+      <w:r>
+        <w:rPr>
+          <w:rFonts w:ascii="Times New Roman" w:hAnsi="Times New Roman"/>
+        </w:rPr>
+        <w:t>The integrated system underwent rigorous testing. Simulated threat data was injected to verify the telemetry ingestion rate, the accuracy of the heuristic scoring, and the reliability of the automatic firewall IP quarantine and manual override controls.</w:t>
+      </w:r>
+    </w:p>
+    <w:p>
+      <w:pPr>
+        <w:spacing w:before="240" w:after="80"/>
+      </w:pPr>
+      <w:r>
+        <w:rPr>
+          <w:rFonts w:ascii="Times New Roman" w:hAnsi="Times New Roman"/>
+          <w:b/>
+          <w:sz w:val="26"/>
+        </w:rPr>
+        <w:t>Phase 8: Cloud Deployment</w:t>
+      </w:r>
+    </w:p>
+    <w:p>
+      <w:pPr>
+        <w:spacing w:after="120" w:line="360" w:lineRule="auto"/>
+        <w:jc w:val="both"/>
+      </w:pPr>
+      <w:r>
+        <w:rPr>
+          <w:rFonts w:ascii="Times New Roman" w:hAnsi="Times New Roman"/>
+        </w:rPr>
+        <w:t>The final phase involved preparing the application for production. The full-stack application was deployed to the Vercel Serverless platform. Environment variables were configured, and production OpenAPI documentation was generated and verified.</w:t>
+      </w:r>
+    </w:p>
+    <w:p>
+      <w:r>
+        <w:br w:type="page"/>
+      </w:r>
+    </w:p>
+    <w:p>
+      <w:pPr>
+        <w:spacing w:before="360" w:after="160"/>
+      </w:pPr>
+      <w:r>
+        <w:rPr>
+          <w:rFonts w:ascii="Times New Roman" w:hAnsi="Times New Roman"/>
+          <w:b/>
+          <w:sz w:val="32"/>
+        </w:rPr>
+        <w:t>Applications</w:t>
+      </w:r>
+    </w:p>
+    <w:p>
+      <w:pPr>
+        <w:spacing w:after="120" w:line="360" w:lineRule="auto"/>
+        <w:jc w:val="both"/>
+      </w:pPr>
+      <w:r>
+        <w:rPr>
+          <w:rFonts w:ascii="Times New Roman" w:hAnsi="Times New Roman"/>
+        </w:rPr>
+        <w:t>SentinelGPT is highly versatile, scalable, and can be deployed across various domain environments to enhance cybersecurity posture:</w:t>
+      </w:r>
+    </w:p>
+    <w:p>
+      <w:pPr>
+        <w:spacing w:after="120" w:line="360" w:lineRule="auto"/>
+        <w:jc w:val="both"/>
+      </w:pPr>
+      <w:r>
+        <w:rPr>
+          <w:rFonts w:ascii="Times New Roman" w:hAnsi="Times New Roman"/>
+          <w:b/>
+        </w:rPr>
+        <w:t xml:space="preserve">1. Enterprise SOC Operations: </w:t>
+      </w:r>
+      <w:r>
+        <w:rPr>
+          <w:rFonts w:ascii="Times New Roman" w:hAnsi="Times New Roman"/>
+        </w:rPr>
+        <w:t xml:space="preserve"> Provides continuous network perimeter monitoring, real-time threat triage, and automated response capabilities for dedicated security teams.</w:t>
+      </w:r>
+    </w:p>
+    <w:p>
+      <w:pPr>
+        <w:spacing w:after="120" w:line="360" w:lineRule="auto"/>
+        <w:jc w:val="both"/>
+      </w:pPr>
+      <w:r>
+        <w:rPr>
+          <w:rFonts w:ascii="Times New Roman" w:hAnsi="Times New Roman"/>
+          <w:b/>
+        </w:rPr>
+        <w:t xml:space="preserve">2. Financial Institutions: </w:t>
+      </w:r>
+      <w:r>
+        <w:rPr>
+          <w:rFonts w:ascii="Times New Roman" w:hAnsi="Times New Roman"/>
+        </w:rPr>
+        <w:t xml:space="preserve"> Protects online banking portals and transaction gateways against credential stuffing, brute-force attacks, and fraud attempts.</w:t>
+      </w:r>
+    </w:p>
+    <w:p>
+      <w:pPr>
+        <w:spacing w:after="120" w:line="360" w:lineRule="auto"/>
+        <w:jc w:val="both"/>
+      </w:pPr>
+      <w:r>
+        <w:rPr>
+          <w:rFonts w:ascii="Times New Roman" w:hAnsi="Times New Roman"/>
+          <w:b/>
+        </w:rPr>
+        <w:t xml:space="preserve">3. Cloud Service Providers: </w:t>
+      </w:r>
+      <w:r>
+        <w:rPr>
+          <w:rFonts w:ascii="Times New Roman" w:hAnsi="Times New Roman"/>
+        </w:rPr>
+        <w:t xml:space="preserve"> Safeguards serverless APIs, microservices, and cloud infrastructure from unauthorized probes and exploitation attempts.</w:t>
+      </w:r>
+    </w:p>
+    <w:p>
+      <w:pPr>
+        <w:spacing w:after="120" w:line="360" w:lineRule="auto"/>
+        <w:jc w:val="both"/>
+      </w:pPr>
+      <w:r>
+        <w:rPr>
+          <w:rFonts w:ascii="Times New Roman" w:hAnsi="Times New Roman"/>
+          <w:b/>
+        </w:rPr>
+        <w:t xml:space="preserve">4. Healthcare Networks: </w:t>
+      </w:r>
+      <w:r>
+        <w:rPr>
+          <w:rFonts w:ascii="Times New Roman" w:hAnsi="Times New Roman"/>
+        </w:rPr>
+        <w:t xml:space="preserve"> Secures critical patient data endpoints and hospital networks against ransomware and malware payload injection.</w:t>
+      </w:r>
+    </w:p>
+    <w:p>
+      <w:pPr>
+        <w:spacing w:after="120" w:line="360" w:lineRule="auto"/>
+        <w:jc w:val="both"/>
+      </w:pPr>
+      <w:r>
+        <w:rPr>
+          <w:rFonts w:ascii="Times New Roman" w:hAnsi="Times New Roman"/>
+          <w:b/>
+        </w:rPr>
+        <w:t xml:space="preserve">5. E-Commerce Platforms: </w:t>
+      </w:r>
+      <w:r>
+        <w:rPr>
+          <w:rFonts w:ascii="Times New Roman" w:hAnsi="Times New Roman"/>
+        </w:rPr>
+        <w:t xml:space="preserve"> Prevents Distributed Denial of Service (DDoS) disruption and unauthorized SQL injection attacks during high-traffic sales events.</w:t>
+      </w:r>
+    </w:p>
+    <w:p>
+      <w:pPr>
+        <w:spacing w:after="120" w:line="360" w:lineRule="auto"/>
+        <w:jc w:val="both"/>
+      </w:pPr>
+      <w:r>
+        <w:rPr>
+          <w:rFonts w:ascii="Times New Roman" w:hAnsi="Times New Roman"/>
+          <w:b/>
+        </w:rPr>
+        <w:t xml:space="preserve">6. Academic Institutions: </w:t>
+      </w:r>
+      <w:r>
+        <w:rPr>
+          <w:rFonts w:ascii="Times New Roman" w:hAnsi="Times New Roman"/>
+        </w:rPr>
+        <w:t xml:space="preserve"> Monitors vast university campus networks, preventing faculty and student account hijacking and unauthorized access to academic records.</w:t>
+      </w:r>
+    </w:p>
+    <w:p>
+      <w:r>
+        <w:br w:type="page"/>
+      </w:r>
+    </w:p>
+    <w:p>
+      <w:pPr>
+        <w:spacing w:before="360" w:after="160"/>
+      </w:pPr>
+      <w:r>
+        <w:rPr>
+          <w:rFonts w:ascii="Times New Roman" w:hAnsi="Times New Roman"/>
+          <w:b/>
+          <w:sz w:val="32"/>
+        </w:rPr>
+        <w:t>User Interface Screenshots</w:t>
+      </w:r>
+    </w:p>
+    <w:p>
+      <w:pPr>
+        <w:spacing w:before="200" w:after="240"/>
+        <w:jc w:val="center"/>
+      </w:pPr>
+      <w:r>
+        <w:drawing>
+          <wp:inline xmlns:a="http://schemas.openxmlformats.org/drawingml/2006/main" xmlns:pic="http://schemas.openxmlformats.org/drawingml/2006/picture">
+            <wp:extent cx="5486400" cy="2606040"/>
+            <wp:docPr id="3" name="Picture 3"/>
             <wp:cNvGraphicFramePr>
               <a:graphicFrameLocks noChangeAspect="1"/>
             </wp:cNvGraphicFramePr>
@@ -360,7 +1639,7 @@
                     <pic:cNvPicPr/>
                   </pic:nvPicPr>
                   <pic:blipFill>
-                    <a:blip r:embed="rId9"/>
+                    <a:blip r:embed="rId11"/>
                     <a:stretch>
                       <a:fillRect/>
                     </a:stretch>
@@ -368,7 +1647,7 @@
                   <pic:spPr>
                     <a:xfrm>
                       <a:off x="0" y="0"/>
-                      <a:ext cx="5669280" cy="2692908"/>
+                      <a:ext cx="5486400" cy="2606040"/>
                     </a:xfrm>
                     <a:prstGeom prst="rect"/>
                   </pic:spPr>
@@ -381,173 +1660,19 @@
     </w:p>
     <w:p>
       <w:pPr>
-        <w:spacing w:after="280"/>
-        <w:jc w:val="center"/>
+        <w:spacing w:after="120" w:line="360" w:lineRule="auto"/>
+        <w:jc w:val="both"/>
       </w:pPr>
       <w:r>
         <w:rPr>
-          <w:i/>
-          <w:color w:val="666666"/>
-          <w:sz w:val="19"/>
+          <w:rFonts w:ascii="Times New Roman" w:hAnsi="Times New Roman"/>
         </w:rPr>
-        <w:t>Figure: SentinelGPT Real-time SOC Operations Dashboard Interface</w:t>
+        <w:t>Figure 1: SentinelGPT Real-Time SOC Dashboard &amp; Telemetry Feed</w:t>
       </w:r>
     </w:p>
     <w:p>
       <w:pPr>
-        <w:spacing w:before="360" w:after="120"/>
-      </w:pPr>
-      <w:r>
-        <w:rPr>
-          <w:rFonts w:ascii="Calibri" w:hAnsi="Calibri"/>
-          <w:b/>
-          <w:color w:val="003366"/>
-          <w:sz w:val="36"/>
-        </w:rPr>
-        <w:t>4. Authentication &amp; Operator Onboarding</w:t>
-      </w:r>
-    </w:p>
-    <w:p>
-      <w:pPr>
-        <w:spacing w:after="120" w:line="276" w:lineRule="auto"/>
-      </w:pPr>
-      <w:r>
-        <w:t>SentinelGPT incorporates a cyberpunk-themed authentication interface offering multi-role login, operator registration with organizational profile setup, and a 1-click Quick Demo Access bypass for rapid evaluation.</w:t>
-      </w:r>
-    </w:p>
-    <w:p>
-      <w:pPr>
-        <w:spacing w:before="240" w:after="80"/>
-        <w:jc w:val="center"/>
-      </w:pPr>
-      <w:r>
-        <w:drawing>
-          <wp:inline xmlns:a="http://schemas.openxmlformats.org/drawingml/2006/main" xmlns:pic="http://schemas.openxmlformats.org/drawingml/2006/picture">
-            <wp:extent cx="5303520" cy="2519172"/>
-            <wp:docPr id="2" name="Picture 2"/>
-            <wp:cNvGraphicFramePr>
-              <a:graphicFrameLocks noChangeAspect="1"/>
-            </wp:cNvGraphicFramePr>
-            <a:graphic>
-              <a:graphicData uri="http://schemas.openxmlformats.org/drawingml/2006/picture">
-                <pic:pic>
-                  <pic:nvPicPr>
-                    <pic:cNvPr id="0" name="login_page.png"/>
-                    <pic:cNvPicPr/>
-                  </pic:nvPicPr>
-                  <pic:blipFill>
-                    <a:blip r:embed="rId10"/>
-                    <a:stretch>
-                      <a:fillRect/>
-                    </a:stretch>
-                  </pic:blipFill>
-                  <pic:spPr>
-                    <a:xfrm>
-                      <a:off x="0" y="0"/>
-                      <a:ext cx="5303520" cy="2519172"/>
-                    </a:xfrm>
-                    <a:prstGeom prst="rect"/>
-                  </pic:spPr>
-                </pic:pic>
-              </a:graphicData>
-            </a:graphic>
-          </wp:inline>
-        </w:drawing>
-      </w:r>
-    </w:p>
-    <w:p>
-      <w:pPr>
-        <w:spacing w:after="280"/>
-        <w:jc w:val="center"/>
-      </w:pPr>
-      <w:r>
-        <w:rPr>
-          <w:i/>
-          <w:color w:val="666666"/>
-          <w:sz w:val="19"/>
-        </w:rPr>
-        <w:t>Figure: Cyberpunk Security Operator Login Interface with Quick Demo Access</w:t>
-      </w:r>
-    </w:p>
-    <w:p>
-      <w:pPr>
-        <w:spacing w:before="240" w:after="80"/>
-        <w:jc w:val="center"/>
-      </w:pPr>
-      <w:r>
-        <w:drawing>
-          <wp:inline xmlns:a="http://schemas.openxmlformats.org/drawingml/2006/main" xmlns:pic="http://schemas.openxmlformats.org/drawingml/2006/picture">
-            <wp:extent cx="5303520" cy="2519172"/>
-            <wp:docPr id="3" name="Picture 3"/>
-            <wp:cNvGraphicFramePr>
-              <a:graphicFrameLocks noChangeAspect="1"/>
-            </wp:cNvGraphicFramePr>
-            <a:graphic>
-              <a:graphicData uri="http://schemas.openxmlformats.org/drawingml/2006/picture">
-                <pic:pic>
-                  <pic:nvPicPr>
-                    <pic:cNvPr id="0" name="registration_page.png"/>
-                    <pic:cNvPicPr/>
-                  </pic:nvPicPr>
-                  <pic:blipFill>
-                    <a:blip r:embed="rId11"/>
-                    <a:stretch>
-                      <a:fillRect/>
-                    </a:stretch>
-                  </pic:blipFill>
-                  <pic:spPr>
-                    <a:xfrm>
-                      <a:off x="0" y="0"/>
-                      <a:ext cx="5303520" cy="2519172"/>
-                    </a:xfrm>
-                    <a:prstGeom prst="rect"/>
-                  </pic:spPr>
-                </pic:pic>
-              </a:graphicData>
-            </a:graphic>
-          </wp:inline>
-        </w:drawing>
-      </w:r>
-    </w:p>
-    <w:p>
-      <w:pPr>
-        <w:spacing w:after="280"/>
-        <w:jc w:val="center"/>
-      </w:pPr>
-      <w:r>
-        <w:rPr>
-          <w:i/>
-          <w:color w:val="666666"/>
-          <w:sz w:val="19"/>
-        </w:rPr>
-        <w:t>Figure: Operator Registration &amp; Organization Setup Portal</w:t>
-      </w:r>
-    </w:p>
-    <w:p>
-      <w:pPr>
-        <w:spacing w:before="360" w:after="120"/>
-      </w:pPr>
-      <w:r>
-        <w:rPr>
-          <w:rFonts w:ascii="Calibri" w:hAnsi="Calibri"/>
-          <w:b/>
-          <w:color w:val="003366"/>
-          <w:sz w:val="36"/>
-        </w:rPr>
-        <w:t>5. Conversational AI Assistant &amp; Payload Scanner</w:t>
-      </w:r>
-    </w:p>
-    <w:p>
-      <w:pPr>
-        <w:spacing w:after="120" w:line="276" w:lineRule="auto"/>
-      </w:pPr>
-      <w:r>
-        <w:t>To accelerate incident triage, SentinelGPT integrates a conversational AI security assistant trained on threat signatures and MITRE ATT&amp;CK techniques, alongside a static payload scanner for analyzing suspicious log files and executables.</w:t>
-      </w:r>
-    </w:p>
-    <w:p>
-      <w:pPr>
-        <w:spacing w:before="240" w:after="80"/>
+        <w:spacing w:before="200" w:after="240"/>
         <w:jc w:val="center"/>
       </w:pPr>
       <w:r>
@@ -562,7 +1687,7 @@
               <a:graphicData uri="http://schemas.openxmlformats.org/drawingml/2006/picture">
                 <pic:pic>
                   <pic:nvPicPr>
-                    <pic:cNvPr id="0" name="ai_chat.png"/>
+                    <pic:cNvPr id="0" name="login_page.png"/>
                     <pic:cNvPicPr/>
                   </pic:nvPicPr>
                   <pic:blipFill>
@@ -587,21 +1712,24 @@
     </w:p>
     <w:p>
       <w:pPr>
-        <w:spacing w:after="280"/>
-        <w:jc w:val="center"/>
+        <w:spacing w:after="120" w:line="360" w:lineRule="auto"/>
+        <w:jc w:val="both"/>
       </w:pPr>
       <w:r>
         <w:rPr>
-          <w:i/>
-          <w:color w:val="666666"/>
-          <w:sz w:val="19"/>
+          <w:rFonts w:ascii="Times New Roman" w:hAnsi="Times New Roman"/>
         </w:rPr>
-        <w:t>Figure: Conversational AI Threat Triage Assistant Interface</w:t>
+        <w:t>Figure 2: Operator Authentication Portal with Quick Demo Access</w:t>
+      </w:r>
+    </w:p>
+    <w:p>
+      <w:r>
+        <w:br w:type="page"/>
       </w:r>
     </w:p>
     <w:p>
       <w:pPr>
-        <w:spacing w:before="240" w:after="80"/>
+        <w:spacing w:before="200" w:after="240"/>
         <w:jc w:val="center"/>
       </w:pPr>
       <w:r>
@@ -616,7 +1744,7 @@
               <a:graphicData uri="http://schemas.openxmlformats.org/drawingml/2006/picture">
                 <pic:pic>
                   <pic:nvPicPr>
-                    <pic:cNvPr id="0" name="file_scanner.png"/>
+                    <pic:cNvPr id="0" name="ai_chat.png"/>
                     <pic:cNvPicPr/>
                   </pic:nvPicPr>
                   <pic:blipFill>
@@ -641,309 +1769,243 @@
     </w:p>
     <w:p>
       <w:pPr>
-        <w:spacing w:after="280"/>
-        <w:jc w:val="center"/>
+        <w:spacing w:after="120" w:line="360" w:lineRule="auto"/>
+        <w:jc w:val="both"/>
       </w:pPr>
       <w:r>
         <w:rPr>
-          <w:i/>
-          <w:color w:val="666666"/>
-          <w:sz w:val="19"/>
+          <w:rFonts w:ascii="Times New Roman" w:hAnsi="Times New Roman"/>
         </w:rPr>
-        <w:t>Figure: Heuristic Payload &amp; Static Log File Scanner</w:t>
+        <w:t>Figure 3: Conversational AI Threat Triage Assistant Interface</w:t>
       </w:r>
     </w:p>
     <w:p>
       <w:pPr>
-        <w:spacing w:before="360" w:after="120"/>
+        <w:spacing w:before="200" w:after="240"/>
+        <w:jc w:val="center"/>
       </w:pPr>
       <w:r>
-        <w:rPr>
-          <w:rFonts w:ascii="Calibri" w:hAnsi="Calibri"/>
-          <w:b/>
-          <w:color w:val="003366"/>
-          <w:sz w:val="36"/>
-        </w:rPr>
-        <w:t>6. API Endpoints &amp; Live Deployment</w:t>
+        <w:drawing>
+          <wp:inline xmlns:a="http://schemas.openxmlformats.org/drawingml/2006/main" xmlns:pic="http://schemas.openxmlformats.org/drawingml/2006/picture">
+            <wp:extent cx="5303520" cy="2519172"/>
+            <wp:docPr id="6" name="Picture 6"/>
+            <wp:cNvGraphicFramePr>
+              <a:graphicFrameLocks noChangeAspect="1"/>
+            </wp:cNvGraphicFramePr>
+            <a:graphic>
+              <a:graphicData uri="http://schemas.openxmlformats.org/drawingml/2006/picture">
+                <pic:pic>
+                  <pic:nvPicPr>
+                    <pic:cNvPr id="0" name="file_scanner.png"/>
+                    <pic:cNvPicPr/>
+                  </pic:nvPicPr>
+                  <pic:blipFill>
+                    <a:blip r:embed="rId14"/>
+                    <a:stretch>
+                      <a:fillRect/>
+                    </a:stretch>
+                  </pic:blipFill>
+                  <pic:spPr>
+                    <a:xfrm>
+                      <a:off x="0" y="0"/>
+                      <a:ext cx="5303520" cy="2519172"/>
+                    </a:xfrm>
+                    <a:prstGeom prst="rect"/>
+                  </pic:spPr>
+                </pic:pic>
+              </a:graphicData>
+            </a:graphic>
+          </wp:inline>
+        </w:drawing>
       </w:r>
     </w:p>
     <w:p>
       <w:pPr>
-        <w:spacing w:after="120" w:line="276" w:lineRule="auto"/>
-      </w:pPr>
-      <w:r>
-        <w:t>The backend exposes standard REST endpoints for telemetry queries, incident history export, and automated IP quarantine control:</w:t>
-      </w:r>
-    </w:p>
-    <w:tbl>
-      <w:tblPr>
-        <w:tblW w:type="auto" w:w="0"/>
-        <w:jc w:val="center"/>
-        <w:tblLook w:firstColumn="1" w:firstRow="1" w:lastColumn="0" w:lastRow="0" w:noHBand="0" w:noVBand="1" w:val="04A0"/>
-      </w:tblPr>
-      <w:tblGrid>
-        <w:gridCol w:w="3120"/>
-        <w:gridCol w:w="3120"/>
-        <w:gridCol w:w="3120"/>
-      </w:tblGrid>
-      <w:tr>
-        <w:tc>
-          <w:tcPr>
-            <w:tcW w:type="dxa" w:w="3120"/>
-          </w:tcPr>
-          <w:p>
-            <w:r>
-              <w:rPr>
-                <w:b/>
-              </w:rPr>
-              <w:t>Endpoint</w:t>
-            </w:r>
-          </w:p>
-        </w:tc>
-        <w:tc>
-          <w:tcPr>
-            <w:tcW w:type="dxa" w:w="3120"/>
-          </w:tcPr>
-          <w:p>
-            <w:r>
-              <w:rPr>
-                <w:b/>
-              </w:rPr>
-              <w:t>HTTP Method</w:t>
-            </w:r>
-          </w:p>
-        </w:tc>
-        <w:tc>
-          <w:tcPr>
-            <w:tcW w:type="dxa" w:w="3120"/>
-          </w:tcPr>
-          <w:p>
-            <w:r>
-              <w:rPr>
-                <w:b/>
-              </w:rPr>
-              <w:t>Functionality</w:t>
-            </w:r>
-          </w:p>
-        </w:tc>
-      </w:tr>
-      <w:tr>
-        <w:tc>
-          <w:tcPr>
-            <w:tcW w:type="dxa" w:w="3120"/>
-          </w:tcPr>
-          <w:p>
-            <w:r>
-              <w:t>/api/login</w:t>
-            </w:r>
-          </w:p>
-        </w:tc>
-        <w:tc>
-          <w:tcPr>
-            <w:tcW w:type="dxa" w:w="3120"/>
-          </w:tcPr>
-          <w:p>
-            <w:r>
-              <w:t>POST</w:t>
-            </w:r>
-          </w:p>
-        </w:tc>
-        <w:tc>
-          <w:tcPr>
-            <w:tcW w:type="dxa" w:w="3120"/>
-          </w:tcPr>
-          <w:p>
-            <w:r>
-              <w:t>Authenticates operator, returns JWT token</w:t>
-            </w:r>
-          </w:p>
-        </w:tc>
-      </w:tr>
-      <w:tr>
-        <w:tc>
-          <w:tcPr>
-            <w:tcW w:type="dxa" w:w="3120"/>
-          </w:tcPr>
-          <w:p>
-            <w:r>
-              <w:t>/api/snapshot</w:t>
-            </w:r>
-          </w:p>
-        </w:tc>
-        <w:tc>
-          <w:tcPr>
-            <w:tcW w:type="dxa" w:w="3120"/>
-          </w:tcPr>
-          <w:p>
-            <w:r>
-              <w:t>GET</w:t>
-            </w:r>
-          </w:p>
-        </w:tc>
-        <w:tc>
-          <w:tcPr>
-            <w:tcW w:type="dxa" w:w="3120"/>
-          </w:tcPr>
-          <w:p>
-            <w:r>
-              <w:t>Retrieves telemetry snapshot, logs &amp; quarantine list</w:t>
-            </w:r>
-          </w:p>
-        </w:tc>
-      </w:tr>
-      <w:tr>
-        <w:tc>
-          <w:tcPr>
-            <w:tcW w:type="dxa" w:w="3120"/>
-          </w:tcPr>
-          <w:p>
-            <w:r>
-              <w:t>/api/block_ip</w:t>
-            </w:r>
-          </w:p>
-        </w:tc>
-        <w:tc>
-          <w:tcPr>
-            <w:tcW w:type="dxa" w:w="3120"/>
-          </w:tcPr>
-          <w:p>
-            <w:r>
-              <w:t>POST</w:t>
-            </w:r>
-          </w:p>
-        </w:tc>
-        <w:tc>
-          <w:tcPr>
-            <w:tcW w:type="dxa" w:w="3120"/>
-          </w:tcPr>
-          <w:p>
-            <w:r>
-              <w:t>Adds target IP address to active firewall quarantine</w:t>
-            </w:r>
-          </w:p>
-        </w:tc>
-      </w:tr>
-      <w:tr>
-        <w:tc>
-          <w:tcPr>
-            <w:tcW w:type="dxa" w:w="3120"/>
-          </w:tcPr>
-          <w:p>
-            <w:r>
-              <w:t>/api/unblock_ip</w:t>
-            </w:r>
-          </w:p>
-        </w:tc>
-        <w:tc>
-          <w:tcPr>
-            <w:tcW w:type="dxa" w:w="3120"/>
-          </w:tcPr>
-          <w:p>
-            <w:r>
-              <w:t>POST</w:t>
-            </w:r>
-          </w:p>
-        </w:tc>
-        <w:tc>
-          <w:tcPr>
-            <w:tcW w:type="dxa" w:w="3120"/>
-          </w:tcPr>
-          <w:p>
-            <w:r>
-              <w:t>Revokes quarantine for target IP address</w:t>
-            </w:r>
-          </w:p>
-        </w:tc>
-      </w:tr>
-      <w:tr>
-        <w:tc>
-          <w:tcPr>
-            <w:tcW w:type="dxa" w:w="3120"/>
-          </w:tcPr>
-          <w:p>
-            <w:r>
-              <w:t>/health</w:t>
-            </w:r>
-          </w:p>
-        </w:tc>
-        <w:tc>
-          <w:tcPr>
-            <w:tcW w:type="dxa" w:w="3120"/>
-          </w:tcPr>
-          <w:p>
-            <w:r>
-              <w:t>GET</w:t>
-            </w:r>
-          </w:p>
-        </w:tc>
-        <w:tc>
-          <w:tcPr>
-            <w:tcW w:type="dxa" w:w="3120"/>
-          </w:tcPr>
-          <w:p>
-            <w:r>
-              <w:t>Returns live serverless system health status</w:t>
-            </w:r>
-          </w:p>
-        </w:tc>
-      </w:tr>
-    </w:tbl>
-    <w:p>
-      <w:pPr>
-        <w:spacing w:before="280" w:after="80"/>
+        <w:spacing w:after="120" w:line="360" w:lineRule="auto"/>
+        <w:jc w:val="both"/>
       </w:pPr>
       <w:r>
         <w:rPr>
-          <w:rFonts w:ascii="Calibri" w:hAnsi="Calibri"/>
-          <w:b/>
-          <w:color w:val="006699"/>
-          <w:sz w:val="28"/>
+          <w:rFonts w:ascii="Times New Roman" w:hAnsi="Times New Roman"/>
         </w:rPr>
-        <w:t>Live Deployment Details:</w:t>
+        <w:t>Figure 4: Heuristic Payload File &amp; Log Scanner Interface</w:t>
+      </w:r>
+    </w:p>
+    <w:p>
+      <w:r>
+        <w:br w:type="page"/>
       </w:r>
     </w:p>
     <w:p>
       <w:pPr>
-        <w:spacing w:after="120" w:line="276" w:lineRule="auto"/>
+        <w:spacing w:before="360" w:after="160"/>
       </w:pPr>
       <w:r>
         <w:rPr>
+          <w:rFonts w:ascii="Times New Roman" w:hAnsi="Times New Roman"/>
           <w:b/>
-          <w:color w:val="003366"/>
+          <w:sz w:val="32"/>
         </w:rPr>
-        <w:t xml:space="preserve">• Production Web App: </w:t>
+        <w:t>Conclusion</w:t>
+      </w:r>
+    </w:p>
+    <w:p>
+      <w:pPr>
+        <w:spacing w:after="120" w:line="360" w:lineRule="auto"/>
+        <w:jc w:val="both"/>
+      </w:pPr>
+      <w:r>
+        <w:rPr>
+          <w:rFonts w:ascii="Times New Roman" w:hAnsi="Times New Roman"/>
+        </w:rPr>
+        <w:t>The SentinelGPT AI-Powered Cyber Defense Framework provides an efficient, intelligent, and scalable solution for modern cybersecurity operations. By replacing manual log review with autonomous software agents, the system drastically reduces alert fatigue, minimizes incident response latency, and ensures continuous network perimeter protection. Built using robust technologies including React 19, FastAPI, and SQLAlchemy, the platform demonstrates an effective and modern paradigm for automated cyber defense.</w:t>
+      </w:r>
+    </w:p>
+    <w:p>
+      <w:pPr>
+        <w:spacing w:before="360" w:after="160"/>
+      </w:pPr>
+      <w:r>
+        <w:rPr>
+          <w:rFonts w:ascii="Times New Roman" w:hAnsi="Times New Roman"/>
+          <w:b/>
+          <w:sz w:val="32"/>
+        </w:rPr>
+        <w:t>References</w:t>
+      </w:r>
+    </w:p>
+    <w:p>
+      <w:pPr>
+        <w:spacing w:after="120" w:line="360" w:lineRule="auto"/>
+        <w:jc w:val="both"/>
+      </w:pPr>
+      <w:r>
+        <w:rPr>
+          <w:rFonts w:ascii="Times New Roman" w:hAnsi="Times New Roman"/>
+        </w:rPr>
+        <w:t>1. FastAPI Documentation. FastAPI Framework. Available at: https://fastapi.tiangolo.com/</w:t>
+      </w:r>
+    </w:p>
+    <w:p>
+      <w:pPr>
+        <w:spacing w:after="120" w:line="360" w:lineRule="auto"/>
+        <w:jc w:val="both"/>
+      </w:pPr>
+      <w:r>
+        <w:rPr>
+          <w:rFonts w:ascii="Times New Roman" w:hAnsi="Times New Roman"/>
+        </w:rPr>
+        <w:t>2. React Documentation. React 19 User Interface Library. Available at: https://react.dev/</w:t>
+      </w:r>
+    </w:p>
+    <w:p>
+      <w:pPr>
+        <w:spacing w:after="120" w:line="360" w:lineRule="auto"/>
+        <w:jc w:val="both"/>
+      </w:pPr>
+      <w:r>
+        <w:rPr>
+          <w:rFonts w:ascii="Times New Roman" w:hAnsi="Times New Roman"/>
+        </w:rPr>
+        <w:t>3. MITRE ATT&amp;CK Framework. Enterprise Tactics &amp; Techniques. Available at: https://attack.mitre.org/</w:t>
+      </w:r>
+    </w:p>
+    <w:p>
+      <w:pPr>
+        <w:spacing w:after="120" w:line="360" w:lineRule="auto"/>
+        <w:jc w:val="both"/>
+      </w:pPr>
+      <w:r>
+        <w:rPr>
+          <w:rFonts w:ascii="Times New Roman" w:hAnsi="Times New Roman"/>
+        </w:rPr>
+        <w:t>4. SQLAlchemy Documentation. Object Relational Mapper for Python. Available at: https://docs.sqlalchemy.org/</w:t>
+      </w:r>
+    </w:p>
+    <w:p>
+      <w:pPr>
+        <w:spacing w:after="120" w:line="360" w:lineRule="auto"/>
+        <w:jc w:val="both"/>
+      </w:pPr>
+      <w:r>
+        <w:rPr>
+          <w:rFonts w:ascii="Times New Roman" w:hAnsi="Times New Roman"/>
+        </w:rPr>
+        <w:t>5. Vercel Serverless Documentation. Deploying Web Applications. Available at: https://vercel.com/docs</w:t>
+      </w:r>
+    </w:p>
+    <w:p>
+      <w:pPr>
+        <w:spacing w:after="120" w:line="360" w:lineRule="auto"/>
+        <w:jc w:val="both"/>
+      </w:pPr>
+      <w:r>
+        <w:rPr>
+          <w:rFonts w:ascii="Times New Roman" w:hAnsi="Times New Roman"/>
+        </w:rPr>
+        <w:t>6. Russell, S., &amp; Norvig, P. (2021). Artificial Intelligence: A Modern Approach (4th ed.). Pearson.</w:t>
+      </w:r>
+    </w:p>
+    <w:p>
+      <w:pPr>
+        <w:spacing w:before="360" w:after="160"/>
+      </w:pPr>
+      <w:r>
+        <w:rPr>
+          <w:rFonts w:ascii="Times New Roman" w:hAnsi="Times New Roman"/>
+          <w:b/>
+          <w:sz w:val="32"/>
+        </w:rPr>
+        <w:t>Live Website &amp; GitHub Links</w:t>
+      </w:r>
+    </w:p>
+    <w:p>
+      <w:pPr>
+        <w:spacing w:after="120" w:line="360" w:lineRule="auto"/>
+        <w:jc w:val="both"/>
+      </w:pPr>
+      <w:r>
+        <w:rPr>
+          <w:rFonts w:ascii="Times New Roman" w:hAnsi="Times New Roman"/>
+        </w:rPr>
+        <w:t>The SentinelGPT project is fully cloud-deployed and accessible online. Evaluators can access the live working dashboard, API documentation, and complete source code using the links below:</w:t>
+      </w:r>
+    </w:p>
+    <w:p>
+      <w:pPr>
+        <w:spacing w:after="120" w:line="360" w:lineRule="auto"/>
+        <w:jc w:val="both"/>
+      </w:pPr>
+      <w:r>
+        <w:rPr>
+          <w:rFonts w:ascii="Times New Roman" w:hAnsi="Times New Roman"/>
+          <w:b/>
+        </w:rPr>
+        <w:t xml:space="preserve">• Single Live Dashboard Deployment Link: </w:t>
       </w:r>
       <w:r>
+        <w:rPr>
+          <w:rFonts w:ascii="Times New Roman" w:hAnsi="Times New Roman"/>
+        </w:rPr>
         <w:t>https://sentinelgpt-ai.vercel.app</w:t>
       </w:r>
     </w:p>
     <w:p>
       <w:pPr>
-        <w:spacing w:after="120" w:line="276" w:lineRule="auto"/>
+        <w:spacing w:after="120" w:line="360" w:lineRule="auto"/>
+        <w:jc w:val="both"/>
       </w:pPr>
       <w:r>
         <w:rPr>
+          <w:rFonts w:ascii="Times New Roman" w:hAnsi="Times New Roman"/>
           <w:b/>
-          <w:color w:val="003366"/>
         </w:rPr>
-        <w:t xml:space="preserve">• Interactive Swagger API Docs: </w:t>
+        <w:t xml:space="preserve">• Official Project GitHub Repository: </w:t>
       </w:r>
       <w:r>
-        <w:t>https://sentinelgpt-ai.vercel.app/docs</w:t>
-      </w:r>
-    </w:p>
-    <w:p>
-      <w:pPr>
-        <w:spacing w:after="120" w:line="276" w:lineRule="auto"/>
-      </w:pPr>
-      <w:r>
         <w:rPr>
-          <w:b/>
-          <w:color w:val="003366"/>
+          <w:rFonts w:ascii="Times New Roman" w:hAnsi="Times New Roman"/>
         </w:rPr>
-        <w:t xml:space="preserve">• GitHub Repository: </w:t>
-      </w:r>
-      <w:r>
         <w:t>https://github.com/Pravallika2025/sentigraud-ai-.git</w:t>
       </w:r>
     </w:p>
@@ -1321,9 +2383,9 @@
     <w:qFormat/>
     <w:rsid w:val="00FC693F"/>
     <w:rPr>
-      <w:rFonts w:ascii="Calibri" w:hAnsi="Calibri"/>
-      <w:color w:val="333333"/>
-      <w:sz w:val="22"/>
+      <w:rFonts w:ascii="Times New Roman" w:hAnsi="Times New Roman"/>
+      <w:color w:val="000000"/>
+      <w:sz w:val="24"/>
     </w:rPr>
   </w:style>
   <w:style w:type="paragraph" w:styleId="Header">

</xml_diff>

<commit_message>
Compact professional Word report: tight spacing, 2-col screenshots, no wasted whitespace
</commit_message>
<xml_diff>
--- a/docs/SentinelGPT_Project_Report.docx
+++ b/docs/SentinelGPT_Project_Report.docx
@@ -4,28 +4,58 @@
   <w:body>
     <w:p>
       <w:pPr>
-        <w:spacing w:before="2400" w:after="400"/>
+        <w:spacing w:before="1200" w:after="320"/>
         <w:jc w:val="center"/>
       </w:pPr>
       <w:r>
         <w:rPr>
           <w:rFonts w:ascii="Times New Roman" w:hAnsi="Times New Roman"/>
           <w:b/>
-          <w:sz w:val="48"/>
+          <w:sz w:val="40"/>
         </w:rPr>
-        <w:t>SentinelGPT: An AI-Powered Large Language Model Framework for Advanced Cyber Threat Detection and Analysis</w:t>
+        <w:t>SentinelGPT: An AI-Powered Large Language Model</w:t>
+        <w:br/>
+        <w:t>Framework for Advanced Cyber Threat Detection</w:t>
+        <w:br/>
+        <w:t>and Analysis</w:t>
       </w:r>
     </w:p>
     <w:p>
       <w:pPr>
-        <w:spacing w:before="2800" w:line="360" w:lineRule="auto"/>
-        <w:jc w:val="right"/>
+        <w:spacing w:after="2000"/>
+        <w:jc w:val="center"/>
       </w:pPr>
       <w:r>
         <w:rPr>
           <w:rFonts w:ascii="Times New Roman" w:hAnsi="Times New Roman"/>
+          <w:sz w:val="26"/>
+        </w:rPr>
+        <w:t>A Project Report Submitted for the Partial Fulfillment</w:t>
+        <w:br/>
+        <w:t>of the Requirements for the Award of the Degree of</w:t>
+        <w:br/>
+        <w:t>Master of Computer Applications (MCA)</w:t>
+      </w:r>
+    </w:p>
+    <w:p>
+      <w:pPr>
+        <w:spacing w:after="80"/>
+        <w:jc w:val="center"/>
+      </w:pPr>
+      <w:r>
+        <w:rPr>
+          <w:rFonts w:ascii="Times New Roman" w:hAnsi="Times New Roman"/>
+          <w:b w:val="0"/>
+          <w:sz w:val="24"/>
+        </w:rPr>
+        <w:t>Submitted by</w:t>
+        <w:br/>
+      </w:r>
+      <w:r>
+        <w:rPr>
+          <w:rFonts w:ascii="Times New Roman" w:hAnsi="Times New Roman"/>
           <w:b/>
-          <w:sz w:val="28"/>
+          <w:sz w:val="30"/>
         </w:rPr>
         <w:t>Pravallika Kalangi</w:t>
         <w:br/>
@@ -33,18 +63,19 @@
       <w:r>
         <w:rPr>
           <w:rFonts w:ascii="Times New Roman" w:hAnsi="Times New Roman"/>
-          <w:sz w:val="28"/>
+          <w:b w:val="0"/>
+          <w:sz w:val="26"/>
         </w:rPr>
-        <w:t>24VV1F0044</w:t>
+        <w:t>Roll No: 24VV1F0044</w:t>
         <w:br/>
       </w:r>
       <w:r>
         <w:rPr>
           <w:rFonts w:ascii="Times New Roman" w:hAnsi="Times New Roman"/>
-          <w:sz w:val="28"/>
+          <w:b w:val="0"/>
+          <w:sz w:val="26"/>
         </w:rPr>
-        <w:t>MCA 2nd year</w:t>
-        <w:br/>
+        <w:t>MCA 2nd Year</w:t>
       </w:r>
     </w:p>
     <w:p>
@@ -54,97 +85,76 @@
     </w:p>
     <w:p>
       <w:pPr>
-        <w:spacing w:before="360" w:after="160"/>
+        <w:keepNext/>
+        <w:spacing w:before="200" w:after="80"/>
       </w:pPr>
       <w:r>
         <w:rPr>
           <w:rFonts w:ascii="Times New Roman" w:hAnsi="Times New Roman"/>
           <w:b/>
-          <w:sz w:val="32"/>
+          <w:color w:val="003366"/>
+          <w:sz w:val="28"/>
         </w:rPr>
-        <w:t>Problem statement</w:t>
+        <w:t>1.  Problem Statement</w:t>
       </w:r>
     </w:p>
     <w:p>
       <w:pPr>
-        <w:spacing w:after="120" w:line="360" w:lineRule="auto"/>
+        <w:spacing w:before="0" w:after="80" w:line="276" w:lineRule="auto"/>
         <w:jc w:val="both"/>
       </w:pPr>
       <w:r>
         <w:rPr>
           <w:rFonts w:ascii="Times New Roman" w:hAnsi="Times New Roman"/>
+          <w:sz w:val="22"/>
         </w:rPr>
-        <w:t>Modern cybersecurity operations face severe challenges in managing the overwhelming volume of network telemetry and security alerts generated by enterprise IT infrastructure. Every day, security information and event management (SIEM) systems process millions of event logs, network probes, and API requests across complex cloud environments. In many organizations, security operations centers (SOC) still rely heavily on manual log inspection, static firewall rules, and fragmented monitoring tools. This traditional approach creates significant operational bottlenecks, leads to severe analyst alert fatigue, and drastically increases incident response time, allowing malicious cyber threats to propagate unchecked.</w:t>
+        <w:t>Modern cybersecurity operations face severe challenges managing the overwhelming volume of network telemetry and security alerts generated by enterprise IT infrastructure. Security information and event management (SIEM) systems process millions of event logs, network probes, and API requests daily. Many organizations still rely on manual log inspection, static firewall rules, and fragmented monitoring tools — creating operational bottlenecks, analyst alert fatigue, and dangerously slow incident response times.</w:t>
       </w:r>
     </w:p>
     <w:p>
       <w:pPr>
-        <w:spacing w:after="120" w:line="360" w:lineRule="auto"/>
+        <w:spacing w:before="0" w:after="80" w:line="276" w:lineRule="auto"/>
         <w:jc w:val="both"/>
       </w:pPr>
       <w:r>
         <w:rPr>
           <w:rFonts w:ascii="Times New Roman" w:hAnsi="Times New Roman"/>
+          <w:sz w:val="22"/>
         </w:rPr>
-        <w:t>One of the major challenges in contemporary cyber defense is identifying sophisticated multi-stage attacks such as credential stuffing, distributed denial of service (DDoS) vectors, SQL injection payloads, and brute-force authentication spikes. Traditional rule-based intrusion detection systems often generate high rates of false positives while failing to correlate anomalous network behavior with recognized attack frameworks like MITRE ATT&amp;CK. Furthermore, when a critical threat is detected, manual quarantine procedures require administrators to manually update firewall rules and isolate compromised IP addresses, a delayed process that exposes internal networks to lateral movement and unauthorized data exfiltration.</w:t>
+        <w:t>A key challenge is identifying sophisticated multi-stage attacks such as credential stuffing, DDoS vectors, SQL injection payloads, and brute-force authentication spikes. Traditional rule-based intrusion detection systems generate high false-positive rates while failing to correlate anomalous behavior with the MITRE ATT&amp;CK framework. Manual quarantine procedures further delay response, exposing networks to lateral movement and data exfiltration.</w:t>
       </w:r>
     </w:p>
     <w:p>
       <w:pPr>
-        <w:spacing w:after="120" w:line="360" w:lineRule="auto"/>
+        <w:spacing w:before="0" w:after="80" w:line="276" w:lineRule="auto"/>
         <w:jc w:val="both"/>
       </w:pPr>
       <w:r>
         <w:rPr>
           <w:rFonts w:ascii="Times New Roman" w:hAnsi="Times New Roman"/>
+          <w:sz w:val="22"/>
         </w:rPr>
-        <w:t>Existing security dashboards also lack transparent decision-making explanations, intelligent payload analysis, and real-time visualization capabilities. Security operators are frequently left without instant remediation guidance, making it difficult to understand why a specific threat score was assigned or what immediate countermeasures should be executed.</w:t>
+        <w:t>To address these challenges, this project proposes SentinelGPT: an AI-Powered LLM Framework for Advanced Cyber Threat Detection and Analysis. It uses intelligent software agents to automatically monitor telemetry, calculate risk scores using heuristic anomaly algorithms, map threats to MITRE ATT&amp;CK, and autonomously quarantine high-risk IP addresses — significantly reducing manual effort and incident response latency.</w:t>
       </w:r>
     </w:p>
     <w:p>
       <w:pPr>
-        <w:spacing w:after="120" w:line="360" w:lineRule="auto"/>
-        <w:jc w:val="both"/>
-      </w:pPr>
-      <w:r>
-        <w:rPr>
-          <w:rFonts w:ascii="Times New Roman" w:hAnsi="Times New Roman"/>
-        </w:rPr>
-        <w:t>To address these critical challenges, this project proposes SentinelGPT: An AI-Powered Large Language Model Framework for Advanced Cyber Threat Detection and Analysis. The system utilizes intelligent software agents to automatically monitor network telemetry, calculate risk scores using heuristic anomaly algorithms, dynamically map threats to MITRE ATT&amp;CK techniques, and autonomously quarantine high-risk IP addresses. Featuring a responsive dashboard, real-time streaming, interactive analytics, an AI triage assistant, and static payload scanning, SentinelGPT minimizes manual effort, eliminates response latency, and provides a scalable, reliable solution for modern enterprise cyber defense.</w:t>
-      </w:r>
-    </w:p>
-    <w:p>
-      <w:r>
-        <w:br w:type="page"/>
-      </w:r>
-    </w:p>
-    <w:p>
-      <w:pPr>
-        <w:spacing w:before="360" w:after="160"/>
+        <w:keepNext/>
+        <w:spacing w:before="200" w:after="80"/>
       </w:pPr>
       <w:r>
         <w:rPr>
           <w:rFonts w:ascii="Times New Roman" w:hAnsi="Times New Roman"/>
           <w:b/>
-          <w:sz w:val="32"/>
+          <w:color w:val="003366"/>
+          <w:sz w:val="28"/>
         </w:rPr>
-        <w:t>Difference Between Traditional Security Operations and the Proposed System</w:t>
-      </w:r>
-    </w:p>
-    <w:p>
-      <w:pPr>
-        <w:spacing w:after="120" w:line="360" w:lineRule="auto"/>
-        <w:jc w:val="both"/>
-      </w:pPr>
-      <w:r>
-        <w:rPr>
-          <w:rFonts w:ascii="Times New Roman" w:hAnsi="Times New Roman"/>
-        </w:rPr>
-        <w:t>Traditional security operations rely on manual log review, static rules, and delayed human response. The proposed SentinelGPT System automates threat detection, anomaly scoring, MITRE ATT&amp;CK mapping, and firewall quarantine using intelligent software agents. The table below highlights the major differences between traditional security management and the proposed AI-based system:</w:t>
+        <w:t>2.  Difference: Traditional System vs. Proposed SentinelGPT</w:t>
       </w:r>
     </w:p>
     <w:tbl>
       <w:tblPr>
+        <w:tblStyle w:val="TableGrid"/>
         <w:tblW w:type="auto" w:w="0"/>
         <w:jc w:val="center"/>
         <w:tblLook w:firstColumn="1" w:firstRow="1" w:lastColumn="0" w:lastRow="0" w:noHBand="0" w:noVBand="1" w:val="04A0"/>
@@ -157,36 +167,34 @@
         <w:tc>
           <w:tcPr>
             <w:tcW w:type="dxa" w:w="4680"/>
-            <w:tcBorders>
-              <w:top w:val="single" w:sz="4" w:space="0" w:color="CCCCCC"/>
-              <w:bottom w:val="single" w:sz="4" w:space="0" w:color="CCCCCC"/>
-              <w:left w:val="single" w:sz="4" w:space="0" w:color="CCCCCC"/>
-              <w:right w:val="single" w:sz="4" w:space="0" w:color="CCCCCC"/>
-            </w:tcBorders>
+            <w:shd w:val="clear" w:color="auto" w:fill="D0E4F7"/>
           </w:tcPr>
           <w:p>
+            <w:pPr>
+              <w:jc w:val="center"/>
+            </w:pPr>
             <w:r>
               <w:rPr>
                 <w:b/>
+                <w:sz w:val="22"/>
               </w:rPr>
-              <w:t>Traditional Security Operations System</w:t>
+              <w:t>Traditional Security System</w:t>
             </w:r>
           </w:p>
         </w:tc>
         <w:tc>
           <w:tcPr>
             <w:tcW w:type="dxa" w:w="4680"/>
-            <w:tcBorders>
-              <w:top w:val="single" w:sz="4" w:space="0" w:color="CCCCCC"/>
-              <w:bottom w:val="single" w:sz="4" w:space="0" w:color="CCCCCC"/>
-              <w:left w:val="single" w:sz="4" w:space="0" w:color="CCCCCC"/>
-              <w:right w:val="single" w:sz="4" w:space="0" w:color="CCCCCC"/>
-            </w:tcBorders>
+            <w:shd w:val="clear" w:color="auto" w:fill="D0E4F7"/>
           </w:tcPr>
           <w:p>
+            <w:pPr>
+              <w:jc w:val="center"/>
+            </w:pPr>
             <w:r>
               <w:rPr>
                 <w:b/>
+                <w:sz w:val="22"/>
               </w:rPr>
               <w:t>Proposed SentinelGPT System</w:t>
             </w:r>
@@ -197,32 +205,26 @@
         <w:tc>
           <w:tcPr>
             <w:tcW w:type="dxa" w:w="4680"/>
-            <w:tcBorders>
-              <w:top w:val="single" w:sz="4" w:space="0" w:color="CCCCCC"/>
-              <w:bottom w:val="single" w:sz="4" w:space="0" w:color="CCCCCC"/>
-              <w:left w:val="single" w:sz="4" w:space="0" w:color="CCCCCC"/>
-              <w:right w:val="single" w:sz="4" w:space="0" w:color="CCCCCC"/>
-            </w:tcBorders>
           </w:tcPr>
           <w:p>
             <w:r>
-              <w:t>Security monitoring relies on manual log inspection and static firewall rules.</w:t>
+              <w:rPr>
+                <w:sz w:val="20"/>
+              </w:rPr>
+              <w:t>Manual log inspection and static firewall rules.</w:t>
             </w:r>
           </w:p>
         </w:tc>
         <w:tc>
           <w:tcPr>
             <w:tcW w:type="dxa" w:w="4680"/>
-            <w:tcBorders>
-              <w:top w:val="single" w:sz="4" w:space="0" w:color="CCCCCC"/>
-              <w:bottom w:val="single" w:sz="4" w:space="0" w:color="CCCCCC"/>
-              <w:left w:val="single" w:sz="4" w:space="0" w:color="CCCCCC"/>
-              <w:right w:val="single" w:sz="4" w:space="0" w:color="CCCCCC"/>
-            </w:tcBorders>
           </w:tcPr>
           <w:p>
             <w:r>
-              <w:t>Threat monitoring is performed automatically using intelligent software agents running 24/7.</w:t>
+              <w:rPr>
+                <w:sz w:val="20"/>
+              </w:rPr>
+              <w:t>Autonomous agents monitor telemetry 24/7 with no manual input.</w:t>
             </w:r>
           </w:p>
         </w:tc>
@@ -231,32 +233,26 @@
         <w:tc>
           <w:tcPr>
             <w:tcW w:type="dxa" w:w="4680"/>
-            <w:tcBorders>
-              <w:top w:val="single" w:sz="4" w:space="0" w:color="CCCCCC"/>
-              <w:bottom w:val="single" w:sz="4" w:space="0" w:color="CCCCCC"/>
-              <w:left w:val="single" w:sz="4" w:space="0" w:color="CCCCCC"/>
-              <w:right w:val="single" w:sz="4" w:space="0" w:color="CCCCCC"/>
-            </w:tcBorders>
           </w:tcPr>
           <w:p>
             <w:r>
-              <w:t>High rate of alert fatigue and delayed incident detection.</w:t>
+              <w:rPr>
+                <w:sz w:val="20"/>
+              </w:rPr>
+              <w:t>High alert fatigue and delayed incident detection.</w:t>
             </w:r>
           </w:p>
         </w:tc>
         <w:tc>
           <w:tcPr>
             <w:tcW w:type="dxa" w:w="4680"/>
-            <w:tcBorders>
-              <w:top w:val="single" w:sz="4" w:space="0" w:color="CCCCCC"/>
-              <w:bottom w:val="single" w:sz="4" w:space="0" w:color="CCCCCC"/>
-              <w:left w:val="single" w:sz="4" w:space="0" w:color="CCCCCC"/>
-              <w:right w:val="single" w:sz="4" w:space="0" w:color="CCCCCC"/>
-            </w:tcBorders>
           </w:tcPr>
           <w:p>
             <w:r>
-              <w:t>Real-time heuristic anomaly scoring (0-100) eliminates alert fatigue and detects threats instantly.</w:t>
+              <w:rPr>
+                <w:sz w:val="20"/>
+              </w:rPr>
+              <w:t>Real-time heuristic scoring (0–100) eliminates fatigue and detects threats instantly.</w:t>
             </w:r>
           </w:p>
         </w:tc>
@@ -265,32 +261,26 @@
         <w:tc>
           <w:tcPr>
             <w:tcW w:type="dxa" w:w="4680"/>
-            <w:tcBorders>
-              <w:top w:val="single" w:sz="4" w:space="0" w:color="CCCCCC"/>
-              <w:bottom w:val="single" w:sz="4" w:space="0" w:color="CCCCCC"/>
-              <w:left w:val="single" w:sz="4" w:space="0" w:color="CCCCCC"/>
-              <w:right w:val="single" w:sz="4" w:space="0" w:color="CCCCCC"/>
-            </w:tcBorders>
           </w:tcPr>
           <w:p>
             <w:r>
-              <w:t>Firewall IP blocking requires manual administrative intervention and rule updates.</w:t>
+              <w:rPr>
+                <w:sz w:val="20"/>
+              </w:rPr>
+              <w:t>IP blocking requires manual admin intervention.</w:t>
             </w:r>
           </w:p>
         </w:tc>
         <w:tc>
           <w:tcPr>
             <w:tcW w:type="dxa" w:w="4680"/>
-            <w:tcBorders>
-              <w:top w:val="single" w:sz="4" w:space="0" w:color="CCCCCC"/>
-              <w:bottom w:val="single" w:sz="4" w:space="0" w:color="CCCCCC"/>
-              <w:left w:val="single" w:sz="4" w:space="0" w:color="CCCCCC"/>
-              <w:right w:val="single" w:sz="4" w:space="0" w:color="CCCCCC"/>
-            </w:tcBorders>
           </w:tcPr>
           <w:p>
             <w:r>
-              <w:t>Autonomous Quarantine Agent automatically isolates high-risk IPs (score &gt;= 75) in real time.</w:t>
+              <w:rPr>
+                <w:sz w:val="20"/>
+              </w:rPr>
+              <w:t>Autonomous Quarantine Agent auto-isolates IPs with score ≥ 75 in real time.</w:t>
             </w:r>
           </w:p>
         </w:tc>
@@ -299,32 +289,26 @@
         <w:tc>
           <w:tcPr>
             <w:tcW w:type="dxa" w:w="4680"/>
-            <w:tcBorders>
-              <w:top w:val="single" w:sz="4" w:space="0" w:color="CCCCCC"/>
-              <w:bottom w:val="single" w:sz="4" w:space="0" w:color="CCCCCC"/>
-              <w:left w:val="single" w:sz="4" w:space="0" w:color="CCCCCC"/>
-              <w:right w:val="single" w:sz="4" w:space="0" w:color="CCCCCC"/>
-            </w:tcBorders>
           </w:tcPr>
           <w:p>
             <w:r>
-              <w:t>Lacks standardized threat classification and attack framework alignment.</w:t>
+              <w:rPr>
+                <w:sz w:val="20"/>
+              </w:rPr>
+              <w:t>Lacks attack-framework-aligned threat classification.</w:t>
             </w:r>
           </w:p>
         </w:tc>
         <w:tc>
           <w:tcPr>
             <w:tcW w:type="dxa" w:w="4680"/>
-            <w:tcBorders>
-              <w:top w:val="single" w:sz="4" w:space="0" w:color="CCCCCC"/>
-              <w:bottom w:val="single" w:sz="4" w:space="0" w:color="CCCCCC"/>
-              <w:left w:val="single" w:sz="4" w:space="0" w:color="CCCCCC"/>
-              <w:right w:val="single" w:sz="4" w:space="0" w:color="CCCCCC"/>
-            </w:tcBorders>
           </w:tcPr>
           <w:p>
             <w:r>
-              <w:t>Automatically maps all detected incidents to MITRE ATT&amp;CK tactics and techniques.</w:t>
+              <w:rPr>
+                <w:sz w:val="20"/>
+              </w:rPr>
+              <w:t>All incidents are automatically mapped to MITRE ATT&amp;CK tactics and techniques.</w:t>
             </w:r>
           </w:p>
         </w:tc>
@@ -333,32 +317,26 @@
         <w:tc>
           <w:tcPr>
             <w:tcW w:type="dxa" w:w="4680"/>
-            <w:tcBorders>
-              <w:top w:val="single" w:sz="4" w:space="0" w:color="CCCCCC"/>
-              <w:bottom w:val="single" w:sz="4" w:space="0" w:color="CCCCCC"/>
-              <w:left w:val="single" w:sz="4" w:space="0" w:color="CCCCCC"/>
-              <w:right w:val="single" w:sz="4" w:space="0" w:color="CCCCCC"/>
-            </w:tcBorders>
           </w:tcPr>
           <w:p>
             <w:r>
-              <w:t>Incident triage requires extensive manual research by security analysts.</w:t>
+              <w:rPr>
+                <w:sz w:val="20"/>
+              </w:rPr>
+              <w:t>Triage requires extensive manual security research.</w:t>
             </w:r>
           </w:p>
         </w:tc>
         <w:tc>
           <w:tcPr>
             <w:tcW w:type="dxa" w:w="4680"/>
-            <w:tcBorders>
-              <w:top w:val="single" w:sz="4" w:space="0" w:color="CCCCCC"/>
-              <w:bottom w:val="single" w:sz="4" w:space="0" w:color="CCCCCC"/>
-              <w:left w:val="single" w:sz="4" w:space="0" w:color="CCCCCC"/>
-              <w:right w:val="single" w:sz="4" w:space="0" w:color="CCCCCC"/>
-            </w:tcBorders>
           </w:tcPr>
           <w:p>
             <w:r>
-              <w:t>Integrated AI Triage Assistant provides instant remediation guidance and remediation steps.</w:t>
+              <w:rPr>
+                <w:sz w:val="20"/>
+              </w:rPr>
+              <w:t>Integrated AI Triage Assistant provides instant remediation guidance.</w:t>
             </w:r>
           </w:p>
         </w:tc>
@@ -367,32 +345,26 @@
         <w:tc>
           <w:tcPr>
             <w:tcW w:type="dxa" w:w="4680"/>
-            <w:tcBorders>
-              <w:top w:val="single" w:sz="4" w:space="0" w:color="CCCCCC"/>
-              <w:bottom w:val="single" w:sz="4" w:space="0" w:color="CCCCCC"/>
-              <w:left w:val="single" w:sz="4" w:space="0" w:color="CCCCCC"/>
-              <w:right w:val="single" w:sz="4" w:space="0" w:color="CCCCCC"/>
-            </w:tcBorders>
           </w:tcPr>
           <w:p>
             <w:r>
-              <w:t>Limited real-time visualization of network perimeter threat velocity.</w:t>
+              <w:rPr>
+                <w:sz w:val="20"/>
+              </w:rPr>
+              <w:t>No real-time visualization of threat velocity.</w:t>
             </w:r>
           </w:p>
         </w:tc>
         <w:tc>
           <w:tcPr>
             <w:tcW w:type="dxa" w:w="4680"/>
-            <w:tcBorders>
-              <w:top w:val="single" w:sz="4" w:space="0" w:color="CCCCCC"/>
-              <w:bottom w:val="single" w:sz="4" w:space="0" w:color="CCCCCC"/>
-              <w:left w:val="single" w:sz="4" w:space="0" w:color="CCCCCC"/>
-              <w:right w:val="single" w:sz="4" w:space="0" w:color="CCCCCC"/>
-            </w:tcBorders>
           </w:tcPr>
           <w:p>
             <w:r>
-              <w:t>Interactive glassmorphic dashboard with live telemetry velocity charts and perimeter heatmaps.</w:t>
+              <w:rPr>
+                <w:sz w:val="20"/>
+              </w:rPr>
+              <w:t>Glassmorphic dashboard with live telemetry charts and perimeter heatmaps.</w:t>
             </w:r>
           </w:p>
         </w:tc>
@@ -401,32 +373,26 @@
         <w:tc>
           <w:tcPr>
             <w:tcW w:type="dxa" w:w="4680"/>
-            <w:tcBorders>
-              <w:top w:val="single" w:sz="4" w:space="0" w:color="CCCCCC"/>
-              <w:bottom w:val="single" w:sz="4" w:space="0" w:color="CCCCCC"/>
-              <w:left w:val="single" w:sz="4" w:space="0" w:color="CCCCCC"/>
-              <w:right w:val="single" w:sz="4" w:space="0" w:color="CCCCCC"/>
-            </w:tcBorders>
           </w:tcPr>
           <w:p>
             <w:r>
-              <w:t>Payload and log file analysis is performed manually using external tools.</w:t>
+              <w:rPr>
+                <w:sz w:val="20"/>
+              </w:rPr>
+              <w:t>Payload analysis done manually with external tools.</w:t>
             </w:r>
           </w:p>
         </w:tc>
         <w:tc>
           <w:tcPr>
             <w:tcW w:type="dxa" w:w="4680"/>
-            <w:tcBorders>
-              <w:top w:val="single" w:sz="4" w:space="0" w:color="CCCCCC"/>
-              <w:bottom w:val="single" w:sz="4" w:space="0" w:color="CCCCCC"/>
-              <w:left w:val="single" w:sz="4" w:space="0" w:color="CCCCCC"/>
-              <w:right w:val="single" w:sz="4" w:space="0" w:color="CCCCCC"/>
-            </w:tcBorders>
           </w:tcPr>
           <w:p>
             <w:r>
-              <w:t>Built-in Payload Scanner analyzes log files and static signatures with automatic verdict reports.</w:t>
+              <w:rPr>
+                <w:sz w:val="20"/>
+              </w:rPr>
+              <w:t>Built-in Payload Scanner analyzes files with automatic verdict reports.</w:t>
             </w:r>
           </w:p>
         </w:tc>
@@ -435,66 +401,26 @@
         <w:tc>
           <w:tcPr>
             <w:tcW w:type="dxa" w:w="4680"/>
-            <w:tcBorders>
-              <w:top w:val="single" w:sz="4" w:space="0" w:color="CCCCCC"/>
-              <w:bottom w:val="single" w:sz="4" w:space="0" w:color="CCCCCC"/>
-              <w:left w:val="single" w:sz="4" w:space="0" w:color="CCCCCC"/>
-              <w:right w:val="single" w:sz="4" w:space="0" w:color="CCCCCC"/>
-            </w:tcBorders>
           </w:tcPr>
           <w:p>
             <w:r>
-              <w:t>Data export and incident reporting require manual log gathering.</w:t>
+              <w:rPr>
+                <w:sz w:val="20"/>
+              </w:rPr>
+              <w:t>Scaling across cloud environments is complex.</w:t>
             </w:r>
           </w:p>
         </w:tc>
         <w:tc>
           <w:tcPr>
             <w:tcW w:type="dxa" w:w="4680"/>
-            <w:tcBorders>
-              <w:top w:val="single" w:sz="4" w:space="0" w:color="CCCCCC"/>
-              <w:bottom w:val="single" w:sz="4" w:space="0" w:color="CCCCCC"/>
-              <w:left w:val="single" w:sz="4" w:space="0" w:color="CCCCCC"/>
-              <w:right w:val="single" w:sz="4" w:space="0" w:color="CCCCCC"/>
-            </w:tcBorders>
           </w:tcPr>
           <w:p>
             <w:r>
-              <w:t>Supports instant JSON incident log export and RESTful API data access.</w:t>
-            </w:r>
-          </w:p>
-        </w:tc>
-      </w:tr>
-      <w:tr>
-        <w:tc>
-          <w:tcPr>
-            <w:tcW w:type="dxa" w:w="4680"/>
-            <w:tcBorders>
-              <w:top w:val="single" w:sz="4" w:space="0" w:color="CCCCCC"/>
-              <w:bottom w:val="single" w:sz="4" w:space="0" w:color="CCCCCC"/>
-              <w:left w:val="single" w:sz="4" w:space="0" w:color="CCCCCC"/>
-              <w:right w:val="single" w:sz="4" w:space="0" w:color="CCCCCC"/>
-            </w:tcBorders>
-          </w:tcPr>
-          <w:p>
-            <w:r>
-              <w:t>Difficult to scale across distributed cloud and multi-tenant environments.</w:t>
-            </w:r>
-          </w:p>
-        </w:tc>
-        <w:tc>
-          <w:tcPr>
-            <w:tcW w:type="dxa" w:w="4680"/>
-            <w:tcBorders>
-              <w:top w:val="single" w:sz="4" w:space="0" w:color="CCCCCC"/>
-              <w:bottom w:val="single" w:sz="4" w:space="0" w:color="CCCCCC"/>
-              <w:left w:val="single" w:sz="4" w:space="0" w:color="CCCCCC"/>
-              <w:right w:val="single" w:sz="4" w:space="0" w:color="CCCCCC"/>
-            </w:tcBorders>
-          </w:tcPr>
-          <w:p>
-            <w:r>
-              <w:t>Serverless cloud architecture (FastAPI + Vercel) provides seamless scalability and high availability.</w:t>
+              <w:rPr>
+                <w:sz w:val="20"/>
+              </w:rPr>
+              <w:t>Serverless architecture (FastAPI + Vercel) provides seamless scalability.</w:t>
             </w:r>
           </w:p>
         </w:tc>
@@ -507,116 +433,82 @@
     </w:p>
     <w:p>
       <w:pPr>
-        <w:spacing w:before="360" w:after="160"/>
+        <w:keepNext/>
+        <w:spacing w:before="200" w:after="80"/>
       </w:pPr>
       <w:r>
         <w:rPr>
           <w:rFonts w:ascii="Times New Roman" w:hAnsi="Times New Roman"/>
           <w:b/>
-          <w:sz w:val="32"/>
+          <w:color w:val="003366"/>
+          <w:sz w:val="28"/>
         </w:rPr>
-        <w:t>Proposed System</w:t>
+        <w:t>3.  Proposed Solution</w:t>
       </w:r>
     </w:p>
     <w:p>
       <w:pPr>
-        <w:spacing w:after="120" w:line="360" w:lineRule="auto"/>
+        <w:spacing w:before="0" w:after="80" w:line="276" w:lineRule="auto"/>
         <w:jc w:val="both"/>
       </w:pPr>
       <w:r>
         <w:rPr>
           <w:rFonts w:ascii="Times New Roman" w:hAnsi="Times New Roman"/>
+          <w:sz w:val="22"/>
         </w:rPr>
-        <w:t>The proposed SentinelGPT system is an intelligent web-based cyber defense application developed to automate threat detection, security monitoring, and incident mitigation. Designed to overcome the limitations of traditional security management, the system utilizes intelligent software agents that continuously evaluate network telemetry against heuristic scoring models and security policies.</w:t>
+        <w:t>SentinelGPT is an intelligent full-stack web-based cyber defense platform that automates threat detection, security monitoring, and incident mitigation. The system uses intelligent software agents that continuously evaluate network telemetry against heuristic scoring models and security policies, replacing slow manual workflows with instant automated decisions.</w:t>
       </w:r>
     </w:p>
     <w:p>
       <w:pPr>
-        <w:spacing w:after="120" w:line="360" w:lineRule="auto"/>
+        <w:spacing w:before="0" w:after="80" w:line="276" w:lineRule="auto"/>
         <w:jc w:val="both"/>
       </w:pPr>
       <w:r>
         <w:rPr>
           <w:rFonts w:ascii="Times New Roman" w:hAnsi="Times New Roman"/>
+          <w:sz w:val="22"/>
         </w:rPr>
-        <w:t>The application features a modern dashboard built with React 19 and Vite 5.4, connected to a high-performance FastAPI Python backend controller. When telemetry data arrives, the Telemetry Monitor Agent analyzes packet rates, IP origins, and request patterns to calculate a risk score (0 to 100). Incidents exceeding risk thresholds are immediately mapped to MITRE ATT&amp;CK techniques (e.g., T1078 Valid Accounts, T1498 Network DoS, T1190 Exploit Public App) and formatted with AI-driven remediation guidance.</w:t>
+        <w:t>The Telemetry Monitor Agent analyzes packet rates, IP origins, and request patterns to compute a risk score from 0 to 100. Each incident is mapped to a MITRE ATT&amp;CK technique (e.g., T1078 Valid Accounts, T1498 Network DoS) with AI-driven remediation guidance. When a score reaches or exceeds 75, the Autonomous Quarantine Agent immediately isolates the offending IP in the database. Administrators retain full manual override control for revocation and simulated threat injection.</w:t>
       </w:r>
     </w:p>
     <w:p>
       <w:pPr>
-        <w:spacing w:after="120" w:line="360" w:lineRule="auto"/>
+        <w:keepNext/>
+        <w:spacing w:before="200" w:after="80"/>
+      </w:pPr>
+      <w:r>
+        <w:rPr>
+          <w:rFonts w:ascii="Times New Roman" w:hAnsi="Times New Roman"/>
+          <w:b/>
+          <w:color w:val="003366"/>
+          <w:sz w:val="28"/>
+        </w:rPr>
+        <w:t>4.  System Architecture</w:t>
+      </w:r>
+    </w:p>
+    <w:p>
+      <w:pPr>
+        <w:spacing w:before="0" w:after="80" w:line="276" w:lineRule="auto"/>
         <w:jc w:val="both"/>
       </w:pPr>
       <w:r>
         <w:rPr>
           <w:rFonts w:ascii="Times New Roman" w:hAnsi="Times New Roman"/>
+          <w:sz w:val="22"/>
         </w:rPr>
-        <w:t>Simultaneously, the Autonomous Quarantine Agent monitors incident severity. If an anomaly score reaches or exceeds 75 (Critical/High threat), the agent automatically adds the offending IP address to the active quarantine database table, blocking further unauthorized access. Administrators retain full visibility and control through interactive dashboard toggles, enabling manual threat simulation, log clearing, and instant quarantine revocation.</w:t>
+        <w:t>The diagram below shows the complete end-to-end architecture of SentinelGPT:</w:t>
       </w:r>
     </w:p>
     <w:p>
       <w:pPr>
-        <w:spacing w:after="120" w:line="360" w:lineRule="auto"/>
-        <w:jc w:val="both"/>
-      </w:pPr>
-      <w:r>
-        <w:rPr>
-          <w:rFonts w:ascii="Times New Roman" w:hAnsi="Times New Roman"/>
-        </w:rPr>
-        <w:t>By integrating real-time telemetry streaming, autonomous quarantine execution, interactive chart analytics, a conversational AI triage assistant, and static payload scanning into a unified serverless environment, SentinelGPT offers a highly reliable, efficient, and scalable solution for modern enterprise cybersecurity operations.</w:t>
-      </w:r>
-    </w:p>
-    <w:p>
-      <w:r>
-        <w:br w:type="page"/>
-      </w:r>
-    </w:p>
-    <w:p>
-      <w:pPr>
-        <w:spacing w:before="360" w:after="160"/>
-      </w:pPr>
-      <w:r>
-        <w:rPr>
-          <w:rFonts w:ascii="Times New Roman" w:hAnsi="Times New Roman"/>
-          <w:b/>
-          <w:sz w:val="32"/>
-        </w:rPr>
-        <w:t>System Architecture</w:t>
-      </w:r>
-    </w:p>
-    <w:p>
-      <w:pPr>
-        <w:spacing w:after="120" w:line="360" w:lineRule="auto"/>
-        <w:jc w:val="both"/>
-      </w:pPr>
-      <w:r>
-        <w:rPr>
-          <w:rFonts w:ascii="Times New Roman" w:hAnsi="Times New Roman"/>
-        </w:rPr>
-        <w:t>SentinelGPT follows a modular, decoupled architecture where each component performs a specialized task. The system starts when an operator authenticates through the React frontend interface. Upon login, the dashboard establishes communication with the FastAPI backend controller to fetch telemetry snapshots and establish WebSocket streaming.</w:t>
-      </w:r>
-    </w:p>
-    <w:p>
-      <w:pPr>
-        <w:spacing w:after="120" w:line="360" w:lineRule="auto"/>
-        <w:jc w:val="both"/>
-      </w:pPr>
-      <w:r>
-        <w:rPr>
-          <w:rFonts w:ascii="Times New Roman" w:hAnsi="Times New Roman"/>
-        </w:rPr>
-        <w:t>The FastAPI backend processes inbound telemetry using two intelligent agents: the Telemetry Monitor Agent (responsible for anomaly scoring and MITRE ATT&amp;CK mapping) and the Autonomous Quarantine Agent (responsible for automated firewall IP isolation and quarantine validation). All incident logs, user credentials, and quarantined IPs are securely managed by SQLAlchemy ORM connected to SQLite (or cloud database). The complete architecture flow is shown in the diagram below:</w:t>
-      </w:r>
-    </w:p>
-    <w:p>
-      <w:pPr>
-        <w:spacing w:before="200" w:after="240"/>
+        <w:spacing w:before="120" w:after="40"/>
         <w:jc w:val="center"/>
       </w:pPr>
       <w:r>
         <w:drawing>
           <wp:inline xmlns:a="http://schemas.openxmlformats.org/drawingml/2006/main" xmlns:pic="http://schemas.openxmlformats.org/drawingml/2006/picture">
-            <wp:extent cx="5486400" cy="4572000"/>
+            <wp:extent cx="5486400" cy="3955312"/>
             <wp:docPr id="1" name="Picture 1"/>
             <wp:cNvGraphicFramePr>
               <a:graphicFrameLocks noChangeAspect="1"/>
@@ -637,7 +529,7 @@
                   <pic:spPr>
                     <a:xfrm>
                       <a:off x="0" y="0"/>
-                      <a:ext cx="5486400" cy="4572000"/>
+                      <a:ext cx="5486400" cy="3955312"/>
                     </a:xfrm>
                     <a:prstGeom prst="rect"/>
                   </pic:spPr>
@@ -649,211 +541,350 @@
       </w:r>
     </w:p>
     <w:p>
+      <w:pPr>
+        <w:spacing w:after="120"/>
+        <w:jc w:val="center"/>
+      </w:pPr>
       <w:r>
-        <w:br w:type="page"/>
+        <w:rPr>
+          <w:rFonts w:ascii="Times New Roman" w:hAnsi="Times New Roman"/>
+          <w:i/>
+          <w:sz w:val="20"/>
+        </w:rPr>
+        <w:t>Fig 1: SentinelGPT System Architecture</w:t>
       </w:r>
     </w:p>
     <w:p>
       <w:pPr>
-        <w:spacing w:before="360" w:after="160"/>
+        <w:keepNext/>
+        <w:spacing w:before="200" w:after="80"/>
       </w:pPr>
       <w:r>
         <w:rPr>
           <w:rFonts w:ascii="Times New Roman" w:hAnsi="Times New Roman"/>
           <w:b/>
-          <w:sz w:val="32"/>
+          <w:color w:val="003366"/>
+          <w:sz w:val="28"/>
         </w:rPr>
-        <w:t>Technologies Used</w:t>
+        <w:t>5.  Technologies Used</w:t>
       </w:r>
     </w:p>
     <w:p>
       <w:pPr>
-        <w:spacing w:after="120" w:line="360" w:lineRule="auto"/>
-        <w:jc w:val="both"/>
-      </w:pPr>
-      <w:r>
-        <w:rPr>
-          <w:rFonts w:ascii="Times New Roman" w:hAnsi="Times New Roman"/>
-        </w:rPr>
-        <w:t>SentinelGPT is developed using a powerful combination of modern frontend, backend, database, and AI technologies. These technologies collaborate to automate threat monitoring, ensure real-time data streaming, and deliver an intuitive security operations dashboard.</w:t>
-      </w:r>
-    </w:p>
-    <w:p>
-      <w:pPr>
-        <w:spacing w:before="240" w:after="80"/>
+        <w:spacing w:before="120" w:after="40"/>
       </w:pPr>
       <w:r>
         <w:rPr>
           <w:rFonts w:ascii="Times New Roman" w:hAnsi="Times New Roman"/>
           <w:b/>
-          <w:sz w:val="26"/>
+          <w:color w:val="1A4A7A"/>
+          <w:sz w:val="24"/>
         </w:rPr>
-        <w:t>1. Frontend Technologies</w:t>
+        <w:t>Frontend</w:t>
       </w:r>
     </w:p>
     <w:p>
       <w:pPr>
-        <w:spacing w:after="120" w:line="360" w:lineRule="auto"/>
+        <w:pStyle w:val="ListBullet"/>
+        <w:spacing w:before="0" w:after="40" w:line="264" w:lineRule="auto"/>
+        <w:ind w:left="360"/>
         <w:jc w:val="both"/>
       </w:pPr>
       <w:r>
         <w:rPr>
           <w:rFonts w:ascii="Times New Roman" w:hAnsi="Times New Roman"/>
           <w:b/>
+          <w:sz w:val="22"/>
         </w:rPr>
-        <w:t xml:space="preserve">• React 19: </w:t>
+        <w:t xml:space="preserve">React 19: </w:t>
       </w:r>
       <w:r>
         <w:rPr>
           <w:rFonts w:ascii="Times New Roman" w:hAnsi="Times New Roman"/>
+          <w:sz w:val="22"/>
         </w:rPr>
-        <w:t xml:space="preserve"> Modern UI library for building dynamic component trees and managing real-time state updates. It allows for efficient rendering of complex dashboards.</w:t>
+        <w:t>Modern UI library for dynamic component trees and real-time state management.</w:t>
       </w:r>
     </w:p>
     <w:p>
       <w:pPr>
-        <w:spacing w:after="120" w:line="360" w:lineRule="auto"/>
+        <w:pStyle w:val="ListBullet"/>
+        <w:spacing w:before="0" w:after="40" w:line="264" w:lineRule="auto"/>
+        <w:ind w:left="360"/>
         <w:jc w:val="both"/>
       </w:pPr>
       <w:r>
         <w:rPr>
           <w:rFonts w:ascii="Times New Roman" w:hAnsi="Times New Roman"/>
           <w:b/>
+          <w:sz w:val="22"/>
         </w:rPr>
-        <w:t xml:space="preserve">• Vite 5.4: </w:t>
+        <w:t xml:space="preserve">Vite 5.4: </w:t>
       </w:r>
       <w:r>
         <w:rPr>
           <w:rFonts w:ascii="Times New Roman" w:hAnsi="Times New Roman"/>
+          <w:sz w:val="22"/>
         </w:rPr>
-        <w:t xml:space="preserve"> Next-generation frontend build tool providing fast Hot Module Replacement (HMR) and optimized production bundles.</w:t>
+        <w:t>Next-gen build tool providing fast HMR and optimized production bundles.</w:t>
       </w:r>
     </w:p>
     <w:p>
       <w:pPr>
-        <w:spacing w:after="120" w:line="360" w:lineRule="auto"/>
+        <w:pStyle w:val="ListBullet"/>
+        <w:spacing w:before="0" w:after="40" w:line="264" w:lineRule="auto"/>
+        <w:ind w:left="360"/>
         <w:jc w:val="both"/>
       </w:pPr>
       <w:r>
         <w:rPr>
           <w:rFonts w:ascii="Times New Roman" w:hAnsi="Times New Roman"/>
           <w:b/>
+          <w:sz w:val="22"/>
         </w:rPr>
-        <w:t xml:space="preserve">• Recharts: </w:t>
+        <w:t xml:space="preserve">Recharts: </w:t>
       </w:r>
       <w:r>
         <w:rPr>
           <w:rFonts w:ascii="Times New Roman" w:hAnsi="Times New Roman"/>
+          <w:sz w:val="22"/>
         </w:rPr>
-        <w:t xml:space="preserve"> A composability library used to render live threat velocity charts, risk gauges, and severity donuts.</w:t>
+        <w:t>Renders live threat velocity charts, risk gauges, and severity donut graphs.</w:t>
       </w:r>
     </w:p>
     <w:p>
       <w:pPr>
-        <w:spacing w:after="120" w:line="360" w:lineRule="auto"/>
+        <w:pStyle w:val="ListBullet"/>
+        <w:spacing w:before="0" w:after="40" w:line="264" w:lineRule="auto"/>
+        <w:ind w:left="360"/>
         <w:jc w:val="both"/>
       </w:pPr>
       <w:r>
         <w:rPr>
           <w:rFonts w:ascii="Times New Roman" w:hAnsi="Times New Roman"/>
           <w:b/>
+          <w:sz w:val="22"/>
         </w:rPr>
-        <w:t xml:space="preserve">• HTML5 &amp; CSS3: </w:t>
+        <w:t xml:space="preserve">CSS3 / Glassmorphism: </w:t>
       </w:r>
       <w:r>
         <w:rPr>
           <w:rFonts w:ascii="Times New Roman" w:hAnsi="Times New Roman"/>
+          <w:sz w:val="22"/>
         </w:rPr>
-        <w:t xml:space="preserve"> Provides the foundation for the visual structure and responsive layouts.</w:t>
+        <w:t>Cyberpunk dark-mode aesthetic with backdrop-blur and neon accents.</w:t>
       </w:r>
     </w:p>
     <w:p>
       <w:pPr>
-        <w:spacing w:after="120" w:line="360" w:lineRule="auto"/>
+        <w:spacing w:before="120" w:after="40"/>
+      </w:pPr>
+      <w:r>
+        <w:rPr>
+          <w:rFonts w:ascii="Times New Roman" w:hAnsi="Times New Roman"/>
+          <w:b/>
+          <w:color w:val="1A4A7A"/>
+          <w:sz w:val="24"/>
+        </w:rPr>
+        <w:t>Backend</w:t>
+      </w:r>
+    </w:p>
+    <w:p>
+      <w:pPr>
+        <w:pStyle w:val="ListBullet"/>
+        <w:spacing w:before="0" w:after="40" w:line="264" w:lineRule="auto"/>
+        <w:ind w:left="360"/>
         <w:jc w:val="both"/>
       </w:pPr>
       <w:r>
         <w:rPr>
           <w:rFonts w:ascii="Times New Roman" w:hAnsi="Times New Roman"/>
           <w:b/>
+          <w:sz w:val="22"/>
         </w:rPr>
-        <w:t xml:space="preserve">• JavaScript: </w:t>
+        <w:t xml:space="preserve">Python 3.11+: </w:t>
       </w:r>
       <w:r>
         <w:rPr>
           <w:rFonts w:ascii="Times New Roman" w:hAnsi="Times New Roman"/>
+          <w:sz w:val="22"/>
         </w:rPr>
-        <w:t xml:space="preserve"> The core scripting language handling client-side logic, API calls, and state management.</w:t>
+        <w:t>Primary language for agent logic, threat algorithms, and database models.</w:t>
       </w:r>
     </w:p>
     <w:p>
       <w:pPr>
-        <w:spacing w:before="240" w:after="80"/>
-      </w:pPr>
-      <w:r>
-        <w:rPr>
-          <w:rFonts w:ascii="Times New Roman" w:hAnsi="Times New Roman"/>
-          <w:b/>
-          <w:sz w:val="26"/>
-        </w:rPr>
-        <w:t>2. Backend Technologies</w:t>
-      </w:r>
-    </w:p>
-    <w:p>
-      <w:pPr>
-        <w:spacing w:after="120" w:line="360" w:lineRule="auto"/>
+        <w:pStyle w:val="ListBullet"/>
+        <w:spacing w:before="0" w:after="40" w:line="264" w:lineRule="auto"/>
+        <w:ind w:left="360"/>
         <w:jc w:val="both"/>
       </w:pPr>
       <w:r>
         <w:rPr>
           <w:rFonts w:ascii="Times New Roman" w:hAnsi="Times New Roman"/>
           <w:b/>
+          <w:sz w:val="22"/>
         </w:rPr>
-        <w:t xml:space="preserve">• Python 3.11+: </w:t>
+        <w:t xml:space="preserve">FastAPI: </w:t>
       </w:r>
       <w:r>
         <w:rPr>
           <w:rFonts w:ascii="Times New Roman" w:hAnsi="Times New Roman"/>
+          <w:sz w:val="22"/>
         </w:rPr>
-        <w:t xml:space="preserve"> Primary language for implementing threat algorithms, agent workflows, and database models.</w:t>
+        <w:t>Async, high-performance framework for RESTful APIs, WebSockets, and OpenAPI docs.</w:t>
       </w:r>
     </w:p>
     <w:p>
       <w:pPr>
-        <w:spacing w:after="120" w:line="360" w:lineRule="auto"/>
+        <w:pStyle w:val="ListBullet"/>
+        <w:spacing w:before="0" w:after="40" w:line="264" w:lineRule="auto"/>
+        <w:ind w:left="360"/>
         <w:jc w:val="both"/>
       </w:pPr>
       <w:r>
         <w:rPr>
           <w:rFonts w:ascii="Times New Roman" w:hAnsi="Times New Roman"/>
           <w:b/>
+          <w:sz w:val="22"/>
         </w:rPr>
-        <w:t xml:space="preserve">• FastAPI: </w:t>
+        <w:t xml:space="preserve">Uvicorn: </w:t>
       </w:r>
       <w:r>
         <w:rPr>
           <w:rFonts w:ascii="Times New Roman" w:hAnsi="Times New Roman"/>
+          <w:sz w:val="22"/>
         </w:rPr>
-        <w:t xml:space="preserve"> Asynchronous, high-performance web framework for handling RESTful APIs, WebSockets, and generating OpenAPI documentation automatically.</w:t>
+        <w:t>High-speed ASGI server for both local dev and Vercel serverless execution.</w:t>
       </w:r>
     </w:p>
     <w:p>
       <w:pPr>
-        <w:spacing w:after="120" w:line="360" w:lineRule="auto"/>
+        <w:pStyle w:val="ListBullet"/>
+        <w:spacing w:before="0" w:after="40" w:line="264" w:lineRule="auto"/>
+        <w:ind w:left="360"/>
         <w:jc w:val="both"/>
       </w:pPr>
       <w:r>
         <w:rPr>
           <w:rFonts w:ascii="Times New Roman" w:hAnsi="Times New Roman"/>
           <w:b/>
+          <w:sz w:val="22"/>
         </w:rPr>
-        <w:t xml:space="preserve">• Uvicorn: </w:t>
+        <w:t xml:space="preserve">PyJWT: </w:t>
       </w:r>
       <w:r>
         <w:rPr>
           <w:rFonts w:ascii="Times New Roman" w:hAnsi="Times New Roman"/>
+          <w:sz w:val="22"/>
         </w:rPr>
-        <w:t xml:space="preserve"> High-speed ASGI server powering local development execution and serverless request routing.</w:t>
+        <w:t>HS256 JSON Web Token generation and validation for secure 8-hour sessions.</w:t>
+      </w:r>
+    </w:p>
+    <w:p>
+      <w:pPr>
+        <w:spacing w:before="120" w:after="40"/>
+      </w:pPr>
+      <w:r>
+        <w:rPr>
+          <w:rFonts w:ascii="Times New Roman" w:hAnsi="Times New Roman"/>
+          <w:b/>
+          <w:color w:val="1A4A7A"/>
+          <w:sz w:val="24"/>
+        </w:rPr>
+        <w:t>Database &amp; Deployment</w:t>
+      </w:r>
+    </w:p>
+    <w:p>
+      <w:pPr>
+        <w:pStyle w:val="ListBullet"/>
+        <w:spacing w:before="0" w:after="40" w:line="264" w:lineRule="auto"/>
+        <w:ind w:left="360"/>
+        <w:jc w:val="both"/>
+      </w:pPr>
+      <w:r>
+        <w:rPr>
+          <w:rFonts w:ascii="Times New Roman" w:hAnsi="Times New Roman"/>
+          <w:b/>
+          <w:sz w:val="22"/>
+        </w:rPr>
+        <w:t xml:space="preserve">SQLAlchemy ORM: </w:t>
+      </w:r>
+      <w:r>
+        <w:rPr>
+          <w:rFonts w:ascii="Times New Roman" w:hAnsi="Times New Roman"/>
+          <w:sz w:val="22"/>
+        </w:rPr>
+        <w:t>Safe, type-annotated Python ORM for all database interactions.</w:t>
+      </w:r>
+    </w:p>
+    <w:p>
+      <w:pPr>
+        <w:pStyle w:val="ListBullet"/>
+        <w:spacing w:before="0" w:after="40" w:line="264" w:lineRule="auto"/>
+        <w:ind w:left="360"/>
+        <w:jc w:val="both"/>
+      </w:pPr>
+      <w:r>
+        <w:rPr>
+          <w:rFonts w:ascii="Times New Roman" w:hAnsi="Times New Roman"/>
+          <w:b/>
+          <w:sz w:val="22"/>
+        </w:rPr>
+        <w:t xml:space="preserve">SQLite: </w:t>
+      </w:r>
+      <w:r>
+        <w:rPr>
+          <w:rFonts w:ascii="Times New Roman" w:hAnsi="Times New Roman"/>
+          <w:sz w:val="22"/>
+        </w:rPr>
+        <w:t>Zero-config relational DB for incident logs, blocked IPs, and user accounts.</w:t>
+      </w:r>
+    </w:p>
+    <w:p>
+      <w:pPr>
+        <w:pStyle w:val="ListBullet"/>
+        <w:spacing w:before="0" w:after="40" w:line="264" w:lineRule="auto"/>
+        <w:ind w:left="360"/>
+        <w:jc w:val="both"/>
+      </w:pPr>
+      <w:r>
+        <w:rPr>
+          <w:rFonts w:ascii="Times New Roman" w:hAnsi="Times New Roman"/>
+          <w:b/>
+          <w:sz w:val="22"/>
+        </w:rPr>
+        <w:t xml:space="preserve">Vercel Serverless: </w:t>
+      </w:r>
+      <w:r>
+        <w:rPr>
+          <w:rFonts w:ascii="Times New Roman" w:hAnsi="Times New Roman"/>
+          <w:sz w:val="22"/>
+        </w:rPr>
+        <w:t>Production cloud host serving the React build and Python API functions.</w:t>
+      </w:r>
+    </w:p>
+    <w:p>
+      <w:pPr>
+        <w:pStyle w:val="ListBullet"/>
+        <w:spacing w:before="0" w:after="40" w:line="264" w:lineRule="auto"/>
+        <w:ind w:left="360"/>
+        <w:jc w:val="both"/>
+      </w:pPr>
+      <w:r>
+        <w:rPr>
+          <w:rFonts w:ascii="Times New Roman" w:hAnsi="Times New Roman"/>
+          <w:b/>
+          <w:sz w:val="22"/>
+        </w:rPr>
+        <w:t xml:space="preserve">GitHub Actions CI/CD: </w:t>
+      </w:r>
+      <w:r>
+        <w:rPr>
+          <w:rFonts w:ascii="Times New Roman" w:hAnsi="Times New Roman"/>
+          <w:sz w:val="22"/>
+        </w:rPr>
+        <w:t>Automated build and deployment pipeline on every push to main.</w:t>
       </w:r>
     </w:p>
     <w:p>
@@ -863,215 +894,28 @@
     </w:p>
     <w:p>
       <w:pPr>
-        <w:spacing w:before="240" w:after="80"/>
+        <w:keepNext/>
+        <w:spacing w:before="200" w:after="80"/>
       </w:pPr>
       <w:r>
         <w:rPr>
           <w:rFonts w:ascii="Times New Roman" w:hAnsi="Times New Roman"/>
           <w:b/>
-          <w:sz w:val="26"/>
+          <w:color w:val="003366"/>
+          <w:sz w:val="28"/>
         </w:rPr>
-        <w:t>3. Database &amp; Storage Technologies</w:t>
+        <w:t>6.  Architecture Flow &amp; Agents Used</w:t>
       </w:r>
     </w:p>
     <w:p>
       <w:pPr>
-        <w:spacing w:after="120" w:line="360" w:lineRule="auto"/>
-        <w:jc w:val="both"/>
-      </w:pPr>
-      <w:r>
-        <w:rPr>
-          <w:rFonts w:ascii="Times New Roman" w:hAnsi="Times New Roman"/>
-          <w:b/>
-        </w:rPr>
-        <w:t xml:space="preserve">• SQLAlchemy ORM: </w:t>
-      </w:r>
-      <w:r>
-        <w:rPr>
-          <w:rFonts w:ascii="Times New Roman" w:hAnsi="Times New Roman"/>
-        </w:rPr>
-        <w:t xml:space="preserve"> Python Object-Relational Mapping (ORM) library that allows secure and efficient database interactions without writing raw SQL queries.</w:t>
-      </w:r>
-    </w:p>
-    <w:p>
-      <w:pPr>
-        <w:spacing w:after="120" w:line="360" w:lineRule="auto"/>
-        <w:jc w:val="both"/>
-      </w:pPr>
-      <w:r>
-        <w:rPr>
-          <w:rFonts w:ascii="Times New Roman" w:hAnsi="Times New Roman"/>
-          <w:b/>
-        </w:rPr>
-        <w:t xml:space="preserve">• SQLite: </w:t>
-      </w:r>
-      <w:r>
-        <w:rPr>
-          <w:rFonts w:ascii="Times New Roman" w:hAnsi="Times New Roman"/>
-        </w:rPr>
-        <w:t xml:space="preserve"> Lightweight, zero-configuration relational database used for local testing and Vercel ephemeral storage.</w:t>
-      </w:r>
-    </w:p>
-    <w:p>
-      <w:pPr>
-        <w:spacing w:before="240" w:after="80"/>
-      </w:pPr>
-      <w:r>
-        <w:rPr>
-          <w:rFonts w:ascii="Times New Roman" w:hAnsi="Times New Roman"/>
-          <w:b/>
-          <w:sz w:val="26"/>
-        </w:rPr>
-        <w:t>4. Deployment Technologies</w:t>
-      </w:r>
-    </w:p>
-    <w:p>
-      <w:pPr>
-        <w:spacing w:after="120" w:line="360" w:lineRule="auto"/>
-        <w:jc w:val="both"/>
-      </w:pPr>
-      <w:r>
-        <w:rPr>
-          <w:rFonts w:ascii="Times New Roman" w:hAnsi="Times New Roman"/>
-          <w:b/>
-        </w:rPr>
-        <w:t xml:space="preserve">• Vercel: </w:t>
-      </w:r>
-      <w:r>
-        <w:rPr>
-          <w:rFonts w:ascii="Times New Roman" w:hAnsi="Times New Roman"/>
-        </w:rPr>
-        <w:t xml:space="preserve"> Cloud serverless deployment platform hosting the static React build and executing Python API functions on the edge.</w:t>
-      </w:r>
-    </w:p>
-    <w:p>
-      <w:pPr>
-        <w:spacing w:after="120" w:line="360" w:lineRule="auto"/>
-        <w:jc w:val="both"/>
-      </w:pPr>
-      <w:r>
-        <w:rPr>
-          <w:rFonts w:ascii="Times New Roman" w:hAnsi="Times New Roman"/>
-          <w:b/>
-        </w:rPr>
-        <w:t xml:space="preserve">• Git &amp; GitHub: </w:t>
-      </w:r>
-      <w:r>
-        <w:rPr>
-          <w:rFonts w:ascii="Times New Roman" w:hAnsi="Times New Roman"/>
-        </w:rPr>
-        <w:t xml:space="preserve"> Used for version control and automated deployment pipelines.</w:t>
-      </w:r>
-    </w:p>
-    <w:p>
-      <w:pPr>
-        <w:spacing w:before="360" w:after="160"/>
-      </w:pPr>
-      <w:r>
-        <w:rPr>
-          <w:rFonts w:ascii="Times New Roman" w:hAnsi="Times New Roman"/>
-          <w:b/>
-          <w:sz w:val="32"/>
-        </w:rPr>
-        <w:t>Algorithms Used</w:t>
-      </w:r>
-    </w:p>
-    <w:p>
-      <w:pPr>
-        <w:spacing w:after="120" w:line="360" w:lineRule="auto"/>
-        <w:jc w:val="both"/>
-      </w:pPr>
-      <w:r>
-        <w:rPr>
-          <w:rFonts w:ascii="Times New Roman" w:hAnsi="Times New Roman"/>
-          <w:b/>
-        </w:rPr>
-        <w:t xml:space="preserve">1. Heuristic Threat Scoring Algorithm: </w:t>
-      </w:r>
-      <w:r>
-        <w:rPr>
-          <w:rFonts w:ascii="Times New Roman" w:hAnsi="Times New Roman"/>
-        </w:rPr>
-        <w:t xml:space="preserve"> Evaluates incoming request velocity, payload anomaly patterns, and IP reputation to generate a normalized risk score ranging from 0 to 100. This heuristic approach identifies unknown threats without relying solely on static signatures.</w:t>
-      </w:r>
-    </w:p>
-    <w:p>
-      <w:pPr>
-        <w:spacing w:after="120" w:line="360" w:lineRule="auto"/>
-        <w:jc w:val="both"/>
-      </w:pPr>
-      <w:r>
-        <w:rPr>
-          <w:rFonts w:ascii="Times New Roman" w:hAnsi="Times New Roman"/>
-          <w:b/>
-        </w:rPr>
-        <w:t xml:space="preserve">2. Severity Matrix Classifier: </w:t>
-      </w:r>
-      <w:r>
-        <w:rPr>
-          <w:rFonts w:ascii="Times New Roman" w:hAnsi="Times New Roman"/>
-        </w:rPr>
-        <w:t xml:space="preserve"> Categorizes risk scores into distinct priority tiers: Critical (&gt;=75), High (60-74), Medium (40-59), and Low (&lt;40). This matrix drives the automated response logic.</w:t>
-      </w:r>
-    </w:p>
-    <w:p>
-      <w:pPr>
-        <w:spacing w:after="120" w:line="360" w:lineRule="auto"/>
-        <w:jc w:val="both"/>
-      </w:pPr>
-      <w:r>
-        <w:rPr>
-          <w:rFonts w:ascii="Times New Roman" w:hAnsi="Times New Roman"/>
-          <w:b/>
-        </w:rPr>
-        <w:t xml:space="preserve">3. Velocity Rate Anomaly Detector: </w:t>
-      </w:r>
-      <w:r>
-        <w:rPr>
-          <w:rFonts w:ascii="Times New Roman" w:hAnsi="Times New Roman"/>
-        </w:rPr>
-        <w:t xml:space="preserve"> Monitors burst traffic spikes per IP address over sliding time windows to detect active Distributed Denial of Service (DDoS) attempts or port scan sweeps.</w:t>
-      </w:r>
-    </w:p>
-    <w:p>
-      <w:r>
-        <w:br w:type="page"/>
-      </w:r>
-    </w:p>
-    <w:p>
-      <w:pPr>
-        <w:spacing w:before="360" w:after="160"/>
-      </w:pPr>
-      <w:r>
-        <w:rPr>
-          <w:rFonts w:ascii="Times New Roman" w:hAnsi="Times New Roman"/>
-          <w:b/>
-          <w:sz w:val="32"/>
-        </w:rPr>
-        <w:t>Architecture Flow &amp; Technology Layers</w:t>
-      </w:r>
-    </w:p>
-    <w:p>
-      <w:pPr>
-        <w:spacing w:after="120" w:line="360" w:lineRule="auto"/>
-        <w:jc w:val="both"/>
-      </w:pPr>
-      <w:r>
-        <w:rPr>
-          <w:rFonts w:ascii="Times New Roman" w:hAnsi="Times New Roman"/>
-        </w:rPr>
-        <w:t>The diagram below summarizes the technology stack layers and workflow, starting from the network traffic telemetry feed down to the Database and Output Report Generation layers:</w:t>
-      </w:r>
-    </w:p>
-    <w:p>
-      <w:pPr>
-        <w:spacing w:before="200" w:after="240"/>
+        <w:spacing w:before="120" w:after="40"/>
         <w:jc w:val="center"/>
       </w:pPr>
       <w:r>
         <w:drawing>
           <wp:inline xmlns:a="http://schemas.openxmlformats.org/drawingml/2006/main" xmlns:pic="http://schemas.openxmlformats.org/drawingml/2006/picture">
-            <wp:extent cx="5943600" cy="5034579"/>
+            <wp:extent cx="5669280" cy="3559780"/>
             <wp:docPr id="2" name="Picture 2"/>
             <wp:cNvGraphicFramePr>
               <a:graphicFrameLocks noChangeAspect="1"/>
@@ -1092,562 +936,7 @@
                   <pic:spPr>
                     <a:xfrm>
                       <a:off x="0" y="0"/>
-                      <a:ext cx="5943600" cy="5034579"/>
-                    </a:xfrm>
-                    <a:prstGeom prst="rect"/>
-                  </pic:spPr>
-                </pic:pic>
-              </a:graphicData>
-            </a:graphic>
-          </wp:inline>
-        </w:drawing>
-      </w:r>
-    </w:p>
-    <w:p>
-      <w:r>
-        <w:br w:type="page"/>
-      </w:r>
-    </w:p>
-    <w:p>
-      <w:pPr>
-        <w:spacing w:before="360" w:after="160"/>
-      </w:pPr>
-      <w:r>
-        <w:rPr>
-          <w:rFonts w:ascii="Times New Roman" w:hAnsi="Times New Roman"/>
-          <w:b/>
-          <w:sz w:val="32"/>
-        </w:rPr>
-        <w:t>Agents Used</w:t>
-      </w:r>
-    </w:p>
-    <w:p>
-      <w:pPr>
-        <w:spacing w:after="120" w:line="360" w:lineRule="auto"/>
-        <w:jc w:val="both"/>
-      </w:pPr>
-      <w:r>
-        <w:rPr>
-          <w:rFonts w:ascii="Times New Roman" w:hAnsi="Times New Roman"/>
-        </w:rPr>
-        <w:t>SentinelGPT utilizes intelligent software agents to automate the security monitoring workflow. Each agent operates independently to evaluate telemetry, classify risks, and execute response actions, significantly reducing the manual workload on human analysts.</w:t>
-      </w:r>
-    </w:p>
-    <w:p>
-      <w:pPr>
-        <w:spacing w:before="240" w:after="80"/>
-      </w:pPr>
-      <w:r>
-        <w:rPr>
-          <w:rFonts w:ascii="Times New Roman" w:hAnsi="Times New Roman"/>
-          <w:b/>
-          <w:sz w:val="26"/>
-        </w:rPr>
-        <w:t>1. Telemetry Monitor &amp; Threat Detection Agent</w:t>
-      </w:r>
-    </w:p>
-    <w:p>
-      <w:pPr>
-        <w:spacing w:after="120" w:line="360" w:lineRule="auto"/>
-        <w:jc w:val="both"/>
-      </w:pPr>
-      <w:r>
-        <w:rPr>
-          <w:rFonts w:ascii="Times New Roman" w:hAnsi="Times New Roman"/>
-        </w:rPr>
-        <w:t>The Telemetry Monitor Agent continuously inspects incoming network log events, extracts IP details, calculates risk scores using heuristic algorithms, and dynamically assigns MITRE ATT&amp;CK tactic and technique metadata based on the observed behavior.</w:t>
-      </w:r>
-    </w:p>
-    <w:p>
-      <w:pPr>
-        <w:spacing w:after="120" w:line="360" w:lineRule="auto"/>
-        <w:jc w:val="both"/>
-      </w:pPr>
-      <w:r>
-        <w:rPr>
-          <w:rFonts w:ascii="Times New Roman" w:hAnsi="Times New Roman"/>
-          <w:b/>
-        </w:rPr>
-        <w:t xml:space="preserve">• Responsibilities: </w:t>
-      </w:r>
-      <w:r>
-        <w:rPr>
-          <w:rFonts w:ascii="Times New Roman" w:hAnsi="Times New Roman"/>
-        </w:rPr>
-        <w:t>Reads network telemetry logs; Calculates priority risk scores; Maps threats to specific MITRE ATT&amp;CK techniques; Generates structured incident payloads for the dashboard.</w:t>
-      </w:r>
-    </w:p>
-    <w:p>
-      <w:pPr>
-        <w:spacing w:before="240" w:after="80"/>
-      </w:pPr>
-      <w:r>
-        <w:rPr>
-          <w:rFonts w:ascii="Times New Roman" w:hAnsi="Times New Roman"/>
-          <w:b/>
-          <w:sz w:val="26"/>
-        </w:rPr>
-        <w:t>2. Autonomous Quarantine &amp; Validation Agent</w:t>
-      </w:r>
-    </w:p>
-    <w:p>
-      <w:pPr>
-        <w:spacing w:after="120" w:line="360" w:lineRule="auto"/>
-        <w:jc w:val="both"/>
-      </w:pPr>
-      <w:r>
-        <w:rPr>
-          <w:rFonts w:ascii="Times New Roman" w:hAnsi="Times New Roman"/>
-        </w:rPr>
-        <w:t>The Autonomous Quarantine Agent evaluates detected incidents against defined safety policies. If an incident risk score reaches or exceeds the threshold of 75, the agent automatically isolates the offending IP address into the quarantine database, effectively blocking it. It also provides security operators with manual revoke controls and AI-driven remediation advice.</w:t>
-      </w:r>
-    </w:p>
-    <w:p>
-      <w:pPr>
-        <w:spacing w:after="120" w:line="360" w:lineRule="auto"/>
-        <w:jc w:val="both"/>
-      </w:pPr>
-      <w:r>
-        <w:rPr>
-          <w:rFonts w:ascii="Times New Roman" w:hAnsi="Times New Roman"/>
-          <w:b/>
-        </w:rPr>
-        <w:t xml:space="preserve">• Responsibilities: </w:t>
-      </w:r>
-      <w:r>
-        <w:rPr>
-          <w:rFonts w:ascii="Times New Roman" w:hAnsi="Times New Roman"/>
-        </w:rPr>
-        <w:t>Validates threat severity; Enforces automated IP quarantine rules; Prevents false-positive lockouts through validation checks; Generates contextual AI remediation advice.</w:t>
-      </w:r>
-    </w:p>
-    <w:p>
-      <w:r>
-        <w:br w:type="page"/>
-      </w:r>
-    </w:p>
-    <w:p>
-      <w:pPr>
-        <w:spacing w:before="360" w:after="160"/>
-      </w:pPr>
-      <w:r>
-        <w:rPr>
-          <w:rFonts w:ascii="Times New Roman" w:hAnsi="Times New Roman"/>
-          <w:b/>
-          <w:sz w:val="32"/>
-        </w:rPr>
-        <w:t>Implementation</w:t>
-      </w:r>
-    </w:p>
-    <w:p>
-      <w:pPr>
-        <w:spacing w:after="120" w:line="360" w:lineRule="auto"/>
-        <w:jc w:val="both"/>
-      </w:pPr>
-      <w:r>
-        <w:rPr>
-          <w:rFonts w:ascii="Times New Roman" w:hAnsi="Times New Roman"/>
-        </w:rPr>
-        <w:t>The development of the SentinelGPT system was executed in structured phases to ensure robustness, security, scalability, and high performance:</w:t>
-      </w:r>
-    </w:p>
-    <w:p>
-      <w:pPr>
-        <w:spacing w:before="240" w:after="80"/>
-      </w:pPr>
-      <w:r>
-        <w:rPr>
-          <w:rFonts w:ascii="Times New Roman" w:hAnsi="Times New Roman"/>
-          <w:b/>
-          <w:sz w:val="26"/>
-        </w:rPr>
-        <w:t>Phase 1: Requirement Analysis &amp; Threat Modeling</w:t>
-      </w:r>
-    </w:p>
-    <w:p>
-      <w:pPr>
-        <w:spacing w:after="120" w:line="360" w:lineRule="auto"/>
-        <w:jc w:val="both"/>
-      </w:pPr>
-      <w:r>
-        <w:rPr>
-          <w:rFonts w:ascii="Times New Roman" w:hAnsi="Times New Roman"/>
-        </w:rPr>
-        <w:t>The initial phase involved identifying the pain points in traditional Security Operations Centers (SOC). Requirements for real-time monitoring, automated quarantine, and intelligent triage were gathered. Threat scoring metrics were defined, and a mapping strategy for MITRE ATT&amp;CK techniques was established.</w:t>
-      </w:r>
-    </w:p>
-    <w:p>
-      <w:pPr>
-        <w:spacing w:before="240" w:after="80"/>
-      </w:pPr>
-      <w:r>
-        <w:rPr>
-          <w:rFonts w:ascii="Times New Roman" w:hAnsi="Times New Roman"/>
-          <w:b/>
-          <w:sz w:val="26"/>
-        </w:rPr>
-        <w:t>Phase 2: System Design &amp; Architecture</w:t>
-      </w:r>
-    </w:p>
-    <w:p>
-      <w:pPr>
-        <w:spacing w:after="120" w:line="360" w:lineRule="auto"/>
-        <w:jc w:val="both"/>
-      </w:pPr>
-      <w:r>
-        <w:rPr>
-          <w:rFonts w:ascii="Times New Roman" w:hAnsi="Times New Roman"/>
-        </w:rPr>
-        <w:t>In this phase, the overall system architecture was designed. The decoupled approach utilizing a React Single Page Application (SPA) for the frontend and a FastAPI serverless backend was planned. API routing and agent workflows were also finalized.</w:t>
-      </w:r>
-    </w:p>
-    <w:p>
-      <w:pPr>
-        <w:spacing w:before="240" w:after="80"/>
-      </w:pPr>
-      <w:r>
-        <w:rPr>
-          <w:rFonts w:ascii="Times New Roman" w:hAnsi="Times New Roman"/>
-          <w:b/>
-          <w:sz w:val="26"/>
-        </w:rPr>
-        <w:t>Phase 3: Database &amp; Schema Design</w:t>
-      </w:r>
-    </w:p>
-    <w:p>
-      <w:pPr>
-        <w:spacing w:after="120" w:line="360" w:lineRule="auto"/>
-        <w:jc w:val="both"/>
-      </w:pPr>
-      <w:r>
-        <w:rPr>
-          <w:rFonts w:ascii="Times New Roman" w:hAnsi="Times New Roman"/>
-        </w:rPr>
-        <w:t>The database was designed using SQLAlchemy ORM to ensure secure and efficient data handling. Tables were created for Users (authentication), SOC Incidents (threat logs), Perimeter Logs (traffic), and Blocked IPs (quarantine list).</w:t>
-      </w:r>
-    </w:p>
-    <w:p>
-      <w:pPr>
-        <w:spacing w:before="240" w:after="80"/>
-      </w:pPr>
-      <w:r>
-        <w:rPr>
-          <w:rFonts w:ascii="Times New Roman" w:hAnsi="Times New Roman"/>
-          <w:b/>
-          <w:sz w:val="26"/>
-        </w:rPr>
-        <w:t>Phase 4: Frontend Component Development</w:t>
-      </w:r>
-    </w:p>
-    <w:p>
-      <w:pPr>
-        <w:spacing w:after="120" w:line="360" w:lineRule="auto"/>
-        <w:jc w:val="both"/>
-      </w:pPr>
-      <w:r>
-        <w:rPr>
-          <w:rFonts w:ascii="Times New Roman" w:hAnsi="Times New Roman"/>
-        </w:rPr>
-        <w:t>The user interface was constructed using React and Tailwind CSS principles. Glassmorphic components were developed to provide a modern aesthetic. Key components like the ThreatChart, RiskGaugeChart, BlockedIPs manager, and Login portal were implemented.</w:t>
-      </w:r>
-    </w:p>
-    <w:p>
-      <w:r>
-        <w:br w:type="page"/>
-      </w:r>
-    </w:p>
-    <w:p>
-      <w:pPr>
-        <w:spacing w:before="240" w:after="80"/>
-      </w:pPr>
-      <w:r>
-        <w:rPr>
-          <w:rFonts w:ascii="Times New Roman" w:hAnsi="Times New Roman"/>
-          <w:b/>
-          <w:sz w:val="26"/>
-        </w:rPr>
-        <w:t>Phase 5: Backend API &amp; Heuristics Implementation</w:t>
-      </w:r>
-    </w:p>
-    <w:p>
-      <w:pPr>
-        <w:spacing w:after="120" w:line="360" w:lineRule="auto"/>
-        <w:jc w:val="both"/>
-      </w:pPr>
-      <w:r>
-        <w:rPr>
-          <w:rFonts w:ascii="Times New Roman" w:hAnsi="Times New Roman"/>
-        </w:rPr>
-        <w:t>The backend logic was implemented using Python and FastAPI. RESTful routes such as `/api/snapshot`, `/api/block_ip`, and `/api/sim_threat` were developed. Secure authentication using JSON Web Tokens (JWT) was integrated to protect endpoints.</w:t>
-      </w:r>
-    </w:p>
-    <w:p>
-      <w:pPr>
-        <w:spacing w:before="240" w:after="80"/>
-      </w:pPr>
-      <w:r>
-        <w:rPr>
-          <w:rFonts w:ascii="Times New Roman" w:hAnsi="Times New Roman"/>
-          <w:b/>
-          <w:sz w:val="26"/>
-        </w:rPr>
-        <w:t>Phase 6: Agentic AI Development</w:t>
-      </w:r>
-    </w:p>
-    <w:p>
-      <w:pPr>
-        <w:spacing w:after="120" w:line="360" w:lineRule="auto"/>
-        <w:jc w:val="both"/>
-      </w:pPr>
-      <w:r>
-        <w:rPr>
-          <w:rFonts w:ascii="Times New Roman" w:hAnsi="Times New Roman"/>
-        </w:rPr>
-        <w:t>The intelligent software agents were programmed. The Telemetry Monitor Agent was built to calculate risk scores and assign MITRE ATT&amp;CK tags. The Autonomous Quarantine Agent was developed to enforce firewall rules based on the severity thresholds.</w:t>
-      </w:r>
-    </w:p>
-    <w:p>
-      <w:pPr>
-        <w:spacing w:before="240" w:after="80"/>
-      </w:pPr>
-      <w:r>
-        <w:rPr>
-          <w:rFonts w:ascii="Times New Roman" w:hAnsi="Times New Roman"/>
-          <w:b/>
-          <w:sz w:val="26"/>
-        </w:rPr>
-        <w:t>Phase 7: Real-Time Telemetry &amp; Alert Testing</w:t>
-      </w:r>
-    </w:p>
-    <w:p>
-      <w:pPr>
-        <w:spacing w:after="120" w:line="360" w:lineRule="auto"/>
-        <w:jc w:val="both"/>
-      </w:pPr>
-      <w:r>
-        <w:rPr>
-          <w:rFonts w:ascii="Times New Roman" w:hAnsi="Times New Roman"/>
-        </w:rPr>
-        <w:t>The integrated system underwent rigorous testing. Simulated threat data was injected to verify the telemetry ingestion rate, the accuracy of the heuristic scoring, and the reliability of the automatic firewall IP quarantine and manual override controls.</w:t>
-      </w:r>
-    </w:p>
-    <w:p>
-      <w:pPr>
-        <w:spacing w:before="240" w:after="80"/>
-      </w:pPr>
-      <w:r>
-        <w:rPr>
-          <w:rFonts w:ascii="Times New Roman" w:hAnsi="Times New Roman"/>
-          <w:b/>
-          <w:sz w:val="26"/>
-        </w:rPr>
-        <w:t>Phase 8: Cloud Deployment</w:t>
-      </w:r>
-    </w:p>
-    <w:p>
-      <w:pPr>
-        <w:spacing w:after="120" w:line="360" w:lineRule="auto"/>
-        <w:jc w:val="both"/>
-      </w:pPr>
-      <w:r>
-        <w:rPr>
-          <w:rFonts w:ascii="Times New Roman" w:hAnsi="Times New Roman"/>
-        </w:rPr>
-        <w:t>The final phase involved preparing the application for production. The full-stack application was deployed to the Vercel Serverless platform. Environment variables were configured, and production OpenAPI documentation was generated and verified.</w:t>
-      </w:r>
-    </w:p>
-    <w:p>
-      <w:r>
-        <w:br w:type="page"/>
-      </w:r>
-    </w:p>
-    <w:p>
-      <w:pPr>
-        <w:spacing w:before="360" w:after="160"/>
-      </w:pPr>
-      <w:r>
-        <w:rPr>
-          <w:rFonts w:ascii="Times New Roman" w:hAnsi="Times New Roman"/>
-          <w:b/>
-          <w:sz w:val="32"/>
-        </w:rPr>
-        <w:t>Applications</w:t>
-      </w:r>
-    </w:p>
-    <w:p>
-      <w:pPr>
-        <w:spacing w:after="120" w:line="360" w:lineRule="auto"/>
-        <w:jc w:val="both"/>
-      </w:pPr>
-      <w:r>
-        <w:rPr>
-          <w:rFonts w:ascii="Times New Roman" w:hAnsi="Times New Roman"/>
-        </w:rPr>
-        <w:t>SentinelGPT is highly versatile, scalable, and can be deployed across various domain environments to enhance cybersecurity posture:</w:t>
-      </w:r>
-    </w:p>
-    <w:p>
-      <w:pPr>
-        <w:spacing w:after="120" w:line="360" w:lineRule="auto"/>
-        <w:jc w:val="both"/>
-      </w:pPr>
-      <w:r>
-        <w:rPr>
-          <w:rFonts w:ascii="Times New Roman" w:hAnsi="Times New Roman"/>
-          <w:b/>
-        </w:rPr>
-        <w:t xml:space="preserve">1. Enterprise SOC Operations: </w:t>
-      </w:r>
-      <w:r>
-        <w:rPr>
-          <w:rFonts w:ascii="Times New Roman" w:hAnsi="Times New Roman"/>
-        </w:rPr>
-        <w:t xml:space="preserve"> Provides continuous network perimeter monitoring, real-time threat triage, and automated response capabilities for dedicated security teams.</w:t>
-      </w:r>
-    </w:p>
-    <w:p>
-      <w:pPr>
-        <w:spacing w:after="120" w:line="360" w:lineRule="auto"/>
-        <w:jc w:val="both"/>
-      </w:pPr>
-      <w:r>
-        <w:rPr>
-          <w:rFonts w:ascii="Times New Roman" w:hAnsi="Times New Roman"/>
-          <w:b/>
-        </w:rPr>
-        <w:t xml:space="preserve">2. Financial Institutions: </w:t>
-      </w:r>
-      <w:r>
-        <w:rPr>
-          <w:rFonts w:ascii="Times New Roman" w:hAnsi="Times New Roman"/>
-        </w:rPr>
-        <w:t xml:space="preserve"> Protects online banking portals and transaction gateways against credential stuffing, brute-force attacks, and fraud attempts.</w:t>
-      </w:r>
-    </w:p>
-    <w:p>
-      <w:pPr>
-        <w:spacing w:after="120" w:line="360" w:lineRule="auto"/>
-        <w:jc w:val="both"/>
-      </w:pPr>
-      <w:r>
-        <w:rPr>
-          <w:rFonts w:ascii="Times New Roman" w:hAnsi="Times New Roman"/>
-          <w:b/>
-        </w:rPr>
-        <w:t xml:space="preserve">3. Cloud Service Providers: </w:t>
-      </w:r>
-      <w:r>
-        <w:rPr>
-          <w:rFonts w:ascii="Times New Roman" w:hAnsi="Times New Roman"/>
-        </w:rPr>
-        <w:t xml:space="preserve"> Safeguards serverless APIs, microservices, and cloud infrastructure from unauthorized probes and exploitation attempts.</w:t>
-      </w:r>
-    </w:p>
-    <w:p>
-      <w:pPr>
-        <w:spacing w:after="120" w:line="360" w:lineRule="auto"/>
-        <w:jc w:val="both"/>
-      </w:pPr>
-      <w:r>
-        <w:rPr>
-          <w:rFonts w:ascii="Times New Roman" w:hAnsi="Times New Roman"/>
-          <w:b/>
-        </w:rPr>
-        <w:t xml:space="preserve">4. Healthcare Networks: </w:t>
-      </w:r>
-      <w:r>
-        <w:rPr>
-          <w:rFonts w:ascii="Times New Roman" w:hAnsi="Times New Roman"/>
-        </w:rPr>
-        <w:t xml:space="preserve"> Secures critical patient data endpoints and hospital networks against ransomware and malware payload injection.</w:t>
-      </w:r>
-    </w:p>
-    <w:p>
-      <w:pPr>
-        <w:spacing w:after="120" w:line="360" w:lineRule="auto"/>
-        <w:jc w:val="both"/>
-      </w:pPr>
-      <w:r>
-        <w:rPr>
-          <w:rFonts w:ascii="Times New Roman" w:hAnsi="Times New Roman"/>
-          <w:b/>
-        </w:rPr>
-        <w:t xml:space="preserve">5. E-Commerce Platforms: </w:t>
-      </w:r>
-      <w:r>
-        <w:rPr>
-          <w:rFonts w:ascii="Times New Roman" w:hAnsi="Times New Roman"/>
-        </w:rPr>
-        <w:t xml:space="preserve"> Prevents Distributed Denial of Service (DDoS) disruption and unauthorized SQL injection attacks during high-traffic sales events.</w:t>
-      </w:r>
-    </w:p>
-    <w:p>
-      <w:pPr>
-        <w:spacing w:after="120" w:line="360" w:lineRule="auto"/>
-        <w:jc w:val="both"/>
-      </w:pPr>
-      <w:r>
-        <w:rPr>
-          <w:rFonts w:ascii="Times New Roman" w:hAnsi="Times New Roman"/>
-          <w:b/>
-        </w:rPr>
-        <w:t xml:space="preserve">6. Academic Institutions: </w:t>
-      </w:r>
-      <w:r>
-        <w:rPr>
-          <w:rFonts w:ascii="Times New Roman" w:hAnsi="Times New Roman"/>
-        </w:rPr>
-        <w:t xml:space="preserve"> Monitors vast university campus networks, preventing faculty and student account hijacking and unauthorized access to academic records.</w:t>
-      </w:r>
-    </w:p>
-    <w:p>
-      <w:r>
-        <w:br w:type="page"/>
-      </w:r>
-    </w:p>
-    <w:p>
-      <w:pPr>
-        <w:spacing w:before="360" w:after="160"/>
-      </w:pPr>
-      <w:r>
-        <w:rPr>
-          <w:rFonts w:ascii="Times New Roman" w:hAnsi="Times New Roman"/>
-          <w:b/>
-          <w:sz w:val="32"/>
-        </w:rPr>
-        <w:t>User Interface Screenshots</w:t>
-      </w:r>
-    </w:p>
-    <w:p>
-      <w:pPr>
-        <w:spacing w:before="200" w:after="240"/>
-        <w:jc w:val="center"/>
-      </w:pPr>
-      <w:r>
-        <w:drawing>
-          <wp:inline xmlns:a="http://schemas.openxmlformats.org/drawingml/2006/main" xmlns:pic="http://schemas.openxmlformats.org/drawingml/2006/picture">
-            <wp:extent cx="5486400" cy="2606040"/>
-            <wp:docPr id="3" name="Picture 3"/>
-            <wp:cNvGraphicFramePr>
-              <a:graphicFrameLocks noChangeAspect="1"/>
-            </wp:cNvGraphicFramePr>
-            <a:graphic>
-              <a:graphicData uri="http://schemas.openxmlformats.org/drawingml/2006/picture">
-                <pic:pic>
-                  <pic:nvPicPr>
-                    <pic:cNvPr id="0" name="dashboard.png"/>
-                    <pic:cNvPicPr/>
-                  </pic:nvPicPr>
-                  <pic:blipFill>
-                    <a:blip r:embed="rId11"/>
-                    <a:stretch>
-                      <a:fillRect/>
-                    </a:stretch>
-                  </pic:blipFill>
-                  <pic:spPr>
-                    <a:xfrm>
-                      <a:off x="0" y="0"/>
-                      <a:ext cx="5486400" cy="2606040"/>
+                      <a:ext cx="5669280" cy="3559780"/>
                     </a:xfrm>
                     <a:prstGeom prst="rect"/>
                   </pic:spPr>
@@ -1660,66 +949,154 @@
     </w:p>
     <w:p>
       <w:pPr>
-        <w:spacing w:after="120" w:line="360" w:lineRule="auto"/>
+        <w:spacing w:after="120"/>
+        <w:jc w:val="center"/>
+      </w:pPr>
+      <w:r>
+        <w:rPr>
+          <w:rFonts w:ascii="Times New Roman" w:hAnsi="Times New Roman"/>
+          <w:i/>
+          <w:sz w:val="20"/>
+        </w:rPr>
+        <w:t>Fig 2: SentinelGPT Agent Workflow &amp; Data Flow</w:t>
+      </w:r>
+    </w:p>
+    <w:p>
+      <w:pPr>
+        <w:spacing w:before="120" w:after="40"/>
+      </w:pPr>
+      <w:r>
+        <w:rPr>
+          <w:rFonts w:ascii="Times New Roman" w:hAnsi="Times New Roman"/>
+          <w:b/>
+          <w:color w:val="1A4A7A"/>
+          <w:sz w:val="24"/>
+        </w:rPr>
+        <w:t>Agent 1 — Telemetry Monitor &amp; Threat Detection Agent</w:t>
+      </w:r>
+    </w:p>
+    <w:p>
+      <w:pPr>
+        <w:spacing w:before="0" w:after="80" w:line="276" w:lineRule="auto"/>
         <w:jc w:val="both"/>
       </w:pPr>
       <w:r>
         <w:rPr>
           <w:rFonts w:ascii="Times New Roman" w:hAnsi="Times New Roman"/>
+          <w:sz w:val="22"/>
         </w:rPr>
-        <w:t>Figure 1: SentinelGPT Real-Time SOC Dashboard &amp; Telemetry Feed</w:t>
+        <w:t>Continuously inspects incoming network log events, extracts IP details, computes a heuristic risk score (0–100), and assigns a MITRE ATT&amp;CK tactic/technique tag. Produces a structured incident payload that is persisted to the SOC Incidents database table and streamed to the frontend dashboard in real time.</w:t>
       </w:r>
     </w:p>
     <w:p>
       <w:pPr>
-        <w:spacing w:before="200" w:after="240"/>
-        <w:jc w:val="center"/>
+        <w:spacing w:before="120" w:after="40"/>
       </w:pPr>
       <w:r>
-        <w:drawing>
-          <wp:inline xmlns:a="http://schemas.openxmlformats.org/drawingml/2006/main" xmlns:pic="http://schemas.openxmlformats.org/drawingml/2006/picture">
-            <wp:extent cx="5303520" cy="2519172"/>
-            <wp:docPr id="4" name="Picture 4"/>
-            <wp:cNvGraphicFramePr>
-              <a:graphicFrameLocks noChangeAspect="1"/>
-            </wp:cNvGraphicFramePr>
-            <a:graphic>
-              <a:graphicData uri="http://schemas.openxmlformats.org/drawingml/2006/picture">
-                <pic:pic>
-                  <pic:nvPicPr>
-                    <pic:cNvPr id="0" name="login_page.png"/>
-                    <pic:cNvPicPr/>
-                  </pic:nvPicPr>
-                  <pic:blipFill>
-                    <a:blip r:embed="rId12"/>
-                    <a:stretch>
-                      <a:fillRect/>
-                    </a:stretch>
-                  </pic:blipFill>
-                  <pic:spPr>
-                    <a:xfrm>
-                      <a:off x="0" y="0"/>
-                      <a:ext cx="5303520" cy="2519172"/>
-                    </a:xfrm>
-                    <a:prstGeom prst="rect"/>
-                  </pic:spPr>
-                </pic:pic>
-              </a:graphicData>
-            </a:graphic>
-          </wp:inline>
-        </w:drawing>
+        <w:rPr>
+          <w:rFonts w:ascii="Times New Roman" w:hAnsi="Times New Roman"/>
+          <w:b/>
+          <w:color w:val="1A4A7A"/>
+          <w:sz w:val="24"/>
+        </w:rPr>
+        <w:t>Agent 2 — Autonomous Quarantine &amp; Validation Agent</w:t>
       </w:r>
     </w:p>
     <w:p>
       <w:pPr>
-        <w:spacing w:after="120" w:line="360" w:lineRule="auto"/>
+        <w:spacing w:before="0" w:after="80" w:line="276" w:lineRule="auto"/>
         <w:jc w:val="both"/>
       </w:pPr>
       <w:r>
         <w:rPr>
           <w:rFonts w:ascii="Times New Roman" w:hAnsi="Times New Roman"/>
+          <w:sz w:val="22"/>
         </w:rPr>
-        <w:t>Figure 2: Operator Authentication Portal with Quick Demo Access</w:t>
+        <w:t>Evaluates every incident against the severity threshold. Incidents scoring ≥ 75 are automatically written to the Blocked IPs table, effectively quarantining the offending IP. The agent also validates revoke requests and generates AI-driven remediation advice, preventing false-positive lockouts through secondary validation checks.</w:t>
+      </w:r>
+    </w:p>
+    <w:p>
+      <w:pPr>
+        <w:keepNext/>
+        <w:spacing w:before="200" w:after="80"/>
+      </w:pPr>
+      <w:r>
+        <w:rPr>
+          <w:rFonts w:ascii="Times New Roman" w:hAnsi="Times New Roman"/>
+          <w:b/>
+          <w:color w:val="003366"/>
+          <w:sz w:val="28"/>
+        </w:rPr>
+        <w:t>7.  Algorithms Used</w:t>
+      </w:r>
+    </w:p>
+    <w:p>
+      <w:pPr>
+        <w:pStyle w:val="ListBullet"/>
+        <w:spacing w:before="0" w:after="40" w:line="264" w:lineRule="auto"/>
+        <w:ind w:left="360"/>
+        <w:jc w:val="both"/>
+      </w:pPr>
+      <w:r>
+        <w:rPr>
+          <w:rFonts w:ascii="Times New Roman" w:hAnsi="Times New Roman"/>
+          <w:b/>
+          <w:sz w:val="22"/>
+        </w:rPr>
+        <w:t xml:space="preserve">Heuristic Threat Scoring: </w:t>
+      </w:r>
+      <w:r>
+        <w:rPr>
+          <w:rFonts w:ascii="Times New Roman" w:hAnsi="Times New Roman"/>
+          <w:sz w:val="22"/>
+        </w:rPr>
+        <w:t>Evaluates request velocity, payload anomaly patterns, and IP reputation to produce a normalized 0–100 risk score.</w:t>
+      </w:r>
+    </w:p>
+    <w:p>
+      <w:pPr>
+        <w:pStyle w:val="ListBullet"/>
+        <w:spacing w:before="0" w:after="40" w:line="264" w:lineRule="auto"/>
+        <w:ind w:left="360"/>
+        <w:jc w:val="both"/>
+      </w:pPr>
+      <w:r>
+        <w:rPr>
+          <w:rFonts w:ascii="Times New Roman" w:hAnsi="Times New Roman"/>
+          <w:b/>
+          <w:sz w:val="22"/>
+        </w:rPr>
+        <w:t xml:space="preserve">Severity Matrix Classifier: </w:t>
+      </w:r>
+      <w:r>
+        <w:rPr>
+          <w:rFonts w:ascii="Times New Roman" w:hAnsi="Times New Roman"/>
+          <w:sz w:val="22"/>
+        </w:rPr>
+        <w:t>Maps scores to Critical (≥75), High (60–74), Medium (40–59), and Low (&lt;40) priority tiers — driving automated responses.</w:t>
+      </w:r>
+    </w:p>
+    <w:p>
+      <w:pPr>
+        <w:pStyle w:val="ListBullet"/>
+        <w:spacing w:before="0" w:after="40" w:line="264" w:lineRule="auto"/>
+        <w:ind w:left="360"/>
+        <w:jc w:val="both"/>
+      </w:pPr>
+      <w:r>
+        <w:rPr>
+          <w:rFonts w:ascii="Times New Roman" w:hAnsi="Times New Roman"/>
+          <w:b/>
+          <w:sz w:val="22"/>
+        </w:rPr>
+        <w:t xml:space="preserve">Velocity Rate Anomaly Detector: </w:t>
+      </w:r>
+      <w:r>
+        <w:rPr>
+          <w:rFonts w:ascii="Times New Roman" w:hAnsi="Times New Roman"/>
+          <w:sz w:val="22"/>
+        </w:rPr>
+        <w:t>Monitors burst traffic spikes per IP over sliding time windows to detect DDoS and port-scan sweeps.</w:t>
       </w:r>
     </w:p>
     <w:p>
@@ -1729,106 +1106,354 @@
     </w:p>
     <w:p>
       <w:pPr>
-        <w:spacing w:before="200" w:after="240"/>
-        <w:jc w:val="center"/>
+        <w:keepNext/>
+        <w:spacing w:before="200" w:after="80"/>
       </w:pPr>
       <w:r>
-        <w:drawing>
-          <wp:inline xmlns:a="http://schemas.openxmlformats.org/drawingml/2006/main" xmlns:pic="http://schemas.openxmlformats.org/drawingml/2006/picture">
-            <wp:extent cx="5303520" cy="2519172"/>
-            <wp:docPr id="5" name="Picture 5"/>
-            <wp:cNvGraphicFramePr>
-              <a:graphicFrameLocks noChangeAspect="1"/>
-            </wp:cNvGraphicFramePr>
-            <a:graphic>
-              <a:graphicData uri="http://schemas.openxmlformats.org/drawingml/2006/picture">
-                <pic:pic>
-                  <pic:nvPicPr>
-                    <pic:cNvPr id="0" name="ai_chat.png"/>
-                    <pic:cNvPicPr/>
-                  </pic:nvPicPr>
-                  <pic:blipFill>
-                    <a:blip r:embed="rId13"/>
-                    <a:stretch>
-                      <a:fillRect/>
-                    </a:stretch>
-                  </pic:blipFill>
-                  <pic:spPr>
-                    <a:xfrm>
-                      <a:off x="0" y="0"/>
-                      <a:ext cx="5303520" cy="2519172"/>
-                    </a:xfrm>
-                    <a:prstGeom prst="rect"/>
-                  </pic:spPr>
-                </pic:pic>
-              </a:graphicData>
-            </a:graphic>
-          </wp:inline>
-        </w:drawing>
+        <w:rPr>
+          <w:rFonts w:ascii="Times New Roman" w:hAnsi="Times New Roman"/>
+          <w:b/>
+          <w:color w:val="003366"/>
+          <w:sz w:val="28"/>
+        </w:rPr>
+        <w:t>8.  Implementation Phases</w:t>
       </w:r>
     </w:p>
     <w:p>
       <w:pPr>
-        <w:spacing w:after="120" w:line="360" w:lineRule="auto"/>
+        <w:pStyle w:val="ListBullet"/>
+        <w:spacing w:before="0" w:after="40" w:line="264" w:lineRule="auto"/>
+        <w:ind w:left="360"/>
         <w:jc w:val="both"/>
       </w:pPr>
       <w:r>
         <w:rPr>
           <w:rFonts w:ascii="Times New Roman" w:hAnsi="Times New Roman"/>
+          <w:b/>
+          <w:sz w:val="22"/>
         </w:rPr>
-        <w:t>Figure 3: Conversational AI Threat Triage Assistant Interface</w:t>
+        <w:t xml:space="preserve">Phase 1 — Requirement Analysis: </w:t>
+      </w:r>
+      <w:r>
+        <w:rPr>
+          <w:rFonts w:ascii="Times New Roman" w:hAnsi="Times New Roman"/>
+          <w:sz w:val="22"/>
+        </w:rPr>
+        <w:t>Identified SOC pain points; defined threat scoring metrics; mapped MITRE ATT&amp;CK coverage.</w:t>
       </w:r>
     </w:p>
     <w:p>
       <w:pPr>
-        <w:spacing w:before="200" w:after="240"/>
-        <w:jc w:val="center"/>
-      </w:pPr>
-      <w:r>
-        <w:drawing>
-          <wp:inline xmlns:a="http://schemas.openxmlformats.org/drawingml/2006/main" xmlns:pic="http://schemas.openxmlformats.org/drawingml/2006/picture">
-            <wp:extent cx="5303520" cy="2519172"/>
-            <wp:docPr id="6" name="Picture 6"/>
-            <wp:cNvGraphicFramePr>
-              <a:graphicFrameLocks noChangeAspect="1"/>
-            </wp:cNvGraphicFramePr>
-            <a:graphic>
-              <a:graphicData uri="http://schemas.openxmlformats.org/drawingml/2006/picture">
-                <pic:pic>
-                  <pic:nvPicPr>
-                    <pic:cNvPr id="0" name="file_scanner.png"/>
-                    <pic:cNvPicPr/>
-                  </pic:nvPicPr>
-                  <pic:blipFill>
-                    <a:blip r:embed="rId14"/>
-                    <a:stretch>
-                      <a:fillRect/>
-                    </a:stretch>
-                  </pic:blipFill>
-                  <pic:spPr>
-                    <a:xfrm>
-                      <a:off x="0" y="0"/>
-                      <a:ext cx="5303520" cy="2519172"/>
-                    </a:xfrm>
-                    <a:prstGeom prst="rect"/>
-                  </pic:spPr>
-                </pic:pic>
-              </a:graphicData>
-            </a:graphic>
-          </wp:inline>
-        </w:drawing>
-      </w:r>
-    </w:p>
-    <w:p>
-      <w:pPr>
-        <w:spacing w:after="120" w:line="360" w:lineRule="auto"/>
+        <w:pStyle w:val="ListBullet"/>
+        <w:spacing w:before="0" w:after="40" w:line="264" w:lineRule="auto"/>
+        <w:ind w:left="360"/>
         <w:jc w:val="both"/>
       </w:pPr>
       <w:r>
         <w:rPr>
           <w:rFonts w:ascii="Times New Roman" w:hAnsi="Times New Roman"/>
+          <w:b/>
+          <w:sz w:val="22"/>
         </w:rPr>
-        <w:t>Figure 4: Heuristic Payload File &amp; Log Scanner Interface</w:t>
+        <w:t xml:space="preserve">Phase 2 — System Design: </w:t>
+      </w:r>
+      <w:r>
+        <w:rPr>
+          <w:rFonts w:ascii="Times New Roman" w:hAnsi="Times New Roman"/>
+          <w:sz w:val="22"/>
+        </w:rPr>
+        <w:t>Architected decoupled React SPA + FastAPI serverless backend; finalized API contracts.</w:t>
+      </w:r>
+    </w:p>
+    <w:p>
+      <w:pPr>
+        <w:pStyle w:val="ListBullet"/>
+        <w:spacing w:before="0" w:after="40" w:line="264" w:lineRule="auto"/>
+        <w:ind w:left="360"/>
+        <w:jc w:val="both"/>
+      </w:pPr>
+      <w:r>
+        <w:rPr>
+          <w:rFonts w:ascii="Times New Roman" w:hAnsi="Times New Roman"/>
+          <w:b/>
+          <w:sz w:val="22"/>
+        </w:rPr>
+        <w:t xml:space="preserve">Phase 3 — Database Schema: </w:t>
+      </w:r>
+      <w:r>
+        <w:rPr>
+          <w:rFonts w:ascii="Times New Roman" w:hAnsi="Times New Roman"/>
+          <w:sz w:val="22"/>
+        </w:rPr>
+        <w:t>Designed SQLAlchemy ORM models — Users, SOC Incidents, Perimeter Logs, Blocked IPs.</w:t>
+      </w:r>
+    </w:p>
+    <w:p>
+      <w:pPr>
+        <w:pStyle w:val="ListBullet"/>
+        <w:spacing w:before="0" w:after="40" w:line="264" w:lineRule="auto"/>
+        <w:ind w:left="360"/>
+        <w:jc w:val="both"/>
+      </w:pPr>
+      <w:r>
+        <w:rPr>
+          <w:rFonts w:ascii="Times New Roman" w:hAnsi="Times New Roman"/>
+          <w:b/>
+          <w:sz w:val="22"/>
+        </w:rPr>
+        <w:t xml:space="preserve">Phase 4 — Frontend Development: </w:t>
+      </w:r>
+      <w:r>
+        <w:rPr>
+          <w:rFonts w:ascii="Times New Roman" w:hAnsi="Times New Roman"/>
+          <w:sz w:val="22"/>
+        </w:rPr>
+        <w:t>Built glassmorphic components — ThreatChart, RiskGaugeChart, BlockedIPs, Login, Dashboard.</w:t>
+      </w:r>
+    </w:p>
+    <w:p>
+      <w:pPr>
+        <w:pStyle w:val="ListBullet"/>
+        <w:spacing w:before="0" w:after="40" w:line="264" w:lineRule="auto"/>
+        <w:ind w:left="360"/>
+        <w:jc w:val="both"/>
+      </w:pPr>
+      <w:r>
+        <w:rPr>
+          <w:rFonts w:ascii="Times New Roman" w:hAnsi="Times New Roman"/>
+          <w:b/>
+          <w:sz w:val="22"/>
+        </w:rPr>
+        <w:t xml:space="preserve">Phase 5 — Backend &amp; JWT Auth: </w:t>
+      </w:r>
+      <w:r>
+        <w:rPr>
+          <w:rFonts w:ascii="Times New Roman" w:hAnsi="Times New Roman"/>
+          <w:sz w:val="22"/>
+        </w:rPr>
+        <w:t>Implemented REST routes (/api/snapshot, /api/block_ip, /api/sim_threat) with HS256 JWT auth.</w:t>
+      </w:r>
+    </w:p>
+    <w:p>
+      <w:pPr>
+        <w:pStyle w:val="ListBullet"/>
+        <w:spacing w:before="0" w:after="40" w:line="264" w:lineRule="auto"/>
+        <w:ind w:left="360"/>
+        <w:jc w:val="both"/>
+      </w:pPr>
+      <w:r>
+        <w:rPr>
+          <w:rFonts w:ascii="Times New Roman" w:hAnsi="Times New Roman"/>
+          <w:b/>
+          <w:sz w:val="22"/>
+        </w:rPr>
+        <w:t xml:space="preserve">Phase 6 — Agentic AI Development: </w:t>
+      </w:r>
+      <w:r>
+        <w:rPr>
+          <w:rFonts w:ascii="Times New Roman" w:hAnsi="Times New Roman"/>
+          <w:sz w:val="22"/>
+        </w:rPr>
+        <w:t>Programmed the Telemetry Monitor Agent and Autonomous Quarantine Agent workflows.</w:t>
+      </w:r>
+    </w:p>
+    <w:p>
+      <w:pPr>
+        <w:pStyle w:val="ListBullet"/>
+        <w:spacing w:before="0" w:after="40" w:line="264" w:lineRule="auto"/>
+        <w:ind w:left="360"/>
+        <w:jc w:val="both"/>
+      </w:pPr>
+      <w:r>
+        <w:rPr>
+          <w:rFonts w:ascii="Times New Roman" w:hAnsi="Times New Roman"/>
+          <w:b/>
+          <w:sz w:val="22"/>
+        </w:rPr>
+        <w:t xml:space="preserve">Phase 7 — Integration &amp; Testing: </w:t>
+      </w:r>
+      <w:r>
+        <w:rPr>
+          <w:rFonts w:ascii="Times New Roman" w:hAnsi="Times New Roman"/>
+          <w:sz w:val="22"/>
+        </w:rPr>
+        <w:t>Injected simulated threats to verify heuristic accuracy, quarantine triggers, and revoke controls.</w:t>
+      </w:r>
+    </w:p>
+    <w:p>
+      <w:pPr>
+        <w:pStyle w:val="ListBullet"/>
+        <w:spacing w:before="0" w:after="40" w:line="264" w:lineRule="auto"/>
+        <w:ind w:left="360"/>
+        <w:jc w:val="both"/>
+      </w:pPr>
+      <w:r>
+        <w:rPr>
+          <w:rFonts w:ascii="Times New Roman" w:hAnsi="Times New Roman"/>
+          <w:b/>
+          <w:sz w:val="22"/>
+        </w:rPr>
+        <w:t xml:space="preserve">Phase 8 — Cloud Deployment: </w:t>
+      </w:r>
+      <w:r>
+        <w:rPr>
+          <w:rFonts w:ascii="Times New Roman" w:hAnsi="Times New Roman"/>
+          <w:sz w:val="22"/>
+        </w:rPr>
+        <w:t>Deployed full-stack to Vercel Serverless; configured env vars; verified Swagger docs in production.</w:t>
+      </w:r>
+    </w:p>
+    <w:p>
+      <w:pPr>
+        <w:keepNext/>
+        <w:spacing w:before="200" w:after="80"/>
+      </w:pPr>
+      <w:r>
+        <w:rPr>
+          <w:rFonts w:ascii="Times New Roman" w:hAnsi="Times New Roman"/>
+          <w:b/>
+          <w:color w:val="003366"/>
+          <w:sz w:val="28"/>
+        </w:rPr>
+        <w:t>9.  Applications</w:t>
+      </w:r>
+    </w:p>
+    <w:p>
+      <w:pPr>
+        <w:pStyle w:val="ListBullet"/>
+        <w:spacing w:before="0" w:after="40" w:line="264" w:lineRule="auto"/>
+        <w:ind w:left="360"/>
+        <w:jc w:val="both"/>
+      </w:pPr>
+      <w:r>
+        <w:rPr>
+          <w:rFonts w:ascii="Times New Roman" w:hAnsi="Times New Roman"/>
+          <w:b/>
+          <w:sz w:val="22"/>
+        </w:rPr>
+        <w:t xml:space="preserve">Enterprise SOC Operations: </w:t>
+      </w:r>
+      <w:r>
+        <w:rPr>
+          <w:rFonts w:ascii="Times New Roman" w:hAnsi="Times New Roman"/>
+          <w:sz w:val="22"/>
+        </w:rPr>
+        <w:t>Continuous perimeter monitoring, real-time threat triage, and automated response for security teams.</w:t>
+      </w:r>
+    </w:p>
+    <w:p>
+      <w:pPr>
+        <w:pStyle w:val="ListBullet"/>
+        <w:spacing w:before="0" w:after="40" w:line="264" w:lineRule="auto"/>
+        <w:ind w:left="360"/>
+        <w:jc w:val="both"/>
+      </w:pPr>
+      <w:r>
+        <w:rPr>
+          <w:rFonts w:ascii="Times New Roman" w:hAnsi="Times New Roman"/>
+          <w:b/>
+          <w:sz w:val="22"/>
+        </w:rPr>
+        <w:t xml:space="preserve">Financial Institutions: </w:t>
+      </w:r>
+      <w:r>
+        <w:rPr>
+          <w:rFonts w:ascii="Times New Roman" w:hAnsi="Times New Roman"/>
+          <w:sz w:val="22"/>
+        </w:rPr>
+        <w:t>Protects banking portals from credential stuffing, brute-force, and transaction fraud.</w:t>
+      </w:r>
+    </w:p>
+    <w:p>
+      <w:pPr>
+        <w:pStyle w:val="ListBullet"/>
+        <w:spacing w:before="0" w:after="40" w:line="264" w:lineRule="auto"/>
+        <w:ind w:left="360"/>
+        <w:jc w:val="both"/>
+      </w:pPr>
+      <w:r>
+        <w:rPr>
+          <w:rFonts w:ascii="Times New Roman" w:hAnsi="Times New Roman"/>
+          <w:b/>
+          <w:sz w:val="22"/>
+        </w:rPr>
+        <w:t xml:space="preserve">Cloud Service Providers: </w:t>
+      </w:r>
+      <w:r>
+        <w:rPr>
+          <w:rFonts w:ascii="Times New Roman" w:hAnsi="Times New Roman"/>
+          <w:sz w:val="22"/>
+        </w:rPr>
+        <w:t>Safeguards serverless APIs and microservices from unauthorized probes and exploitation.</w:t>
+      </w:r>
+    </w:p>
+    <w:p>
+      <w:pPr>
+        <w:pStyle w:val="ListBullet"/>
+        <w:spacing w:before="0" w:after="40" w:line="264" w:lineRule="auto"/>
+        <w:ind w:left="360"/>
+        <w:jc w:val="both"/>
+      </w:pPr>
+      <w:r>
+        <w:rPr>
+          <w:rFonts w:ascii="Times New Roman" w:hAnsi="Times New Roman"/>
+          <w:b/>
+          <w:sz w:val="22"/>
+        </w:rPr>
+        <w:t xml:space="preserve">Healthcare Networks: </w:t>
+      </w:r>
+      <w:r>
+        <w:rPr>
+          <w:rFonts w:ascii="Times New Roman" w:hAnsi="Times New Roman"/>
+          <w:sz w:val="22"/>
+        </w:rPr>
+        <w:t>Secures patient data endpoints against ransomware and malware payload injection.</w:t>
+      </w:r>
+    </w:p>
+    <w:p>
+      <w:pPr>
+        <w:pStyle w:val="ListBullet"/>
+        <w:spacing w:before="0" w:after="40" w:line="264" w:lineRule="auto"/>
+        <w:ind w:left="360"/>
+        <w:jc w:val="both"/>
+      </w:pPr>
+      <w:r>
+        <w:rPr>
+          <w:rFonts w:ascii="Times New Roman" w:hAnsi="Times New Roman"/>
+          <w:b/>
+          <w:sz w:val="22"/>
+        </w:rPr>
+        <w:t xml:space="preserve">E-Commerce Platforms: </w:t>
+      </w:r>
+      <w:r>
+        <w:rPr>
+          <w:rFonts w:ascii="Times New Roman" w:hAnsi="Times New Roman"/>
+          <w:sz w:val="22"/>
+        </w:rPr>
+        <w:t>Prevents DDoS disruption and SQL injection attacks during high-traffic periods.</w:t>
+      </w:r>
+    </w:p>
+    <w:p>
+      <w:pPr>
+        <w:pStyle w:val="ListBullet"/>
+        <w:spacing w:before="0" w:after="40" w:line="264" w:lineRule="auto"/>
+        <w:ind w:left="360"/>
+        <w:jc w:val="both"/>
+      </w:pPr>
+      <w:r>
+        <w:rPr>
+          <w:rFonts w:ascii="Times New Roman" w:hAnsi="Times New Roman"/>
+          <w:b/>
+          <w:sz w:val="22"/>
+        </w:rPr>
+        <w:t xml:space="preserve">Academic Institutions: </w:t>
+      </w:r>
+      <w:r>
+        <w:rPr>
+          <w:rFonts w:ascii="Times New Roman" w:hAnsi="Times New Roman"/>
+          <w:sz w:val="22"/>
+        </w:rPr>
+        <w:t>Monitors campus networks and prevents faculty/student account hijacking.</w:t>
       </w:r>
     </w:p>
     <w:p>
@@ -1838,180 +1463,624 @@
     </w:p>
     <w:p>
       <w:pPr>
-        <w:spacing w:before="360" w:after="160"/>
+        <w:keepNext/>
+        <w:spacing w:before="200" w:after="80"/>
       </w:pPr>
       <w:r>
         <w:rPr>
           <w:rFonts w:ascii="Times New Roman" w:hAnsi="Times New Roman"/>
           <w:b/>
-          <w:sz w:val="32"/>
+          <w:color w:val="003366"/>
+          <w:sz w:val="28"/>
         </w:rPr>
-        <w:t>Conclusion</w:t>
+        <w:t>10.  User Interface Screenshots</w:t>
+      </w:r>
+    </w:p>
+    <w:tbl>
+      <w:tblPr>
+        <w:tblStyle w:val="TableGrid"/>
+        <w:tblW w:type="auto" w:w="0"/>
+        <w:jc w:val="center"/>
+        <w:tblLook w:firstColumn="1" w:firstRow="1" w:lastColumn="0" w:lastRow="0" w:noHBand="0" w:noVBand="1" w:val="04A0"/>
+      </w:tblPr>
+      <w:tblGrid>
+        <w:gridCol w:w="4680"/>
+        <w:gridCol w:w="4680"/>
+      </w:tblGrid>
+      <w:tr>
+        <w:tc>
+          <w:tcPr>
+            <w:tcW w:type="dxa" w:w="4680"/>
+            <w:tcBorders>
+              <w:top w:val="none"/>
+              <w:bottom w:val="none"/>
+              <w:left w:val="none"/>
+              <w:right w:val="none"/>
+            </w:tcBorders>
+          </w:tcPr>
+          <w:p>
+            <w:pPr>
+              <w:spacing w:after="40"/>
+              <w:jc w:val="center"/>
+            </w:pPr>
+            <w:r>
+              <w:drawing>
+                <wp:inline xmlns:a="http://schemas.openxmlformats.org/drawingml/2006/main" xmlns:pic="http://schemas.openxmlformats.org/drawingml/2006/picture">
+                  <wp:extent cx="2743200" cy="1303020"/>
+                  <wp:docPr id="3" name="Picture 3"/>
+                  <wp:cNvGraphicFramePr>
+                    <a:graphicFrameLocks noChangeAspect="1"/>
+                  </wp:cNvGraphicFramePr>
+                  <a:graphic>
+                    <a:graphicData uri="http://schemas.openxmlformats.org/drawingml/2006/picture">
+                      <pic:pic>
+                        <pic:nvPicPr>
+                          <pic:cNvPr id="0" name="dashboard.png"/>
+                          <pic:cNvPicPr/>
+                        </pic:nvPicPr>
+                        <pic:blipFill>
+                          <a:blip r:embed="rId11"/>
+                          <a:stretch>
+                            <a:fillRect/>
+                          </a:stretch>
+                        </pic:blipFill>
+                        <pic:spPr>
+                          <a:xfrm>
+                            <a:off x="0" y="0"/>
+                            <a:ext cx="2743200" cy="1303020"/>
+                          </a:xfrm>
+                          <a:prstGeom prst="rect"/>
+                        </pic:spPr>
+                      </pic:pic>
+                    </a:graphicData>
+                  </a:graphic>
+                </wp:inline>
+              </w:drawing>
+            </w:r>
+          </w:p>
+        </w:tc>
+        <w:tc>
+          <w:tcPr>
+            <w:tcW w:type="dxa" w:w="4680"/>
+            <w:tcBorders>
+              <w:top w:val="none"/>
+              <w:bottom w:val="none"/>
+              <w:left w:val="none"/>
+              <w:right w:val="none"/>
+            </w:tcBorders>
+          </w:tcPr>
+          <w:p>
+            <w:pPr>
+              <w:spacing w:after="40"/>
+              <w:jc w:val="center"/>
+            </w:pPr>
+            <w:r>
+              <w:drawing>
+                <wp:inline xmlns:a="http://schemas.openxmlformats.org/drawingml/2006/main" xmlns:pic="http://schemas.openxmlformats.org/drawingml/2006/picture">
+                  <wp:extent cx="2743200" cy="1303020"/>
+                  <wp:docPr id="4" name="Picture 4"/>
+                  <wp:cNvGraphicFramePr>
+                    <a:graphicFrameLocks noChangeAspect="1"/>
+                  </wp:cNvGraphicFramePr>
+                  <a:graphic>
+                    <a:graphicData uri="http://schemas.openxmlformats.org/drawingml/2006/picture">
+                      <pic:pic>
+                        <pic:nvPicPr>
+                          <pic:cNvPr id="0" name="login_page.png"/>
+                          <pic:cNvPicPr/>
+                        </pic:nvPicPr>
+                        <pic:blipFill>
+                          <a:blip r:embed="rId12"/>
+                          <a:stretch>
+                            <a:fillRect/>
+                          </a:stretch>
+                        </pic:blipFill>
+                        <pic:spPr>
+                          <a:xfrm>
+                            <a:off x="0" y="0"/>
+                            <a:ext cx="2743200" cy="1303020"/>
+                          </a:xfrm>
+                          <a:prstGeom prst="rect"/>
+                        </pic:spPr>
+                      </pic:pic>
+                    </a:graphicData>
+                  </a:graphic>
+                </wp:inline>
+              </w:drawing>
+            </w:r>
+          </w:p>
+        </w:tc>
+      </w:tr>
+      <w:tr>
+        <w:tc>
+          <w:tcPr>
+            <w:tcW w:type="dxa" w:w="4680"/>
+            <w:tcBorders>
+              <w:top w:val="none"/>
+              <w:bottom w:val="none"/>
+              <w:left w:val="none"/>
+              <w:right w:val="none"/>
+            </w:tcBorders>
+          </w:tcPr>
+          <w:p>
+            <w:pPr>
+              <w:spacing w:after="160"/>
+              <w:jc w:val="center"/>
+            </w:pPr>
+            <w:r>
+              <w:rPr>
+                <w:i/>
+                <w:sz w:val="19"/>
+              </w:rPr>
+              <w:t>Fig 3: SOC Operations Dashboard</w:t>
+            </w:r>
+          </w:p>
+        </w:tc>
+        <w:tc>
+          <w:tcPr>
+            <w:tcW w:type="dxa" w:w="4680"/>
+            <w:tcBorders>
+              <w:top w:val="none"/>
+              <w:bottom w:val="none"/>
+              <w:left w:val="none"/>
+              <w:right w:val="none"/>
+            </w:tcBorders>
+          </w:tcPr>
+          <w:p>
+            <w:pPr>
+              <w:spacing w:after="160"/>
+              <w:jc w:val="center"/>
+            </w:pPr>
+            <w:r>
+              <w:rPr>
+                <w:i/>
+                <w:sz w:val="19"/>
+              </w:rPr>
+              <w:t>Fig 4: Operator Login Portal</w:t>
+            </w:r>
+          </w:p>
+        </w:tc>
+      </w:tr>
+    </w:tbl>
+    <w:tbl>
+      <w:tblPr>
+        <w:tblStyle w:val="TableGrid"/>
+        <w:tblW w:type="auto" w:w="0"/>
+        <w:jc w:val="center"/>
+        <w:tblLook w:firstColumn="1" w:firstRow="1" w:lastColumn="0" w:lastRow="0" w:noHBand="0" w:noVBand="1" w:val="04A0"/>
+      </w:tblPr>
+      <w:tblGrid>
+        <w:gridCol w:w="4680"/>
+        <w:gridCol w:w="4680"/>
+      </w:tblGrid>
+      <w:tr>
+        <w:tc>
+          <w:tcPr>
+            <w:tcW w:type="dxa" w:w="4680"/>
+            <w:tcBorders>
+              <w:top w:val="none"/>
+              <w:bottom w:val="none"/>
+              <w:left w:val="none"/>
+              <w:right w:val="none"/>
+            </w:tcBorders>
+          </w:tcPr>
+          <w:p>
+            <w:pPr>
+              <w:spacing w:after="40"/>
+              <w:jc w:val="center"/>
+            </w:pPr>
+            <w:r>
+              <w:drawing>
+                <wp:inline xmlns:a="http://schemas.openxmlformats.org/drawingml/2006/main" xmlns:pic="http://schemas.openxmlformats.org/drawingml/2006/picture">
+                  <wp:extent cx="2743200" cy="1303020"/>
+                  <wp:docPr id="5" name="Picture 5"/>
+                  <wp:cNvGraphicFramePr>
+                    <a:graphicFrameLocks noChangeAspect="1"/>
+                  </wp:cNvGraphicFramePr>
+                  <a:graphic>
+                    <a:graphicData uri="http://schemas.openxmlformats.org/drawingml/2006/picture">
+                      <pic:pic>
+                        <pic:nvPicPr>
+                          <pic:cNvPr id="0" name="ai_chat.png"/>
+                          <pic:cNvPicPr/>
+                        </pic:nvPicPr>
+                        <pic:blipFill>
+                          <a:blip r:embed="rId13"/>
+                          <a:stretch>
+                            <a:fillRect/>
+                          </a:stretch>
+                        </pic:blipFill>
+                        <pic:spPr>
+                          <a:xfrm>
+                            <a:off x="0" y="0"/>
+                            <a:ext cx="2743200" cy="1303020"/>
+                          </a:xfrm>
+                          <a:prstGeom prst="rect"/>
+                        </pic:spPr>
+                      </pic:pic>
+                    </a:graphicData>
+                  </a:graphic>
+                </wp:inline>
+              </w:drawing>
+            </w:r>
+          </w:p>
+        </w:tc>
+        <w:tc>
+          <w:tcPr>
+            <w:tcW w:type="dxa" w:w="4680"/>
+            <w:tcBorders>
+              <w:top w:val="none"/>
+              <w:bottom w:val="none"/>
+              <w:left w:val="none"/>
+              <w:right w:val="none"/>
+            </w:tcBorders>
+          </w:tcPr>
+          <w:p>
+            <w:pPr>
+              <w:spacing w:after="40"/>
+              <w:jc w:val="center"/>
+            </w:pPr>
+            <w:r>
+              <w:drawing>
+                <wp:inline xmlns:a="http://schemas.openxmlformats.org/drawingml/2006/main" xmlns:pic="http://schemas.openxmlformats.org/drawingml/2006/picture">
+                  <wp:extent cx="2743200" cy="1303020"/>
+                  <wp:docPr id="6" name="Picture 6"/>
+                  <wp:cNvGraphicFramePr>
+                    <a:graphicFrameLocks noChangeAspect="1"/>
+                  </wp:cNvGraphicFramePr>
+                  <a:graphic>
+                    <a:graphicData uri="http://schemas.openxmlformats.org/drawingml/2006/picture">
+                      <pic:pic>
+                        <pic:nvPicPr>
+                          <pic:cNvPr id="0" name="file_scanner.png"/>
+                          <pic:cNvPicPr/>
+                        </pic:nvPicPr>
+                        <pic:blipFill>
+                          <a:blip r:embed="rId14"/>
+                          <a:stretch>
+                            <a:fillRect/>
+                          </a:stretch>
+                        </pic:blipFill>
+                        <pic:spPr>
+                          <a:xfrm>
+                            <a:off x="0" y="0"/>
+                            <a:ext cx="2743200" cy="1303020"/>
+                          </a:xfrm>
+                          <a:prstGeom prst="rect"/>
+                        </pic:spPr>
+                      </pic:pic>
+                    </a:graphicData>
+                  </a:graphic>
+                </wp:inline>
+              </w:drawing>
+            </w:r>
+          </w:p>
+        </w:tc>
+      </w:tr>
+      <w:tr>
+        <w:tc>
+          <w:tcPr>
+            <w:tcW w:type="dxa" w:w="4680"/>
+            <w:tcBorders>
+              <w:top w:val="none"/>
+              <w:bottom w:val="none"/>
+              <w:left w:val="none"/>
+              <w:right w:val="none"/>
+            </w:tcBorders>
+          </w:tcPr>
+          <w:p>
+            <w:pPr>
+              <w:spacing w:after="160"/>
+              <w:jc w:val="center"/>
+            </w:pPr>
+            <w:r>
+              <w:rPr>
+                <w:i/>
+                <w:sz w:val="19"/>
+              </w:rPr>
+              <w:t>Fig 5: AI Threat Triage Assistant</w:t>
+            </w:r>
+          </w:p>
+        </w:tc>
+        <w:tc>
+          <w:tcPr>
+            <w:tcW w:type="dxa" w:w="4680"/>
+            <w:tcBorders>
+              <w:top w:val="none"/>
+              <w:bottom w:val="none"/>
+              <w:left w:val="none"/>
+              <w:right w:val="none"/>
+            </w:tcBorders>
+          </w:tcPr>
+          <w:p>
+            <w:pPr>
+              <w:spacing w:after="160"/>
+              <w:jc w:val="center"/>
+            </w:pPr>
+            <w:r>
+              <w:rPr>
+                <w:i/>
+                <w:sz w:val="19"/>
+              </w:rPr>
+              <w:t>Fig 6: Heuristic Payload Scanner</w:t>
+            </w:r>
+          </w:p>
+        </w:tc>
+      </w:tr>
+    </w:tbl>
+    <w:p>
+      <w:r>
+        <w:br w:type="page"/>
       </w:r>
     </w:p>
     <w:p>
       <w:pPr>
-        <w:spacing w:after="120" w:line="360" w:lineRule="auto"/>
+        <w:keepNext/>
+        <w:spacing w:before="200" w:after="80"/>
+      </w:pPr>
+      <w:r>
+        <w:rPr>
+          <w:rFonts w:ascii="Times New Roman" w:hAnsi="Times New Roman"/>
+          <w:b/>
+          <w:color w:val="003366"/>
+          <w:sz w:val="28"/>
+        </w:rPr>
+        <w:t>11.  Conclusion</w:t>
+      </w:r>
+    </w:p>
+    <w:p>
+      <w:pPr>
+        <w:spacing w:before="0" w:after="80" w:line="276" w:lineRule="auto"/>
         <w:jc w:val="both"/>
       </w:pPr>
       <w:r>
         <w:rPr>
           <w:rFonts w:ascii="Times New Roman" w:hAnsi="Times New Roman"/>
+          <w:sz w:val="22"/>
         </w:rPr>
-        <w:t>The SentinelGPT AI-Powered Cyber Defense Framework provides an efficient, intelligent, and scalable solution for modern cybersecurity operations. By replacing manual log review with autonomous software agents, the system drastically reduces alert fatigue, minimizes incident response latency, and ensures continuous network perimeter protection. Built using robust technologies including React 19, FastAPI, and SQLAlchemy, the platform demonstrates an effective and modern paradigm for automated cyber defense.</w:t>
+        <w:t>SentinelGPT demonstrates that integrating Agentic AI with a modern full-stack architecture (React 19, FastAPI, SQLAlchemy, Vercel) can transform traditional reactive security operations into a proactive, automated cyber defense system. By replacing manual log review with autonomous software agents, the platform eliminates alert fatigue, reduces incident response latency to near zero, and provides continuous 24/7 network perimeter protection — setting a strong foundation for next-generation AI-powered cybersecurity frameworks.</w:t>
       </w:r>
     </w:p>
     <w:p>
       <w:pPr>
-        <w:spacing w:before="360" w:after="160"/>
+        <w:keepNext/>
+        <w:spacing w:before="200" w:after="80"/>
       </w:pPr>
       <w:r>
         <w:rPr>
           <w:rFonts w:ascii="Times New Roman" w:hAnsi="Times New Roman"/>
           <w:b/>
-          <w:sz w:val="32"/>
+          <w:color w:val="003366"/>
+          <w:sz w:val="28"/>
         </w:rPr>
-        <w:t>References</w:t>
+        <w:t>12.  References</w:t>
       </w:r>
     </w:p>
     <w:p>
       <w:pPr>
-        <w:spacing w:after="120" w:line="360" w:lineRule="auto"/>
-        <w:jc w:val="both"/>
-      </w:pPr>
-      <w:r>
-        <w:rPr>
-          <w:rFonts w:ascii="Times New Roman" w:hAnsi="Times New Roman"/>
-        </w:rPr>
-        <w:t>1. FastAPI Documentation. FastAPI Framework. Available at: https://fastapi.tiangolo.com/</w:t>
-      </w:r>
-    </w:p>
-    <w:p>
-      <w:pPr>
-        <w:spacing w:after="120" w:line="360" w:lineRule="auto"/>
-        <w:jc w:val="both"/>
-      </w:pPr>
-      <w:r>
-        <w:rPr>
-          <w:rFonts w:ascii="Times New Roman" w:hAnsi="Times New Roman"/>
-        </w:rPr>
-        <w:t>2. React Documentation. React 19 User Interface Library. Available at: https://react.dev/</w:t>
-      </w:r>
-    </w:p>
-    <w:p>
-      <w:pPr>
-        <w:spacing w:after="120" w:line="360" w:lineRule="auto"/>
-        <w:jc w:val="both"/>
-      </w:pPr>
-      <w:r>
-        <w:rPr>
-          <w:rFonts w:ascii="Times New Roman" w:hAnsi="Times New Roman"/>
-        </w:rPr>
-        <w:t>3. MITRE ATT&amp;CK Framework. Enterprise Tactics &amp; Techniques. Available at: https://attack.mitre.org/</w:t>
-      </w:r>
-    </w:p>
-    <w:p>
-      <w:pPr>
-        <w:spacing w:after="120" w:line="360" w:lineRule="auto"/>
-        <w:jc w:val="both"/>
-      </w:pPr>
-      <w:r>
-        <w:rPr>
-          <w:rFonts w:ascii="Times New Roman" w:hAnsi="Times New Roman"/>
-        </w:rPr>
-        <w:t>4. SQLAlchemy Documentation. Object Relational Mapper for Python. Available at: https://docs.sqlalchemy.org/</w:t>
-      </w:r>
-    </w:p>
-    <w:p>
-      <w:pPr>
-        <w:spacing w:after="120" w:line="360" w:lineRule="auto"/>
-        <w:jc w:val="both"/>
-      </w:pPr>
-      <w:r>
-        <w:rPr>
-          <w:rFonts w:ascii="Times New Roman" w:hAnsi="Times New Roman"/>
-        </w:rPr>
-        <w:t>5. Vercel Serverless Documentation. Deploying Web Applications. Available at: https://vercel.com/docs</w:t>
-      </w:r>
-    </w:p>
-    <w:p>
-      <w:pPr>
-        <w:spacing w:after="120" w:line="360" w:lineRule="auto"/>
-        <w:jc w:val="both"/>
-      </w:pPr>
-      <w:r>
-        <w:rPr>
-          <w:rFonts w:ascii="Times New Roman" w:hAnsi="Times New Roman"/>
-        </w:rPr>
-        <w:t>6. Russell, S., &amp; Norvig, P. (2021). Artificial Intelligence: A Modern Approach (4th ed.). Pearson.</w:t>
-      </w:r>
-    </w:p>
-    <w:p>
-      <w:pPr>
-        <w:spacing w:before="360" w:after="160"/>
-      </w:pPr>
-      <w:r>
-        <w:rPr>
-          <w:rFonts w:ascii="Times New Roman" w:hAnsi="Times New Roman"/>
-          <w:b/>
-          <w:sz w:val="32"/>
-        </w:rPr>
-        <w:t>Live Website &amp; GitHub Links</w:t>
-      </w:r>
-    </w:p>
-    <w:p>
-      <w:pPr>
-        <w:spacing w:after="120" w:line="360" w:lineRule="auto"/>
-        <w:jc w:val="both"/>
-      </w:pPr>
-      <w:r>
-        <w:rPr>
-          <w:rFonts w:ascii="Times New Roman" w:hAnsi="Times New Roman"/>
-        </w:rPr>
-        <w:t>The SentinelGPT project is fully cloud-deployed and accessible online. Evaluators can access the live working dashboard, API documentation, and complete source code using the links below:</w:t>
-      </w:r>
-    </w:p>
-    <w:p>
-      <w:pPr>
-        <w:spacing w:after="120" w:line="360" w:lineRule="auto"/>
+        <w:pStyle w:val="ListBullet"/>
+        <w:spacing w:before="0" w:after="40" w:line="264" w:lineRule="auto"/>
+        <w:ind w:left="360"/>
         <w:jc w:val="both"/>
       </w:pPr>
       <w:r>
         <w:rPr>
           <w:rFonts w:ascii="Times New Roman" w:hAnsi="Times New Roman"/>
           <w:b/>
+          <w:sz w:val="22"/>
         </w:rPr>
-        <w:t xml:space="preserve">• Single Live Dashboard Deployment Link: </w:t>
+        <w:t xml:space="preserve">[1]  </w:t>
       </w:r>
       <w:r>
         <w:rPr>
           <w:rFonts w:ascii="Times New Roman" w:hAnsi="Times New Roman"/>
+          <w:sz w:val="22"/>
+        </w:rPr>
+        <w:t>FastAPI Documentation — https://fastapi.tiangolo.com/</w:t>
+      </w:r>
+    </w:p>
+    <w:p>
+      <w:pPr>
+        <w:pStyle w:val="ListBullet"/>
+        <w:spacing w:before="0" w:after="40" w:line="264" w:lineRule="auto"/>
+        <w:ind w:left="360"/>
+        <w:jc w:val="both"/>
+      </w:pPr>
+      <w:r>
+        <w:rPr>
+          <w:rFonts w:ascii="Times New Roman" w:hAnsi="Times New Roman"/>
+          <w:b/>
+          <w:sz w:val="22"/>
+        </w:rPr>
+        <w:t xml:space="preserve">[2]  </w:t>
+      </w:r>
+      <w:r>
+        <w:rPr>
+          <w:rFonts w:ascii="Times New Roman" w:hAnsi="Times New Roman"/>
+          <w:sz w:val="22"/>
+        </w:rPr>
+        <w:t>React 19 Docs — https://react.dev/</w:t>
+      </w:r>
+    </w:p>
+    <w:p>
+      <w:pPr>
+        <w:pStyle w:val="ListBullet"/>
+        <w:spacing w:before="0" w:after="40" w:line="264" w:lineRule="auto"/>
+        <w:ind w:left="360"/>
+        <w:jc w:val="both"/>
+      </w:pPr>
+      <w:r>
+        <w:rPr>
+          <w:rFonts w:ascii="Times New Roman" w:hAnsi="Times New Roman"/>
+          <w:b/>
+          <w:sz w:val="22"/>
+        </w:rPr>
+        <w:t xml:space="preserve">[3]  </w:t>
+      </w:r>
+      <w:r>
+        <w:rPr>
+          <w:rFonts w:ascii="Times New Roman" w:hAnsi="Times New Roman"/>
+          <w:sz w:val="22"/>
+        </w:rPr>
+        <w:t>MITRE ATT&amp;CK Framework — https://attack.mitre.org/</w:t>
+      </w:r>
+    </w:p>
+    <w:p>
+      <w:pPr>
+        <w:pStyle w:val="ListBullet"/>
+        <w:spacing w:before="0" w:after="40" w:line="264" w:lineRule="auto"/>
+        <w:ind w:left="360"/>
+        <w:jc w:val="both"/>
+      </w:pPr>
+      <w:r>
+        <w:rPr>
+          <w:rFonts w:ascii="Times New Roman" w:hAnsi="Times New Roman"/>
+          <w:b/>
+          <w:sz w:val="22"/>
+        </w:rPr>
+        <w:t xml:space="preserve">[4]  </w:t>
+      </w:r>
+      <w:r>
+        <w:rPr>
+          <w:rFonts w:ascii="Times New Roman" w:hAnsi="Times New Roman"/>
+          <w:sz w:val="22"/>
+        </w:rPr>
+        <w:t>SQLAlchemy ORM — https://docs.sqlalchemy.org/</w:t>
+      </w:r>
+    </w:p>
+    <w:p>
+      <w:pPr>
+        <w:pStyle w:val="ListBullet"/>
+        <w:spacing w:before="0" w:after="40" w:line="264" w:lineRule="auto"/>
+        <w:ind w:left="360"/>
+        <w:jc w:val="both"/>
+      </w:pPr>
+      <w:r>
+        <w:rPr>
+          <w:rFonts w:ascii="Times New Roman" w:hAnsi="Times New Roman"/>
+          <w:b/>
+          <w:sz w:val="22"/>
+        </w:rPr>
+        <w:t xml:space="preserve">[5]  </w:t>
+      </w:r>
+      <w:r>
+        <w:rPr>
+          <w:rFonts w:ascii="Times New Roman" w:hAnsi="Times New Roman"/>
+          <w:sz w:val="22"/>
+        </w:rPr>
+        <w:t>Vercel Docs — https://vercel.com/docs</w:t>
+      </w:r>
+    </w:p>
+    <w:p>
+      <w:pPr>
+        <w:pStyle w:val="ListBullet"/>
+        <w:spacing w:before="0" w:after="40" w:line="264" w:lineRule="auto"/>
+        <w:ind w:left="360"/>
+        <w:jc w:val="both"/>
+      </w:pPr>
+      <w:r>
+        <w:rPr>
+          <w:rFonts w:ascii="Times New Roman" w:hAnsi="Times New Roman"/>
+          <w:b/>
+          <w:sz w:val="22"/>
+        </w:rPr>
+        <w:t xml:space="preserve">[6]  </w:t>
+      </w:r>
+      <w:r>
+        <w:rPr>
+          <w:rFonts w:ascii="Times New Roman" w:hAnsi="Times New Roman"/>
+          <w:sz w:val="22"/>
+        </w:rPr>
+        <w:t>Russell, S. &amp; Norvig, P. (2021). Artificial Intelligence: A Modern Approach (4th ed.). Pearson.</w:t>
+      </w:r>
+    </w:p>
+    <w:p>
+      <w:pPr>
+        <w:keepNext/>
+        <w:spacing w:before="200" w:after="80"/>
+      </w:pPr>
+      <w:r>
+        <w:rPr>
+          <w:rFonts w:ascii="Times New Roman" w:hAnsi="Times New Roman"/>
+          <w:b/>
+          <w:color w:val="003366"/>
+          <w:sz w:val="28"/>
+        </w:rPr>
+        <w:t>13.  Live Deployment &amp; GitHub Links</w:t>
+      </w:r>
+    </w:p>
+    <w:p>
+      <w:pPr>
+        <w:pStyle w:val="ListBullet"/>
+        <w:spacing w:before="0" w:after="40" w:line="264" w:lineRule="auto"/>
+        <w:ind w:left="360"/>
+        <w:jc w:val="both"/>
+      </w:pPr>
+      <w:r>
+        <w:rPr>
+          <w:rFonts w:ascii="Times New Roman" w:hAnsi="Times New Roman"/>
+          <w:b/>
+          <w:sz w:val="22"/>
+        </w:rPr>
+        <w:t xml:space="preserve">Single Live Dashboard Link:  </w:t>
+      </w:r>
+      <w:r>
+        <w:rPr>
+          <w:rFonts w:ascii="Times New Roman" w:hAnsi="Times New Roman"/>
+          <w:sz w:val="22"/>
         </w:rPr>
         <w:t>https://sentinelgpt-ai.vercel.app</w:t>
       </w:r>
     </w:p>
     <w:p>
       <w:pPr>
-        <w:spacing w:after="120" w:line="360" w:lineRule="auto"/>
+        <w:pStyle w:val="ListBullet"/>
+        <w:spacing w:before="0" w:after="40" w:line="264" w:lineRule="auto"/>
+        <w:ind w:left="360"/>
         <w:jc w:val="both"/>
       </w:pPr>
       <w:r>
         <w:rPr>
           <w:rFonts w:ascii="Times New Roman" w:hAnsi="Times New Roman"/>
           <w:b/>
+          <w:sz w:val="22"/>
         </w:rPr>
-        <w:t xml:space="preserve">• Official Project GitHub Repository: </w:t>
+        <w:t xml:space="preserve">Interactive Swagger API Docs: </w:t>
       </w:r>
       <w:r>
         <w:rPr>
           <w:rFonts w:ascii="Times New Roman" w:hAnsi="Times New Roman"/>
+          <w:sz w:val="22"/>
+        </w:rPr>
+        <w:t>https://sentinelgpt-ai.vercel.app/docs</w:t>
+      </w:r>
+    </w:p>
+    <w:p>
+      <w:pPr>
+        <w:pStyle w:val="ListBullet"/>
+        <w:spacing w:before="0" w:after="40" w:line="264" w:lineRule="auto"/>
+        <w:ind w:left="360"/>
+        <w:jc w:val="both"/>
+      </w:pPr>
+      <w:r>
+        <w:rPr>
+          <w:rFonts w:ascii="Times New Roman" w:hAnsi="Times New Roman"/>
+          <w:b/>
+          <w:sz w:val="22"/>
+        </w:rPr>
+        <w:t xml:space="preserve">Official GitHub Repository:   </w:t>
+      </w:r>
+      <w:r>
+        <w:rPr>
+          <w:rFonts w:ascii="Times New Roman" w:hAnsi="Times New Roman"/>
+          <w:sz w:val="22"/>
         </w:rPr>
         <w:t>https://github.com/Pravallika2025/sentigraud-ai-.git</w:t>
       </w:r>
     </w:p>
     <w:sectPr>
       <w:pgSz w:w="12240" w:h="15840"/>
-      <w:pgMar w:top="1440" w:right="1440" w:bottom="1440" w:left="1440" w:header="720" w:footer="720" w:gutter="0"/>
+      <w:pgMar w:top="1296" w:right="1440" w:bottom="1296" w:left="1440" w:header="720" w:footer="720" w:gutter="0"/>
       <w:cols w:space="720"/>
       <w:docGrid w:linePitch="360"/>
     </w:sectPr>
@@ -2384,8 +2453,7 @@
     <w:rsid w:val="00FC693F"/>
     <w:rPr>
       <w:rFonts w:ascii="Times New Roman" w:hAnsi="Times New Roman"/>
-      <w:color w:val="000000"/>
-      <w:sz w:val="24"/>
+      <w:sz w:val="22"/>
     </w:rPr>
   </w:style>
   <w:style w:type="paragraph" w:styleId="Header">

</xml_diff>

<commit_message>
Final professional Word report: corrected title, Pravallika Kalangi 24VV1F0044, calibri style, striped tables, 2-col screenshots
</commit_message>
<xml_diff>
--- a/docs/SentinelGPT_Project_Report.docx
+++ b/docs/SentinelGPT_Project_Report.docx
@@ -4,14 +4,30 @@
   <w:body>
     <w:p>
       <w:pPr>
-        <w:spacing w:before="1200" w:after="320"/>
+        <w:spacing w:before="0" w:after="120"/>
         <w:jc w:val="center"/>
       </w:pPr>
       <w:r>
         <w:rPr>
-          <w:rFonts w:ascii="Times New Roman" w:hAnsi="Times New Roman"/>
+          <w:rFonts w:ascii="Calibri" w:hAnsi="Calibri"/>
           <w:b/>
-          <w:sz w:val="40"/>
+          <w:color w:val="555555"/>
+          <w:sz w:val="26"/>
+        </w:rPr>
+        <w:t>PROJECT TECHNICAL REPORT</w:t>
+      </w:r>
+    </w:p>
+    <w:p>
+      <w:pPr>
+        <w:spacing w:before="480" w:after="280"/>
+        <w:jc w:val="center"/>
+      </w:pPr>
+      <w:r>
+        <w:rPr>
+          <w:rFonts w:ascii="Calibri" w:hAnsi="Calibri"/>
+          <w:b/>
+          <w:color w:val="002750"/>
+          <w:sz w:val="48"/>
         </w:rPr>
         <w:t>SentinelGPT: An AI-Powered Large Language Model</w:t>
         <w:br/>
@@ -22,181 +38,105 @@
     </w:p>
     <w:p>
       <w:pPr>
-        <w:spacing w:after="2000"/>
+        <w:spacing w:after="720"/>
         <w:jc w:val="center"/>
       </w:pPr>
       <w:r>
         <w:rPr>
-          <w:rFonts w:ascii="Times New Roman" w:hAnsi="Times New Roman"/>
-          <w:sz w:val="26"/>
-        </w:rPr>
-        <w:t>A Project Report Submitted for the Partial Fulfillment</w:t>
-        <w:br/>
-        <w:t>of the Requirements for the Award of the Degree of</w:t>
-        <w:br/>
-        <w:t>Master of Computer Applications (MCA)</w:t>
-      </w:r>
-    </w:p>
-    <w:p>
-      <w:pPr>
-        <w:spacing w:after="80"/>
-        <w:jc w:val="center"/>
-      </w:pPr>
-      <w:r>
-        <w:rPr>
-          <w:rFonts w:ascii="Times New Roman" w:hAnsi="Times New Roman"/>
-          <w:b w:val="0"/>
+          <w:rFonts w:ascii="Calibri" w:hAnsi="Calibri"/>
+          <w:i/>
+          <w:color w:val="555555"/>
           <w:sz w:val="24"/>
         </w:rPr>
-        <w:t>Submitted by</w:t>
+        <w:t>Real-time AI-powered cybersecurity monitoring, autonomous threat detection,</w:t>
         <w:br/>
-      </w:r>
-      <w:r>
-        <w:rPr>
-          <w:rFonts w:ascii="Times New Roman" w:hAnsi="Times New Roman"/>
-          <w:b/>
-          <w:sz w:val="30"/>
-        </w:rPr>
-        <w:t>Pravallika Kalangi</w:t>
-        <w:br/>
-      </w:r>
-      <w:r>
-        <w:rPr>
-          <w:rFonts w:ascii="Times New Roman" w:hAnsi="Times New Roman"/>
-          <w:b w:val="0"/>
-          <w:sz w:val="26"/>
-        </w:rPr>
-        <w:t>Roll No: 24VV1F0044</w:t>
-        <w:br/>
-      </w:r>
-      <w:r>
-        <w:rPr>
-          <w:rFonts w:ascii="Times New Roman" w:hAnsi="Times New Roman"/>
-          <w:b w:val="0"/>
-          <w:sz w:val="26"/>
-        </w:rPr>
-        <w:t>MCA 2nd Year</w:t>
-      </w:r>
-    </w:p>
-    <w:p>
-      <w:r>
-        <w:br w:type="page"/>
-      </w:r>
-    </w:p>
-    <w:p>
-      <w:pPr>
-        <w:keepNext/>
-        <w:spacing w:before="200" w:after="80"/>
-      </w:pPr>
-      <w:r>
-        <w:rPr>
-          <w:rFonts w:ascii="Times New Roman" w:hAnsi="Times New Roman"/>
-          <w:b/>
-          <w:color w:val="003366"/>
-          <w:sz w:val="28"/>
-        </w:rPr>
-        <w:t>1.  Problem Statement</w:t>
-      </w:r>
-    </w:p>
-    <w:p>
-      <w:pPr>
-        <w:spacing w:before="0" w:after="80" w:line="276" w:lineRule="auto"/>
-        <w:jc w:val="both"/>
-      </w:pPr>
-      <w:r>
-        <w:rPr>
-          <w:rFonts w:ascii="Times New Roman" w:hAnsi="Times New Roman"/>
-          <w:sz w:val="22"/>
-        </w:rPr>
-        <w:t>Modern cybersecurity operations face severe challenges managing the overwhelming volume of network telemetry and security alerts generated by enterprise IT infrastructure. Security information and event management (SIEM) systems process millions of event logs, network probes, and API requests daily. Many organizations still rely on manual log inspection, static firewall rules, and fragmented monitoring tools — creating operational bottlenecks, analyst alert fatigue, and dangerously slow incident response times.</w:t>
-      </w:r>
-    </w:p>
-    <w:p>
-      <w:pPr>
-        <w:spacing w:before="0" w:after="80" w:line="276" w:lineRule="auto"/>
-        <w:jc w:val="both"/>
-      </w:pPr>
-      <w:r>
-        <w:rPr>
-          <w:rFonts w:ascii="Times New Roman" w:hAnsi="Times New Roman"/>
-          <w:sz w:val="22"/>
-        </w:rPr>
-        <w:t>A key challenge is identifying sophisticated multi-stage attacks such as credential stuffing, DDoS vectors, SQL injection payloads, and brute-force authentication spikes. Traditional rule-based intrusion detection systems generate high false-positive rates while failing to correlate anomalous behavior with the MITRE ATT&amp;CK framework. Manual quarantine procedures further delay response, exposing networks to lateral movement and data exfiltration.</w:t>
-      </w:r>
-    </w:p>
-    <w:p>
-      <w:pPr>
-        <w:spacing w:before="0" w:after="80" w:line="276" w:lineRule="auto"/>
-        <w:jc w:val="both"/>
-      </w:pPr>
-      <w:r>
-        <w:rPr>
-          <w:rFonts w:ascii="Times New Roman" w:hAnsi="Times New Roman"/>
-          <w:sz w:val="22"/>
-        </w:rPr>
-        <w:t>To address these challenges, this project proposes SentinelGPT: an AI-Powered LLM Framework for Advanced Cyber Threat Detection and Analysis. It uses intelligent software agents to automatically monitor telemetry, calculate risk scores using heuristic anomaly algorithms, map threats to MITRE ATT&amp;CK, and autonomously quarantine high-risk IP addresses — significantly reducing manual effort and incident response latency.</w:t>
-      </w:r>
-    </w:p>
-    <w:p>
-      <w:pPr>
-        <w:keepNext/>
-        <w:spacing w:before="200" w:after="80"/>
-      </w:pPr>
-      <w:r>
-        <w:rPr>
-          <w:rFonts w:ascii="Times New Roman" w:hAnsi="Times New Roman"/>
-          <w:b/>
-          <w:color w:val="003366"/>
-          <w:sz w:val="28"/>
-        </w:rPr>
-        <w:t>2.  Difference: Traditional System vs. Proposed SentinelGPT</w:t>
+        <w:t>and intelligent incident response dashboard</w:t>
       </w:r>
     </w:p>
     <w:tbl>
       <w:tblPr>
         <w:tblStyle w:val="TableGrid"/>
         <w:tblW w:type="auto" w:w="0"/>
+        <w:tblLook w:firstColumn="1" w:firstRow="1" w:lastColumn="0" w:lastRow="0" w:noHBand="0" w:noVBand="1" w:val="04A0"/>
+      </w:tblPr>
+      <w:tblGrid>
+        <w:gridCol w:w="8928"/>
+      </w:tblGrid>
+      <w:tr>
+        <w:trPr>
+          <w:trHeight w:val="40"/>
+        </w:trPr>
+        <w:tc>
+          <w:tcPr>
+            <w:tcW w:type="dxa" w:w="8928"/>
+            <w:shd w:val="clear" w:color="auto" w:fill="003366"/>
+          </w:tcPr>
+          <w:p>
+            <w:r/>
+          </w:p>
+        </w:tc>
+      </w:tr>
+    </w:tbl>
+    <w:p>
+      <w:pPr>
+        <w:spacing w:after="120"/>
+      </w:pPr>
+    </w:p>
+    <w:tbl>
+      <w:tblPr>
+        <w:tblW w:type="auto" w:w="0"/>
         <w:jc w:val="center"/>
         <w:tblLook w:firstColumn="1" w:firstRow="1" w:lastColumn="0" w:lastRow="0" w:noHBand="0" w:noVBand="1" w:val="04A0"/>
       </w:tblPr>
       <w:tblGrid>
-        <w:gridCol w:w="4680"/>
-        <w:gridCol w:w="4680"/>
+        <w:gridCol w:w="4464"/>
+        <w:gridCol w:w="4464"/>
       </w:tblGrid>
       <w:tr>
         <w:tc>
           <w:tcPr>
-            <w:tcW w:type="dxa" w:w="4680"/>
-            <w:shd w:val="clear" w:color="auto" w:fill="D0E4F7"/>
+            <w:tcW w:type="dxa" w:w="4464"/>
+            <w:tcBorders>
+              <w:top w:val="single" w:sz="4" w:color="B0C4DE"/>
+              <w:bottom w:val="single" w:sz="4" w:color="B0C4DE"/>
+              <w:left w:val="single" w:sz="4" w:color="B0C4DE"/>
+              <w:right w:val="single" w:sz="4" w:color="B0C4DE"/>
+            </w:tcBorders>
           </w:tcPr>
           <w:p>
             <w:pPr>
-              <w:jc w:val="center"/>
+              <w:spacing w:after="80"/>
             </w:pPr>
             <w:r>
               <w:rPr>
+                <w:rFonts w:ascii="Calibri" w:hAnsi="Calibri"/>
                 <w:b/>
-                <w:sz w:val="22"/>
+                <w:color w:val="002750"/>
               </w:rPr>
-              <w:t>Traditional Security System</w:t>
+              <w:t>Project Title:</w:t>
             </w:r>
           </w:p>
         </w:tc>
         <w:tc>
           <w:tcPr>
-            <w:tcW w:type="dxa" w:w="4680"/>
-            <w:shd w:val="clear" w:color="auto" w:fill="D0E4F7"/>
+            <w:tcW w:type="dxa" w:w="4464"/>
+            <w:tcBorders>
+              <w:top w:val="single" w:sz="4" w:color="B0C4DE"/>
+              <w:bottom w:val="single" w:sz="4" w:color="B0C4DE"/>
+              <w:left w:val="single" w:sz="4" w:color="B0C4DE"/>
+              <w:right w:val="single" w:sz="4" w:color="B0C4DE"/>
+            </w:tcBorders>
           </w:tcPr>
           <w:p>
             <w:pPr>
-              <w:jc w:val="center"/>
+              <w:spacing w:after="80"/>
             </w:pPr>
             <w:r>
               <w:rPr>
-                <w:b/>
+                <w:rFonts w:ascii="Calibri" w:hAnsi="Calibri"/>
                 <w:sz w:val="22"/>
               </w:rPr>
-              <w:t>Proposed SentinelGPT System</w:t>
+              <w:t>SentinelGPT: An AI-Powered LLM Framework for Advanced Cyber Threat Detection</w:t>
             </w:r>
           </w:p>
         </w:tc>
@@ -204,27 +144,48 @@
       <w:tr>
         <w:tc>
           <w:tcPr>
-            <w:tcW w:type="dxa" w:w="4680"/>
+            <w:tcW w:type="dxa" w:w="4464"/>
+            <w:tcBorders>
+              <w:top w:val="single" w:sz="4" w:color="B0C4DE"/>
+              <w:bottom w:val="single" w:sz="4" w:color="B0C4DE"/>
+              <w:left w:val="single" w:sz="4" w:color="B0C4DE"/>
+              <w:right w:val="single" w:sz="4" w:color="B0C4DE"/>
+            </w:tcBorders>
           </w:tcPr>
           <w:p>
+            <w:pPr>
+              <w:spacing w:after="80"/>
+            </w:pPr>
             <w:r>
               <w:rPr>
-                <w:sz w:val="20"/>
+                <w:rFonts w:ascii="Calibri" w:hAnsi="Calibri"/>
+                <w:b/>
+                <w:color w:val="002750"/>
               </w:rPr>
-              <w:t>Manual log inspection and static firewall rules.</w:t>
+              <w:t>Submitted by:</w:t>
             </w:r>
           </w:p>
         </w:tc>
         <w:tc>
           <w:tcPr>
-            <w:tcW w:type="dxa" w:w="4680"/>
+            <w:tcW w:type="dxa" w:w="4464"/>
+            <w:tcBorders>
+              <w:top w:val="single" w:sz="4" w:color="B0C4DE"/>
+              <w:bottom w:val="single" w:sz="4" w:color="B0C4DE"/>
+              <w:left w:val="single" w:sz="4" w:color="B0C4DE"/>
+              <w:right w:val="single" w:sz="4" w:color="B0C4DE"/>
+            </w:tcBorders>
           </w:tcPr>
           <w:p>
+            <w:pPr>
+              <w:spacing w:after="80"/>
+            </w:pPr>
             <w:r>
               <w:rPr>
-                <w:sz w:val="20"/>
+                <w:rFonts w:ascii="Calibri" w:hAnsi="Calibri"/>
+                <w:sz w:val="22"/>
               </w:rPr>
-              <w:t>Autonomous agents monitor telemetry 24/7 with no manual input.</w:t>
+              <w:t>Pravallika Kalangi</w:t>
             </w:r>
           </w:p>
         </w:tc>
@@ -232,27 +193,48 @@
       <w:tr>
         <w:tc>
           <w:tcPr>
-            <w:tcW w:type="dxa" w:w="4680"/>
+            <w:tcW w:type="dxa" w:w="4464"/>
+            <w:tcBorders>
+              <w:top w:val="single" w:sz="4" w:color="B0C4DE"/>
+              <w:bottom w:val="single" w:sz="4" w:color="B0C4DE"/>
+              <w:left w:val="single" w:sz="4" w:color="B0C4DE"/>
+              <w:right w:val="single" w:sz="4" w:color="B0C4DE"/>
+            </w:tcBorders>
           </w:tcPr>
           <w:p>
+            <w:pPr>
+              <w:spacing w:after="80"/>
+            </w:pPr>
             <w:r>
               <w:rPr>
-                <w:sz w:val="20"/>
+                <w:rFonts w:ascii="Calibri" w:hAnsi="Calibri"/>
+                <w:b/>
+                <w:color w:val="002750"/>
               </w:rPr>
-              <w:t>High alert fatigue and delayed incident detection.</w:t>
+              <w:t>Roll Number:</w:t>
             </w:r>
           </w:p>
         </w:tc>
         <w:tc>
           <w:tcPr>
-            <w:tcW w:type="dxa" w:w="4680"/>
+            <w:tcW w:type="dxa" w:w="4464"/>
+            <w:tcBorders>
+              <w:top w:val="single" w:sz="4" w:color="B0C4DE"/>
+              <w:bottom w:val="single" w:sz="4" w:color="B0C4DE"/>
+              <w:left w:val="single" w:sz="4" w:color="B0C4DE"/>
+              <w:right w:val="single" w:sz="4" w:color="B0C4DE"/>
+            </w:tcBorders>
           </w:tcPr>
           <w:p>
+            <w:pPr>
+              <w:spacing w:after="80"/>
+            </w:pPr>
             <w:r>
               <w:rPr>
-                <w:sz w:val="20"/>
+                <w:rFonts w:ascii="Calibri" w:hAnsi="Calibri"/>
+                <w:sz w:val="22"/>
               </w:rPr>
-              <w:t>Real-time heuristic scoring (0–100) eliminates fatigue and detects threats instantly.</w:t>
+              <w:t>24VV1F0044</w:t>
             </w:r>
           </w:p>
         </w:tc>
@@ -260,27 +242,48 @@
       <w:tr>
         <w:tc>
           <w:tcPr>
-            <w:tcW w:type="dxa" w:w="4680"/>
+            <w:tcW w:type="dxa" w:w="4464"/>
+            <w:tcBorders>
+              <w:top w:val="single" w:sz="4" w:color="B0C4DE"/>
+              <w:bottom w:val="single" w:sz="4" w:color="B0C4DE"/>
+              <w:left w:val="single" w:sz="4" w:color="B0C4DE"/>
+              <w:right w:val="single" w:sz="4" w:color="B0C4DE"/>
+            </w:tcBorders>
           </w:tcPr>
           <w:p>
+            <w:pPr>
+              <w:spacing w:after="80"/>
+            </w:pPr>
             <w:r>
               <w:rPr>
-                <w:sz w:val="20"/>
+                <w:rFonts w:ascii="Calibri" w:hAnsi="Calibri"/>
+                <w:b/>
+                <w:color w:val="002750"/>
               </w:rPr>
-              <w:t>IP blocking requires manual admin intervention.</w:t>
+              <w:t>Programme:</w:t>
             </w:r>
           </w:p>
         </w:tc>
         <w:tc>
           <w:tcPr>
-            <w:tcW w:type="dxa" w:w="4680"/>
+            <w:tcW w:type="dxa" w:w="4464"/>
+            <w:tcBorders>
+              <w:top w:val="single" w:sz="4" w:color="B0C4DE"/>
+              <w:bottom w:val="single" w:sz="4" w:color="B0C4DE"/>
+              <w:left w:val="single" w:sz="4" w:color="B0C4DE"/>
+              <w:right w:val="single" w:sz="4" w:color="B0C4DE"/>
+            </w:tcBorders>
           </w:tcPr>
           <w:p>
+            <w:pPr>
+              <w:spacing w:after="80"/>
+            </w:pPr>
             <w:r>
               <w:rPr>
-                <w:sz w:val="20"/>
+                <w:rFonts w:ascii="Calibri" w:hAnsi="Calibri"/>
+                <w:sz w:val="22"/>
               </w:rPr>
-              <w:t>Autonomous Quarantine Agent auto-isolates IPs with score ≥ 75 in real time.</w:t>
+              <w:t>Master of Computer Applications (MCA) — 2nd Year</w:t>
             </w:r>
           </w:p>
         </w:tc>
@@ -288,27 +291,48 @@
       <w:tr>
         <w:tc>
           <w:tcPr>
-            <w:tcW w:type="dxa" w:w="4680"/>
+            <w:tcW w:type="dxa" w:w="4464"/>
+            <w:tcBorders>
+              <w:top w:val="single" w:sz="4" w:color="B0C4DE"/>
+              <w:bottom w:val="single" w:sz="4" w:color="B0C4DE"/>
+              <w:left w:val="single" w:sz="4" w:color="B0C4DE"/>
+              <w:right w:val="single" w:sz="4" w:color="B0C4DE"/>
+            </w:tcBorders>
           </w:tcPr>
           <w:p>
+            <w:pPr>
+              <w:spacing w:after="80"/>
+            </w:pPr>
             <w:r>
               <w:rPr>
-                <w:sz w:val="20"/>
+                <w:rFonts w:ascii="Calibri" w:hAnsi="Calibri"/>
+                <w:b/>
+                <w:color w:val="002750"/>
               </w:rPr>
-              <w:t>Lacks attack-framework-aligned threat classification.</w:t>
+              <w:t>Live Deployment:</w:t>
             </w:r>
           </w:p>
         </w:tc>
         <w:tc>
           <w:tcPr>
-            <w:tcW w:type="dxa" w:w="4680"/>
+            <w:tcW w:type="dxa" w:w="4464"/>
+            <w:tcBorders>
+              <w:top w:val="single" w:sz="4" w:color="B0C4DE"/>
+              <w:bottom w:val="single" w:sz="4" w:color="B0C4DE"/>
+              <w:left w:val="single" w:sz="4" w:color="B0C4DE"/>
+              <w:right w:val="single" w:sz="4" w:color="B0C4DE"/>
+            </w:tcBorders>
           </w:tcPr>
           <w:p>
+            <w:pPr>
+              <w:spacing w:after="80"/>
+            </w:pPr>
             <w:r>
               <w:rPr>
-                <w:sz w:val="20"/>
+                <w:rFonts w:ascii="Calibri" w:hAnsi="Calibri"/>
+                <w:sz w:val="22"/>
               </w:rPr>
-              <w:t>All incidents are automatically mapped to MITRE ATT&amp;CK tactics and techniques.</w:t>
+              <w:t>https://sentinelgpt-ai.vercel.app</w:t>
             </w:r>
           </w:p>
         </w:tc>
@@ -316,111 +340,48 @@
       <w:tr>
         <w:tc>
           <w:tcPr>
-            <w:tcW w:type="dxa" w:w="4680"/>
+            <w:tcW w:type="dxa" w:w="4464"/>
+            <w:tcBorders>
+              <w:top w:val="single" w:sz="4" w:color="B0C4DE"/>
+              <w:bottom w:val="single" w:sz="4" w:color="B0C4DE"/>
+              <w:left w:val="single" w:sz="4" w:color="B0C4DE"/>
+              <w:right w:val="single" w:sz="4" w:color="B0C4DE"/>
+            </w:tcBorders>
           </w:tcPr>
           <w:p>
+            <w:pPr>
+              <w:spacing w:after="80"/>
+            </w:pPr>
             <w:r>
               <w:rPr>
-                <w:sz w:val="20"/>
+                <w:rFonts w:ascii="Calibri" w:hAnsi="Calibri"/>
+                <w:b/>
+                <w:color w:val="002750"/>
               </w:rPr>
-              <w:t>Triage requires extensive manual security research.</w:t>
+              <w:t>GitHub Repository:</w:t>
             </w:r>
           </w:p>
         </w:tc>
         <w:tc>
           <w:tcPr>
-            <w:tcW w:type="dxa" w:w="4680"/>
+            <w:tcW w:type="dxa" w:w="4464"/>
+            <w:tcBorders>
+              <w:top w:val="single" w:sz="4" w:color="B0C4DE"/>
+              <w:bottom w:val="single" w:sz="4" w:color="B0C4DE"/>
+              <w:left w:val="single" w:sz="4" w:color="B0C4DE"/>
+              <w:right w:val="single" w:sz="4" w:color="B0C4DE"/>
+            </w:tcBorders>
           </w:tcPr>
           <w:p>
+            <w:pPr>
+              <w:spacing w:after="80"/>
+            </w:pPr>
             <w:r>
               <w:rPr>
-                <w:sz w:val="20"/>
+                <w:rFonts w:ascii="Calibri" w:hAnsi="Calibri"/>
+                <w:sz w:val="22"/>
               </w:rPr>
-              <w:t>Integrated AI Triage Assistant provides instant remediation guidance.</w:t>
-            </w:r>
-          </w:p>
-        </w:tc>
-      </w:tr>
-      <w:tr>
-        <w:tc>
-          <w:tcPr>
-            <w:tcW w:type="dxa" w:w="4680"/>
-          </w:tcPr>
-          <w:p>
-            <w:r>
-              <w:rPr>
-                <w:sz w:val="20"/>
-              </w:rPr>
-              <w:t>No real-time visualization of threat velocity.</w:t>
-            </w:r>
-          </w:p>
-        </w:tc>
-        <w:tc>
-          <w:tcPr>
-            <w:tcW w:type="dxa" w:w="4680"/>
-          </w:tcPr>
-          <w:p>
-            <w:r>
-              <w:rPr>
-                <w:sz w:val="20"/>
-              </w:rPr>
-              <w:t>Glassmorphic dashboard with live telemetry charts and perimeter heatmaps.</w:t>
-            </w:r>
-          </w:p>
-        </w:tc>
-      </w:tr>
-      <w:tr>
-        <w:tc>
-          <w:tcPr>
-            <w:tcW w:type="dxa" w:w="4680"/>
-          </w:tcPr>
-          <w:p>
-            <w:r>
-              <w:rPr>
-                <w:sz w:val="20"/>
-              </w:rPr>
-              <w:t>Payload analysis done manually with external tools.</w:t>
-            </w:r>
-          </w:p>
-        </w:tc>
-        <w:tc>
-          <w:tcPr>
-            <w:tcW w:type="dxa" w:w="4680"/>
-          </w:tcPr>
-          <w:p>
-            <w:r>
-              <w:rPr>
-                <w:sz w:val="20"/>
-              </w:rPr>
-              <w:t>Built-in Payload Scanner analyzes files with automatic verdict reports.</w:t>
-            </w:r>
-          </w:p>
-        </w:tc>
-      </w:tr>
-      <w:tr>
-        <w:tc>
-          <w:tcPr>
-            <w:tcW w:type="dxa" w:w="4680"/>
-          </w:tcPr>
-          <w:p>
-            <w:r>
-              <w:rPr>
-                <w:sz w:val="20"/>
-              </w:rPr>
-              <w:t>Scaling across cloud environments is complex.</w:t>
-            </w:r>
-          </w:p>
-        </w:tc>
-        <w:tc>
-          <w:tcPr>
-            <w:tcW w:type="dxa" w:w="4680"/>
-          </w:tcPr>
-          <w:p>
-            <w:r>
-              <w:rPr>
-                <w:sz w:val="20"/>
-              </w:rPr>
-              <w:t>Serverless architecture (FastAPI + Vercel) provides seamless scalability.</w:t>
+              <w:t>https://github.com/Pravallika2025/sentigraud-ai-.git</w:t>
             </w:r>
           </w:p>
         </w:tc>
@@ -433,82 +394,516 @@
     </w:p>
     <w:p>
       <w:pPr>
-        <w:keepNext/>
-        <w:spacing w:before="200" w:after="80"/>
+        <w:spacing w:before="320" w:after="100"/>
+        <w:pBdr>
+          <w:bottom w:val="single" w:sz="6" w:space="1" w:color="003366"/>
+        </w:pBdr>
       </w:pPr>
       <w:r>
         <w:rPr>
-          <w:rFonts w:ascii="Times New Roman" w:hAnsi="Times New Roman"/>
+          <w:rFonts w:ascii="Calibri" w:hAnsi="Calibri"/>
           <w:b/>
-          <w:color w:val="003366"/>
-          <w:sz w:val="28"/>
+          <w:color w:val="002750"/>
+          <w:sz w:val="30"/>
         </w:rPr>
-        <w:t>3.  Proposed Solution</w:t>
+        <w:t>1.  Problem Statement</w:t>
       </w:r>
     </w:p>
     <w:p>
       <w:pPr>
-        <w:spacing w:before="0" w:after="80" w:line="276" w:lineRule="auto"/>
+        <w:spacing w:before="0" w:after="120" w:line="288" w:lineRule="auto"/>
         <w:jc w:val="both"/>
       </w:pPr>
       <w:r>
         <w:rPr>
-          <w:rFonts w:ascii="Times New Roman" w:hAnsi="Times New Roman"/>
-          <w:sz w:val="22"/>
+          <w:rFonts w:ascii="Calibri" w:hAnsi="Calibri"/>
         </w:rPr>
-        <w:t>SentinelGPT is an intelligent full-stack web-based cyber defense platform that automates threat detection, security monitoring, and incident mitigation. The system uses intelligent software agents that continuously evaluate network telemetry against heuristic scoring models and security policies, replacing slow manual workflows with instant automated decisions.</w:t>
+        <w:t>Modern cybersecurity operations face severe challenges managing the overwhelming volume of network telemetry and security alerts generated by enterprise IT infrastructure. Security Information and Event Management (SIEM) systems process millions of event logs, network probes, and API requests daily. Many organizations still rely heavily on manual log inspection, static firewall rules, and fragmented monitoring tools — creating serious operational bottlenecks, severe analyst alert fatigue, and dangerously slow incident response times that allow threats to propagate unchecked through internal networks.</w:t>
       </w:r>
     </w:p>
     <w:p>
       <w:pPr>
-        <w:spacing w:before="0" w:after="80" w:line="276" w:lineRule="auto"/>
+        <w:spacing w:before="0" w:after="120" w:line="288" w:lineRule="auto"/>
         <w:jc w:val="both"/>
       </w:pPr>
       <w:r>
         <w:rPr>
-          <w:rFonts w:ascii="Times New Roman" w:hAnsi="Times New Roman"/>
-          <w:sz w:val="22"/>
+          <w:rFonts w:ascii="Calibri" w:hAnsi="Calibri"/>
         </w:rPr>
-        <w:t>The Telemetry Monitor Agent analyzes packet rates, IP origins, and request patterns to compute a risk score from 0 to 100. Each incident is mapped to a MITRE ATT&amp;CK technique (e.g., T1078 Valid Accounts, T1498 Network DoS) with AI-driven remediation guidance. When a score reaches or exceeds 75, the Autonomous Quarantine Agent immediately isolates the offending IP in the database. Administrators retain full manual override control for revocation and simulated threat injection.</w:t>
+        <w:t>A central challenge is identifying sophisticated multi-stage attacks such as credential stuffing, Distributed Denial of Service (DDoS) vectors, SQL injection payloads, and brute-force authentication spikes. Traditional rule-based intrusion detection systems generate high rates of false positives while failing to correlate anomalous network behavior with recognized attack frameworks like MITRE ATT&amp;CK. Manual quarantine procedures further delay response, exposing internal networks to lateral movement and unauthorized data exfiltration.</w:t>
       </w:r>
     </w:p>
     <w:p>
       <w:pPr>
-        <w:keepNext/>
-        <w:spacing w:before="200" w:after="80"/>
+        <w:spacing w:before="0" w:after="120" w:line="288" w:lineRule="auto"/>
+        <w:jc w:val="both"/>
       </w:pPr>
       <w:r>
         <w:rPr>
-          <w:rFonts w:ascii="Times New Roman" w:hAnsi="Times New Roman"/>
+          <w:rFonts w:ascii="Calibri" w:hAnsi="Calibri"/>
+        </w:rPr>
+        <w:t>Existing security dashboards lack transparent decision-making, intelligent payload analysis, and real-time visualization. Analysts are left without instant remediation guidance, unsure why a specific threat score was assigned or which immediate countermeasures to execute.</w:t>
+      </w:r>
+    </w:p>
+    <w:p>
+      <w:pPr>
+        <w:spacing w:before="0" w:after="120" w:line="288" w:lineRule="auto"/>
+        <w:jc w:val="both"/>
+      </w:pPr>
+      <w:r>
+        <w:rPr>
+          <w:rFonts w:ascii="Calibri" w:hAnsi="Calibri"/>
+        </w:rPr>
+        <w:t>To address these challenges, this project presents SentinelGPT — an AI-Powered Large Language Model Framework for Advanced Cyber Threat Detection and Analysis. The system uses intelligent software agents to automatically monitor network telemetry, compute risk scores via heuristic anomaly algorithms, map threats to MITRE ATT&amp;CK techniques, and autonomously quarantine high-risk IP addresses — drastically reducing manual effort and incident response latency.</w:t>
+      </w:r>
+    </w:p>
+    <w:p>
+      <w:pPr>
+        <w:spacing w:before="320" w:after="100"/>
+        <w:pBdr>
+          <w:bottom w:val="single" w:sz="6" w:space="1" w:color="003366"/>
+        </w:pBdr>
+      </w:pPr>
+      <w:r>
+        <w:rPr>
+          <w:rFonts w:ascii="Calibri" w:hAnsi="Calibri"/>
           <w:b/>
-          <w:color w:val="003366"/>
-          <w:sz w:val="28"/>
+          <w:color w:val="002750"/>
+          <w:sz w:val="30"/>
+        </w:rPr>
+        <w:t>2.  Difference: Traditional System vs. Proposed SentinelGPT</w:t>
+      </w:r>
+    </w:p>
+    <w:p>
+      <w:pPr>
+        <w:spacing w:before="0" w:after="120" w:line="288" w:lineRule="auto"/>
+        <w:jc w:val="both"/>
+      </w:pPr>
+      <w:r>
+        <w:rPr>
+          <w:rFonts w:ascii="Calibri" w:hAnsi="Calibri"/>
+        </w:rPr>
+        <w:t>The table below contrasts conventional security operations with the proposed SentinelGPT AI-powered system across key operational dimensions:</w:t>
+      </w:r>
+    </w:p>
+    <w:tbl>
+      <w:tblPr>
+        <w:tblStyle w:val="TableGrid"/>
+        <w:tblW w:type="auto" w:w="0"/>
+        <w:jc w:val="center"/>
+        <w:tblLook w:firstColumn="1" w:firstRow="1" w:lastColumn="0" w:lastRow="0" w:noHBand="0" w:noVBand="1" w:val="04A0"/>
+      </w:tblPr>
+      <w:tblGrid>
+        <w:gridCol w:w="4464"/>
+        <w:gridCol w:w="4464"/>
+      </w:tblGrid>
+      <w:tr>
+        <w:tc>
+          <w:tcPr>
+            <w:tcW w:type="dxa" w:w="4464"/>
+            <w:shd w:val="clear" w:color="auto" w:fill="003366"/>
+          </w:tcPr>
+          <w:p>
+            <w:pPr>
+              <w:jc w:val="center"/>
+            </w:pPr>
+            <w:r>
+              <w:rPr>
+                <w:rFonts w:ascii="Calibri" w:hAnsi="Calibri"/>
+                <w:b/>
+                <w:color w:val="FFFFFF"/>
+                <w:sz w:val="22"/>
+              </w:rPr>
+              <w:t>Traditional Security System</w:t>
+            </w:r>
+          </w:p>
+        </w:tc>
+        <w:tc>
+          <w:tcPr>
+            <w:tcW w:type="dxa" w:w="4464"/>
+            <w:shd w:val="clear" w:color="auto" w:fill="003366"/>
+          </w:tcPr>
+          <w:p>
+            <w:pPr>
+              <w:jc w:val="center"/>
+            </w:pPr>
+            <w:r>
+              <w:rPr>
+                <w:rFonts w:ascii="Calibri" w:hAnsi="Calibri"/>
+                <w:b/>
+                <w:color w:val="FFFFFF"/>
+                <w:sz w:val="22"/>
+              </w:rPr>
+              <w:t>Proposed SentinelGPT System</w:t>
+            </w:r>
+          </w:p>
+        </w:tc>
+      </w:tr>
+      <w:tr>
+        <w:tc>
+          <w:tcPr>
+            <w:tcW w:type="dxa" w:w="4464"/>
+            <w:shd w:val="clear" w:color="auto" w:fill="EEF4FB"/>
+          </w:tcPr>
+          <w:p>
+            <w:pPr>
+              <w:spacing w:before="60" w:after="60"/>
+            </w:pPr>
+            <w:r>
+              <w:rPr>
+                <w:rFonts w:ascii="Calibri" w:hAnsi="Calibri"/>
+              </w:rPr>
+              <w:t>Manual log inspection; static firewall rules; delayed response.</w:t>
+            </w:r>
+          </w:p>
+        </w:tc>
+        <w:tc>
+          <w:tcPr>
+            <w:tcW w:type="dxa" w:w="4464"/>
+            <w:shd w:val="clear" w:color="auto" w:fill="EEF4FB"/>
+          </w:tcPr>
+          <w:p>
+            <w:pPr>
+              <w:spacing w:before="60" w:after="60"/>
+            </w:pPr>
+            <w:r>
+              <w:rPr>
+                <w:rFonts w:ascii="Calibri" w:hAnsi="Calibri"/>
+              </w:rPr>
+              <w:t>Autonomous agents monitor telemetry 24/7 with zero manual input required.</w:t>
+            </w:r>
+          </w:p>
+        </w:tc>
+      </w:tr>
+      <w:tr>
+        <w:tc>
+          <w:tcPr>
+            <w:tcW w:type="dxa" w:w="4464"/>
+          </w:tcPr>
+          <w:p>
+            <w:pPr>
+              <w:spacing w:before="60" w:after="60"/>
+            </w:pPr>
+            <w:r>
+              <w:rPr>
+                <w:rFonts w:ascii="Calibri" w:hAnsi="Calibri"/>
+              </w:rPr>
+              <w:t>High alert fatigue; delayed incident detection.</w:t>
+            </w:r>
+          </w:p>
+        </w:tc>
+        <w:tc>
+          <w:tcPr>
+            <w:tcW w:type="dxa" w:w="4464"/>
+          </w:tcPr>
+          <w:p>
+            <w:pPr>
+              <w:spacing w:before="60" w:after="60"/>
+            </w:pPr>
+            <w:r>
+              <w:rPr>
+                <w:rFonts w:ascii="Calibri" w:hAnsi="Calibri"/>
+              </w:rPr>
+              <w:t>Heuristic scoring (0–100) eliminates alert fatigue; threats detected instantly.</w:t>
+            </w:r>
+          </w:p>
+        </w:tc>
+      </w:tr>
+      <w:tr>
+        <w:tc>
+          <w:tcPr>
+            <w:tcW w:type="dxa" w:w="4464"/>
+            <w:shd w:val="clear" w:color="auto" w:fill="EEF4FB"/>
+          </w:tcPr>
+          <w:p>
+            <w:pPr>
+              <w:spacing w:before="60" w:after="60"/>
+            </w:pPr>
+            <w:r>
+              <w:rPr>
+                <w:rFonts w:ascii="Calibri" w:hAnsi="Calibri"/>
+              </w:rPr>
+              <w:t>IP blocking requires manual admin intervention and rule updates.</w:t>
+            </w:r>
+          </w:p>
+        </w:tc>
+        <w:tc>
+          <w:tcPr>
+            <w:tcW w:type="dxa" w:w="4464"/>
+            <w:shd w:val="clear" w:color="auto" w:fill="EEF4FB"/>
+          </w:tcPr>
+          <w:p>
+            <w:pPr>
+              <w:spacing w:before="60" w:after="60"/>
+            </w:pPr>
+            <w:r>
+              <w:rPr>
+                <w:rFonts w:ascii="Calibri" w:hAnsi="Calibri"/>
+              </w:rPr>
+              <w:t>Autonomous Quarantine Agent auto-isolates IPs scoring ≥75 in real time.</w:t>
+            </w:r>
+          </w:p>
+        </w:tc>
+      </w:tr>
+      <w:tr>
+        <w:tc>
+          <w:tcPr>
+            <w:tcW w:type="dxa" w:w="4464"/>
+          </w:tcPr>
+          <w:p>
+            <w:pPr>
+              <w:spacing w:before="60" w:after="60"/>
+            </w:pPr>
+            <w:r>
+              <w:rPr>
+                <w:rFonts w:ascii="Calibri" w:hAnsi="Calibri"/>
+              </w:rPr>
+              <w:t>Lacks standardized MITRE ATT&amp;CK threat-framework alignment.</w:t>
+            </w:r>
+          </w:p>
+        </w:tc>
+        <w:tc>
+          <w:tcPr>
+            <w:tcW w:type="dxa" w:w="4464"/>
+          </w:tcPr>
+          <w:p>
+            <w:pPr>
+              <w:spacing w:before="60" w:after="60"/>
+            </w:pPr>
+            <w:r>
+              <w:rPr>
+                <w:rFonts w:ascii="Calibri" w:hAnsi="Calibri"/>
+              </w:rPr>
+              <w:t>All incidents automatically mapped to MITRE ATT&amp;CK tactics and techniques.</w:t>
+            </w:r>
+          </w:p>
+        </w:tc>
+      </w:tr>
+      <w:tr>
+        <w:tc>
+          <w:tcPr>
+            <w:tcW w:type="dxa" w:w="4464"/>
+            <w:shd w:val="clear" w:color="auto" w:fill="EEF4FB"/>
+          </w:tcPr>
+          <w:p>
+            <w:pPr>
+              <w:spacing w:before="60" w:after="60"/>
+            </w:pPr>
+            <w:r>
+              <w:rPr>
+                <w:rFonts w:ascii="Calibri" w:hAnsi="Calibri"/>
+              </w:rPr>
+              <w:t>Triage requires lengthy manual research by analysts.</w:t>
+            </w:r>
+          </w:p>
+        </w:tc>
+        <w:tc>
+          <w:tcPr>
+            <w:tcW w:type="dxa" w:w="4464"/>
+            <w:shd w:val="clear" w:color="auto" w:fill="EEF4FB"/>
+          </w:tcPr>
+          <w:p>
+            <w:pPr>
+              <w:spacing w:before="60" w:after="60"/>
+            </w:pPr>
+            <w:r>
+              <w:rPr>
+                <w:rFonts w:ascii="Calibri" w:hAnsi="Calibri"/>
+              </w:rPr>
+              <w:t>Integrated AI Triage Assistant delivers instant remediation guidance.</w:t>
+            </w:r>
+          </w:p>
+        </w:tc>
+      </w:tr>
+      <w:tr>
+        <w:tc>
+          <w:tcPr>
+            <w:tcW w:type="dxa" w:w="4464"/>
+          </w:tcPr>
+          <w:p>
+            <w:pPr>
+              <w:spacing w:before="60" w:after="60"/>
+            </w:pPr>
+            <w:r>
+              <w:rPr>
+                <w:rFonts w:ascii="Calibri" w:hAnsi="Calibri"/>
+              </w:rPr>
+              <w:t>Limited real-time visualization of threat velocity.</w:t>
+            </w:r>
+          </w:p>
+        </w:tc>
+        <w:tc>
+          <w:tcPr>
+            <w:tcW w:type="dxa" w:w="4464"/>
+          </w:tcPr>
+          <w:p>
+            <w:pPr>
+              <w:spacing w:before="60" w:after="60"/>
+            </w:pPr>
+            <w:r>
+              <w:rPr>
+                <w:rFonts w:ascii="Calibri" w:hAnsi="Calibri"/>
+              </w:rPr>
+              <w:t>Glassmorphic dashboard with live telemetry charts and perimeter heatmaps.</w:t>
+            </w:r>
+          </w:p>
+        </w:tc>
+      </w:tr>
+      <w:tr>
+        <w:tc>
+          <w:tcPr>
+            <w:tcW w:type="dxa" w:w="4464"/>
+            <w:shd w:val="clear" w:color="auto" w:fill="EEF4FB"/>
+          </w:tcPr>
+          <w:p>
+            <w:pPr>
+              <w:spacing w:before="60" w:after="60"/>
+            </w:pPr>
+            <w:r>
+              <w:rPr>
+                <w:rFonts w:ascii="Calibri" w:hAnsi="Calibri"/>
+              </w:rPr>
+              <w:t>Payload analysis performed manually with external tools.</w:t>
+            </w:r>
+          </w:p>
+        </w:tc>
+        <w:tc>
+          <w:tcPr>
+            <w:tcW w:type="dxa" w:w="4464"/>
+            <w:shd w:val="clear" w:color="auto" w:fill="EEF4FB"/>
+          </w:tcPr>
+          <w:p>
+            <w:pPr>
+              <w:spacing w:before="60" w:after="60"/>
+            </w:pPr>
+            <w:r>
+              <w:rPr>
+                <w:rFonts w:ascii="Calibri" w:hAnsi="Calibri"/>
+              </w:rPr>
+              <w:t>Built-in Payload Scanner auto-analyzes files with verdict reports.</w:t>
+            </w:r>
+          </w:p>
+        </w:tc>
+      </w:tr>
+      <w:tr>
+        <w:tc>
+          <w:tcPr>
+            <w:tcW w:type="dxa" w:w="4464"/>
+          </w:tcPr>
+          <w:p>
+            <w:pPr>
+              <w:spacing w:before="60" w:after="60"/>
+            </w:pPr>
+            <w:r>
+              <w:rPr>
+                <w:rFonts w:ascii="Calibri" w:hAnsi="Calibri"/>
+              </w:rPr>
+              <w:t>Incident data export requires manual log collection.</w:t>
+            </w:r>
+          </w:p>
+        </w:tc>
+        <w:tc>
+          <w:tcPr>
+            <w:tcW w:type="dxa" w:w="4464"/>
+          </w:tcPr>
+          <w:p>
+            <w:pPr>
+              <w:spacing w:before="60" w:after="60"/>
+            </w:pPr>
+            <w:r>
+              <w:rPr>
+                <w:rFonts w:ascii="Calibri" w:hAnsi="Calibri"/>
+              </w:rPr>
+              <w:t>Instant JSON incident-log export via REST API (/api/export).</w:t>
+            </w:r>
+          </w:p>
+        </w:tc>
+      </w:tr>
+    </w:tbl>
+    <w:p>
+      <w:r>
+        <w:br w:type="page"/>
+      </w:r>
+    </w:p>
+    <w:p>
+      <w:pPr>
+        <w:spacing w:before="320" w:after="100"/>
+        <w:pBdr>
+          <w:bottom w:val="single" w:sz="6" w:space="1" w:color="003366"/>
+        </w:pBdr>
+      </w:pPr>
+      <w:r>
+        <w:rPr>
+          <w:rFonts w:ascii="Calibri" w:hAnsi="Calibri"/>
+          <w:b/>
+          <w:color w:val="002750"/>
+          <w:sz w:val="30"/>
+        </w:rPr>
+        <w:t>3.  Proposed Solution &amp; System Overview</w:t>
+      </w:r>
+    </w:p>
+    <w:p>
+      <w:pPr>
+        <w:spacing w:before="0" w:after="120" w:line="288" w:lineRule="auto"/>
+        <w:jc w:val="both"/>
+      </w:pPr>
+      <w:r>
+        <w:rPr>
+          <w:rFonts w:ascii="Calibri" w:hAnsi="Calibri"/>
+        </w:rPr>
+        <w:t>SentinelGPT is an intelligent, full-stack, cloud-native cyber defense application that automates threat detection, security monitoring, and incident mitigation. It uses intelligent software agents that continuously evaluate network telemetry against heuristic scoring models and security policies, replacing slow manual workflows with instant automated decisions.</w:t>
+      </w:r>
+    </w:p>
+    <w:p>
+      <w:pPr>
+        <w:spacing w:before="0" w:after="120" w:line="288" w:lineRule="auto"/>
+        <w:jc w:val="both"/>
+      </w:pPr>
+      <w:r>
+        <w:rPr>
+          <w:rFonts w:ascii="Calibri" w:hAnsi="Calibri"/>
+        </w:rPr>
+        <w:t>The Telemetry Monitor Agent analyzes packet rates, IP origins, and request patterns to compute a risk score (0–100). Each incident is mapped to a MITRE ATT&amp;CK technique (e.g., T1078 Valid Accounts, T1498 Network DoS, T1190 Exploit Public App) and enriched with AI-driven remediation guidance. When a score reaches or exceeds 75, the Autonomous Quarantine Agent immediately isolates the offending IP in the database — providing administrators full manual override and revocation control.</w:t>
+      </w:r>
+    </w:p>
+    <w:p>
+      <w:pPr>
+        <w:spacing w:before="320" w:after="100"/>
+        <w:pBdr>
+          <w:bottom w:val="single" w:sz="6" w:space="1" w:color="003366"/>
+        </w:pBdr>
+      </w:pPr>
+      <w:r>
+        <w:rPr>
+          <w:rFonts w:ascii="Calibri" w:hAnsi="Calibri"/>
+          <w:b/>
+          <w:color w:val="002750"/>
+          <w:sz w:val="30"/>
         </w:rPr>
         <w:t>4.  System Architecture</w:t>
       </w:r>
     </w:p>
     <w:p>
       <w:pPr>
-        <w:spacing w:before="0" w:after="80" w:line="276" w:lineRule="auto"/>
+        <w:spacing w:before="0" w:after="120" w:line="288" w:lineRule="auto"/>
         <w:jc w:val="both"/>
       </w:pPr>
       <w:r>
         <w:rPr>
-          <w:rFonts w:ascii="Times New Roman" w:hAnsi="Times New Roman"/>
-          <w:sz w:val="22"/>
+          <w:rFonts w:ascii="Calibri" w:hAnsi="Calibri"/>
         </w:rPr>
-        <w:t>The diagram below shows the complete end-to-end architecture of SentinelGPT:</w:t>
+        <w:t>SentinelGPT follows a modular, decoupled architecture. The operator authenticates via the React SPA frontend, which connects to the FastAPI backend controller for telemetry snapshots and WebSocket streaming. Two intelligent agents process telemetry: the Telemetry Monitor Agent (anomaly scoring + MITRE ATT&amp;CK mapping) and the Autonomous Quarantine Agent (IP isolation + validation). All incident logs and quarantine data are stored via SQLAlchemy ORM in SQLite.</w:t>
       </w:r>
     </w:p>
     <w:p>
       <w:pPr>
-        <w:spacing w:before="120" w:after="40"/>
+        <w:spacing w:before="160" w:after="60"/>
         <w:jc w:val="center"/>
       </w:pPr>
       <w:r>
         <w:drawing>
           <wp:inline xmlns:a="http://schemas.openxmlformats.org/drawingml/2006/main" xmlns:pic="http://schemas.openxmlformats.org/drawingml/2006/picture">
-            <wp:extent cx="5486400" cy="3955312"/>
+            <wp:extent cx="5394960" cy="3763926"/>
             <wp:docPr id="1" name="Picture 1"/>
             <wp:cNvGraphicFramePr>
               <a:graphicFrameLocks noChangeAspect="1"/>
@@ -517,7 +912,7 @@
               <a:graphicData uri="http://schemas.openxmlformats.org/drawingml/2006/picture">
                 <pic:pic>
                   <pic:nvPicPr>
-                    <pic:cNvPr id="0" name="architecture_diagram.png"/>
+                    <pic:cNvPr id="0" name="arch_diagram.png"/>
                     <pic:cNvPicPr/>
                   </pic:nvPicPr>
                   <pic:blipFill>
@@ -529,7 +924,7 @@
                   <pic:spPr>
                     <a:xfrm>
                       <a:off x="0" y="0"/>
-                      <a:ext cx="5486400" cy="3955312"/>
+                      <a:ext cx="5394960" cy="3763926"/>
                     </a:xfrm>
                     <a:prstGeom prst="rect"/>
                   </pic:spPr>
@@ -542,254 +937,249 @@
     </w:p>
     <w:p>
       <w:pPr>
-        <w:spacing w:after="120"/>
+        <w:spacing w:after="200"/>
         <w:jc w:val="center"/>
       </w:pPr>
       <w:r>
         <w:rPr>
-          <w:rFonts w:ascii="Times New Roman" w:hAnsi="Times New Roman"/>
+          <w:rFonts w:ascii="Calibri" w:hAnsi="Calibri"/>
           <w:i/>
-          <w:sz w:val="20"/>
+          <w:color w:val="555555"/>
+          <w:sz w:val="19"/>
         </w:rPr>
-        <w:t>Fig 1: SentinelGPT System Architecture</w:t>
+        <w:t>Figure 1: SentinelGPT End-to-End System Architecture</w:t>
       </w:r>
     </w:p>
     <w:p>
       <w:pPr>
-        <w:keepNext/>
-        <w:spacing w:before="200" w:after="80"/>
+        <w:spacing w:before="320" w:after="100"/>
+        <w:pBdr>
+          <w:bottom w:val="single" w:sz="6" w:space="1" w:color="003366"/>
+        </w:pBdr>
       </w:pPr>
       <w:r>
         <w:rPr>
-          <w:rFonts w:ascii="Times New Roman" w:hAnsi="Times New Roman"/>
+          <w:rFonts w:ascii="Calibri" w:hAnsi="Calibri"/>
           <w:b/>
-          <w:color w:val="003366"/>
-          <w:sz w:val="28"/>
+          <w:color w:val="002750"/>
+          <w:sz w:val="30"/>
         </w:rPr>
         <w:t>5.  Technologies Used</w:t>
       </w:r>
     </w:p>
     <w:p>
       <w:pPr>
-        <w:spacing w:before="120" w:after="40"/>
+        <w:spacing w:before="200" w:after="60"/>
       </w:pPr>
       <w:r>
         <w:rPr>
-          <w:rFonts w:ascii="Times New Roman" w:hAnsi="Times New Roman"/>
+          <w:rFonts w:ascii="Calibri" w:hAnsi="Calibri"/>
           <w:b/>
-          <w:color w:val="1A4A7A"/>
+          <w:color w:val="005F8E"/>
           <w:sz w:val="24"/>
         </w:rPr>
-        <w:t>Frontend</w:t>
+        <w:t>Frontend Stack</w:t>
       </w:r>
     </w:p>
     <w:p>
       <w:pPr>
         <w:pStyle w:val="ListBullet"/>
-        <w:spacing w:before="0" w:after="40" w:line="264" w:lineRule="auto"/>
-        <w:ind w:left="360"/>
+        <w:spacing w:before="0" w:after="60" w:line="276" w:lineRule="auto"/>
+        <w:ind w:left="432"/>
         <w:jc w:val="both"/>
       </w:pPr>
       <w:r>
         <w:rPr>
-          <w:rFonts w:ascii="Times New Roman" w:hAnsi="Times New Roman"/>
+          <w:rFonts w:ascii="Calibri" w:hAnsi="Calibri"/>
           <w:b/>
-          <w:sz w:val="22"/>
+          <w:color w:val="002750"/>
         </w:rPr>
         <w:t xml:space="preserve">React 19: </w:t>
       </w:r>
       <w:r>
         <w:rPr>
-          <w:rFonts w:ascii="Times New Roman" w:hAnsi="Times New Roman"/>
-          <w:sz w:val="22"/>
+          <w:rFonts w:ascii="Calibri" w:hAnsi="Calibri"/>
         </w:rPr>
-        <w:t>Modern UI library for dynamic component trees and real-time state management.</w:t>
+        <w:t>UI library for dynamic glassmorphic component trees and real-time state management.</w:t>
       </w:r>
     </w:p>
     <w:p>
       <w:pPr>
         <w:pStyle w:val="ListBullet"/>
-        <w:spacing w:before="0" w:after="40" w:line="264" w:lineRule="auto"/>
-        <w:ind w:left="360"/>
+        <w:spacing w:before="0" w:after="60" w:line="276" w:lineRule="auto"/>
+        <w:ind w:left="432"/>
         <w:jc w:val="both"/>
       </w:pPr>
       <w:r>
         <w:rPr>
-          <w:rFonts w:ascii="Times New Roman" w:hAnsi="Times New Roman"/>
+          <w:rFonts w:ascii="Calibri" w:hAnsi="Calibri"/>
           <w:b/>
-          <w:sz w:val="22"/>
+          <w:color w:val="002750"/>
         </w:rPr>
         <w:t xml:space="preserve">Vite 5.4: </w:t>
       </w:r>
       <w:r>
         <w:rPr>
-          <w:rFonts w:ascii="Times New Roman" w:hAnsi="Times New Roman"/>
-          <w:sz w:val="22"/>
+          <w:rFonts w:ascii="Calibri" w:hAnsi="Calibri"/>
         </w:rPr>
-        <w:t>Next-gen build tool providing fast HMR and optimized production bundles.</w:t>
+        <w:t>Next-gen build tool — fast Hot Module Replacement and optimized production bundles.</w:t>
       </w:r>
     </w:p>
     <w:p>
       <w:pPr>
         <w:pStyle w:val="ListBullet"/>
-        <w:spacing w:before="0" w:after="40" w:line="264" w:lineRule="auto"/>
-        <w:ind w:left="360"/>
+        <w:spacing w:before="0" w:after="60" w:line="276" w:lineRule="auto"/>
+        <w:ind w:left="432"/>
         <w:jc w:val="both"/>
       </w:pPr>
       <w:r>
         <w:rPr>
-          <w:rFonts w:ascii="Times New Roman" w:hAnsi="Times New Roman"/>
+          <w:rFonts w:ascii="Calibri" w:hAnsi="Calibri"/>
           <w:b/>
-          <w:sz w:val="22"/>
+          <w:color w:val="002750"/>
         </w:rPr>
         <w:t xml:space="preserve">Recharts: </w:t>
       </w:r>
       <w:r>
         <w:rPr>
-          <w:rFonts w:ascii="Times New Roman" w:hAnsi="Times New Roman"/>
-          <w:sz w:val="22"/>
+          <w:rFonts w:ascii="Calibri" w:hAnsi="Calibri"/>
         </w:rPr>
-        <w:t>Renders live threat velocity charts, risk gauges, and severity donut graphs.</w:t>
+        <w:t>Data visualization library — threat velocity charts, risk gauges, severity donuts.</w:t>
       </w:r>
     </w:p>
     <w:p>
       <w:pPr>
         <w:pStyle w:val="ListBullet"/>
-        <w:spacing w:before="0" w:after="40" w:line="264" w:lineRule="auto"/>
-        <w:ind w:left="360"/>
+        <w:spacing w:before="0" w:after="60" w:line="276" w:lineRule="auto"/>
+        <w:ind w:left="432"/>
         <w:jc w:val="both"/>
       </w:pPr>
       <w:r>
         <w:rPr>
-          <w:rFonts w:ascii="Times New Roman" w:hAnsi="Times New Roman"/>
+          <w:rFonts w:ascii="Calibri" w:hAnsi="Calibri"/>
           <w:b/>
-          <w:sz w:val="22"/>
+          <w:color w:val="002750"/>
         </w:rPr>
-        <w:t xml:space="preserve">CSS3 / Glassmorphism: </w:t>
+        <w:t xml:space="preserve">Web Audio API: </w:t>
       </w:r>
       <w:r>
         <w:rPr>
-          <w:rFonts w:ascii="Times New Roman" w:hAnsi="Times New Roman"/>
-          <w:sz w:val="22"/>
+          <w:rFonts w:ascii="Calibri" w:hAnsi="Calibri"/>
         </w:rPr>
-        <w:t>Cyberpunk dark-mode aesthetic with backdrop-blur and neon accents.</w:t>
+        <w:t>Browser-native alarm system that plays audio alerts on critical threat detection.</w:t>
       </w:r>
     </w:p>
     <w:p>
       <w:pPr>
-        <w:spacing w:before="120" w:after="40"/>
+        <w:spacing w:before="200" w:after="60"/>
       </w:pPr>
       <w:r>
         <w:rPr>
-          <w:rFonts w:ascii="Times New Roman" w:hAnsi="Times New Roman"/>
+          <w:rFonts w:ascii="Calibri" w:hAnsi="Calibri"/>
           <w:b/>
-          <w:color w:val="1A4A7A"/>
+          <w:color w:val="005F8E"/>
           <w:sz w:val="24"/>
         </w:rPr>
-        <w:t>Backend</w:t>
+        <w:t>Backend Stack</w:t>
       </w:r>
     </w:p>
     <w:p>
       <w:pPr>
         <w:pStyle w:val="ListBullet"/>
-        <w:spacing w:before="0" w:after="40" w:line="264" w:lineRule="auto"/>
-        <w:ind w:left="360"/>
+        <w:spacing w:before="0" w:after="60" w:line="276" w:lineRule="auto"/>
+        <w:ind w:left="432"/>
         <w:jc w:val="both"/>
       </w:pPr>
       <w:r>
         <w:rPr>
-          <w:rFonts w:ascii="Times New Roman" w:hAnsi="Times New Roman"/>
+          <w:rFonts w:ascii="Calibri" w:hAnsi="Calibri"/>
           <w:b/>
-          <w:sz w:val="22"/>
+          <w:color w:val="002750"/>
         </w:rPr>
         <w:t xml:space="preserve">Python 3.11+: </w:t>
       </w:r>
       <w:r>
         <w:rPr>
-          <w:rFonts w:ascii="Times New Roman" w:hAnsi="Times New Roman"/>
-          <w:sz w:val="22"/>
+          <w:rFonts w:ascii="Calibri" w:hAnsi="Calibri"/>
         </w:rPr>
-        <w:t>Primary language for agent logic, threat algorithms, and database models.</w:t>
+        <w:t>Core language for agent logic, threat heuristics, and database models.</w:t>
       </w:r>
     </w:p>
     <w:p>
       <w:pPr>
         <w:pStyle w:val="ListBullet"/>
-        <w:spacing w:before="0" w:after="40" w:line="264" w:lineRule="auto"/>
-        <w:ind w:left="360"/>
+        <w:spacing w:before="0" w:after="60" w:line="276" w:lineRule="auto"/>
+        <w:ind w:left="432"/>
         <w:jc w:val="both"/>
       </w:pPr>
       <w:r>
         <w:rPr>
-          <w:rFonts w:ascii="Times New Roman" w:hAnsi="Times New Roman"/>
+          <w:rFonts w:ascii="Calibri" w:hAnsi="Calibri"/>
           <w:b/>
-          <w:sz w:val="22"/>
+          <w:color w:val="002750"/>
         </w:rPr>
         <w:t xml:space="preserve">FastAPI: </w:t>
       </w:r>
       <w:r>
         <w:rPr>
-          <w:rFonts w:ascii="Times New Roman" w:hAnsi="Times New Roman"/>
-          <w:sz w:val="22"/>
+          <w:rFonts w:ascii="Calibri" w:hAnsi="Calibri"/>
         </w:rPr>
-        <w:t>Async, high-performance framework for RESTful APIs, WebSockets, and OpenAPI docs.</w:t>
+        <w:t>Async, high-performance framework — RESTful API, WebSockets, auto Swagger docs.</w:t>
       </w:r>
     </w:p>
     <w:p>
       <w:pPr>
         <w:pStyle w:val="ListBullet"/>
-        <w:spacing w:before="0" w:after="40" w:line="264" w:lineRule="auto"/>
-        <w:ind w:left="360"/>
+        <w:spacing w:before="0" w:after="60" w:line="276" w:lineRule="auto"/>
+        <w:ind w:left="432"/>
         <w:jc w:val="both"/>
       </w:pPr>
       <w:r>
         <w:rPr>
-          <w:rFonts w:ascii="Times New Roman" w:hAnsi="Times New Roman"/>
+          <w:rFonts w:ascii="Calibri" w:hAnsi="Calibri"/>
           <w:b/>
-          <w:sz w:val="22"/>
+          <w:color w:val="002750"/>
         </w:rPr>
         <w:t xml:space="preserve">Uvicorn: </w:t>
       </w:r>
       <w:r>
         <w:rPr>
-          <w:rFonts w:ascii="Times New Roman" w:hAnsi="Times New Roman"/>
-          <w:sz w:val="22"/>
+          <w:rFonts w:ascii="Calibri" w:hAnsi="Calibri"/>
         </w:rPr>
-        <w:t>High-speed ASGI server for both local dev and Vercel serverless execution.</w:t>
+        <w:t>ASGI server for local development and Vercel serverless function routing.</w:t>
       </w:r>
     </w:p>
     <w:p>
       <w:pPr>
         <w:pStyle w:val="ListBullet"/>
-        <w:spacing w:before="0" w:after="40" w:line="264" w:lineRule="auto"/>
-        <w:ind w:left="360"/>
+        <w:spacing w:before="0" w:after="60" w:line="276" w:lineRule="auto"/>
+        <w:ind w:left="432"/>
         <w:jc w:val="both"/>
       </w:pPr>
       <w:r>
         <w:rPr>
-          <w:rFonts w:ascii="Times New Roman" w:hAnsi="Times New Roman"/>
+          <w:rFonts w:ascii="Calibri" w:hAnsi="Calibri"/>
           <w:b/>
-          <w:sz w:val="22"/>
+          <w:color w:val="002750"/>
         </w:rPr>
         <w:t xml:space="preserve">PyJWT: </w:t>
       </w:r>
       <w:r>
         <w:rPr>
-          <w:rFonts w:ascii="Times New Roman" w:hAnsi="Times New Roman"/>
-          <w:sz w:val="22"/>
+          <w:rFonts w:ascii="Calibri" w:hAnsi="Calibri"/>
         </w:rPr>
-        <w:t>HS256 JSON Web Token generation and validation for secure 8-hour sessions.</w:t>
+        <w:t>HS256 JSON Web Token generation and validation — 8-hour expiring sessions.</w:t>
       </w:r>
     </w:p>
     <w:p>
       <w:pPr>
-        <w:spacing w:before="120" w:after="40"/>
+        <w:spacing w:before="200" w:after="60"/>
       </w:pPr>
       <w:r>
         <w:rPr>
-          <w:rFonts w:ascii="Times New Roman" w:hAnsi="Times New Roman"/>
+          <w:rFonts w:ascii="Calibri" w:hAnsi="Calibri"/>
           <w:b/>
-          <w:color w:val="1A4A7A"/>
+          <w:color w:val="005F8E"/>
           <w:sz w:val="24"/>
         </w:rPr>
         <w:t>Database &amp; Deployment</w:t>
@@ -798,93 +1188,89 @@
     <w:p>
       <w:pPr>
         <w:pStyle w:val="ListBullet"/>
-        <w:spacing w:before="0" w:after="40" w:line="264" w:lineRule="auto"/>
-        <w:ind w:left="360"/>
+        <w:spacing w:before="0" w:after="60" w:line="276" w:lineRule="auto"/>
+        <w:ind w:left="432"/>
         <w:jc w:val="both"/>
       </w:pPr>
       <w:r>
         <w:rPr>
-          <w:rFonts w:ascii="Times New Roman" w:hAnsi="Times New Roman"/>
+          <w:rFonts w:ascii="Calibri" w:hAnsi="Calibri"/>
           <w:b/>
-          <w:sz w:val="22"/>
+          <w:color w:val="002750"/>
         </w:rPr>
         <w:t xml:space="preserve">SQLAlchemy ORM: </w:t>
       </w:r>
       <w:r>
         <w:rPr>
-          <w:rFonts w:ascii="Times New Roman" w:hAnsi="Times New Roman"/>
-          <w:sz w:val="22"/>
+          <w:rFonts w:ascii="Calibri" w:hAnsi="Calibri"/>
         </w:rPr>
-        <w:t>Safe, type-annotated Python ORM for all database interactions.</w:t>
+        <w:t>Type-safe Python ORM for all database reads and writes.</w:t>
       </w:r>
     </w:p>
     <w:p>
       <w:pPr>
         <w:pStyle w:val="ListBullet"/>
-        <w:spacing w:before="0" w:after="40" w:line="264" w:lineRule="auto"/>
-        <w:ind w:left="360"/>
+        <w:spacing w:before="0" w:after="60" w:line="276" w:lineRule="auto"/>
+        <w:ind w:left="432"/>
         <w:jc w:val="both"/>
       </w:pPr>
       <w:r>
         <w:rPr>
-          <w:rFonts w:ascii="Times New Roman" w:hAnsi="Times New Roman"/>
+          <w:rFonts w:ascii="Calibri" w:hAnsi="Calibri"/>
           <w:b/>
-          <w:sz w:val="22"/>
+          <w:color w:val="002750"/>
         </w:rPr>
         <w:t xml:space="preserve">SQLite: </w:t>
       </w:r>
       <w:r>
         <w:rPr>
-          <w:rFonts w:ascii="Times New Roman" w:hAnsi="Times New Roman"/>
-          <w:sz w:val="22"/>
+          <w:rFonts w:ascii="Calibri" w:hAnsi="Calibri"/>
         </w:rPr>
-        <w:t>Zero-config relational DB for incident logs, blocked IPs, and user accounts.</w:t>
+        <w:t>Lightweight relational DB for incident logs, quarantine data, and user accounts.</w:t>
       </w:r>
     </w:p>
     <w:p>
       <w:pPr>
         <w:pStyle w:val="ListBullet"/>
-        <w:spacing w:before="0" w:after="40" w:line="264" w:lineRule="auto"/>
-        <w:ind w:left="360"/>
+        <w:spacing w:before="0" w:after="60" w:line="276" w:lineRule="auto"/>
+        <w:ind w:left="432"/>
         <w:jc w:val="both"/>
       </w:pPr>
       <w:r>
         <w:rPr>
-          <w:rFonts w:ascii="Times New Roman" w:hAnsi="Times New Roman"/>
+          <w:rFonts w:ascii="Calibri" w:hAnsi="Calibri"/>
           <w:b/>
-          <w:sz w:val="22"/>
+          <w:color w:val="002750"/>
         </w:rPr>
         <w:t xml:space="preserve">Vercel Serverless: </w:t>
       </w:r>
       <w:r>
         <w:rPr>
-          <w:rFonts w:ascii="Times New Roman" w:hAnsi="Times New Roman"/>
-          <w:sz w:val="22"/>
+          <w:rFonts w:ascii="Calibri" w:hAnsi="Calibri"/>
         </w:rPr>
-        <w:t>Production cloud host serving the React build and Python API functions.</w:t>
+        <w:t>Cloud host serving React static build and Python API functions at the edge.</w:t>
       </w:r>
     </w:p>
     <w:p>
       <w:pPr>
         <w:pStyle w:val="ListBullet"/>
-        <w:spacing w:before="0" w:after="40" w:line="264" w:lineRule="auto"/>
-        <w:ind w:left="360"/>
+        <w:spacing w:before="0" w:after="60" w:line="276" w:lineRule="auto"/>
+        <w:ind w:left="432"/>
         <w:jc w:val="both"/>
       </w:pPr>
       <w:r>
         <w:rPr>
-          <w:rFonts w:ascii="Times New Roman" w:hAnsi="Times New Roman"/>
+          <w:rFonts w:ascii="Calibri" w:hAnsi="Calibri"/>
           <w:b/>
-          <w:sz w:val="22"/>
+          <w:color w:val="002750"/>
         </w:rPr>
-        <w:t xml:space="preserve">GitHub Actions CI/CD: </w:t>
+        <w:t xml:space="preserve">GitHub Actions: </w:t>
       </w:r>
       <w:r>
         <w:rPr>
-          <w:rFonts w:ascii="Times New Roman" w:hAnsi="Times New Roman"/>
-          <w:sz w:val="22"/>
+          <w:rFonts w:ascii="Calibri" w:hAnsi="Calibri"/>
         </w:rPr>
-        <w:t>Automated build and deployment pipeline on every push to main.</w:t>
+        <w:t>CI/CD pipeline — automated build and deploy on every push to main.</w:t>
       </w:r>
     </w:p>
     <w:p>
@@ -894,28 +1280,30 @@
     </w:p>
     <w:p>
       <w:pPr>
-        <w:keepNext/>
-        <w:spacing w:before="200" w:after="80"/>
+        <w:spacing w:before="320" w:after="100"/>
+        <w:pBdr>
+          <w:bottom w:val="single" w:sz="6" w:space="1" w:color="003366"/>
+        </w:pBdr>
       </w:pPr>
       <w:r>
         <w:rPr>
-          <w:rFonts w:ascii="Times New Roman" w:hAnsi="Times New Roman"/>
+          <w:rFonts w:ascii="Calibri" w:hAnsi="Calibri"/>
           <w:b/>
-          <w:color w:val="003366"/>
-          <w:sz w:val="28"/>
+          <w:color w:val="002750"/>
+          <w:sz w:val="30"/>
         </w:rPr>
         <w:t>6.  Architecture Flow &amp; Agents Used</w:t>
       </w:r>
     </w:p>
     <w:p>
       <w:pPr>
-        <w:spacing w:before="120" w:after="40"/>
+        <w:spacing w:before="160" w:after="60"/>
         <w:jc w:val="center"/>
       </w:pPr>
       <w:r>
         <w:drawing>
           <wp:inline xmlns:a="http://schemas.openxmlformats.org/drawingml/2006/main" xmlns:pic="http://schemas.openxmlformats.org/drawingml/2006/picture">
-            <wp:extent cx="5669280" cy="3559780"/>
+            <wp:extent cx="5486400" cy="3317358"/>
             <wp:docPr id="2" name="Picture 2"/>
             <wp:cNvGraphicFramePr>
               <a:graphicFrameLocks noChangeAspect="1"/>
@@ -924,7 +1312,7 @@
               <a:graphicData uri="http://schemas.openxmlformats.org/drawingml/2006/picture">
                 <pic:pic>
                   <pic:nvPicPr>
-                    <pic:cNvPr id="0" name="agent_workflow_diagram.png"/>
+                    <pic:cNvPr id="0" name="workflow_diagram.png"/>
                     <pic:cNvPicPr/>
                   </pic:nvPicPr>
                   <pic:blipFill>
@@ -936,7 +1324,7 @@
                   <pic:spPr>
                     <a:xfrm>
                       <a:off x="0" y="0"/>
-                      <a:ext cx="5669280" cy="3559780"/>
+                      <a:ext cx="5486400" cy="3317358"/>
                     </a:xfrm>
                     <a:prstGeom prst="rect"/>
                   </pic:spPr>
@@ -949,27 +1337,28 @@
     </w:p>
     <w:p>
       <w:pPr>
-        <w:spacing w:after="120"/>
+        <w:spacing w:after="200"/>
         <w:jc w:val="center"/>
       </w:pPr>
       <w:r>
         <w:rPr>
-          <w:rFonts w:ascii="Times New Roman" w:hAnsi="Times New Roman"/>
+          <w:rFonts w:ascii="Calibri" w:hAnsi="Calibri"/>
           <w:i/>
-          <w:sz w:val="20"/>
+          <w:color w:val="555555"/>
+          <w:sz w:val="19"/>
         </w:rPr>
-        <w:t>Fig 2: SentinelGPT Agent Workflow &amp; Data Flow</w:t>
+        <w:t>Figure 2: Agent Workflow — From Telemetry Ingestion to SOC Output</w:t>
       </w:r>
     </w:p>
     <w:p>
       <w:pPr>
-        <w:spacing w:before="120" w:after="40"/>
+        <w:spacing w:before="200" w:after="60"/>
       </w:pPr>
       <w:r>
         <w:rPr>
-          <w:rFonts w:ascii="Times New Roman" w:hAnsi="Times New Roman"/>
+          <w:rFonts w:ascii="Calibri" w:hAnsi="Calibri"/>
           <w:b/>
-          <w:color w:val="1A4A7A"/>
+          <w:color w:val="005F8E"/>
           <w:sz w:val="24"/>
         </w:rPr>
         <w:t>Agent 1 — Telemetry Monitor &amp; Threat Detection Agent</w:t>
@@ -977,26 +1366,25 @@
     </w:p>
     <w:p>
       <w:pPr>
-        <w:spacing w:before="0" w:after="80" w:line="276" w:lineRule="auto"/>
+        <w:spacing w:before="0" w:after="120" w:line="288" w:lineRule="auto"/>
         <w:jc w:val="both"/>
       </w:pPr>
       <w:r>
         <w:rPr>
-          <w:rFonts w:ascii="Times New Roman" w:hAnsi="Times New Roman"/>
-          <w:sz w:val="22"/>
+          <w:rFonts w:ascii="Calibri" w:hAnsi="Calibri"/>
         </w:rPr>
-        <w:t>Continuously inspects incoming network log events, extracts IP details, computes a heuristic risk score (0–100), and assigns a MITRE ATT&amp;CK tactic/technique tag. Produces a structured incident payload that is persisted to the SOC Incidents database table and streamed to the frontend dashboard in real time.</w:t>
+        <w:t>Continuously inspects incoming network log events, extracts IP details, computes a heuristic risk score (0–100), and assigns a MITRE ATT&amp;CK tactic/technique tag. Produces a structured SOC Incident payload persisted to the database and streamed live to the frontend dashboard.</w:t>
       </w:r>
     </w:p>
     <w:p>
       <w:pPr>
-        <w:spacing w:before="120" w:after="40"/>
+        <w:spacing w:before="200" w:after="60"/>
       </w:pPr>
       <w:r>
         <w:rPr>
-          <w:rFonts w:ascii="Times New Roman" w:hAnsi="Times New Roman"/>
+          <w:rFonts w:ascii="Calibri" w:hAnsi="Calibri"/>
           <w:b/>
-          <w:color w:val="1A4A7A"/>
+          <w:color w:val="005F8E"/>
           <w:sz w:val="24"/>
         </w:rPr>
         <w:t>Agent 2 — Autonomous Quarantine &amp; Validation Agent</w:t>
@@ -1004,28 +1392,29 @@
     </w:p>
     <w:p>
       <w:pPr>
-        <w:spacing w:before="0" w:after="80" w:line="276" w:lineRule="auto"/>
+        <w:spacing w:before="0" w:after="120" w:line="288" w:lineRule="auto"/>
         <w:jc w:val="both"/>
       </w:pPr>
       <w:r>
         <w:rPr>
-          <w:rFonts w:ascii="Times New Roman" w:hAnsi="Times New Roman"/>
-          <w:sz w:val="22"/>
+          <w:rFonts w:ascii="Calibri" w:hAnsi="Calibri"/>
         </w:rPr>
-        <w:t>Evaluates every incident against the severity threshold. Incidents scoring ≥ 75 are automatically written to the Blocked IPs table, effectively quarantining the offending IP. The agent also validates revoke requests and generates AI-driven remediation advice, preventing false-positive lockouts through secondary validation checks.</w:t>
+        <w:t>Evaluates every incident against the severity threshold (≥75 = Critical/High). Qualifying incidents are automatically written to the Blocked IPs table, quarantining the offending IP. The agent validates revoke requests and generates AI-driven remediation advice to prevent false-positive lockouts.</w:t>
       </w:r>
     </w:p>
     <w:p>
       <w:pPr>
-        <w:keepNext/>
-        <w:spacing w:before="200" w:after="80"/>
+        <w:spacing w:before="320" w:after="100"/>
+        <w:pBdr>
+          <w:bottom w:val="single" w:sz="6" w:space="1" w:color="003366"/>
+        </w:pBdr>
       </w:pPr>
       <w:r>
         <w:rPr>
-          <w:rFonts w:ascii="Times New Roman" w:hAnsi="Times New Roman"/>
+          <w:rFonts w:ascii="Calibri" w:hAnsi="Calibri"/>
           <w:b/>
-          <w:color w:val="003366"/>
-          <w:sz w:val="28"/>
+          <w:color w:val="002750"/>
+          <w:sz w:val="30"/>
         </w:rPr>
         <w:t>7.  Algorithms Used</w:t>
       </w:r>
@@ -1033,70 +1422,409 @@
     <w:p>
       <w:pPr>
         <w:pStyle w:val="ListBullet"/>
-        <w:spacing w:before="0" w:after="40" w:line="264" w:lineRule="auto"/>
-        <w:ind w:left="360"/>
+        <w:spacing w:before="0" w:after="60" w:line="276" w:lineRule="auto"/>
+        <w:ind w:left="432"/>
         <w:jc w:val="both"/>
       </w:pPr>
       <w:r>
         <w:rPr>
-          <w:rFonts w:ascii="Times New Roman" w:hAnsi="Times New Roman"/>
+          <w:rFonts w:ascii="Calibri" w:hAnsi="Calibri"/>
           <w:b/>
-          <w:sz w:val="22"/>
+          <w:color w:val="002750"/>
         </w:rPr>
         <w:t xml:space="preserve">Heuristic Threat Scoring: </w:t>
       </w:r>
       <w:r>
         <w:rPr>
-          <w:rFonts w:ascii="Times New Roman" w:hAnsi="Times New Roman"/>
-          <w:sz w:val="22"/>
+          <w:rFonts w:ascii="Calibri" w:hAnsi="Calibri"/>
         </w:rPr>
-        <w:t>Evaluates request velocity, payload anomaly patterns, and IP reputation to produce a normalized 0–100 risk score.</w:t>
+        <w:t>Evaluates request velocity, payload anomaly patterns, and IP reputation to produce a normalized 0–100 risk score without relying solely on static signatures.</w:t>
       </w:r>
     </w:p>
     <w:p>
       <w:pPr>
         <w:pStyle w:val="ListBullet"/>
-        <w:spacing w:before="0" w:after="40" w:line="264" w:lineRule="auto"/>
-        <w:ind w:left="360"/>
+        <w:spacing w:before="0" w:after="60" w:line="276" w:lineRule="auto"/>
+        <w:ind w:left="432"/>
         <w:jc w:val="both"/>
       </w:pPr>
       <w:r>
         <w:rPr>
-          <w:rFonts w:ascii="Times New Roman" w:hAnsi="Times New Roman"/>
+          <w:rFonts w:ascii="Calibri" w:hAnsi="Calibri"/>
           <w:b/>
-          <w:sz w:val="22"/>
+          <w:color w:val="002750"/>
         </w:rPr>
         <w:t xml:space="preserve">Severity Matrix Classifier: </w:t>
       </w:r>
       <w:r>
         <w:rPr>
-          <w:rFonts w:ascii="Times New Roman" w:hAnsi="Times New Roman"/>
-          <w:sz w:val="22"/>
+          <w:rFonts w:ascii="Calibri" w:hAnsi="Calibri"/>
         </w:rPr>
-        <w:t>Maps scores to Critical (≥75), High (60–74), Medium (40–59), and Low (&lt;40) priority tiers — driving automated responses.</w:t>
+        <w:t>Maps scores to Critical (≥75), High (60–74), Medium (40–59), and Low (&lt;40) priority tiers — driving the automated quarantine and alerting logic.</w:t>
       </w:r>
     </w:p>
     <w:p>
       <w:pPr>
         <w:pStyle w:val="ListBullet"/>
-        <w:spacing w:before="0" w:after="40" w:line="264" w:lineRule="auto"/>
-        <w:ind w:left="360"/>
+        <w:spacing w:before="0" w:after="60" w:line="276" w:lineRule="auto"/>
+        <w:ind w:left="432"/>
         <w:jc w:val="both"/>
       </w:pPr>
       <w:r>
         <w:rPr>
-          <w:rFonts w:ascii="Times New Roman" w:hAnsi="Times New Roman"/>
+          <w:rFonts w:ascii="Calibri" w:hAnsi="Calibri"/>
           <w:b/>
-          <w:sz w:val="22"/>
+          <w:color w:val="002750"/>
         </w:rPr>
         <w:t xml:space="preserve">Velocity Rate Anomaly Detector: </w:t>
       </w:r>
       <w:r>
         <w:rPr>
-          <w:rFonts w:ascii="Times New Roman" w:hAnsi="Times New Roman"/>
-          <w:sz w:val="22"/>
+          <w:rFonts w:ascii="Calibri" w:hAnsi="Calibri"/>
         </w:rPr>
-        <w:t>Monitors burst traffic spikes per IP over sliding time windows to detect DDoS and port-scan sweeps.</w:t>
+        <w:t>Monitors burst traffic spikes per IP over sliding time windows to detect active DDoS attacks and port-scan sweeps.</w:t>
+      </w:r>
+    </w:p>
+    <w:p>
+      <w:pPr>
+        <w:spacing w:before="320" w:after="100"/>
+        <w:pBdr>
+          <w:bottom w:val="single" w:sz="6" w:space="1" w:color="003366"/>
+        </w:pBdr>
+      </w:pPr>
+      <w:r>
+        <w:rPr>
+          <w:rFonts w:ascii="Calibri" w:hAnsi="Calibri"/>
+          <w:b/>
+          <w:color w:val="002750"/>
+          <w:sz w:val="30"/>
+        </w:rPr>
+        <w:t>8.  Implementation Phases</w:t>
+      </w:r>
+    </w:p>
+    <w:p>
+      <w:pPr>
+        <w:pStyle w:val="ListBullet"/>
+        <w:spacing w:before="0" w:after="60" w:line="276" w:lineRule="auto"/>
+        <w:ind w:left="432"/>
+        <w:jc w:val="both"/>
+      </w:pPr>
+      <w:r>
+        <w:rPr>
+          <w:rFonts w:ascii="Calibri" w:hAnsi="Calibri"/>
+          <w:b/>
+          <w:color w:val="002750"/>
+        </w:rPr>
+        <w:t>Phase 1 — Requirement Analysis:</w:t>
+      </w:r>
+      <w:r>
+        <w:rPr>
+          <w:rFonts w:ascii="Calibri" w:hAnsi="Calibri"/>
+        </w:rPr>
+        <w:t xml:space="preserve"> Identified SOC pain points, defined scoring metrics, mapped MITRE ATT&amp;CK coverage.</w:t>
+      </w:r>
+    </w:p>
+    <w:p>
+      <w:pPr>
+        <w:pStyle w:val="ListBullet"/>
+        <w:spacing w:before="0" w:after="60" w:line="276" w:lineRule="auto"/>
+        <w:ind w:left="432"/>
+        <w:jc w:val="both"/>
+      </w:pPr>
+      <w:r>
+        <w:rPr>
+          <w:rFonts w:ascii="Calibri" w:hAnsi="Calibri"/>
+          <w:b/>
+          <w:color w:val="002750"/>
+        </w:rPr>
+        <w:t>Phase 2 — System Design:</w:t>
+      </w:r>
+      <w:r>
+        <w:rPr>
+          <w:rFonts w:ascii="Calibri" w:hAnsi="Calibri"/>
+        </w:rPr>
+        <w:t xml:space="preserve"> Architected decoupled React SPA + FastAPI serverless backend; finalized API contracts.</w:t>
+      </w:r>
+    </w:p>
+    <w:p>
+      <w:pPr>
+        <w:pStyle w:val="ListBullet"/>
+        <w:spacing w:before="0" w:after="60" w:line="276" w:lineRule="auto"/>
+        <w:ind w:left="432"/>
+        <w:jc w:val="both"/>
+      </w:pPr>
+      <w:r>
+        <w:rPr>
+          <w:rFonts w:ascii="Calibri" w:hAnsi="Calibri"/>
+          <w:b/>
+          <w:color w:val="002750"/>
+        </w:rPr>
+        <w:t>Phase 3 — Database Schema:</w:t>
+      </w:r>
+      <w:r>
+        <w:rPr>
+          <w:rFonts w:ascii="Calibri" w:hAnsi="Calibri"/>
+        </w:rPr>
+        <w:t xml:space="preserve"> Designed ORM models — Users, SOC Incidents, Perimeter Logs, Blocked IPs.</w:t>
+      </w:r>
+    </w:p>
+    <w:p>
+      <w:pPr>
+        <w:pStyle w:val="ListBullet"/>
+        <w:spacing w:before="0" w:after="60" w:line="276" w:lineRule="auto"/>
+        <w:ind w:left="432"/>
+        <w:jc w:val="both"/>
+      </w:pPr>
+      <w:r>
+        <w:rPr>
+          <w:rFonts w:ascii="Calibri" w:hAnsi="Calibri"/>
+          <w:b/>
+          <w:color w:val="002750"/>
+        </w:rPr>
+        <w:t>Phase 4 — Frontend Development:</w:t>
+      </w:r>
+      <w:r>
+        <w:rPr>
+          <w:rFonts w:ascii="Calibri" w:hAnsi="Calibri"/>
+        </w:rPr>
+        <w:t xml:space="preserve"> Built glassmorphic components — ThreatChart, RiskGauge, BlockedIPs, Login, Dashboard.</w:t>
+      </w:r>
+    </w:p>
+    <w:p>
+      <w:pPr>
+        <w:pStyle w:val="ListBullet"/>
+        <w:spacing w:before="0" w:after="60" w:line="276" w:lineRule="auto"/>
+        <w:ind w:left="432"/>
+        <w:jc w:val="both"/>
+      </w:pPr>
+      <w:r>
+        <w:rPr>
+          <w:rFonts w:ascii="Calibri" w:hAnsi="Calibri"/>
+          <w:b/>
+          <w:color w:val="002750"/>
+        </w:rPr>
+        <w:t>Phase 5 — Backend &amp; JWT Auth:</w:t>
+      </w:r>
+      <w:r>
+        <w:rPr>
+          <w:rFonts w:ascii="Calibri" w:hAnsi="Calibri"/>
+        </w:rPr>
+        <w:t xml:space="preserve"> Implemented REST routes (/api/snapshot, /api/block_ip, /api/sim_threat) with HS256 JWT.</w:t>
+      </w:r>
+    </w:p>
+    <w:p>
+      <w:pPr>
+        <w:pStyle w:val="ListBullet"/>
+        <w:spacing w:before="0" w:after="60" w:line="276" w:lineRule="auto"/>
+        <w:ind w:left="432"/>
+        <w:jc w:val="both"/>
+      </w:pPr>
+      <w:r>
+        <w:rPr>
+          <w:rFonts w:ascii="Calibri" w:hAnsi="Calibri"/>
+          <w:b/>
+          <w:color w:val="002750"/>
+        </w:rPr>
+        <w:t>Phase 6 — Agentic AI Dev:</w:t>
+      </w:r>
+      <w:r>
+        <w:rPr>
+          <w:rFonts w:ascii="Calibri" w:hAnsi="Calibri"/>
+        </w:rPr>
+        <w:t xml:space="preserve"> Programmed Telemetry Monitor Agent and Autonomous Quarantine Agent workflows.</w:t>
+      </w:r>
+    </w:p>
+    <w:p>
+      <w:pPr>
+        <w:pStyle w:val="ListBullet"/>
+        <w:spacing w:before="0" w:after="60" w:line="276" w:lineRule="auto"/>
+        <w:ind w:left="432"/>
+        <w:jc w:val="both"/>
+      </w:pPr>
+      <w:r>
+        <w:rPr>
+          <w:rFonts w:ascii="Calibri" w:hAnsi="Calibri"/>
+          <w:b/>
+          <w:color w:val="002750"/>
+        </w:rPr>
+        <w:t>Phase 7 — Integration Testing:</w:t>
+      </w:r>
+      <w:r>
+        <w:rPr>
+          <w:rFonts w:ascii="Calibri" w:hAnsi="Calibri"/>
+        </w:rPr>
+        <w:t xml:space="preserve"> Simulated threat injection to verify scoring accuracy, quarantine triggers, and revocation.</w:t>
+      </w:r>
+    </w:p>
+    <w:p>
+      <w:pPr>
+        <w:pStyle w:val="ListBullet"/>
+        <w:spacing w:before="0" w:after="60" w:line="276" w:lineRule="auto"/>
+        <w:ind w:left="432"/>
+        <w:jc w:val="both"/>
+      </w:pPr>
+      <w:r>
+        <w:rPr>
+          <w:rFonts w:ascii="Calibri" w:hAnsi="Calibri"/>
+          <w:b/>
+          <w:color w:val="002750"/>
+        </w:rPr>
+        <w:t>Phase 8 — Cloud Deployment:</w:t>
+      </w:r>
+      <w:r>
+        <w:rPr>
+          <w:rFonts w:ascii="Calibri" w:hAnsi="Calibri"/>
+        </w:rPr>
+        <w:t xml:space="preserve"> Deployed full-stack to Vercel Serverless; verified Swagger docs in production.</w:t>
+      </w:r>
+    </w:p>
+    <w:p>
+      <w:pPr>
+        <w:spacing w:before="320" w:after="100"/>
+        <w:pBdr>
+          <w:bottom w:val="single" w:sz="6" w:space="1" w:color="003366"/>
+        </w:pBdr>
+      </w:pPr>
+      <w:r>
+        <w:rPr>
+          <w:rFonts w:ascii="Calibri" w:hAnsi="Calibri"/>
+          <w:b/>
+          <w:color w:val="002750"/>
+          <w:sz w:val="30"/>
+        </w:rPr>
+        <w:t>9.  Applications</w:t>
+      </w:r>
+    </w:p>
+    <w:p>
+      <w:pPr>
+        <w:pStyle w:val="ListBullet"/>
+        <w:spacing w:before="0" w:after="60" w:line="276" w:lineRule="auto"/>
+        <w:ind w:left="432"/>
+        <w:jc w:val="both"/>
+      </w:pPr>
+      <w:r>
+        <w:rPr>
+          <w:rFonts w:ascii="Calibri" w:hAnsi="Calibri"/>
+          <w:b/>
+          <w:color w:val="002750"/>
+        </w:rPr>
+        <w:t>Enterprise SOC Operations:</w:t>
+      </w:r>
+      <w:r>
+        <w:rPr>
+          <w:rFonts w:ascii="Calibri" w:hAnsi="Calibri"/>
+        </w:rPr>
+        <w:t xml:space="preserve"> Continuous perimeter monitoring and automated response for dedicated security teams.</w:t>
+      </w:r>
+    </w:p>
+    <w:p>
+      <w:pPr>
+        <w:pStyle w:val="ListBullet"/>
+        <w:spacing w:before="0" w:after="60" w:line="276" w:lineRule="auto"/>
+        <w:ind w:left="432"/>
+        <w:jc w:val="both"/>
+      </w:pPr>
+      <w:r>
+        <w:rPr>
+          <w:rFonts w:ascii="Calibri" w:hAnsi="Calibri"/>
+          <w:b/>
+          <w:color w:val="002750"/>
+        </w:rPr>
+        <w:t>Financial Institutions:</w:t>
+      </w:r>
+      <w:r>
+        <w:rPr>
+          <w:rFonts w:ascii="Calibri" w:hAnsi="Calibri"/>
+        </w:rPr>
+        <w:t xml:space="preserve"> Protects banking portals from credential stuffing, brute-force, and fraud attempts.</w:t>
+      </w:r>
+    </w:p>
+    <w:p>
+      <w:pPr>
+        <w:pStyle w:val="ListBullet"/>
+        <w:spacing w:before="0" w:after="60" w:line="276" w:lineRule="auto"/>
+        <w:ind w:left="432"/>
+        <w:jc w:val="both"/>
+      </w:pPr>
+      <w:r>
+        <w:rPr>
+          <w:rFonts w:ascii="Calibri" w:hAnsi="Calibri"/>
+          <w:b/>
+          <w:color w:val="002750"/>
+        </w:rPr>
+        <w:t>Cloud Service Providers:</w:t>
+      </w:r>
+      <w:r>
+        <w:rPr>
+          <w:rFonts w:ascii="Calibri" w:hAnsi="Calibri"/>
+        </w:rPr>
+        <w:t xml:space="preserve"> Safeguards serverless APIs and microservices from unauthorized probes and exploits.</w:t>
+      </w:r>
+    </w:p>
+    <w:p>
+      <w:pPr>
+        <w:pStyle w:val="ListBullet"/>
+        <w:spacing w:before="0" w:after="60" w:line="276" w:lineRule="auto"/>
+        <w:ind w:left="432"/>
+        <w:jc w:val="both"/>
+      </w:pPr>
+      <w:r>
+        <w:rPr>
+          <w:rFonts w:ascii="Calibri" w:hAnsi="Calibri"/>
+          <w:b/>
+          <w:color w:val="002750"/>
+        </w:rPr>
+        <w:t>Healthcare Networks:</w:t>
+      </w:r>
+      <w:r>
+        <w:rPr>
+          <w:rFonts w:ascii="Calibri" w:hAnsi="Calibri"/>
+        </w:rPr>
+        <w:t xml:space="preserve"> Secures patient data endpoints against ransomware and malware payload injection.</w:t>
+      </w:r>
+    </w:p>
+    <w:p>
+      <w:pPr>
+        <w:pStyle w:val="ListBullet"/>
+        <w:spacing w:before="0" w:after="60" w:line="276" w:lineRule="auto"/>
+        <w:ind w:left="432"/>
+        <w:jc w:val="both"/>
+      </w:pPr>
+      <w:r>
+        <w:rPr>
+          <w:rFonts w:ascii="Calibri" w:hAnsi="Calibri"/>
+          <w:b/>
+          <w:color w:val="002750"/>
+        </w:rPr>
+        <w:t>E-Commerce Platforms:</w:t>
+      </w:r>
+      <w:r>
+        <w:rPr>
+          <w:rFonts w:ascii="Calibri" w:hAnsi="Calibri"/>
+        </w:rPr>
+        <w:t xml:space="preserve"> Prevents DDoS and SQL injection attacks during high-traffic sales events.</w:t>
+      </w:r>
+    </w:p>
+    <w:p>
+      <w:pPr>
+        <w:pStyle w:val="ListBullet"/>
+        <w:spacing w:before="0" w:after="60" w:line="276" w:lineRule="auto"/>
+        <w:ind w:left="432"/>
+        <w:jc w:val="both"/>
+      </w:pPr>
+      <w:r>
+        <w:rPr>
+          <w:rFonts w:ascii="Calibri" w:hAnsi="Calibri"/>
+          <w:b/>
+          <w:color w:val="002750"/>
+        </w:rPr>
+        <w:t>Academic Institutions:</w:t>
+      </w:r>
+      <w:r>
+        <w:rPr>
+          <w:rFonts w:ascii="Calibri" w:hAnsi="Calibri"/>
+        </w:rPr>
+        <w:t xml:space="preserve"> Monitors campus networks and prevents faculty/student account hijacking.</w:t>
       </w:r>
     </w:p>
     <w:p>
@@ -1106,391 +1834,46 @@
     </w:p>
     <w:p>
       <w:pPr>
-        <w:keepNext/>
-        <w:spacing w:before="200" w:after="80"/>
+        <w:spacing w:before="320" w:after="100"/>
+        <w:pBdr>
+          <w:bottom w:val="single" w:sz="6" w:space="1" w:color="003366"/>
+        </w:pBdr>
       </w:pPr>
       <w:r>
         <w:rPr>
-          <w:rFonts w:ascii="Times New Roman" w:hAnsi="Times New Roman"/>
+          <w:rFonts w:ascii="Calibri" w:hAnsi="Calibri"/>
           <w:b/>
-          <w:color w:val="003366"/>
-          <w:sz w:val="28"/>
+          <w:color w:val="002750"/>
+          <w:sz w:val="30"/>
         </w:rPr>
-        <w:t>8.  Implementation Phases</w:t>
+        <w:t>10.  User Interface Screenshots</w:t>
       </w:r>
     </w:p>
     <w:p>
       <w:pPr>
-        <w:pStyle w:val="ListBullet"/>
-        <w:spacing w:before="0" w:after="40" w:line="264" w:lineRule="auto"/>
-        <w:ind w:left="360"/>
-        <w:jc w:val="both"/>
+        <w:spacing w:before="0" w:after="120" w:line="288" w:lineRule="auto"/>
       </w:pPr>
       <w:r>
         <w:rPr>
-          <w:rFonts w:ascii="Times New Roman" w:hAnsi="Times New Roman"/>
-          <w:b/>
-          <w:sz w:val="22"/>
+          <w:rFonts w:ascii="Calibri" w:hAnsi="Calibri"/>
         </w:rPr>
-        <w:t xml:space="preserve">Phase 1 — Requirement Analysis: </w:t>
-      </w:r>
-      <w:r>
-        <w:rPr>
-          <w:rFonts w:ascii="Times New Roman" w:hAnsi="Times New Roman"/>
-          <w:sz w:val="22"/>
-        </w:rPr>
-        <w:t>Identified SOC pain points; defined threat scoring metrics; mapped MITRE ATT&amp;CK coverage.</w:t>
-      </w:r>
-    </w:p>
-    <w:p>
-      <w:pPr>
-        <w:pStyle w:val="ListBullet"/>
-        <w:spacing w:before="0" w:after="40" w:line="264" w:lineRule="auto"/>
-        <w:ind w:left="360"/>
-        <w:jc w:val="both"/>
-      </w:pPr>
-      <w:r>
-        <w:rPr>
-          <w:rFonts w:ascii="Times New Roman" w:hAnsi="Times New Roman"/>
-          <w:b/>
-          <w:sz w:val="22"/>
-        </w:rPr>
-        <w:t xml:space="preserve">Phase 2 — System Design: </w:t>
-      </w:r>
-      <w:r>
-        <w:rPr>
-          <w:rFonts w:ascii="Times New Roman" w:hAnsi="Times New Roman"/>
-          <w:sz w:val="22"/>
-        </w:rPr>
-        <w:t>Architected decoupled React SPA + FastAPI serverless backend; finalized API contracts.</w:t>
-      </w:r>
-    </w:p>
-    <w:p>
-      <w:pPr>
-        <w:pStyle w:val="ListBullet"/>
-        <w:spacing w:before="0" w:after="40" w:line="264" w:lineRule="auto"/>
-        <w:ind w:left="360"/>
-        <w:jc w:val="both"/>
-      </w:pPr>
-      <w:r>
-        <w:rPr>
-          <w:rFonts w:ascii="Times New Roman" w:hAnsi="Times New Roman"/>
-          <w:b/>
-          <w:sz w:val="22"/>
-        </w:rPr>
-        <w:t xml:space="preserve">Phase 3 — Database Schema: </w:t>
-      </w:r>
-      <w:r>
-        <w:rPr>
-          <w:rFonts w:ascii="Times New Roman" w:hAnsi="Times New Roman"/>
-          <w:sz w:val="22"/>
-        </w:rPr>
-        <w:t>Designed SQLAlchemy ORM models — Users, SOC Incidents, Perimeter Logs, Blocked IPs.</w:t>
-      </w:r>
-    </w:p>
-    <w:p>
-      <w:pPr>
-        <w:pStyle w:val="ListBullet"/>
-        <w:spacing w:before="0" w:after="40" w:line="264" w:lineRule="auto"/>
-        <w:ind w:left="360"/>
-        <w:jc w:val="both"/>
-      </w:pPr>
-      <w:r>
-        <w:rPr>
-          <w:rFonts w:ascii="Times New Roman" w:hAnsi="Times New Roman"/>
-          <w:b/>
-          <w:sz w:val="22"/>
-        </w:rPr>
-        <w:t xml:space="preserve">Phase 4 — Frontend Development: </w:t>
-      </w:r>
-      <w:r>
-        <w:rPr>
-          <w:rFonts w:ascii="Times New Roman" w:hAnsi="Times New Roman"/>
-          <w:sz w:val="22"/>
-        </w:rPr>
-        <w:t>Built glassmorphic components — ThreatChart, RiskGaugeChart, BlockedIPs, Login, Dashboard.</w:t>
-      </w:r>
-    </w:p>
-    <w:p>
-      <w:pPr>
-        <w:pStyle w:val="ListBullet"/>
-        <w:spacing w:before="0" w:after="40" w:line="264" w:lineRule="auto"/>
-        <w:ind w:left="360"/>
-        <w:jc w:val="both"/>
-      </w:pPr>
-      <w:r>
-        <w:rPr>
-          <w:rFonts w:ascii="Times New Roman" w:hAnsi="Times New Roman"/>
-          <w:b/>
-          <w:sz w:val="22"/>
-        </w:rPr>
-        <w:t xml:space="preserve">Phase 5 — Backend &amp; JWT Auth: </w:t>
-      </w:r>
-      <w:r>
-        <w:rPr>
-          <w:rFonts w:ascii="Times New Roman" w:hAnsi="Times New Roman"/>
-          <w:sz w:val="22"/>
-        </w:rPr>
-        <w:t>Implemented REST routes (/api/snapshot, /api/block_ip, /api/sim_threat) with HS256 JWT auth.</w:t>
-      </w:r>
-    </w:p>
-    <w:p>
-      <w:pPr>
-        <w:pStyle w:val="ListBullet"/>
-        <w:spacing w:before="0" w:after="40" w:line="264" w:lineRule="auto"/>
-        <w:ind w:left="360"/>
-        <w:jc w:val="both"/>
-      </w:pPr>
-      <w:r>
-        <w:rPr>
-          <w:rFonts w:ascii="Times New Roman" w:hAnsi="Times New Roman"/>
-          <w:b/>
-          <w:sz w:val="22"/>
-        </w:rPr>
-        <w:t xml:space="preserve">Phase 6 — Agentic AI Development: </w:t>
-      </w:r>
-      <w:r>
-        <w:rPr>
-          <w:rFonts w:ascii="Times New Roman" w:hAnsi="Times New Roman"/>
-          <w:sz w:val="22"/>
-        </w:rPr>
-        <w:t>Programmed the Telemetry Monitor Agent and Autonomous Quarantine Agent workflows.</w:t>
-      </w:r>
-    </w:p>
-    <w:p>
-      <w:pPr>
-        <w:pStyle w:val="ListBullet"/>
-        <w:spacing w:before="0" w:after="40" w:line="264" w:lineRule="auto"/>
-        <w:ind w:left="360"/>
-        <w:jc w:val="both"/>
-      </w:pPr>
-      <w:r>
-        <w:rPr>
-          <w:rFonts w:ascii="Times New Roman" w:hAnsi="Times New Roman"/>
-          <w:b/>
-          <w:sz w:val="22"/>
-        </w:rPr>
-        <w:t xml:space="preserve">Phase 7 — Integration &amp; Testing: </w:t>
-      </w:r>
-      <w:r>
-        <w:rPr>
-          <w:rFonts w:ascii="Times New Roman" w:hAnsi="Times New Roman"/>
-          <w:sz w:val="22"/>
-        </w:rPr>
-        <w:t>Injected simulated threats to verify heuristic accuracy, quarantine triggers, and revoke controls.</w:t>
-      </w:r>
-    </w:p>
-    <w:p>
-      <w:pPr>
-        <w:pStyle w:val="ListBullet"/>
-        <w:spacing w:before="0" w:after="40" w:line="264" w:lineRule="auto"/>
-        <w:ind w:left="360"/>
-        <w:jc w:val="both"/>
-      </w:pPr>
-      <w:r>
-        <w:rPr>
-          <w:rFonts w:ascii="Times New Roman" w:hAnsi="Times New Roman"/>
-          <w:b/>
-          <w:sz w:val="22"/>
-        </w:rPr>
-        <w:t xml:space="preserve">Phase 8 — Cloud Deployment: </w:t>
-      </w:r>
-      <w:r>
-        <w:rPr>
-          <w:rFonts w:ascii="Times New Roman" w:hAnsi="Times New Roman"/>
-          <w:sz w:val="22"/>
-        </w:rPr>
-        <w:t>Deployed full-stack to Vercel Serverless; configured env vars; verified Swagger docs in production.</w:t>
-      </w:r>
-    </w:p>
-    <w:p>
-      <w:pPr>
-        <w:keepNext/>
-        <w:spacing w:before="200" w:after="80"/>
-      </w:pPr>
-      <w:r>
-        <w:rPr>
-          <w:rFonts w:ascii="Times New Roman" w:hAnsi="Times New Roman"/>
-          <w:b/>
-          <w:color w:val="003366"/>
-          <w:sz w:val="28"/>
-        </w:rPr>
-        <w:t>9.  Applications</w:t>
-      </w:r>
-    </w:p>
-    <w:p>
-      <w:pPr>
-        <w:pStyle w:val="ListBullet"/>
-        <w:spacing w:before="0" w:after="40" w:line="264" w:lineRule="auto"/>
-        <w:ind w:left="360"/>
-        <w:jc w:val="both"/>
-      </w:pPr>
-      <w:r>
-        <w:rPr>
-          <w:rFonts w:ascii="Times New Roman" w:hAnsi="Times New Roman"/>
-          <w:b/>
-          <w:sz w:val="22"/>
-        </w:rPr>
-        <w:t xml:space="preserve">Enterprise SOC Operations: </w:t>
-      </w:r>
-      <w:r>
-        <w:rPr>
-          <w:rFonts w:ascii="Times New Roman" w:hAnsi="Times New Roman"/>
-          <w:sz w:val="22"/>
-        </w:rPr>
-        <w:t>Continuous perimeter monitoring, real-time threat triage, and automated response for security teams.</w:t>
-      </w:r>
-    </w:p>
-    <w:p>
-      <w:pPr>
-        <w:pStyle w:val="ListBullet"/>
-        <w:spacing w:before="0" w:after="40" w:line="264" w:lineRule="auto"/>
-        <w:ind w:left="360"/>
-        <w:jc w:val="both"/>
-      </w:pPr>
-      <w:r>
-        <w:rPr>
-          <w:rFonts w:ascii="Times New Roman" w:hAnsi="Times New Roman"/>
-          <w:b/>
-          <w:sz w:val="22"/>
-        </w:rPr>
-        <w:t xml:space="preserve">Financial Institutions: </w:t>
-      </w:r>
-      <w:r>
-        <w:rPr>
-          <w:rFonts w:ascii="Times New Roman" w:hAnsi="Times New Roman"/>
-          <w:sz w:val="22"/>
-        </w:rPr>
-        <w:t>Protects banking portals from credential stuffing, brute-force, and transaction fraud.</w:t>
-      </w:r>
-    </w:p>
-    <w:p>
-      <w:pPr>
-        <w:pStyle w:val="ListBullet"/>
-        <w:spacing w:before="0" w:after="40" w:line="264" w:lineRule="auto"/>
-        <w:ind w:left="360"/>
-        <w:jc w:val="both"/>
-      </w:pPr>
-      <w:r>
-        <w:rPr>
-          <w:rFonts w:ascii="Times New Roman" w:hAnsi="Times New Roman"/>
-          <w:b/>
-          <w:sz w:val="22"/>
-        </w:rPr>
-        <w:t xml:space="preserve">Cloud Service Providers: </w:t>
-      </w:r>
-      <w:r>
-        <w:rPr>
-          <w:rFonts w:ascii="Times New Roman" w:hAnsi="Times New Roman"/>
-          <w:sz w:val="22"/>
-        </w:rPr>
-        <w:t>Safeguards serverless APIs and microservices from unauthorized probes and exploitation.</w:t>
-      </w:r>
-    </w:p>
-    <w:p>
-      <w:pPr>
-        <w:pStyle w:val="ListBullet"/>
-        <w:spacing w:before="0" w:after="40" w:line="264" w:lineRule="auto"/>
-        <w:ind w:left="360"/>
-        <w:jc w:val="both"/>
-      </w:pPr>
-      <w:r>
-        <w:rPr>
-          <w:rFonts w:ascii="Times New Roman" w:hAnsi="Times New Roman"/>
-          <w:b/>
-          <w:sz w:val="22"/>
-        </w:rPr>
-        <w:t xml:space="preserve">Healthcare Networks: </w:t>
-      </w:r>
-      <w:r>
-        <w:rPr>
-          <w:rFonts w:ascii="Times New Roman" w:hAnsi="Times New Roman"/>
-          <w:sz w:val="22"/>
-        </w:rPr>
-        <w:t>Secures patient data endpoints against ransomware and malware payload injection.</w:t>
-      </w:r>
-    </w:p>
-    <w:p>
-      <w:pPr>
-        <w:pStyle w:val="ListBullet"/>
-        <w:spacing w:before="0" w:after="40" w:line="264" w:lineRule="auto"/>
-        <w:ind w:left="360"/>
-        <w:jc w:val="both"/>
-      </w:pPr>
-      <w:r>
-        <w:rPr>
-          <w:rFonts w:ascii="Times New Roman" w:hAnsi="Times New Roman"/>
-          <w:b/>
-          <w:sz w:val="22"/>
-        </w:rPr>
-        <w:t xml:space="preserve">E-Commerce Platforms: </w:t>
-      </w:r>
-      <w:r>
-        <w:rPr>
-          <w:rFonts w:ascii="Times New Roman" w:hAnsi="Times New Roman"/>
-          <w:sz w:val="22"/>
-        </w:rPr>
-        <w:t>Prevents DDoS disruption and SQL injection attacks during high-traffic periods.</w:t>
-      </w:r>
-    </w:p>
-    <w:p>
-      <w:pPr>
-        <w:pStyle w:val="ListBullet"/>
-        <w:spacing w:before="0" w:after="40" w:line="264" w:lineRule="auto"/>
-        <w:ind w:left="360"/>
-        <w:jc w:val="both"/>
-      </w:pPr>
-      <w:r>
-        <w:rPr>
-          <w:rFonts w:ascii="Times New Roman" w:hAnsi="Times New Roman"/>
-          <w:b/>
-          <w:sz w:val="22"/>
-        </w:rPr>
-        <w:t xml:space="preserve">Academic Institutions: </w:t>
-      </w:r>
-      <w:r>
-        <w:rPr>
-          <w:rFonts w:ascii="Times New Roman" w:hAnsi="Times New Roman"/>
-          <w:sz w:val="22"/>
-        </w:rPr>
-        <w:t>Monitors campus networks and prevents faculty/student account hijacking.</w:t>
-      </w:r>
-    </w:p>
-    <w:p>
-      <w:r>
-        <w:br w:type="page"/>
-      </w:r>
-    </w:p>
-    <w:p>
-      <w:pPr>
-        <w:keepNext/>
-        <w:spacing w:before="200" w:after="80"/>
-      </w:pPr>
-      <w:r>
-        <w:rPr>
-          <w:rFonts w:ascii="Times New Roman" w:hAnsi="Times New Roman"/>
-          <w:b/>
-          <w:color w:val="003366"/>
-          <w:sz w:val="28"/>
-        </w:rPr>
-        <w:t>10.  User Interface Screenshots</w:t>
+        <w:t>The following figures depict the live operational screens of the SentinelGPT system:</w:t>
       </w:r>
     </w:p>
     <w:tbl>
       <w:tblPr>
-        <w:tblStyle w:val="TableGrid"/>
         <w:tblW w:type="auto" w:w="0"/>
         <w:jc w:val="center"/>
         <w:tblLook w:firstColumn="1" w:firstRow="1" w:lastColumn="0" w:lastRow="0" w:noHBand="0" w:noVBand="1" w:val="04A0"/>
       </w:tblPr>
       <w:tblGrid>
-        <w:gridCol w:w="4680"/>
-        <w:gridCol w:w="4680"/>
+        <w:gridCol w:w="4464"/>
+        <w:gridCol w:w="4464"/>
       </w:tblGrid>
       <w:tr>
         <w:tc>
           <w:tcPr>
-            <w:tcW w:type="dxa" w:w="4680"/>
+            <w:tcW w:type="dxa" w:w="4464"/>
             <w:tcBorders>
               <w:top w:val="none"/>
               <w:bottom w:val="none"/>
@@ -1500,13 +1883,13 @@
           </w:tcPr>
           <w:p>
             <w:pPr>
-              <w:spacing w:after="40"/>
+              <w:spacing w:before="120" w:after="40"/>
               <w:jc w:val="center"/>
             </w:pPr>
             <w:r>
               <w:drawing>
                 <wp:inline xmlns:a="http://schemas.openxmlformats.org/drawingml/2006/main" xmlns:pic="http://schemas.openxmlformats.org/drawingml/2006/picture">
-                  <wp:extent cx="2743200" cy="1303020"/>
+                  <wp:extent cx="2697480" cy="1281303"/>
                   <wp:docPr id="3" name="Picture 3"/>
                   <wp:cNvGraphicFramePr>
                     <a:graphicFrameLocks noChangeAspect="1"/>
@@ -1527,7 +1910,7 @@
                         <pic:spPr>
                           <a:xfrm>
                             <a:off x="0" y="0"/>
-                            <a:ext cx="2743200" cy="1303020"/>
+                            <a:ext cx="2697480" cy="1281303"/>
                           </a:xfrm>
                           <a:prstGeom prst="rect"/>
                         </pic:spPr>
@@ -1541,7 +1924,7 @@
         </w:tc>
         <w:tc>
           <w:tcPr>
-            <w:tcW w:type="dxa" w:w="4680"/>
+            <w:tcW w:type="dxa" w:w="4464"/>
             <w:tcBorders>
               <w:top w:val="none"/>
               <w:bottom w:val="none"/>
@@ -1551,13 +1934,13 @@
           </w:tcPr>
           <w:p>
             <w:pPr>
-              <w:spacing w:after="40"/>
+              <w:spacing w:before="120" w:after="40"/>
               <w:jc w:val="center"/>
             </w:pPr>
             <w:r>
               <w:drawing>
                 <wp:inline xmlns:a="http://schemas.openxmlformats.org/drawingml/2006/main" xmlns:pic="http://schemas.openxmlformats.org/drawingml/2006/picture">
-                  <wp:extent cx="2743200" cy="1303020"/>
+                  <wp:extent cx="2697480" cy="1281303"/>
                   <wp:docPr id="4" name="Picture 4"/>
                   <wp:cNvGraphicFramePr>
                     <a:graphicFrameLocks noChangeAspect="1"/>
@@ -1578,7 +1961,7 @@
                         <pic:spPr>
                           <a:xfrm>
                             <a:off x="0" y="0"/>
-                            <a:ext cx="2743200" cy="1303020"/>
+                            <a:ext cx="2697480" cy="1281303"/>
                           </a:xfrm>
                           <a:prstGeom prst="rect"/>
                         </pic:spPr>
@@ -1594,7 +1977,7 @@
       <w:tr>
         <w:tc>
           <w:tcPr>
-            <w:tcW w:type="dxa" w:w="4680"/>
+            <w:tcW w:type="dxa" w:w="4464"/>
             <w:tcBorders>
               <w:top w:val="none"/>
               <w:bottom w:val="none"/>
@@ -1610,15 +1993,16 @@
             <w:r>
               <w:rPr>
                 <w:i/>
+                <w:color w:val="555555"/>
                 <w:sz w:val="19"/>
               </w:rPr>
-              <w:t>Fig 3: SOC Operations Dashboard</w:t>
+              <w:t>Fig 3: SentinelGPT SOC Operations Dashboard</w:t>
             </w:r>
           </w:p>
         </w:tc>
         <w:tc>
           <w:tcPr>
-            <w:tcW w:type="dxa" w:w="4680"/>
+            <w:tcW w:type="dxa" w:w="4464"/>
             <w:tcBorders>
               <w:top w:val="none"/>
               <w:bottom w:val="none"/>
@@ -1634,9 +2018,10 @@
             <w:r>
               <w:rPr>
                 <w:i/>
+                <w:color w:val="555555"/>
                 <w:sz w:val="19"/>
               </w:rPr>
-              <w:t>Fig 4: Operator Login Portal</w:t>
+              <w:t>Fig 4: Operator Authentication Portal</w:t>
             </w:r>
           </w:p>
         </w:tc>
@@ -1644,19 +2029,18 @@
     </w:tbl>
     <w:tbl>
       <w:tblPr>
-        <w:tblStyle w:val="TableGrid"/>
         <w:tblW w:type="auto" w:w="0"/>
         <w:jc w:val="center"/>
         <w:tblLook w:firstColumn="1" w:firstRow="1" w:lastColumn="0" w:lastRow="0" w:noHBand="0" w:noVBand="1" w:val="04A0"/>
       </w:tblPr>
       <w:tblGrid>
-        <w:gridCol w:w="4680"/>
-        <w:gridCol w:w="4680"/>
+        <w:gridCol w:w="4464"/>
+        <w:gridCol w:w="4464"/>
       </w:tblGrid>
       <w:tr>
         <w:tc>
           <w:tcPr>
-            <w:tcW w:type="dxa" w:w="4680"/>
+            <w:tcW w:type="dxa" w:w="4464"/>
             <w:tcBorders>
               <w:top w:val="none"/>
               <w:bottom w:val="none"/>
@@ -1666,13 +2050,13 @@
           </w:tcPr>
           <w:p>
             <w:pPr>
-              <w:spacing w:after="40"/>
+              <w:spacing w:before="120" w:after="40"/>
               <w:jc w:val="center"/>
             </w:pPr>
             <w:r>
               <w:drawing>
                 <wp:inline xmlns:a="http://schemas.openxmlformats.org/drawingml/2006/main" xmlns:pic="http://schemas.openxmlformats.org/drawingml/2006/picture">
-                  <wp:extent cx="2743200" cy="1303020"/>
+                  <wp:extent cx="2697480" cy="1281303"/>
                   <wp:docPr id="5" name="Picture 5"/>
                   <wp:cNvGraphicFramePr>
                     <a:graphicFrameLocks noChangeAspect="1"/>
@@ -1693,7 +2077,7 @@
                         <pic:spPr>
                           <a:xfrm>
                             <a:off x="0" y="0"/>
-                            <a:ext cx="2743200" cy="1303020"/>
+                            <a:ext cx="2697480" cy="1281303"/>
                           </a:xfrm>
                           <a:prstGeom prst="rect"/>
                         </pic:spPr>
@@ -1707,7 +2091,7 @@
         </w:tc>
         <w:tc>
           <w:tcPr>
-            <w:tcW w:type="dxa" w:w="4680"/>
+            <w:tcW w:type="dxa" w:w="4464"/>
             <w:tcBorders>
               <w:top w:val="none"/>
               <w:bottom w:val="none"/>
@@ -1717,13 +2101,13 @@
           </w:tcPr>
           <w:p>
             <w:pPr>
-              <w:spacing w:after="40"/>
+              <w:spacing w:before="120" w:after="40"/>
               <w:jc w:val="center"/>
             </w:pPr>
             <w:r>
               <w:drawing>
                 <wp:inline xmlns:a="http://schemas.openxmlformats.org/drawingml/2006/main" xmlns:pic="http://schemas.openxmlformats.org/drawingml/2006/picture">
-                  <wp:extent cx="2743200" cy="1303020"/>
+                  <wp:extent cx="2697480" cy="1281303"/>
                   <wp:docPr id="6" name="Picture 6"/>
                   <wp:cNvGraphicFramePr>
                     <a:graphicFrameLocks noChangeAspect="1"/>
@@ -1744,7 +2128,7 @@
                         <pic:spPr>
                           <a:xfrm>
                             <a:off x="0" y="0"/>
-                            <a:ext cx="2743200" cy="1303020"/>
+                            <a:ext cx="2697480" cy="1281303"/>
                           </a:xfrm>
                           <a:prstGeom prst="rect"/>
                         </pic:spPr>
@@ -1760,7 +2144,7 @@
       <w:tr>
         <w:tc>
           <w:tcPr>
-            <w:tcW w:type="dxa" w:w="4680"/>
+            <w:tcW w:type="dxa" w:w="4464"/>
             <w:tcBorders>
               <w:top w:val="none"/>
               <w:bottom w:val="none"/>
@@ -1776,6 +2160,7 @@
             <w:r>
               <w:rPr>
                 <w:i/>
+                <w:color w:val="555555"/>
                 <w:sz w:val="19"/>
               </w:rPr>
               <w:t>Fig 5: AI Threat Triage Assistant</w:t>
@@ -1784,7 +2169,7 @@
         </w:tc>
         <w:tc>
           <w:tcPr>
-            <w:tcW w:type="dxa" w:w="4680"/>
+            <w:tcW w:type="dxa" w:w="4464"/>
             <w:tcBorders>
               <w:top w:val="none"/>
               <w:bottom w:val="none"/>
@@ -1800,81 +2185,426 @@
             <w:r>
               <w:rPr>
                 <w:i/>
+                <w:color w:val="555555"/>
                 <w:sz w:val="19"/>
               </w:rPr>
-              <w:t>Fig 6: Heuristic Payload Scanner</w:t>
+              <w:t>Fig 6: Heuristic Payload File Scanner</w:t>
             </w:r>
           </w:p>
         </w:tc>
       </w:tr>
     </w:tbl>
     <w:p>
+      <w:pPr>
+        <w:spacing w:before="320" w:after="100"/>
+        <w:pBdr>
+          <w:bottom w:val="single" w:sz="6" w:space="1" w:color="003366"/>
+        </w:pBdr>
+      </w:pPr>
       <w:r>
-        <w:br w:type="page"/>
+        <w:rPr>
+          <w:rFonts w:ascii="Calibri" w:hAnsi="Calibri"/>
+          <w:b/>
+          <w:color w:val="002750"/>
+          <w:sz w:val="30"/>
+        </w:rPr>
+        <w:t>11.  REST API Endpoints</w:t>
       </w:r>
     </w:p>
     <w:p>
       <w:pPr>
-        <w:keepNext/>
-        <w:spacing w:before="200" w:after="80"/>
+        <w:spacing w:before="0" w:after="120" w:line="288" w:lineRule="auto"/>
+        <w:jc w:val="both"/>
       </w:pPr>
       <w:r>
         <w:rPr>
-          <w:rFonts w:ascii="Times New Roman" w:hAnsi="Times New Roman"/>
+          <w:rFonts w:ascii="Calibri" w:hAnsi="Calibri"/>
+        </w:rPr>
+        <w:t>The backend exposes the following endpoints for telemetry, quarantine control, and authentication:</w:t>
+      </w:r>
+    </w:p>
+    <w:tbl>
+      <w:tblPr>
+        <w:tblStyle w:val="TableGrid"/>
+        <w:tblW w:type="auto" w:w="0"/>
+        <w:jc w:val="center"/>
+        <w:tblLook w:firstColumn="1" w:firstRow="1" w:lastColumn="0" w:lastRow="0" w:noHBand="0" w:noVBand="1" w:val="04A0"/>
+      </w:tblPr>
+      <w:tblGrid>
+        <w:gridCol w:w="2976"/>
+        <w:gridCol w:w="2976"/>
+        <w:gridCol w:w="2976"/>
+      </w:tblGrid>
+      <w:tr>
+        <w:tc>
+          <w:tcPr>
+            <w:tcW w:type="dxa" w:w="2976"/>
+            <w:shd w:val="clear" w:color="auto" w:fill="003366"/>
+          </w:tcPr>
+          <w:p>
+            <w:r>
+              <w:rPr>
+                <w:rFonts w:ascii="Calibri" w:hAnsi="Calibri"/>
+                <w:b/>
+                <w:color w:val="FFFFFF"/>
+              </w:rPr>
+              <w:t>Endpoint</w:t>
+            </w:r>
+          </w:p>
+        </w:tc>
+        <w:tc>
+          <w:tcPr>
+            <w:tcW w:type="dxa" w:w="2976"/>
+            <w:shd w:val="clear" w:color="auto" w:fill="003366"/>
+          </w:tcPr>
+          <w:p>
+            <w:r>
+              <w:rPr>
+                <w:rFonts w:ascii="Calibri" w:hAnsi="Calibri"/>
+                <w:b/>
+                <w:color w:val="FFFFFF"/>
+              </w:rPr>
+              <w:t>Method</w:t>
+            </w:r>
+          </w:p>
+        </w:tc>
+        <w:tc>
+          <w:tcPr>
+            <w:tcW w:type="dxa" w:w="2976"/>
+            <w:shd w:val="clear" w:color="auto" w:fill="003366"/>
+          </w:tcPr>
+          <w:p>
+            <w:r>
+              <w:rPr>
+                <w:rFonts w:ascii="Calibri" w:hAnsi="Calibri"/>
+                <w:b/>
+                <w:color w:val="FFFFFF"/>
+              </w:rPr>
+              <w:t>Description</w:t>
+            </w:r>
+          </w:p>
+        </w:tc>
+      </w:tr>
+      <w:tr>
+        <w:tc>
+          <w:tcPr>
+            <w:tcW w:type="dxa" w:w="2976"/>
+            <w:shd w:val="clear" w:color="auto" w:fill="EEF4FB"/>
+          </w:tcPr>
+          <w:p>
+            <w:r>
+              <w:rPr>
+                <w:rFonts w:ascii="Calibri" w:hAnsi="Calibri"/>
+              </w:rPr>
+              <w:t>/api/login</w:t>
+            </w:r>
+          </w:p>
+        </w:tc>
+        <w:tc>
+          <w:tcPr>
+            <w:tcW w:type="dxa" w:w="2976"/>
+            <w:shd w:val="clear" w:color="auto" w:fill="EEF4FB"/>
+          </w:tcPr>
+          <w:p>
+            <w:r>
+              <w:rPr>
+                <w:rFonts w:ascii="Calibri" w:hAnsi="Calibri"/>
+              </w:rPr>
+              <w:t>POST</w:t>
+            </w:r>
+          </w:p>
+        </w:tc>
+        <w:tc>
+          <w:tcPr>
+            <w:tcW w:type="dxa" w:w="2976"/>
+            <w:shd w:val="clear" w:color="auto" w:fill="EEF4FB"/>
+          </w:tcPr>
+          <w:p>
+            <w:r>
+              <w:rPr>
+                <w:rFonts w:ascii="Calibri" w:hAnsi="Calibri"/>
+              </w:rPr>
+              <w:t>Authenticates operator; returns 8-hour JWT token</w:t>
+            </w:r>
+          </w:p>
+        </w:tc>
+      </w:tr>
+      <w:tr>
+        <w:tc>
+          <w:tcPr>
+            <w:tcW w:type="dxa" w:w="2976"/>
+          </w:tcPr>
+          <w:p>
+            <w:r>
+              <w:rPr>
+                <w:rFonts w:ascii="Calibri" w:hAnsi="Calibri"/>
+              </w:rPr>
+              <w:t>/api/register</w:t>
+            </w:r>
+          </w:p>
+        </w:tc>
+        <w:tc>
+          <w:tcPr>
+            <w:tcW w:type="dxa" w:w="2976"/>
+          </w:tcPr>
+          <w:p>
+            <w:r>
+              <w:rPr>
+                <w:rFonts w:ascii="Calibri" w:hAnsi="Calibri"/>
+              </w:rPr>
+              <w:t>POST</w:t>
+            </w:r>
+          </w:p>
+        </w:tc>
+        <w:tc>
+          <w:tcPr>
+            <w:tcW w:type="dxa" w:w="2976"/>
+          </w:tcPr>
+          <w:p>
+            <w:r>
+              <w:rPr>
+                <w:rFonts w:ascii="Calibri" w:hAnsi="Calibri"/>
+              </w:rPr>
+              <w:t>Creates new operator account with hashed password</w:t>
+            </w:r>
+          </w:p>
+        </w:tc>
+      </w:tr>
+      <w:tr>
+        <w:tc>
+          <w:tcPr>
+            <w:tcW w:type="dxa" w:w="2976"/>
+            <w:shd w:val="clear" w:color="auto" w:fill="EEF4FB"/>
+          </w:tcPr>
+          <w:p>
+            <w:r>
+              <w:rPr>
+                <w:rFonts w:ascii="Calibri" w:hAnsi="Calibri"/>
+              </w:rPr>
+              <w:t>/api/snapshot</w:t>
+            </w:r>
+          </w:p>
+        </w:tc>
+        <w:tc>
+          <w:tcPr>
+            <w:tcW w:type="dxa" w:w="2976"/>
+            <w:shd w:val="clear" w:color="auto" w:fill="EEF4FB"/>
+          </w:tcPr>
+          <w:p>
+            <w:r>
+              <w:rPr>
+                <w:rFonts w:ascii="Calibri" w:hAnsi="Calibri"/>
+              </w:rPr>
+              <w:t>GET</w:t>
+            </w:r>
+          </w:p>
+        </w:tc>
+        <w:tc>
+          <w:tcPr>
+            <w:tcW w:type="dxa" w:w="2976"/>
+            <w:shd w:val="clear" w:color="auto" w:fill="EEF4FB"/>
+          </w:tcPr>
+          <w:p>
+            <w:r>
+              <w:rPr>
+                <w:rFonts w:ascii="Calibri" w:hAnsi="Calibri"/>
+              </w:rPr>
+              <w:t>Returns telemetry snapshot, incident logs &amp; quarantine list</w:t>
+            </w:r>
+          </w:p>
+        </w:tc>
+      </w:tr>
+      <w:tr>
+        <w:tc>
+          <w:tcPr>
+            <w:tcW w:type="dxa" w:w="2976"/>
+          </w:tcPr>
+          <w:p>
+            <w:r>
+              <w:rPr>
+                <w:rFonts w:ascii="Calibri" w:hAnsi="Calibri"/>
+              </w:rPr>
+              <w:t>/api/block_ip</w:t>
+            </w:r>
+          </w:p>
+        </w:tc>
+        <w:tc>
+          <w:tcPr>
+            <w:tcW w:type="dxa" w:w="2976"/>
+          </w:tcPr>
+          <w:p>
+            <w:r>
+              <w:rPr>
+                <w:rFonts w:ascii="Calibri" w:hAnsi="Calibri"/>
+              </w:rPr>
+              <w:t>POST</w:t>
+            </w:r>
+          </w:p>
+        </w:tc>
+        <w:tc>
+          <w:tcPr>
+            <w:tcW w:type="dxa" w:w="2976"/>
+          </w:tcPr>
+          <w:p>
+            <w:r>
+              <w:rPr>
+                <w:rFonts w:ascii="Calibri" w:hAnsi="Calibri"/>
+              </w:rPr>
+              <w:t>Adds target IP address to active firewall quarantine</w:t>
+            </w:r>
+          </w:p>
+        </w:tc>
+      </w:tr>
+      <w:tr>
+        <w:tc>
+          <w:tcPr>
+            <w:tcW w:type="dxa" w:w="2976"/>
+            <w:shd w:val="clear" w:color="auto" w:fill="EEF4FB"/>
+          </w:tcPr>
+          <w:p>
+            <w:r>
+              <w:rPr>
+                <w:rFonts w:ascii="Calibri" w:hAnsi="Calibri"/>
+              </w:rPr>
+              <w:t>/api/unblock_ip</w:t>
+            </w:r>
+          </w:p>
+        </w:tc>
+        <w:tc>
+          <w:tcPr>
+            <w:tcW w:type="dxa" w:w="2976"/>
+            <w:shd w:val="clear" w:color="auto" w:fill="EEF4FB"/>
+          </w:tcPr>
+          <w:p>
+            <w:r>
+              <w:rPr>
+                <w:rFonts w:ascii="Calibri" w:hAnsi="Calibri"/>
+              </w:rPr>
+              <w:t>POST</w:t>
+            </w:r>
+          </w:p>
+        </w:tc>
+        <w:tc>
+          <w:tcPr>
+            <w:tcW w:type="dxa" w:w="2976"/>
+            <w:shd w:val="clear" w:color="auto" w:fill="EEF4FB"/>
+          </w:tcPr>
+          <w:p>
+            <w:r>
+              <w:rPr>
+                <w:rFonts w:ascii="Calibri" w:hAnsi="Calibri"/>
+              </w:rPr>
+              <w:t>Revokes quarantine for target IP address</w:t>
+            </w:r>
+          </w:p>
+        </w:tc>
+      </w:tr>
+      <w:tr>
+        <w:tc>
+          <w:tcPr>
+            <w:tcW w:type="dxa" w:w="2976"/>
+          </w:tcPr>
+          <w:p>
+            <w:r>
+              <w:rPr>
+                <w:rFonts w:ascii="Calibri" w:hAnsi="Calibri"/>
+              </w:rPr>
+              <w:t>/api/export</w:t>
+            </w:r>
+          </w:p>
+        </w:tc>
+        <w:tc>
+          <w:tcPr>
+            <w:tcW w:type="dxa" w:w="2976"/>
+          </w:tcPr>
+          <w:p>
+            <w:r>
+              <w:rPr>
+                <w:rFonts w:ascii="Calibri" w:hAnsi="Calibri"/>
+              </w:rPr>
+              <w:t>GET</w:t>
+            </w:r>
+          </w:p>
+        </w:tc>
+        <w:tc>
+          <w:tcPr>
+            <w:tcW w:type="dxa" w:w="2976"/>
+          </w:tcPr>
+          <w:p>
+            <w:r>
+              <w:rPr>
+                <w:rFonts w:ascii="Calibri" w:hAnsi="Calibri"/>
+              </w:rPr>
+              <w:t>Downloads full incident history as JSON</w:t>
+            </w:r>
+          </w:p>
+        </w:tc>
+      </w:tr>
+    </w:tbl>
+    <w:p>
+      <w:pPr>
+        <w:spacing w:before="320" w:after="100"/>
+        <w:pBdr>
+          <w:bottom w:val="single" w:sz="6" w:space="1" w:color="003366"/>
+        </w:pBdr>
+      </w:pPr>
+      <w:r>
+        <w:rPr>
+          <w:rFonts w:ascii="Calibri" w:hAnsi="Calibri"/>
           <w:b/>
-          <w:color w:val="003366"/>
-          <w:sz w:val="28"/>
+          <w:color w:val="002750"/>
+          <w:sz w:val="30"/>
         </w:rPr>
-        <w:t>11.  Conclusion</w:t>
+        <w:t>12.  Conclusion</w:t>
       </w:r>
     </w:p>
     <w:p>
       <w:pPr>
-        <w:spacing w:before="0" w:after="80" w:line="276" w:lineRule="auto"/>
+        <w:spacing w:before="0" w:after="120" w:line="288" w:lineRule="auto"/>
         <w:jc w:val="both"/>
       </w:pPr>
       <w:r>
         <w:rPr>
-          <w:rFonts w:ascii="Times New Roman" w:hAnsi="Times New Roman"/>
-          <w:sz w:val="22"/>
+          <w:rFonts w:ascii="Calibri" w:hAnsi="Calibri"/>
         </w:rPr>
-        <w:t>SentinelGPT demonstrates that integrating Agentic AI with a modern full-stack architecture (React 19, FastAPI, SQLAlchemy, Vercel) can transform traditional reactive security operations into a proactive, automated cyber defense system. By replacing manual log review with autonomous software agents, the platform eliminates alert fatigue, reduces incident response latency to near zero, and provides continuous 24/7 network perimeter protection — setting a strong foundation for next-generation AI-powered cybersecurity frameworks.</w:t>
+        <w:t>SentinelGPT demonstrates that integrating Agentic AI with a modern full-stack serverless architecture can transform traditional reactive security operations into a proactive, automated cyber defense system. By replacing manual log review with autonomous software agents, the platform eliminates alert fatigue, reduces incident response latency to near zero, and provides continuous 24/7 network perimeter protection — establishing a strong foundation for next-generation AI-powered cybersecurity frameworks.</w:t>
       </w:r>
     </w:p>
     <w:p>
       <w:pPr>
-        <w:keepNext/>
-        <w:spacing w:before="200" w:after="80"/>
+        <w:spacing w:before="320" w:after="100"/>
+        <w:pBdr>
+          <w:bottom w:val="single" w:sz="6" w:space="1" w:color="003366"/>
+        </w:pBdr>
       </w:pPr>
       <w:r>
         <w:rPr>
-          <w:rFonts w:ascii="Times New Roman" w:hAnsi="Times New Roman"/>
+          <w:rFonts w:ascii="Calibri" w:hAnsi="Calibri"/>
           <w:b/>
-          <w:color w:val="003366"/>
-          <w:sz w:val="28"/>
+          <w:color w:val="002750"/>
+          <w:sz w:val="30"/>
         </w:rPr>
-        <w:t>12.  References</w:t>
+        <w:t>13.  References</w:t>
       </w:r>
     </w:p>
     <w:p>
       <w:pPr>
         <w:pStyle w:val="ListBullet"/>
-        <w:spacing w:before="0" w:after="40" w:line="264" w:lineRule="auto"/>
-        <w:ind w:left="360"/>
+        <w:spacing w:before="0" w:after="60" w:line="276" w:lineRule="auto"/>
+        <w:ind w:left="432"/>
         <w:jc w:val="both"/>
       </w:pPr>
       <w:r>
         <w:rPr>
-          <w:rFonts w:ascii="Times New Roman" w:hAnsi="Times New Roman"/>
+          <w:rFonts w:ascii="Calibri" w:hAnsi="Calibri"/>
           <w:b/>
-          <w:sz w:val="22"/>
+          <w:color w:val="002750"/>
         </w:rPr>
         <w:t xml:space="preserve">[1]  </w:t>
       </w:r>
       <w:r>
         <w:rPr>
-          <w:rFonts w:ascii="Times New Roman" w:hAnsi="Times New Roman"/>
-          <w:sz w:val="22"/>
+          <w:rFonts w:ascii="Calibri" w:hAnsi="Calibri"/>
         </w:rPr>
         <w:t>FastAPI Documentation — https://fastapi.tiangolo.com/</w:t>
       </w:r>
@@ -1882,22 +2612,21 @@
     <w:p>
       <w:pPr>
         <w:pStyle w:val="ListBullet"/>
-        <w:spacing w:before="0" w:after="40" w:line="264" w:lineRule="auto"/>
-        <w:ind w:left="360"/>
+        <w:spacing w:before="0" w:after="60" w:line="276" w:lineRule="auto"/>
+        <w:ind w:left="432"/>
         <w:jc w:val="both"/>
       </w:pPr>
       <w:r>
         <w:rPr>
-          <w:rFonts w:ascii="Times New Roman" w:hAnsi="Times New Roman"/>
+          <w:rFonts w:ascii="Calibri" w:hAnsi="Calibri"/>
           <w:b/>
-          <w:sz w:val="22"/>
+          <w:color w:val="002750"/>
         </w:rPr>
         <w:t xml:space="preserve">[2]  </w:t>
       </w:r>
       <w:r>
         <w:rPr>
-          <w:rFonts w:ascii="Times New Roman" w:hAnsi="Times New Roman"/>
-          <w:sz w:val="22"/>
+          <w:rFonts w:ascii="Calibri" w:hAnsi="Calibri"/>
         </w:rPr>
         <w:t>React 19 Docs — https://react.dev/</w:t>
       </w:r>
@@ -1905,22 +2634,21 @@
     <w:p>
       <w:pPr>
         <w:pStyle w:val="ListBullet"/>
-        <w:spacing w:before="0" w:after="40" w:line="264" w:lineRule="auto"/>
-        <w:ind w:left="360"/>
+        <w:spacing w:before="0" w:after="60" w:line="276" w:lineRule="auto"/>
+        <w:ind w:left="432"/>
         <w:jc w:val="both"/>
       </w:pPr>
       <w:r>
         <w:rPr>
-          <w:rFonts w:ascii="Times New Roman" w:hAnsi="Times New Roman"/>
+          <w:rFonts w:ascii="Calibri" w:hAnsi="Calibri"/>
           <w:b/>
-          <w:sz w:val="22"/>
+          <w:color w:val="002750"/>
         </w:rPr>
         <w:t xml:space="preserve">[3]  </w:t>
       </w:r>
       <w:r>
         <w:rPr>
-          <w:rFonts w:ascii="Times New Roman" w:hAnsi="Times New Roman"/>
-          <w:sz w:val="22"/>
+          <w:rFonts w:ascii="Calibri" w:hAnsi="Calibri"/>
         </w:rPr>
         <w:t>MITRE ATT&amp;CK Framework — https://attack.mitre.org/</w:t>
       </w:r>
@@ -1928,22 +2656,21 @@
     <w:p>
       <w:pPr>
         <w:pStyle w:val="ListBullet"/>
-        <w:spacing w:before="0" w:after="40" w:line="264" w:lineRule="auto"/>
-        <w:ind w:left="360"/>
+        <w:spacing w:before="0" w:after="60" w:line="276" w:lineRule="auto"/>
+        <w:ind w:left="432"/>
         <w:jc w:val="both"/>
       </w:pPr>
       <w:r>
         <w:rPr>
-          <w:rFonts w:ascii="Times New Roman" w:hAnsi="Times New Roman"/>
+          <w:rFonts w:ascii="Calibri" w:hAnsi="Calibri"/>
           <w:b/>
-          <w:sz w:val="22"/>
+          <w:color w:val="002750"/>
         </w:rPr>
         <w:t xml:space="preserve">[4]  </w:t>
       </w:r>
       <w:r>
         <w:rPr>
-          <w:rFonts w:ascii="Times New Roman" w:hAnsi="Times New Roman"/>
-          <w:sz w:val="22"/>
+          <w:rFonts w:ascii="Calibri" w:hAnsi="Calibri"/>
         </w:rPr>
         <w:t>SQLAlchemy ORM — https://docs.sqlalchemy.org/</w:t>
       </w:r>
@@ -1951,83 +2678,82 @@
     <w:p>
       <w:pPr>
         <w:pStyle w:val="ListBullet"/>
-        <w:spacing w:before="0" w:after="40" w:line="264" w:lineRule="auto"/>
-        <w:ind w:left="360"/>
+        <w:spacing w:before="0" w:after="60" w:line="276" w:lineRule="auto"/>
+        <w:ind w:left="432"/>
         <w:jc w:val="both"/>
       </w:pPr>
       <w:r>
         <w:rPr>
-          <w:rFonts w:ascii="Times New Roman" w:hAnsi="Times New Roman"/>
+          <w:rFonts w:ascii="Calibri" w:hAnsi="Calibri"/>
           <w:b/>
-          <w:sz w:val="22"/>
+          <w:color w:val="002750"/>
         </w:rPr>
         <w:t xml:space="preserve">[5]  </w:t>
       </w:r>
       <w:r>
         <w:rPr>
-          <w:rFonts w:ascii="Times New Roman" w:hAnsi="Times New Roman"/>
-          <w:sz w:val="22"/>
+          <w:rFonts w:ascii="Calibri" w:hAnsi="Calibri"/>
         </w:rPr>
-        <w:t>Vercel Docs — https://vercel.com/docs</w:t>
+        <w:t>Vercel Platform Docs — https://vercel.com/docs</w:t>
       </w:r>
     </w:p>
     <w:p>
       <w:pPr>
         <w:pStyle w:val="ListBullet"/>
-        <w:spacing w:before="0" w:after="40" w:line="264" w:lineRule="auto"/>
-        <w:ind w:left="360"/>
+        <w:spacing w:before="0" w:after="60" w:line="276" w:lineRule="auto"/>
+        <w:ind w:left="432"/>
         <w:jc w:val="both"/>
       </w:pPr>
       <w:r>
         <w:rPr>
-          <w:rFonts w:ascii="Times New Roman" w:hAnsi="Times New Roman"/>
+          <w:rFonts w:ascii="Calibri" w:hAnsi="Calibri"/>
           <w:b/>
-          <w:sz w:val="22"/>
+          <w:color w:val="002750"/>
         </w:rPr>
         <w:t xml:space="preserve">[6]  </w:t>
       </w:r>
       <w:r>
         <w:rPr>
-          <w:rFonts w:ascii="Times New Roman" w:hAnsi="Times New Roman"/>
-          <w:sz w:val="22"/>
+          <w:rFonts w:ascii="Calibri" w:hAnsi="Calibri"/>
         </w:rPr>
         <w:t>Russell, S. &amp; Norvig, P. (2021). Artificial Intelligence: A Modern Approach (4th ed.). Pearson.</w:t>
       </w:r>
     </w:p>
     <w:p>
       <w:pPr>
-        <w:keepNext/>
-        <w:spacing w:before="200" w:after="80"/>
+        <w:spacing w:before="320" w:after="100"/>
+        <w:pBdr>
+          <w:bottom w:val="single" w:sz="6" w:space="1" w:color="003366"/>
+        </w:pBdr>
       </w:pPr>
       <w:r>
         <w:rPr>
-          <w:rFonts w:ascii="Times New Roman" w:hAnsi="Times New Roman"/>
+          <w:rFonts w:ascii="Calibri" w:hAnsi="Calibri"/>
           <w:b/>
-          <w:color w:val="003366"/>
-          <w:sz w:val="28"/>
+          <w:color w:val="002750"/>
+          <w:sz w:val="30"/>
         </w:rPr>
-        <w:t>13.  Live Deployment &amp; GitHub Links</w:t>
+        <w:t>14.  Live Deployment &amp; GitHub Links</w:t>
       </w:r>
     </w:p>
     <w:p>
       <w:pPr>
         <w:pStyle w:val="ListBullet"/>
-        <w:spacing w:before="0" w:after="40" w:line="264" w:lineRule="auto"/>
-        <w:ind w:left="360"/>
+        <w:spacing w:before="0" w:after="60" w:line="276" w:lineRule="auto"/>
+        <w:ind w:left="432"/>
         <w:jc w:val="both"/>
       </w:pPr>
       <w:r>
         <w:rPr>
-          <w:rFonts w:ascii="Times New Roman" w:hAnsi="Times New Roman"/>
+          <w:rFonts w:ascii="Calibri" w:hAnsi="Calibri"/>
           <w:b/>
-          <w:sz w:val="22"/>
+          <w:color w:val="002750"/>
         </w:rPr>
         <w:t xml:space="preserve">Single Live Dashboard Link:  </w:t>
       </w:r>
       <w:r>
         <w:rPr>
-          <w:rFonts w:ascii="Times New Roman" w:hAnsi="Times New Roman"/>
-          <w:sz w:val="22"/>
+          <w:rFonts w:ascii="Calibri" w:hAnsi="Calibri"/>
         </w:rPr>
         <w:t>https://sentinelgpt-ai.vercel.app</w:t>
       </w:r>
@@ -2035,22 +2761,21 @@
     <w:p>
       <w:pPr>
         <w:pStyle w:val="ListBullet"/>
-        <w:spacing w:before="0" w:after="40" w:line="264" w:lineRule="auto"/>
-        <w:ind w:left="360"/>
+        <w:spacing w:before="0" w:after="60" w:line="276" w:lineRule="auto"/>
+        <w:ind w:left="432"/>
         <w:jc w:val="both"/>
       </w:pPr>
       <w:r>
         <w:rPr>
-          <w:rFonts w:ascii="Times New Roman" w:hAnsi="Times New Roman"/>
+          <w:rFonts w:ascii="Calibri" w:hAnsi="Calibri"/>
           <w:b/>
-          <w:sz w:val="22"/>
+          <w:color w:val="002750"/>
         </w:rPr>
         <w:t xml:space="preserve">Interactive Swagger API Docs: </w:t>
       </w:r>
       <w:r>
         <w:rPr>
-          <w:rFonts w:ascii="Times New Roman" w:hAnsi="Times New Roman"/>
-          <w:sz w:val="22"/>
+          <w:rFonts w:ascii="Calibri" w:hAnsi="Calibri"/>
         </w:rPr>
         <w:t>https://sentinelgpt-ai.vercel.app/docs</w:t>
       </w:r>
@@ -2058,29 +2783,28 @@
     <w:p>
       <w:pPr>
         <w:pStyle w:val="ListBullet"/>
-        <w:spacing w:before="0" w:after="40" w:line="264" w:lineRule="auto"/>
-        <w:ind w:left="360"/>
+        <w:spacing w:before="0" w:after="60" w:line="276" w:lineRule="auto"/>
+        <w:ind w:left="432"/>
         <w:jc w:val="both"/>
       </w:pPr>
       <w:r>
         <w:rPr>
-          <w:rFonts w:ascii="Times New Roman" w:hAnsi="Times New Roman"/>
+          <w:rFonts w:ascii="Calibri" w:hAnsi="Calibri"/>
           <w:b/>
-          <w:sz w:val="22"/>
+          <w:color w:val="002750"/>
         </w:rPr>
         <w:t xml:space="preserve">Official GitHub Repository:   </w:t>
       </w:r>
       <w:r>
         <w:rPr>
-          <w:rFonts w:ascii="Times New Roman" w:hAnsi="Times New Roman"/>
-          <w:sz w:val="22"/>
+          <w:rFonts w:ascii="Calibri" w:hAnsi="Calibri"/>
         </w:rPr>
         <w:t>https://github.com/Pravallika2025/sentigraud-ai-.git</w:t>
       </w:r>
     </w:p>
     <w:sectPr>
       <w:pgSz w:w="12240" w:h="15840"/>
-      <w:pgMar w:top="1296" w:right="1440" w:bottom="1296" w:left="1440" w:header="720" w:footer="720" w:gutter="0"/>
+      <w:pgMar w:top="1440" w:right="1656" w:bottom="1440" w:left="1656" w:header="720" w:footer="720" w:gutter="0"/>
       <w:cols w:space="720"/>
       <w:docGrid w:linePitch="360"/>
     </w:sectPr>
@@ -2452,7 +3176,8 @@
     <w:qFormat/>
     <w:rsid w:val="00FC693F"/>
     <w:rPr>
-      <w:rFonts w:ascii="Times New Roman" w:hAnsi="Times New Roman"/>
+      <w:rFonts w:ascii="Calibri" w:hAnsi="Calibri"/>
+      <w:color w:val="222222"/>
       <w:sz w:val="22"/>
     </w:rPr>
   </w:style>

</xml_diff>

<commit_message>
Recreate exact reference-matching 15-page Word Report (.docx) with Times New Roman and precise layout
</commit_message>
<xml_diff>
--- a/docs/SentinelGPT_Project_Report.docx
+++ b/docs/SentinelGPT_Project_Report.docx
@@ -4,30 +4,15 @@
   <w:body>
     <w:p>
       <w:pPr>
-        <w:spacing w:before="0" w:after="120"/>
+        <w:spacing w:before="2800" w:after="400"/>
         <w:jc w:val="center"/>
       </w:pPr>
       <w:r>
         <w:rPr>
-          <w:rFonts w:ascii="Calibri" w:hAnsi="Calibri"/>
+          <w:rFonts w:ascii="Times New Roman" w:hAnsi="Times New Roman"/>
           <w:b/>
-          <w:color w:val="555555"/>
-          <w:sz w:val="26"/>
-        </w:rPr>
-        <w:t>PROJECT TECHNICAL REPORT</w:t>
-      </w:r>
-    </w:p>
-    <w:p>
-      <w:pPr>
-        <w:spacing w:before="480" w:after="280"/>
-        <w:jc w:val="center"/>
-      </w:pPr>
-      <w:r>
-        <w:rPr>
-          <w:rFonts w:ascii="Calibri" w:hAnsi="Calibri"/>
-          <w:b/>
-          <w:color w:val="002750"/>
-          <w:sz w:val="48"/>
+          <w:color w:val="000000"/>
+          <w:sz w:val="40"/>
         </w:rPr>
         <w:t>SentinelGPT: An AI-Powered Large Language Model</w:t>
         <w:br/>
@@ -38,105 +23,173 @@
     </w:p>
     <w:p>
       <w:pPr>
-        <w:spacing w:after="720"/>
-        <w:jc w:val="center"/>
+        <w:spacing w:before="3200" w:line="360" w:lineRule="auto"/>
+        <w:jc w:val="right"/>
       </w:pPr>
       <w:r>
         <w:rPr>
-          <w:rFonts w:ascii="Calibri" w:hAnsi="Calibri"/>
-          <w:i/>
-          <w:color w:val="555555"/>
-          <w:sz w:val="24"/>
+          <w:rFonts w:ascii="Times New Roman" w:hAnsi="Times New Roman"/>
+          <w:b/>
+          <w:sz w:val="28"/>
         </w:rPr>
-        <w:t>Real-time AI-powered cybersecurity monitoring, autonomous threat detection,</w:t>
+        <w:t>pravallika kalangi</w:t>
         <w:br/>
-        <w:t>and intelligent incident response dashboard</w:t>
+      </w:r>
+      <w:r>
+        <w:rPr>
+          <w:rFonts w:ascii="Times New Roman" w:hAnsi="Times New Roman"/>
+          <w:sz w:val="28"/>
+        </w:rPr>
+        <w:t>24VV1F0044</w:t>
+        <w:br/>
+      </w:r>
+      <w:r>
+        <w:rPr>
+          <w:rFonts w:ascii="Times New Roman" w:hAnsi="Times New Roman"/>
+          <w:sz w:val="28"/>
+        </w:rPr>
+        <w:t>MCA 2nd year</w:t>
+        <w:br/>
+      </w:r>
+    </w:p>
+    <w:p>
+      <w:r>
+        <w:br w:type="page"/>
+      </w:r>
+    </w:p>
+    <w:p>
+      <w:pPr>
+        <w:spacing w:before="360" w:after="240"/>
+      </w:pPr>
+      <w:r>
+        <w:rPr>
+          <w:rFonts w:ascii="Times New Roman" w:hAnsi="Times New Roman"/>
+          <w:b/>
+          <w:color w:val="000000"/>
+          <w:sz w:val="32"/>
+        </w:rPr>
+        <w:t>Problem statement</w:t>
+      </w:r>
+    </w:p>
+    <w:p>
+      <w:pPr>
+        <w:spacing w:after="160" w:line="360" w:lineRule="auto"/>
+        <w:jc w:val="both"/>
+      </w:pPr>
+      <w:r>
+        <w:rPr>
+          <w:rFonts w:ascii="Times New Roman" w:hAnsi="Times New Roman"/>
+          <w:color w:val="000000"/>
+        </w:rPr>
+        <w:t>Preparing and managing enterprise cybersecurity operations is a challenging and time-consuming task for modern organizations. Every day, security administrators must analyze incoming network packets, monitor server logs, track potential vulnerabilities, and isolate malicious IP addresses while ensuring that all operational protocols and data protection constraints are satisfied. In many organizations, this process is still performed manually or using basic logging applications, which often leads to alert fatigue, missed security threats, repeated operational delays, and increased administrative effort. As the number of network nodes, cloud microservices, and connected devices increases, cybersecurity management becomes more complex and difficult to execute efficiently.</w:t>
+      </w:r>
+    </w:p>
+    <w:p>
+      <w:pPr>
+        <w:spacing w:after="160" w:line="360" w:lineRule="auto"/>
+        <w:jc w:val="both"/>
+      </w:pPr>
+      <w:r>
+        <w:rPr>
+          <w:rFonts w:ascii="Times New Roman" w:hAnsi="Times New Roman"/>
+          <w:color w:val="000000"/>
+        </w:rPr>
+        <w:t>One of the major challenges is avoiding delayed incident response and lateral threat movement. A malicious attacker or compromise attempt may target multiple endpoints across different network segments simultaneously, making it difficult for human security analysts to detect correlated attacks in real time. Automated firewall quarantine is another critical issue because threat isolation requires continuous, immediate enforcement and should not be delayed by manual administrative review. In addition, every threat event must receive proper risk scoring according to established cybersecurity frameworks, and security monitoring must maintain uninterrupted 24/7 surveillance without creating security blind spots.</w:t>
+      </w:r>
+    </w:p>
+    <w:p>
+      <w:pPr>
+        <w:spacing w:after="160" w:line="360" w:lineRule="auto"/>
+        <w:jc w:val="both"/>
+      </w:pPr>
+      <w:r>
+        <w:rPr>
+          <w:rFonts w:ascii="Times New Roman" w:hAnsi="Times New Roman"/>
+          <w:color w:val="000000"/>
+        </w:rPr>
+        <w:t>Traditional security management methods also lack flexibility, transparency, and real-time visualization. Even a minor change in network traffic patterns or threat vectors often requires administrators to manually reconfigure rules or re-evaluate historical logs. Identifying and resolving complex security incidents consumes significant time and increases the possibility of human error. Furthermore, many existing systems do not provide clear explanations of security decisions, interactive threat analytics, or dynamic incident remediation recommendations.</w:t>
+      </w:r>
+    </w:p>
+    <w:p>
+      <w:pPr>
+        <w:spacing w:after="160" w:line="360" w:lineRule="auto"/>
+        <w:jc w:val="both"/>
+      </w:pPr>
+      <w:r>
+        <w:rPr>
+          <w:rFonts w:ascii="Times New Roman" w:hAnsi="Times New Roman"/>
+          <w:color w:val="000000"/>
+        </w:rPr>
+        <w:t>To address these challenges, this project proposes SentinelGPT: An AI-Powered Large Language Model Framework for Advanced Cyber Threat Detection and Analysis. The system uses intelligent software agents to automatically generate threat assessments, validate network security posture, calculate risk scores using heuristic algorithms, dynamically map threats to MITRE ATT&amp;CK techniques, and execute autonomous quarantine actions. It also provides a web-based dashboard for threat management, incident analysis, live telemetry visualization, AI triage assistant interaction, and log export. By automating threat detection and response, the proposed system reduces manual effort, minimizes incident response times, improves threat accuracy, and provides an efficient, reliable, and user-friendly solution for enterprise cybersecurity operations.</w:t>
+      </w:r>
+    </w:p>
+    <w:p>
+      <w:r>
+        <w:br w:type="page"/>
+      </w:r>
+    </w:p>
+    <w:p>
+      <w:pPr>
+        <w:spacing w:before="360" w:after="240"/>
+      </w:pPr>
+      <w:r>
+        <w:rPr>
+          <w:rFonts w:ascii="Times New Roman" w:hAnsi="Times New Roman"/>
+          <w:b/>
+          <w:color w:val="000000"/>
+          <w:sz w:val="32"/>
+        </w:rPr>
+        <w:t>Difference Between Traditional Security Operations and the Proposed Agentic AI-Based SentinelGPT System</w:t>
+      </w:r>
+    </w:p>
+    <w:p>
+      <w:pPr>
+        <w:spacing w:after="160" w:line="360" w:lineRule="auto"/>
+        <w:jc w:val="both"/>
+      </w:pPr>
+      <w:r>
+        <w:rPr>
+          <w:rFonts w:ascii="Times New Roman" w:hAnsi="Times New Roman"/>
+          <w:color w:val="000000"/>
+        </w:rPr>
+        <w:t>Traditional security monitoring is done manually using paper records, basic log viewers, or simple firewall management software. It requires more time and effort and may result in response delays and human error. The proposed Agentic AI-Based SentinelGPT System automates threat detection and mitigation using intelligent software agents. It reduces manual work, improves accuracy, and provides features such as real-time telemetry visualization, heuristic anomaly scoring, automated quarantine, AI triage assistance, and log export. The table below shows the comparison between the traditional system and the proposed system. The following table highlights the major differences between the traditional security operations system and the proposed Agentic AI-based system.</w:t>
       </w:r>
     </w:p>
     <w:tbl>
       <w:tblPr>
         <w:tblStyle w:val="TableGrid"/>
         <w:tblW w:type="auto" w:w="0"/>
-        <w:tblLook w:firstColumn="1" w:firstRow="1" w:lastColumn="0" w:lastRow="0" w:noHBand="0" w:noVBand="1" w:val="04A0"/>
-      </w:tblPr>
-      <w:tblGrid>
-        <w:gridCol w:w="8928"/>
-      </w:tblGrid>
-      <w:tr>
-        <w:trPr>
-          <w:trHeight w:val="40"/>
-        </w:trPr>
-        <w:tc>
-          <w:tcPr>
-            <w:tcW w:type="dxa" w:w="8928"/>
-            <w:shd w:val="clear" w:color="auto" w:fill="003366"/>
-          </w:tcPr>
-          <w:p>
-            <w:r/>
-          </w:p>
-        </w:tc>
-      </w:tr>
-    </w:tbl>
-    <w:p>
-      <w:pPr>
-        <w:spacing w:after="120"/>
-      </w:pPr>
-    </w:p>
-    <w:tbl>
-      <w:tblPr>
-        <w:tblW w:type="auto" w:w="0"/>
         <w:jc w:val="center"/>
         <w:tblLook w:firstColumn="1" w:firstRow="1" w:lastColumn="0" w:lastRow="0" w:noHBand="0" w:noVBand="1" w:val="04A0"/>
       </w:tblPr>
       <w:tblGrid>
-        <w:gridCol w:w="4464"/>
-        <w:gridCol w:w="4464"/>
+        <w:gridCol w:w="4680"/>
+        <w:gridCol w:w="4680"/>
       </w:tblGrid>
       <w:tr>
         <w:tc>
           <w:tcPr>
-            <w:tcW w:type="dxa" w:w="4464"/>
-            <w:tcBorders>
-              <w:top w:val="single" w:sz="4" w:color="B0C4DE"/>
-              <w:bottom w:val="single" w:sz="4" w:color="B0C4DE"/>
-              <w:left w:val="single" w:sz="4" w:color="B0C4DE"/>
-              <w:right w:val="single" w:sz="4" w:color="B0C4DE"/>
-            </w:tcBorders>
+            <w:tcW w:type="dxa" w:w="4680"/>
           </w:tcPr>
           <w:p>
-            <w:pPr>
-              <w:spacing w:after="80"/>
-            </w:pPr>
             <w:r>
               <w:rPr>
-                <w:rFonts w:ascii="Calibri" w:hAnsi="Calibri"/>
                 <w:b/>
-                <w:color w:val="002750"/>
               </w:rPr>
-              <w:t>Project Title:</w:t>
+              <w:t>Traditional Security Operations System</w:t>
             </w:r>
           </w:p>
         </w:tc>
         <w:tc>
           <w:tcPr>
-            <w:tcW w:type="dxa" w:w="4464"/>
-            <w:tcBorders>
-              <w:top w:val="single" w:sz="4" w:color="B0C4DE"/>
-              <w:bottom w:val="single" w:sz="4" w:color="B0C4DE"/>
-              <w:left w:val="single" w:sz="4" w:color="B0C4DE"/>
-              <w:right w:val="single" w:sz="4" w:color="B0C4DE"/>
-            </w:tcBorders>
+            <w:tcW w:type="dxa" w:w="4680"/>
           </w:tcPr>
           <w:p>
-            <w:pPr>
-              <w:spacing w:after="80"/>
-            </w:pPr>
             <w:r>
               <w:rPr>
-                <w:rFonts w:ascii="Calibri" w:hAnsi="Calibri"/>
-                <w:sz w:val="22"/>
+                <w:b/>
               </w:rPr>
-              <w:t>SentinelGPT: An AI-Powered LLM Framework for Advanced Cyber Threat Detection</w:t>
+              <w:t>Proposed Agentic AI Based SentinelGPT System</w:t>
             </w:r>
           </w:p>
         </w:tc>
@@ -144,48 +197,21 @@
       <w:tr>
         <w:tc>
           <w:tcPr>
-            <w:tcW w:type="dxa" w:w="4464"/>
-            <w:tcBorders>
-              <w:top w:val="single" w:sz="4" w:color="B0C4DE"/>
-              <w:bottom w:val="single" w:sz="4" w:color="B0C4DE"/>
-              <w:left w:val="single" w:sz="4" w:color="B0C4DE"/>
-              <w:right w:val="single" w:sz="4" w:color="B0C4DE"/>
-            </w:tcBorders>
+            <w:tcW w:type="dxa" w:w="4680"/>
           </w:tcPr>
           <w:p>
-            <w:pPr>
-              <w:spacing w:after="80"/>
-            </w:pPr>
             <w:r>
-              <w:rPr>
-                <w:rFonts w:ascii="Calibri" w:hAnsi="Calibri"/>
-                <w:b/>
-                <w:color w:val="002750"/>
-              </w:rPr>
-              <w:t>Submitted by:</w:t>
+              <w:t>Security alerts are monitored manually using basic log viewers or static firewall software.</w:t>
             </w:r>
           </w:p>
         </w:tc>
         <w:tc>
           <w:tcPr>
-            <w:tcW w:type="dxa" w:w="4464"/>
-            <w:tcBorders>
-              <w:top w:val="single" w:sz="4" w:color="B0C4DE"/>
-              <w:bottom w:val="single" w:sz="4" w:color="B0C4DE"/>
-              <w:left w:val="single" w:sz="4" w:color="B0C4DE"/>
-              <w:right w:val="single" w:sz="4" w:color="B0C4DE"/>
-            </w:tcBorders>
+            <w:tcW w:type="dxa" w:w="4680"/>
           </w:tcPr>
           <w:p>
-            <w:pPr>
-              <w:spacing w:after="80"/>
-            </w:pPr>
             <w:r>
-              <w:rPr>
-                <w:rFonts w:ascii="Calibri" w:hAnsi="Calibri"/>
-                <w:sz w:val="22"/>
-              </w:rPr>
-              <w:t>Pravallika Kalangi</w:t>
+              <w:t>Threats are detected and analyzed automatically using intelligent software agents based on heuristic security models.</w:t>
             </w:r>
           </w:p>
         </w:tc>
@@ -193,48 +219,21 @@
       <w:tr>
         <w:tc>
           <w:tcPr>
-            <w:tcW w:type="dxa" w:w="4464"/>
-            <w:tcBorders>
-              <w:top w:val="single" w:sz="4" w:color="B0C4DE"/>
-              <w:bottom w:val="single" w:sz="4" w:color="B0C4DE"/>
-              <w:left w:val="single" w:sz="4" w:color="B0C4DE"/>
-              <w:right w:val="single" w:sz="4" w:color="B0C4DE"/>
-            </w:tcBorders>
+            <w:tcW w:type="dxa" w:w="4680"/>
           </w:tcPr>
           <w:p>
-            <w:pPr>
-              <w:spacing w:after="80"/>
-            </w:pPr>
             <w:r>
-              <w:rPr>
-                <w:rFonts w:ascii="Calibri" w:hAnsi="Calibri"/>
-                <w:b/>
-                <w:color w:val="002750"/>
-              </w:rPr>
-              <w:t>Roll Number:</w:t>
+              <w:t>Requires significant manual effort and considerable time to evaluate network threats.</w:t>
             </w:r>
           </w:p>
         </w:tc>
         <w:tc>
           <w:tcPr>
-            <w:tcW w:type="dxa" w:w="4464"/>
-            <w:tcBorders>
-              <w:top w:val="single" w:sz="4" w:color="B0C4DE"/>
-              <w:bottom w:val="single" w:sz="4" w:color="B0C4DE"/>
-              <w:left w:val="single" w:sz="4" w:color="B0C4DE"/>
-              <w:right w:val="single" w:sz="4" w:color="B0C4DE"/>
-            </w:tcBorders>
+            <w:tcW w:type="dxa" w:w="4680"/>
           </w:tcPr>
           <w:p>
-            <w:pPr>
-              <w:spacing w:after="80"/>
-            </w:pPr>
             <w:r>
-              <w:rPr>
-                <w:rFonts w:ascii="Calibri" w:hAnsi="Calibri"/>
-                <w:sz w:val="22"/>
-              </w:rPr>
-              <w:t>24VV1F0044</w:t>
+              <w:t>Reduces manual effort and analyzes threats efficiently within a fraction of a second.</w:t>
             </w:r>
           </w:p>
         </w:tc>
@@ -242,48 +241,21 @@
       <w:tr>
         <w:tc>
           <w:tcPr>
-            <w:tcW w:type="dxa" w:w="4464"/>
-            <w:tcBorders>
-              <w:top w:val="single" w:sz="4" w:color="B0C4DE"/>
-              <w:bottom w:val="single" w:sz="4" w:color="B0C4DE"/>
-              <w:left w:val="single" w:sz="4" w:color="B0C4DE"/>
-              <w:right w:val="single" w:sz="4" w:color="B0C4DE"/>
-            </w:tcBorders>
+            <w:tcW w:type="dxa" w:w="4680"/>
           </w:tcPr>
           <w:p>
-            <w:pPr>
-              <w:spacing w:after="80"/>
-            </w:pPr>
             <w:r>
-              <w:rPr>
-                <w:rFonts w:ascii="Calibri" w:hAnsi="Calibri"/>
-                <w:b/>
-                <w:color w:val="002750"/>
-              </w:rPr>
-              <w:t>Programme:</w:t>
+              <w:t>Network packet anomalies must be reviewed manually, increasing the risk of security breaches.</w:t>
             </w:r>
           </w:p>
         </w:tc>
         <w:tc>
           <w:tcPr>
-            <w:tcW w:type="dxa" w:w="4464"/>
-            <w:tcBorders>
-              <w:top w:val="single" w:sz="4" w:color="B0C4DE"/>
-              <w:bottom w:val="single" w:sz="4" w:color="B0C4DE"/>
-              <w:left w:val="single" w:sz="4" w:color="B0C4DE"/>
-              <w:right w:val="single" w:sz="4" w:color="B0C4DE"/>
-            </w:tcBorders>
+            <w:tcW w:type="dxa" w:w="4680"/>
           </w:tcPr>
           <w:p>
-            <w:pPr>
-              <w:spacing w:after="80"/>
-            </w:pPr>
             <w:r>
-              <w:rPr>
-                <w:rFonts w:ascii="Calibri" w:hAnsi="Calibri"/>
-                <w:sz w:val="22"/>
-              </w:rPr>
-              <w:t>Master of Computer Applications (MCA) — 2nd Year</w:t>
+              <w:t>Automatically verifies network telemetry and prevents malicious IP addresses from compromising system resources.</w:t>
             </w:r>
           </w:p>
         </w:tc>
@@ -291,48 +263,21 @@
       <w:tr>
         <w:tc>
           <w:tcPr>
-            <w:tcW w:type="dxa" w:w="4464"/>
-            <w:tcBorders>
-              <w:top w:val="single" w:sz="4" w:color="B0C4DE"/>
-              <w:bottom w:val="single" w:sz="4" w:color="B0C4DE"/>
-              <w:left w:val="single" w:sz="4" w:color="B0C4DE"/>
-              <w:right w:val="single" w:sz="4" w:color="B0C4DE"/>
-            </w:tcBorders>
+            <w:tcW w:type="dxa" w:w="4680"/>
           </w:tcPr>
           <w:p>
-            <w:pPr>
-              <w:spacing w:after="80"/>
-            </w:pPr>
             <w:r>
-              <w:rPr>
-                <w:rFonts w:ascii="Calibri" w:hAnsi="Calibri"/>
-                <w:b/>
-                <w:color w:val="002750"/>
-              </w:rPr>
-              <w:t>Live Deployment:</w:t>
+              <w:t>Firewall quarantine rules may be applied in non-continuous intervals or conflict with active rules.</w:t>
             </w:r>
           </w:p>
         </w:tc>
         <w:tc>
           <w:tcPr>
-            <w:tcW w:type="dxa" w:w="4464"/>
-            <w:tcBorders>
-              <w:top w:val="single" w:sz="4" w:color="B0C4DE"/>
-              <w:bottom w:val="single" w:sz="4" w:color="B0C4DE"/>
-              <w:left w:val="single" w:sz="4" w:color="B0C4DE"/>
-              <w:right w:val="single" w:sz="4" w:color="B0C4DE"/>
-            </w:tcBorders>
+            <w:tcW w:type="dxa" w:w="4680"/>
           </w:tcPr>
           <w:p>
-            <w:pPr>
-              <w:spacing w:after="80"/>
-            </w:pPr>
             <w:r>
-              <w:rPr>
-                <w:rFonts w:ascii="Calibri" w:hAnsi="Calibri"/>
-                <w:sz w:val="22"/>
-              </w:rPr>
-              <w:t>https://sentinelgpt-ai.vercel.app</w:t>
+              <w:t>Automatically allocates firewall quarantine rules in real time while maintaining strict security policies.</w:t>
             </w:r>
           </w:p>
         </w:tc>
@@ -340,48 +285,109 @@
       <w:tr>
         <w:tc>
           <w:tcPr>
-            <w:tcW w:type="dxa" w:w="4464"/>
-            <w:tcBorders>
-              <w:top w:val="single" w:sz="4" w:color="B0C4DE"/>
-              <w:bottom w:val="single" w:sz="4" w:color="B0C4DE"/>
-              <w:left w:val="single" w:sz="4" w:color="B0C4DE"/>
-              <w:right w:val="single" w:sz="4" w:color="B0C4DE"/>
-            </w:tcBorders>
+            <w:tcW w:type="dxa" w:w="4680"/>
           </w:tcPr>
           <w:p>
-            <w:pPr>
-              <w:spacing w:after="80"/>
-            </w:pPr>
             <w:r>
-              <w:rPr>
-                <w:rFonts w:ascii="Calibri" w:hAnsi="Calibri"/>
-                <w:b/>
-                <w:color w:val="002750"/>
-              </w:rPr>
-              <w:t>GitHub Repository:</w:t>
+              <w:t>Incident priority scores are manually estimated, which may lead to incorrect threat assessments.</w:t>
             </w:r>
           </w:p>
         </w:tc>
         <w:tc>
           <w:tcPr>
-            <w:tcW w:type="dxa" w:w="4464"/>
-            <w:tcBorders>
-              <w:top w:val="single" w:sz="4" w:color="B0C4DE"/>
-              <w:bottom w:val="single" w:sz="4" w:color="B0C4DE"/>
-              <w:left w:val="single" w:sz="4" w:color="B0C4DE"/>
-              <w:right w:val="single" w:sz="4" w:color="B0C4DE"/>
-            </w:tcBorders>
+            <w:tcW w:type="dxa" w:w="4680"/>
           </w:tcPr>
           <w:p>
-            <w:pPr>
-              <w:spacing w:after="80"/>
-            </w:pPr>
             <w:r>
-              <w:rPr>
-                <w:rFonts w:ascii="Calibri" w:hAnsi="Calibri"/>
-                <w:sz w:val="22"/>
-              </w:rPr>
-              <w:t>https://github.com/Pravallika2025/sentigraud-ai-.git</w:t>
+              <w:t>Ensures every incident receives an accurate risk score (0-100) through automatic heuristic validation.</w:t>
+            </w:r>
+          </w:p>
+        </w:tc>
+      </w:tr>
+      <w:tr>
+        <w:tc>
+          <w:tcPr>
+            <w:tcW w:type="dxa" w:w="4680"/>
+          </w:tcPr>
+          <w:p>
+            <w:r>
+              <w:t>Threat remediation requires manual analysis and repeated verification of security logs.</w:t>
+            </w:r>
+          </w:p>
+        </w:tc>
+        <w:tc>
+          <w:tcPr>
+            <w:tcW w:type="dxa" w:w="4680"/>
+          </w:tcPr>
+          <w:p>
+            <w:r>
+              <w:t>Supports quick AI-driven triage generation and instant security remediation guidance.</w:t>
+            </w:r>
+          </w:p>
+        </w:tc>
+      </w:tr>
+      <w:tr>
+        <w:tc>
+          <w:tcPr>
+            <w:tcW w:type="dxa" w:w="4680"/>
+          </w:tcPr>
+          <w:p>
+            <w:r>
+              <w:t>Security incidents and false positives are difficult to identify and resolve manually.</w:t>
+            </w:r>
+          </w:p>
+        </w:tc>
+        <w:tc>
+          <w:tcPr>
+            <w:tcW w:type="dxa" w:w="4680"/>
+          </w:tcPr>
+          <w:p>
+            <w:r>
+              <w:t>Uses an Autonomous Quarantine Agent to automatically detect and eliminate high-risk threats before system compromise.</w:t>
+            </w:r>
+          </w:p>
+        </w:tc>
+      </w:tr>
+      <w:tr>
+        <w:tc>
+          <w:tcPr>
+            <w:tcW w:type="dxa" w:w="4680"/>
+          </w:tcPr>
+          <w:p>
+            <w:r>
+              <w:t>Provides limited information about how security decisions and threat scores are made.</w:t>
+            </w:r>
+          </w:p>
+        </w:tc>
+        <w:tc>
+          <w:tcPr>
+            <w:tcW w:type="dxa" w:w="4680"/>
+          </w:tcPr>
+          <w:p>
+            <w:r>
+              <w:t>Maintains detailed agent logs and MITRE ATT&amp;CK mapping that record security activities for better transparency.</w:t>
+            </w:r>
+          </w:p>
+        </w:tc>
+      </w:tr>
+      <w:tr>
+        <w:tc>
+          <w:tcPr>
+            <w:tcW w:type="dxa" w:w="4680"/>
+          </w:tcPr>
+          <w:p>
+            <w:r>
+              <w:t>Security reports often require manual formatting before sharing with executive teams.</w:t>
+            </w:r>
+          </w:p>
+        </w:tc>
+        <w:tc>
+          <w:tcPr>
+            <w:tcW w:type="dxa" w:w="4680"/>
+          </w:tcPr>
+          <w:p>
+            <w:r>
+              <w:t>Generates structured JSON incident logs and interactive reports that can be exported directly.</w:t>
             </w:r>
           </w:p>
         </w:tc>
@@ -394,432 +400,83 @@
     </w:p>
     <w:p>
       <w:pPr>
-        <w:spacing w:before="320" w:after="100"/>
-        <w:pBdr>
-          <w:bottom w:val="single" w:sz="6" w:space="1" w:color="003366"/>
-        </w:pBdr>
+        <w:spacing w:before="360" w:after="240"/>
       </w:pPr>
       <w:r>
         <w:rPr>
-          <w:rFonts w:ascii="Calibri" w:hAnsi="Calibri"/>
+          <w:rFonts w:ascii="Times New Roman" w:hAnsi="Times New Roman"/>
           <w:b/>
-          <w:color w:val="002750"/>
-          <w:sz w:val="30"/>
+          <w:color w:val="000000"/>
+          <w:sz w:val="32"/>
         </w:rPr>
-        <w:t>1.  Problem Statement</w:t>
+        <w:t>Proposed System</w:t>
       </w:r>
     </w:p>
     <w:p>
       <w:pPr>
-        <w:spacing w:before="0" w:after="120" w:line="288" w:lineRule="auto"/>
+        <w:spacing w:after="160" w:line="360" w:lineRule="auto"/>
         <w:jc w:val="both"/>
       </w:pPr>
       <w:r>
         <w:rPr>
-          <w:rFonts w:ascii="Calibri" w:hAnsi="Calibri"/>
+          <w:rFonts w:ascii="Times New Roman" w:hAnsi="Times New Roman"/>
+          <w:color w:val="000000"/>
         </w:rPr>
-        <w:t>Modern cybersecurity operations face severe challenges managing the overwhelming volume of network telemetry and security alerts generated by enterprise IT infrastructure. Security Information and Event Management (SIEM) systems process millions of event logs, network probes, and API requests daily. Many organizations still rely heavily on manual log inspection, static firewall rules, and fragmented monitoring tools — creating serious operational bottlenecks, severe analyst alert fatigue, and dangerously slow incident response times that allow threats to propagate unchecked through internal networks.</w:t>
+        <w:t>The proposed Agentic AI Based SentinelGPT System is an intelligent web-based application developed to automate the process of cyber threat detection, network monitoring, and incident management. The system is designed to reduce the time, effort, and errors involved in manual security operations by using intelligent software agents that analyze telemetry and validate security policies based on predefined cybersecurity constraints.</w:t>
       </w:r>
     </w:p>
     <w:p>
       <w:pPr>
-        <w:spacing w:before="0" w:after="120" w:line="288" w:lineRule="auto"/>
+        <w:spacing w:after="160" w:line="360" w:lineRule="auto"/>
         <w:jc w:val="both"/>
       </w:pPr>
       <w:r>
         <w:rPr>
-          <w:rFonts w:ascii="Calibri" w:hAnsi="Calibri"/>
+          <w:rFonts w:ascii="Times New Roman" w:hAnsi="Times New Roman"/>
+          <w:color w:val="000000"/>
         </w:rPr>
-        <w:t>A central challenge is identifying sophisticated multi-stage attacks such as credential stuffing, Distributed Denial of Service (DDoS) vectors, SQL injection payloads, and brute-force authentication spikes. Traditional rule-based intrusion detection systems generate high rates of false positives while failing to correlate anomalous network behavior with recognized attack frameworks like MITRE ATT&amp;CK. Manual quarantine procedures further delay response, exposing internal networks to lateral movement and unauthorized data exfiltration.</w:t>
+        <w:t>The system allows the security administrator to monitor parameters such as source IP address, target endpoint, payload signature, attack type (such as DDoS, SQL injection, or brute force), and required risk threshold. Based on these inputs, the Telemetry Monitor Agent automatically creates threat assessments by evaluating network traffic against heuristic models while ensuring that all security rules are followed. It gives priority to critical vulnerability vectors by assigning them immediate risk scores and ensures that anomalous traffic does not cross perimeter boundaries. The system also checks active IP quarantine status across all network nodes to prevent unauthorized access.</w:t>
       </w:r>
     </w:p>
     <w:p>
       <w:pPr>
-        <w:spacing w:before="0" w:after="120" w:line="288" w:lineRule="auto"/>
+        <w:spacing w:after="160" w:line="360" w:lineRule="auto"/>
         <w:jc w:val="both"/>
       </w:pPr>
       <w:r>
         <w:rPr>
-          <w:rFonts w:ascii="Calibri" w:hAnsi="Calibri"/>
+          <w:rFonts w:ascii="Times New Roman" w:hAnsi="Times New Roman"/>
+          <w:color w:val="000000"/>
         </w:rPr>
-        <w:t>Existing security dashboards lack transparent decision-making, intelligent payload analysis, and real-time visualization. Analysts are left without instant remediation guidance, unsure why a specific threat score was assigned or which immediate countermeasures to execute.</w:t>
+        <w:t>After threat assessment generation, the Autonomous Quarantine Agent verifies the detected security events by checking whether each incident has been assigned the correct priority score, firewall isolation rules remain active, security policies are preserved, and no malicious IP is permitted to execute unauthorized requests. If any high-risk violation (score &gt;= 75) is detected, the offending IP is automatically quarantined until administrator review.</w:t>
       </w:r>
     </w:p>
     <w:p>
       <w:pPr>
-        <w:spacing w:before="0" w:after="120" w:line="288" w:lineRule="auto"/>
+        <w:spacing w:after="160" w:line="360" w:lineRule="auto"/>
         <w:jc w:val="both"/>
       </w:pPr>
       <w:r>
         <w:rPr>
-          <w:rFonts w:ascii="Calibri" w:hAnsi="Calibri"/>
+          <w:rFonts w:ascii="Times New Roman" w:hAnsi="Times New Roman"/>
+          <w:color w:val="000000"/>
         </w:rPr>
-        <w:t>To address these challenges, this project presents SentinelGPT — an AI-Powered Large Language Model Framework for Advanced Cyber Threat Detection and Analysis. The system uses intelligent software agents to automatically monitor network telemetry, compute risk scores via heuristic anomaly algorithms, map threats to MITRE ATT&amp;CK techniques, and autonomously quarantine high-risk IP addresses — drastically reducing manual effort and incident response latency.</w:t>
+        <w:t>The system provides a user-friendly dashboard where administrators can view live telemetry, trigger manual threat simulations, inspect incident histories, manage quarantine lists, interact with an AI triage assistant, and clear logs. All detected incidents are securely stored in the database, allowing easy retrieval and future security audits. The application also maintains detailed agent logs that record every important security decision taken during threat analysis and quarantine, making the process transparent and easy to debug.</w:t>
       </w:r>
     </w:p>
     <w:p>
       <w:pPr>
-        <w:spacing w:before="320" w:after="100"/>
-        <w:pBdr>
-          <w:bottom w:val="single" w:sz="6" w:space="1" w:color="003366"/>
-        </w:pBdr>
+        <w:spacing w:after="160" w:line="360" w:lineRule="auto"/>
+        <w:jc w:val="both"/>
       </w:pPr>
       <w:r>
         <w:rPr>
-          <w:rFonts w:ascii="Calibri" w:hAnsi="Calibri"/>
-          <w:b/>
-          <w:color w:val="002750"/>
-          <w:sz w:val="30"/>
+          <w:rFonts w:ascii="Times New Roman" w:hAnsi="Times New Roman"/>
+          <w:color w:val="000000"/>
         </w:rPr>
-        <w:t>2.  Difference: Traditional System vs. Proposed SentinelGPT</w:t>
+        <w:t>Additionally, the system supports structured JSON log export and RESTful API access, enabling security teams to integrate SentinelGPT with external SIEM tools. By combining intelligent threat detection, automated quarantine validation, secure data management, and an interactive web interface, the proposed system provides a reliable, efficient, and scalable solution for enterprise cybersecurity management. It minimizes manual effort, improves detection accuracy, eliminates response delays, and enhances the overall security posture of modern organizations.</w:t>
       </w:r>
     </w:p>
-    <w:p>
-      <w:pPr>
-        <w:spacing w:before="0" w:after="120" w:line="288" w:lineRule="auto"/>
-        <w:jc w:val="both"/>
-      </w:pPr>
-      <w:r>
-        <w:rPr>
-          <w:rFonts w:ascii="Calibri" w:hAnsi="Calibri"/>
-        </w:rPr>
-        <w:t>The table below contrasts conventional security operations with the proposed SentinelGPT AI-powered system across key operational dimensions:</w:t>
-      </w:r>
-    </w:p>
-    <w:tbl>
-      <w:tblPr>
-        <w:tblStyle w:val="TableGrid"/>
-        <w:tblW w:type="auto" w:w="0"/>
-        <w:jc w:val="center"/>
-        <w:tblLook w:firstColumn="1" w:firstRow="1" w:lastColumn="0" w:lastRow="0" w:noHBand="0" w:noVBand="1" w:val="04A0"/>
-      </w:tblPr>
-      <w:tblGrid>
-        <w:gridCol w:w="4464"/>
-        <w:gridCol w:w="4464"/>
-      </w:tblGrid>
-      <w:tr>
-        <w:tc>
-          <w:tcPr>
-            <w:tcW w:type="dxa" w:w="4464"/>
-            <w:shd w:val="clear" w:color="auto" w:fill="003366"/>
-          </w:tcPr>
-          <w:p>
-            <w:pPr>
-              <w:jc w:val="center"/>
-            </w:pPr>
-            <w:r>
-              <w:rPr>
-                <w:rFonts w:ascii="Calibri" w:hAnsi="Calibri"/>
-                <w:b/>
-                <w:color w:val="FFFFFF"/>
-                <w:sz w:val="22"/>
-              </w:rPr>
-              <w:t>Traditional Security System</w:t>
-            </w:r>
-          </w:p>
-        </w:tc>
-        <w:tc>
-          <w:tcPr>
-            <w:tcW w:type="dxa" w:w="4464"/>
-            <w:shd w:val="clear" w:color="auto" w:fill="003366"/>
-          </w:tcPr>
-          <w:p>
-            <w:pPr>
-              <w:jc w:val="center"/>
-            </w:pPr>
-            <w:r>
-              <w:rPr>
-                <w:rFonts w:ascii="Calibri" w:hAnsi="Calibri"/>
-                <w:b/>
-                <w:color w:val="FFFFFF"/>
-                <w:sz w:val="22"/>
-              </w:rPr>
-              <w:t>Proposed SentinelGPT System</w:t>
-            </w:r>
-          </w:p>
-        </w:tc>
-      </w:tr>
-      <w:tr>
-        <w:tc>
-          <w:tcPr>
-            <w:tcW w:type="dxa" w:w="4464"/>
-            <w:shd w:val="clear" w:color="auto" w:fill="EEF4FB"/>
-          </w:tcPr>
-          <w:p>
-            <w:pPr>
-              <w:spacing w:before="60" w:after="60"/>
-            </w:pPr>
-            <w:r>
-              <w:rPr>
-                <w:rFonts w:ascii="Calibri" w:hAnsi="Calibri"/>
-              </w:rPr>
-              <w:t>Manual log inspection; static firewall rules; delayed response.</w:t>
-            </w:r>
-          </w:p>
-        </w:tc>
-        <w:tc>
-          <w:tcPr>
-            <w:tcW w:type="dxa" w:w="4464"/>
-            <w:shd w:val="clear" w:color="auto" w:fill="EEF4FB"/>
-          </w:tcPr>
-          <w:p>
-            <w:pPr>
-              <w:spacing w:before="60" w:after="60"/>
-            </w:pPr>
-            <w:r>
-              <w:rPr>
-                <w:rFonts w:ascii="Calibri" w:hAnsi="Calibri"/>
-              </w:rPr>
-              <w:t>Autonomous agents monitor telemetry 24/7 with zero manual input required.</w:t>
-            </w:r>
-          </w:p>
-        </w:tc>
-      </w:tr>
-      <w:tr>
-        <w:tc>
-          <w:tcPr>
-            <w:tcW w:type="dxa" w:w="4464"/>
-          </w:tcPr>
-          <w:p>
-            <w:pPr>
-              <w:spacing w:before="60" w:after="60"/>
-            </w:pPr>
-            <w:r>
-              <w:rPr>
-                <w:rFonts w:ascii="Calibri" w:hAnsi="Calibri"/>
-              </w:rPr>
-              <w:t>High alert fatigue; delayed incident detection.</w:t>
-            </w:r>
-          </w:p>
-        </w:tc>
-        <w:tc>
-          <w:tcPr>
-            <w:tcW w:type="dxa" w:w="4464"/>
-          </w:tcPr>
-          <w:p>
-            <w:pPr>
-              <w:spacing w:before="60" w:after="60"/>
-            </w:pPr>
-            <w:r>
-              <w:rPr>
-                <w:rFonts w:ascii="Calibri" w:hAnsi="Calibri"/>
-              </w:rPr>
-              <w:t>Heuristic scoring (0–100) eliminates alert fatigue; threats detected instantly.</w:t>
-            </w:r>
-          </w:p>
-        </w:tc>
-      </w:tr>
-      <w:tr>
-        <w:tc>
-          <w:tcPr>
-            <w:tcW w:type="dxa" w:w="4464"/>
-            <w:shd w:val="clear" w:color="auto" w:fill="EEF4FB"/>
-          </w:tcPr>
-          <w:p>
-            <w:pPr>
-              <w:spacing w:before="60" w:after="60"/>
-            </w:pPr>
-            <w:r>
-              <w:rPr>
-                <w:rFonts w:ascii="Calibri" w:hAnsi="Calibri"/>
-              </w:rPr>
-              <w:t>IP blocking requires manual admin intervention and rule updates.</w:t>
-            </w:r>
-          </w:p>
-        </w:tc>
-        <w:tc>
-          <w:tcPr>
-            <w:tcW w:type="dxa" w:w="4464"/>
-            <w:shd w:val="clear" w:color="auto" w:fill="EEF4FB"/>
-          </w:tcPr>
-          <w:p>
-            <w:pPr>
-              <w:spacing w:before="60" w:after="60"/>
-            </w:pPr>
-            <w:r>
-              <w:rPr>
-                <w:rFonts w:ascii="Calibri" w:hAnsi="Calibri"/>
-              </w:rPr>
-              <w:t>Autonomous Quarantine Agent auto-isolates IPs scoring ≥75 in real time.</w:t>
-            </w:r>
-          </w:p>
-        </w:tc>
-      </w:tr>
-      <w:tr>
-        <w:tc>
-          <w:tcPr>
-            <w:tcW w:type="dxa" w:w="4464"/>
-          </w:tcPr>
-          <w:p>
-            <w:pPr>
-              <w:spacing w:before="60" w:after="60"/>
-            </w:pPr>
-            <w:r>
-              <w:rPr>
-                <w:rFonts w:ascii="Calibri" w:hAnsi="Calibri"/>
-              </w:rPr>
-              <w:t>Lacks standardized MITRE ATT&amp;CK threat-framework alignment.</w:t>
-            </w:r>
-          </w:p>
-        </w:tc>
-        <w:tc>
-          <w:tcPr>
-            <w:tcW w:type="dxa" w:w="4464"/>
-          </w:tcPr>
-          <w:p>
-            <w:pPr>
-              <w:spacing w:before="60" w:after="60"/>
-            </w:pPr>
-            <w:r>
-              <w:rPr>
-                <w:rFonts w:ascii="Calibri" w:hAnsi="Calibri"/>
-              </w:rPr>
-              <w:t>All incidents automatically mapped to MITRE ATT&amp;CK tactics and techniques.</w:t>
-            </w:r>
-          </w:p>
-        </w:tc>
-      </w:tr>
-      <w:tr>
-        <w:tc>
-          <w:tcPr>
-            <w:tcW w:type="dxa" w:w="4464"/>
-            <w:shd w:val="clear" w:color="auto" w:fill="EEF4FB"/>
-          </w:tcPr>
-          <w:p>
-            <w:pPr>
-              <w:spacing w:before="60" w:after="60"/>
-            </w:pPr>
-            <w:r>
-              <w:rPr>
-                <w:rFonts w:ascii="Calibri" w:hAnsi="Calibri"/>
-              </w:rPr>
-              <w:t>Triage requires lengthy manual research by analysts.</w:t>
-            </w:r>
-          </w:p>
-        </w:tc>
-        <w:tc>
-          <w:tcPr>
-            <w:tcW w:type="dxa" w:w="4464"/>
-            <w:shd w:val="clear" w:color="auto" w:fill="EEF4FB"/>
-          </w:tcPr>
-          <w:p>
-            <w:pPr>
-              <w:spacing w:before="60" w:after="60"/>
-            </w:pPr>
-            <w:r>
-              <w:rPr>
-                <w:rFonts w:ascii="Calibri" w:hAnsi="Calibri"/>
-              </w:rPr>
-              <w:t>Integrated AI Triage Assistant delivers instant remediation guidance.</w:t>
-            </w:r>
-          </w:p>
-        </w:tc>
-      </w:tr>
-      <w:tr>
-        <w:tc>
-          <w:tcPr>
-            <w:tcW w:type="dxa" w:w="4464"/>
-          </w:tcPr>
-          <w:p>
-            <w:pPr>
-              <w:spacing w:before="60" w:after="60"/>
-            </w:pPr>
-            <w:r>
-              <w:rPr>
-                <w:rFonts w:ascii="Calibri" w:hAnsi="Calibri"/>
-              </w:rPr>
-              <w:t>Limited real-time visualization of threat velocity.</w:t>
-            </w:r>
-          </w:p>
-        </w:tc>
-        <w:tc>
-          <w:tcPr>
-            <w:tcW w:type="dxa" w:w="4464"/>
-          </w:tcPr>
-          <w:p>
-            <w:pPr>
-              <w:spacing w:before="60" w:after="60"/>
-            </w:pPr>
-            <w:r>
-              <w:rPr>
-                <w:rFonts w:ascii="Calibri" w:hAnsi="Calibri"/>
-              </w:rPr>
-              <w:t>Glassmorphic dashboard with live telemetry charts and perimeter heatmaps.</w:t>
-            </w:r>
-          </w:p>
-        </w:tc>
-      </w:tr>
-      <w:tr>
-        <w:tc>
-          <w:tcPr>
-            <w:tcW w:type="dxa" w:w="4464"/>
-            <w:shd w:val="clear" w:color="auto" w:fill="EEF4FB"/>
-          </w:tcPr>
-          <w:p>
-            <w:pPr>
-              <w:spacing w:before="60" w:after="60"/>
-            </w:pPr>
-            <w:r>
-              <w:rPr>
-                <w:rFonts w:ascii="Calibri" w:hAnsi="Calibri"/>
-              </w:rPr>
-              <w:t>Payload analysis performed manually with external tools.</w:t>
-            </w:r>
-          </w:p>
-        </w:tc>
-        <w:tc>
-          <w:tcPr>
-            <w:tcW w:type="dxa" w:w="4464"/>
-            <w:shd w:val="clear" w:color="auto" w:fill="EEF4FB"/>
-          </w:tcPr>
-          <w:p>
-            <w:pPr>
-              <w:spacing w:before="60" w:after="60"/>
-            </w:pPr>
-            <w:r>
-              <w:rPr>
-                <w:rFonts w:ascii="Calibri" w:hAnsi="Calibri"/>
-              </w:rPr>
-              <w:t>Built-in Payload Scanner auto-analyzes files with verdict reports.</w:t>
-            </w:r>
-          </w:p>
-        </w:tc>
-      </w:tr>
-      <w:tr>
-        <w:tc>
-          <w:tcPr>
-            <w:tcW w:type="dxa" w:w="4464"/>
-          </w:tcPr>
-          <w:p>
-            <w:pPr>
-              <w:spacing w:before="60" w:after="60"/>
-            </w:pPr>
-            <w:r>
-              <w:rPr>
-                <w:rFonts w:ascii="Calibri" w:hAnsi="Calibri"/>
-              </w:rPr>
-              <w:t>Incident data export requires manual log collection.</w:t>
-            </w:r>
-          </w:p>
-        </w:tc>
-        <w:tc>
-          <w:tcPr>
-            <w:tcW w:type="dxa" w:w="4464"/>
-          </w:tcPr>
-          <w:p>
-            <w:pPr>
-              <w:spacing w:before="60" w:after="60"/>
-            </w:pPr>
-            <w:r>
-              <w:rPr>
-                <w:rFonts w:ascii="Calibri" w:hAnsi="Calibri"/>
-              </w:rPr>
-              <w:t>Instant JSON incident-log export via REST API (/api/export).</w:t>
-            </w:r>
-          </w:p>
-        </w:tc>
-      </w:tr>
-    </w:tbl>
     <w:p>
       <w:r>
         <w:br w:type="page"/>
@@ -827,83 +484,123 @@
     </w:p>
     <w:p>
       <w:pPr>
-        <w:spacing w:before="320" w:after="100"/>
-        <w:pBdr>
-          <w:bottom w:val="single" w:sz="6" w:space="1" w:color="003366"/>
-        </w:pBdr>
+        <w:spacing w:before="360" w:after="240"/>
       </w:pPr>
       <w:r>
         <w:rPr>
-          <w:rFonts w:ascii="Calibri" w:hAnsi="Calibri"/>
+          <w:rFonts w:ascii="Times New Roman" w:hAnsi="Times New Roman"/>
           <w:b/>
-          <w:color w:val="002750"/>
-          <w:sz w:val="30"/>
+          <w:color w:val="000000"/>
+          <w:sz w:val="32"/>
         </w:rPr>
-        <w:t>3.  Proposed Solution &amp; System Overview</w:t>
+        <w:t>System Architecture</w:t>
       </w:r>
     </w:p>
     <w:p>
       <w:pPr>
-        <w:spacing w:before="0" w:after="120" w:line="288" w:lineRule="auto"/>
+        <w:spacing w:after="160" w:line="360" w:lineRule="auto"/>
         <w:jc w:val="both"/>
       </w:pPr>
       <w:r>
         <w:rPr>
-          <w:rFonts w:ascii="Calibri" w:hAnsi="Calibri"/>
+          <w:rFonts w:ascii="Times New Roman" w:hAnsi="Times New Roman"/>
+          <w:color w:val="000000"/>
         </w:rPr>
-        <w:t>SentinelGPT is an intelligent, full-stack, cloud-native cyber defense application that automates threat detection, security monitoring, and incident mitigation. It uses intelligent software agents that continuously evaluate network telemetry against heuristic scoring models and security policies, replacing slow manual workflows with instant automated decisions.</w:t>
+        <w:t>The Agentic AI Based SentinelGPT System follows a modular architecture in which each component performs a specific security task. The system starts when the administrator logs in using a valid username and password. After successful authentication, the administrator accesses the security operations dashboard to monitor live telemetry, inspect network anomalies, and review risk metrics.</w:t>
       </w:r>
     </w:p>
     <w:p>
       <w:pPr>
-        <w:spacing w:before="0" w:after="120" w:line="288" w:lineRule="auto"/>
+        <w:spacing w:after="160" w:line="360" w:lineRule="auto"/>
         <w:jc w:val="both"/>
       </w:pPr>
       <w:r>
         <w:rPr>
-          <w:rFonts w:ascii="Calibri" w:hAnsi="Calibri"/>
+          <w:rFonts w:ascii="Times New Roman" w:hAnsi="Times New Roman"/>
+          <w:color w:val="000000"/>
         </w:rPr>
-        <w:t>The Telemetry Monitor Agent analyzes packet rates, IP origins, and request patterns to compute a risk score (0–100). Each incident is mapped to a MITRE ATT&amp;CK technique (e.g., T1078 Valid Accounts, T1498 Network DoS, T1190 Exploit Public App) and enriched with AI-driven remediation guidance. When a score reaches or exceeds 75, the Autonomous Quarantine Agent immediately isolates the offending IP in the database — providing administrators full manual override and revocation control.</w:t>
+        <w:t>The entered information and network requests are sent to the FastAPI backend, which acts as the central controller of the system. It receives user requests, processes API calls, manages authentication tokens, and coordinates communication between different security modules of the application.</w:t>
       </w:r>
     </w:p>
     <w:p>
       <w:pPr>
-        <w:spacing w:before="320" w:after="100"/>
-        <w:pBdr>
-          <w:bottom w:val="single" w:sz="6" w:space="1" w:color="003366"/>
-        </w:pBdr>
+        <w:spacing w:after="160" w:line="360" w:lineRule="auto"/>
+        <w:jc w:val="both"/>
       </w:pPr>
       <w:r>
         <w:rPr>
-          <w:rFonts w:ascii="Calibri" w:hAnsi="Calibri"/>
-          <w:b/>
-          <w:color w:val="002750"/>
-          <w:sz w:val="30"/>
+          <w:rFonts w:ascii="Times New Roman" w:hAnsi="Times New Roman"/>
+          <w:color w:val="000000"/>
         </w:rPr>
-        <w:t>4.  System Architecture</w:t>
+        <w:t>The backend first sends telemetry data to the Telemetry Monitor Agent, which automatically evaluates the security events. It gives priority to high-risk attack vectors by calculating heuristic anomaly scores (0-100) and ensures that threat classifications dynamically map to recognized MITRE ATT&amp;CK techniques. After evaluating network traffic, it assigns risk categories (Critical, High, Medium, Low) while checking IP reputation and avoiding security conflicts across different network segments.</w:t>
       </w:r>
     </w:p>
     <w:p>
       <w:pPr>
-        <w:spacing w:before="0" w:after="120" w:line="288" w:lineRule="auto"/>
+        <w:spacing w:after="160" w:line="360" w:lineRule="auto"/>
         <w:jc w:val="both"/>
       </w:pPr>
       <w:r>
         <w:rPr>
-          <w:rFonts w:ascii="Calibri" w:hAnsi="Calibri"/>
+          <w:rFonts w:ascii="Times New Roman" w:hAnsi="Times New Roman"/>
+          <w:color w:val="000000"/>
         </w:rPr>
-        <w:t>SentinelGPT follows a modular, decoupled architecture. The operator authenticates via the React SPA frontend, which connects to the FastAPI backend controller for telemetry snapshots and WebSocket streaming. Two intelligent agents process telemetry: the Telemetry Monitor Agent (anomaly scoring + MITRE ATT&amp;CK mapping) and the Autonomous Quarantine Agent (IP isolation + validation). All incident logs and quarantine data are stored via SQLAlchemy ORM in SQLite.</w:t>
+        <w:t>Once threat assessments are generated, they are passed to the Autonomous Quarantine Agent. This agent verifies that all security rules are satisfied. It checks whether each incident has an accurate risk score, confirms that quarantine thresholds remain enforced, ensures continuous perimeter protection, and verifies that high-risk malicious IPs are blocked immediately from executing further API calls.</w:t>
       </w:r>
     </w:p>
     <w:p>
       <w:pPr>
-        <w:spacing w:before="160" w:after="60"/>
+        <w:spacing w:after="160" w:line="360" w:lineRule="auto"/>
+        <w:jc w:val="both"/>
+      </w:pPr>
+      <w:r>
+        <w:rPr>
+          <w:rFonts w:ascii="Times New Roman" w:hAnsi="Times New Roman"/>
+          <w:color w:val="000000"/>
+        </w:rPr>
+        <w:t>After successful validation, security incidents and quarantine status are stored in the database. The database contains four main ORM tables: the Users table for administrator credentials and roles, the SOC Incidents table for storing threat configurations and risk scores, the Perimeter Logs table for network traffic metrics, and the Blocked IPs table for recording active quarantine lists enforced by the intelligent agents.</w:t>
+      </w:r>
+    </w:p>
+    <w:p>
+      <w:pPr>
+        <w:spacing w:after="160" w:line="360" w:lineRule="auto"/>
+        <w:jc w:val="both"/>
+      </w:pPr>
+      <w:r>
+        <w:rPr>
+          <w:rFonts w:ascii="Times New Roman" w:hAnsi="Times New Roman"/>
+          <w:color w:val="000000"/>
+        </w:rPr>
+        <w:t>Finally, stored security data is displayed on the interactive dashboard, where administrators can view live threat velocity, inspect charts, execute manual IP blocks or unblocks, trigger test threats, or clear logs whenever necessary. The system also allows incident reports to be exported as structured JSON data for security compliance.</w:t>
+      </w:r>
+    </w:p>
+    <w:p>
+      <w:pPr>
+        <w:spacing w:after="160" w:line="360" w:lineRule="auto"/>
+        <w:jc w:val="both"/>
+      </w:pPr>
+      <w:r>
+        <w:rPr>
+          <w:rFonts w:ascii="Times New Roman" w:hAnsi="Times New Roman"/>
+          <w:color w:val="000000"/>
+        </w:rPr>
+        <w:t>The modular design of the system improves reliability, reduces manual effort, eliminates response latency, and provides an efficient solution for enterprise cybersecurity operations.</w:t>
+      </w:r>
+    </w:p>
+    <w:p>
+      <w:r>
+        <w:br w:type="page"/>
+      </w:r>
+    </w:p>
+    <w:p>
+      <w:pPr>
+        <w:spacing w:before="280" w:after="280"/>
         <w:jc w:val="center"/>
       </w:pPr>
       <w:r>
         <w:drawing>
           <wp:inline xmlns:a="http://schemas.openxmlformats.org/drawingml/2006/main" xmlns:pic="http://schemas.openxmlformats.org/drawingml/2006/picture">
-            <wp:extent cx="5394960" cy="3763926"/>
+            <wp:extent cx="5303520" cy="3677107"/>
             <wp:docPr id="1" name="Picture 1"/>
             <wp:cNvGraphicFramePr>
               <a:graphicFrameLocks noChangeAspect="1"/>
@@ -912,7 +609,7 @@
               <a:graphicData uri="http://schemas.openxmlformats.org/drawingml/2006/picture">
                 <pic:pic>
                   <pic:nvPicPr>
-                    <pic:cNvPr id="0" name="arch_diagram.png"/>
+                    <pic:cNvPr id="0" name="sample_arch_diagram.png"/>
                     <pic:cNvPicPr/>
                   </pic:nvPicPr>
                   <pic:blipFill>
@@ -924,7 +621,7 @@
                   <pic:spPr>
                     <a:xfrm>
                       <a:off x="0" y="0"/>
-                      <a:ext cx="5394960" cy="3763926"/>
+                      <a:ext cx="5303520" cy="3677107"/>
                     </a:xfrm>
                     <a:prstGeom prst="rect"/>
                   </pic:spPr>
@@ -937,340 +634,90 @@
     </w:p>
     <w:p>
       <w:pPr>
-        <w:spacing w:after="200"/>
-        <w:jc w:val="center"/>
+        <w:spacing w:before="360" w:after="240"/>
       </w:pPr>
       <w:r>
         <w:rPr>
-          <w:rFonts w:ascii="Calibri" w:hAnsi="Calibri"/>
-          <w:i/>
-          <w:color w:val="555555"/>
-          <w:sz w:val="19"/>
+          <w:rFonts w:ascii="Times New Roman" w:hAnsi="Times New Roman"/>
+          <w:b/>
+          <w:color w:val="000000"/>
+          <w:sz w:val="32"/>
         </w:rPr>
-        <w:t>Figure 1: SentinelGPT End-to-End System Architecture</w:t>
+        <w:t>Technologies Used</w:t>
       </w:r>
     </w:p>
     <w:p>
       <w:pPr>
-        <w:spacing w:before="320" w:after="100"/>
-        <w:pBdr>
-          <w:bottom w:val="single" w:sz="6" w:space="1" w:color="003366"/>
-        </w:pBdr>
+        <w:spacing w:after="160" w:line="360" w:lineRule="auto"/>
+        <w:jc w:val="both"/>
       </w:pPr>
       <w:r>
         <w:rPr>
-          <w:rFonts w:ascii="Calibri" w:hAnsi="Calibri"/>
-          <w:b/>
-          <w:color w:val="002750"/>
-          <w:sz w:val="30"/>
+          <w:rFonts w:ascii="Times New Roman" w:hAnsi="Times New Roman"/>
+          <w:color w:val="000000"/>
         </w:rPr>
-        <w:t>5.  Technologies Used</w:t>
+        <w:t>The Agentic AI Based SentinelGPT System is developed using a combination of modern frontend, backend, database, and AI technologies. These technologies work together to automate threat monitoring, manage security schedules efficiently, and provide a secure and user-friendly web application. The technology stack used in this project is described below.</w:t>
       </w:r>
     </w:p>
     <w:p>
       <w:pPr>
-        <w:spacing w:before="200" w:after="60"/>
+        <w:spacing w:before="280" w:after="120"/>
       </w:pPr>
       <w:r>
         <w:rPr>
-          <w:rFonts w:ascii="Calibri" w:hAnsi="Calibri"/>
+          <w:rFonts w:ascii="Times New Roman" w:hAnsi="Times New Roman"/>
           <w:b/>
-          <w:color w:val="005F8E"/>
-          <w:sz w:val="24"/>
+          <w:color w:val="000000"/>
+          <w:sz w:val="26"/>
         </w:rPr>
-        <w:t>Frontend Stack</w:t>
+        <w:t>1. Frontend Technologies</w:t>
       </w:r>
     </w:p>
     <w:p>
       <w:pPr>
-        <w:pStyle w:val="ListBullet"/>
-        <w:spacing w:before="0" w:after="60" w:line="276" w:lineRule="auto"/>
-        <w:ind w:left="432"/>
+        <w:spacing w:after="160" w:line="360" w:lineRule="auto"/>
         <w:jc w:val="both"/>
       </w:pPr>
       <w:r>
         <w:rPr>
-          <w:rFonts w:ascii="Calibri" w:hAnsi="Calibri"/>
+          <w:rFonts w:ascii="Times New Roman" w:hAnsi="Times New Roman"/>
+          <w:color w:val="000000"/>
+        </w:rPr>
+        <w:t>The frontend provides an interactive and user-friendly interface through which administrators can access all system features such as login, dashboard monitoring, threat inspection, firewall quarantine control, AI triage assistant chat, and log export.</w:t>
+      </w:r>
+    </w:p>
+    <w:p>
+      <w:pPr>
+        <w:spacing w:after="160" w:line="360" w:lineRule="auto"/>
+        <w:jc w:val="both"/>
+      </w:pPr>
+      <w:r>
+        <w:rPr>
+          <w:rFonts w:ascii="Times New Roman" w:hAnsi="Times New Roman"/>
           <w:b/>
-          <w:color w:val="002750"/>
+          <w:color w:val="000000"/>
         </w:rPr>
-        <w:t xml:space="preserve">React 19: </w:t>
+        <w:t>HTML5</w:t>
+        <w:br/>
       </w:r>
       <w:r>
         <w:rPr>
-          <w:rFonts w:ascii="Calibri" w:hAnsi="Calibri"/>
+          <w:rFonts w:ascii="Times New Roman" w:hAnsi="Times New Roman"/>
+          <w:color w:val="000000"/>
         </w:rPr>
-        <w:t>UI library for dynamic glassmorphic component trees and real-time state management.</w:t>
       </w:r>
     </w:p>
     <w:p>
       <w:pPr>
-        <w:pStyle w:val="ListBullet"/>
-        <w:spacing w:before="0" w:after="60" w:line="276" w:lineRule="auto"/>
-        <w:ind w:left="432"/>
+        <w:spacing w:after="160" w:line="360" w:lineRule="auto"/>
         <w:jc w:val="both"/>
       </w:pPr>
       <w:r>
         <w:rPr>
-          <w:rFonts w:ascii="Calibri" w:hAnsi="Calibri"/>
-          <w:b/>
-          <w:color w:val="002750"/>
+          <w:rFonts w:ascii="Times New Roman" w:hAnsi="Times New Roman"/>
+          <w:color w:val="000000"/>
         </w:rPr>
-        <w:t xml:space="preserve">Vite 5.4: </w:t>
-      </w:r>
-      <w:r>
-        <w:rPr>
-          <w:rFonts w:ascii="Calibri" w:hAnsi="Calibri"/>
-        </w:rPr>
-        <w:t>Next-gen build tool — fast Hot Module Replacement and optimized production bundles.</w:t>
-      </w:r>
-    </w:p>
-    <w:p>
-      <w:pPr>
-        <w:pStyle w:val="ListBullet"/>
-        <w:spacing w:before="0" w:after="60" w:line="276" w:lineRule="auto"/>
-        <w:ind w:left="432"/>
-        <w:jc w:val="both"/>
-      </w:pPr>
-      <w:r>
-        <w:rPr>
-          <w:rFonts w:ascii="Calibri" w:hAnsi="Calibri"/>
-          <w:b/>
-          <w:color w:val="002750"/>
-        </w:rPr>
-        <w:t xml:space="preserve">Recharts: </w:t>
-      </w:r>
-      <w:r>
-        <w:rPr>
-          <w:rFonts w:ascii="Calibri" w:hAnsi="Calibri"/>
-        </w:rPr>
-        <w:t>Data visualization library — threat velocity charts, risk gauges, severity donuts.</w:t>
-      </w:r>
-    </w:p>
-    <w:p>
-      <w:pPr>
-        <w:pStyle w:val="ListBullet"/>
-        <w:spacing w:before="0" w:after="60" w:line="276" w:lineRule="auto"/>
-        <w:ind w:left="432"/>
-        <w:jc w:val="both"/>
-      </w:pPr>
-      <w:r>
-        <w:rPr>
-          <w:rFonts w:ascii="Calibri" w:hAnsi="Calibri"/>
-          <w:b/>
-          <w:color w:val="002750"/>
-        </w:rPr>
-        <w:t xml:space="preserve">Web Audio API: </w:t>
-      </w:r>
-      <w:r>
-        <w:rPr>
-          <w:rFonts w:ascii="Calibri" w:hAnsi="Calibri"/>
-        </w:rPr>
-        <w:t>Browser-native alarm system that plays audio alerts on critical threat detection.</w:t>
-      </w:r>
-    </w:p>
-    <w:p>
-      <w:pPr>
-        <w:spacing w:before="200" w:after="60"/>
-      </w:pPr>
-      <w:r>
-        <w:rPr>
-          <w:rFonts w:ascii="Calibri" w:hAnsi="Calibri"/>
-          <w:b/>
-          <w:color w:val="005F8E"/>
-          <w:sz w:val="24"/>
-        </w:rPr>
-        <w:t>Backend Stack</w:t>
-      </w:r>
-    </w:p>
-    <w:p>
-      <w:pPr>
-        <w:pStyle w:val="ListBullet"/>
-        <w:spacing w:before="0" w:after="60" w:line="276" w:lineRule="auto"/>
-        <w:ind w:left="432"/>
-        <w:jc w:val="both"/>
-      </w:pPr>
-      <w:r>
-        <w:rPr>
-          <w:rFonts w:ascii="Calibri" w:hAnsi="Calibri"/>
-          <w:b/>
-          <w:color w:val="002750"/>
-        </w:rPr>
-        <w:t xml:space="preserve">Python 3.11+: </w:t>
-      </w:r>
-      <w:r>
-        <w:rPr>
-          <w:rFonts w:ascii="Calibri" w:hAnsi="Calibri"/>
-        </w:rPr>
-        <w:t>Core language for agent logic, threat heuristics, and database models.</w:t>
-      </w:r>
-    </w:p>
-    <w:p>
-      <w:pPr>
-        <w:pStyle w:val="ListBullet"/>
-        <w:spacing w:before="0" w:after="60" w:line="276" w:lineRule="auto"/>
-        <w:ind w:left="432"/>
-        <w:jc w:val="both"/>
-      </w:pPr>
-      <w:r>
-        <w:rPr>
-          <w:rFonts w:ascii="Calibri" w:hAnsi="Calibri"/>
-          <w:b/>
-          <w:color w:val="002750"/>
-        </w:rPr>
-        <w:t xml:space="preserve">FastAPI: </w:t>
-      </w:r>
-      <w:r>
-        <w:rPr>
-          <w:rFonts w:ascii="Calibri" w:hAnsi="Calibri"/>
-        </w:rPr>
-        <w:t>Async, high-performance framework — RESTful API, WebSockets, auto Swagger docs.</w:t>
-      </w:r>
-    </w:p>
-    <w:p>
-      <w:pPr>
-        <w:pStyle w:val="ListBullet"/>
-        <w:spacing w:before="0" w:after="60" w:line="276" w:lineRule="auto"/>
-        <w:ind w:left="432"/>
-        <w:jc w:val="both"/>
-      </w:pPr>
-      <w:r>
-        <w:rPr>
-          <w:rFonts w:ascii="Calibri" w:hAnsi="Calibri"/>
-          <w:b/>
-          <w:color w:val="002750"/>
-        </w:rPr>
-        <w:t xml:space="preserve">Uvicorn: </w:t>
-      </w:r>
-      <w:r>
-        <w:rPr>
-          <w:rFonts w:ascii="Calibri" w:hAnsi="Calibri"/>
-        </w:rPr>
-        <w:t>ASGI server for local development and Vercel serverless function routing.</w:t>
-      </w:r>
-    </w:p>
-    <w:p>
-      <w:pPr>
-        <w:pStyle w:val="ListBullet"/>
-        <w:spacing w:before="0" w:after="60" w:line="276" w:lineRule="auto"/>
-        <w:ind w:left="432"/>
-        <w:jc w:val="both"/>
-      </w:pPr>
-      <w:r>
-        <w:rPr>
-          <w:rFonts w:ascii="Calibri" w:hAnsi="Calibri"/>
-          <w:b/>
-          <w:color w:val="002750"/>
-        </w:rPr>
-        <w:t xml:space="preserve">PyJWT: </w:t>
-      </w:r>
-      <w:r>
-        <w:rPr>
-          <w:rFonts w:ascii="Calibri" w:hAnsi="Calibri"/>
-        </w:rPr>
-        <w:t>HS256 JSON Web Token generation and validation — 8-hour expiring sessions.</w:t>
-      </w:r>
-    </w:p>
-    <w:p>
-      <w:pPr>
-        <w:spacing w:before="200" w:after="60"/>
-      </w:pPr>
-      <w:r>
-        <w:rPr>
-          <w:rFonts w:ascii="Calibri" w:hAnsi="Calibri"/>
-          <w:b/>
-          <w:color w:val="005F8E"/>
-          <w:sz w:val="24"/>
-        </w:rPr>
-        <w:t>Database &amp; Deployment</w:t>
-      </w:r>
-    </w:p>
-    <w:p>
-      <w:pPr>
-        <w:pStyle w:val="ListBullet"/>
-        <w:spacing w:before="0" w:after="60" w:line="276" w:lineRule="auto"/>
-        <w:ind w:left="432"/>
-        <w:jc w:val="both"/>
-      </w:pPr>
-      <w:r>
-        <w:rPr>
-          <w:rFonts w:ascii="Calibri" w:hAnsi="Calibri"/>
-          <w:b/>
-          <w:color w:val="002750"/>
-        </w:rPr>
-        <w:t xml:space="preserve">SQLAlchemy ORM: </w:t>
-      </w:r>
-      <w:r>
-        <w:rPr>
-          <w:rFonts w:ascii="Calibri" w:hAnsi="Calibri"/>
-        </w:rPr>
-        <w:t>Type-safe Python ORM for all database reads and writes.</w:t>
-      </w:r>
-    </w:p>
-    <w:p>
-      <w:pPr>
-        <w:pStyle w:val="ListBullet"/>
-        <w:spacing w:before="0" w:after="60" w:line="276" w:lineRule="auto"/>
-        <w:ind w:left="432"/>
-        <w:jc w:val="both"/>
-      </w:pPr>
-      <w:r>
-        <w:rPr>
-          <w:rFonts w:ascii="Calibri" w:hAnsi="Calibri"/>
-          <w:b/>
-          <w:color w:val="002750"/>
-        </w:rPr>
-        <w:t xml:space="preserve">SQLite: </w:t>
-      </w:r>
-      <w:r>
-        <w:rPr>
-          <w:rFonts w:ascii="Calibri" w:hAnsi="Calibri"/>
-        </w:rPr>
-        <w:t>Lightweight relational DB for incident logs, quarantine data, and user accounts.</w:t>
-      </w:r>
-    </w:p>
-    <w:p>
-      <w:pPr>
-        <w:pStyle w:val="ListBullet"/>
-        <w:spacing w:before="0" w:after="60" w:line="276" w:lineRule="auto"/>
-        <w:ind w:left="432"/>
-        <w:jc w:val="both"/>
-      </w:pPr>
-      <w:r>
-        <w:rPr>
-          <w:rFonts w:ascii="Calibri" w:hAnsi="Calibri"/>
-          <w:b/>
-          <w:color w:val="002750"/>
-        </w:rPr>
-        <w:t xml:space="preserve">Vercel Serverless: </w:t>
-      </w:r>
-      <w:r>
-        <w:rPr>
-          <w:rFonts w:ascii="Calibri" w:hAnsi="Calibri"/>
-        </w:rPr>
-        <w:t>Cloud host serving React static build and Python API functions at the edge.</w:t>
-      </w:r>
-    </w:p>
-    <w:p>
-      <w:pPr>
-        <w:pStyle w:val="ListBullet"/>
-        <w:spacing w:before="0" w:after="60" w:line="276" w:lineRule="auto"/>
-        <w:ind w:left="432"/>
-        <w:jc w:val="both"/>
-      </w:pPr>
-      <w:r>
-        <w:rPr>
-          <w:rFonts w:ascii="Calibri" w:hAnsi="Calibri"/>
-          <w:b/>
-          <w:color w:val="002750"/>
-        </w:rPr>
-        <w:t xml:space="preserve">GitHub Actions: </w:t>
-      </w:r>
-      <w:r>
-        <w:rPr>
-          <w:rFonts w:ascii="Calibri" w:hAnsi="Calibri"/>
-        </w:rPr>
-        <w:t>CI/CD pipeline — automated build and deploy on every push to main.</w:t>
+        <w:t>HTML5 is used to create the structure of all web pages, including the login page, operations dashboard, threat management views, AI assistant panel, and report export templates.</w:t>
       </w:r>
     </w:p>
     <w:p>
@@ -1280,30 +727,684 @@
     </w:p>
     <w:p>
       <w:pPr>
-        <w:spacing w:before="320" w:after="100"/>
-        <w:pBdr>
-          <w:bottom w:val="single" w:sz="6" w:space="1" w:color="003366"/>
-        </w:pBdr>
+        <w:spacing w:after="160" w:line="360" w:lineRule="auto"/>
+        <w:jc w:val="both"/>
       </w:pPr>
       <w:r>
         <w:rPr>
-          <w:rFonts w:ascii="Calibri" w:hAnsi="Calibri"/>
+          <w:rFonts w:ascii="Times New Roman" w:hAnsi="Times New Roman"/>
           <w:b/>
-          <w:color w:val="002750"/>
-          <w:sz w:val="30"/>
+          <w:color w:val="000000"/>
         </w:rPr>
-        <w:t>6.  Architecture Flow &amp; Agents Used</w:t>
+        <w:t>CSS3 &amp; Glassmorphism</w:t>
+        <w:br/>
+      </w:r>
+      <w:r>
+        <w:rPr>
+          <w:rFonts w:ascii="Times New Roman" w:hAnsi="Times New Roman"/>
+          <w:color w:val="000000"/>
+        </w:rPr>
       </w:r>
     </w:p>
     <w:p>
       <w:pPr>
-        <w:spacing w:before="160" w:after="60"/>
+        <w:spacing w:after="160" w:line="360" w:lineRule="auto"/>
+        <w:jc w:val="both"/>
+      </w:pPr>
+      <w:r>
+        <w:rPr>
+          <w:rFonts w:ascii="Times New Roman" w:hAnsi="Times New Roman"/>
+          <w:color w:val="000000"/>
+        </w:rPr>
+        <w:t>CSS3 is used to design an attractive and responsive user interface. It styles forms, buttons, cards, dashboard charts, navigation menus, and cyberpunk glassmorphic layouts to improve the user experience.</w:t>
+      </w:r>
+    </w:p>
+    <w:p>
+      <w:pPr>
+        <w:spacing w:after="160" w:line="360" w:lineRule="auto"/>
+        <w:jc w:val="both"/>
+      </w:pPr>
+      <w:r>
+        <w:rPr>
+          <w:rFonts w:ascii="Times New Roman" w:hAnsi="Times New Roman"/>
+          <w:b/>
+          <w:color w:val="000000"/>
+        </w:rPr>
+        <w:t>JavaScript &amp; React 19</w:t>
+        <w:br/>
+      </w:r>
+      <w:r>
+        <w:rPr>
+          <w:rFonts w:ascii="Times New Roman" w:hAnsi="Times New Roman"/>
+          <w:color w:val="000000"/>
+        </w:rPr>
+      </w:r>
+    </w:p>
+    <w:p>
+      <w:pPr>
+        <w:spacing w:after="160" w:line="360" w:lineRule="auto"/>
+        <w:jc w:val="both"/>
+      </w:pPr>
+      <w:r>
+        <w:rPr>
+          <w:rFonts w:ascii="Times New Roman" w:hAnsi="Times New Roman"/>
+          <w:color w:val="000000"/>
+        </w:rPr>
+        <w:t>JavaScript and React 19 are used to provide client-side interactivity, handle user actions, validate form inputs, and dynamically update webpage content without refreshing the entire page. React 19 manages state updates efficiently.</w:t>
+      </w:r>
+    </w:p>
+    <w:p>
+      <w:pPr>
+        <w:spacing w:after="160" w:line="360" w:lineRule="auto"/>
+        <w:jc w:val="both"/>
+      </w:pPr>
+      <w:r>
+        <w:rPr>
+          <w:rFonts w:ascii="Times New Roman" w:hAnsi="Times New Roman"/>
+          <w:b/>
+          <w:color w:val="000000"/>
+        </w:rPr>
+        <w:t>Vite 5.4</w:t>
+        <w:br/>
+      </w:r>
+      <w:r>
+        <w:rPr>
+          <w:rFonts w:ascii="Times New Roman" w:hAnsi="Times New Roman"/>
+          <w:color w:val="000000"/>
+        </w:rPr>
+      </w:r>
+    </w:p>
+    <w:p>
+      <w:pPr>
+        <w:spacing w:after="160" w:line="360" w:lineRule="auto"/>
+        <w:jc w:val="both"/>
+      </w:pPr>
+      <w:r>
+        <w:rPr>
+          <w:rFonts w:ascii="Times New Roman" w:hAnsi="Times New Roman"/>
+          <w:color w:val="000000"/>
+        </w:rPr>
+        <w:t>Vite 5.4 is the build tool and development server used to serve the single-page application (SPA). It provides ultra-fast Hot Module Replacement (HMR) and packages production builds into static bundles.</w:t>
+      </w:r>
+    </w:p>
+    <w:p>
+      <w:pPr>
+        <w:spacing w:before="280" w:after="120"/>
+      </w:pPr>
+      <w:r>
+        <w:rPr>
+          <w:rFonts w:ascii="Times New Roman" w:hAnsi="Times New Roman"/>
+          <w:b/>
+          <w:color w:val="000000"/>
+          <w:sz w:val="26"/>
+        </w:rPr>
+        <w:t>2. Backend Technologies</w:t>
+      </w:r>
+    </w:p>
+    <w:p>
+      <w:pPr>
+        <w:spacing w:after="160" w:line="360" w:lineRule="auto"/>
+        <w:jc w:val="both"/>
+      </w:pPr>
+      <w:r>
+        <w:rPr>
+          <w:rFonts w:ascii="Times New Roman" w:hAnsi="Times New Roman"/>
+          <w:color w:val="000000"/>
+        </w:rPr>
+        <w:t>The backend contains the core business logic of the application. It processes administrator requests, manages threat scoring, validates security policies, and communicates with the database.</w:t>
+      </w:r>
+    </w:p>
+    <w:p>
+      <w:pPr>
+        <w:spacing w:after="160" w:line="360" w:lineRule="auto"/>
+        <w:jc w:val="both"/>
+      </w:pPr>
+      <w:r>
+        <w:rPr>
+          <w:rFonts w:ascii="Times New Roman" w:hAnsi="Times New Roman"/>
+          <w:b/>
+          <w:color w:val="000000"/>
+        </w:rPr>
+        <w:t>Python 3.11+</w:t>
+        <w:br/>
+      </w:r>
+      <w:r>
+        <w:rPr>
+          <w:rFonts w:ascii="Times New Roman" w:hAnsi="Times New Roman"/>
+          <w:color w:val="000000"/>
+        </w:rPr>
+      </w:r>
+    </w:p>
+    <w:p>
+      <w:pPr>
+        <w:spacing w:after="160" w:line="360" w:lineRule="auto"/>
+        <w:jc w:val="both"/>
+      </w:pPr>
+      <w:r>
+        <w:rPr>
+          <w:rFonts w:ascii="Times New Roman" w:hAnsi="Times New Roman"/>
+          <w:color w:val="000000"/>
+        </w:rPr>
+        <w:t>Python is the primary programming language used to implement the application logic, threat scoring algorithms, validation rules, database ORM operations, and overall system functionality.</w:t>
+      </w:r>
+    </w:p>
+    <w:p>
+      <w:pPr>
+        <w:spacing w:after="160" w:line="360" w:lineRule="auto"/>
+        <w:jc w:val="both"/>
+      </w:pPr>
+      <w:r>
+        <w:rPr>
+          <w:rFonts w:ascii="Times New Roman" w:hAnsi="Times New Roman"/>
+          <w:b/>
+          <w:color w:val="000000"/>
+        </w:rPr>
+        <w:t>FastAPI</w:t>
+        <w:br/>
+      </w:r>
+      <w:r>
+        <w:rPr>
+          <w:rFonts w:ascii="Times New Roman" w:hAnsi="Times New Roman"/>
+          <w:color w:val="000000"/>
+        </w:rPr>
+      </w:r>
+    </w:p>
+    <w:p>
+      <w:pPr>
+        <w:spacing w:after="160" w:line="360" w:lineRule="auto"/>
+        <w:jc w:val="both"/>
+      </w:pPr>
+      <w:r>
+        <w:rPr>
+          <w:rFonts w:ascii="Times New Roman" w:hAnsi="Times New Roman"/>
+          <w:color w:val="000000"/>
+        </w:rPr>
+        <w:t>FastAPI is the backend framework used to develop the web application. It handles routing, JWT authentication, session management, API requests, threat processing, and communication between the frontend and database.</w:t>
+      </w:r>
+    </w:p>
+    <w:p>
+      <w:pPr>
+        <w:spacing w:after="160" w:line="360" w:lineRule="auto"/>
+        <w:jc w:val="both"/>
+      </w:pPr>
+      <w:r>
+        <w:rPr>
+          <w:rFonts w:ascii="Times New Roman" w:hAnsi="Times New Roman"/>
+          <w:b/>
+          <w:color w:val="000000"/>
+        </w:rPr>
+        <w:t>Uvicorn</w:t>
+        <w:br/>
+      </w:r>
+      <w:r>
+        <w:rPr>
+          <w:rFonts w:ascii="Times New Roman" w:hAnsi="Times New Roman"/>
+          <w:color w:val="000000"/>
+        </w:rPr>
+      </w:r>
+    </w:p>
+    <w:p>
+      <w:pPr>
+        <w:spacing w:after="160" w:line="360" w:lineRule="auto"/>
+        <w:jc w:val="both"/>
+      </w:pPr>
+      <w:r>
+        <w:rPr>
+          <w:rFonts w:ascii="Times New Roman" w:hAnsi="Times New Roman"/>
+          <w:color w:val="000000"/>
+        </w:rPr>
+        <w:t>Uvicorn is the ASGI server used to run the FastAPI application. It processes client requests efficiently and delivers fast responses to users.</w:t>
+      </w:r>
+    </w:p>
+    <w:p>
+      <w:pPr>
+        <w:spacing w:before="280" w:after="120"/>
+      </w:pPr>
+      <w:r>
+        <w:rPr>
+          <w:rFonts w:ascii="Times New Roman" w:hAnsi="Times New Roman"/>
+          <w:b/>
+          <w:color w:val="000000"/>
+          <w:sz w:val="26"/>
+        </w:rPr>
+        <w:t>3. Agentic AI Technologies</w:t>
+      </w:r>
+    </w:p>
+    <w:p>
+      <w:pPr>
+        <w:spacing w:after="160" w:line="360" w:lineRule="auto"/>
+        <w:jc w:val="both"/>
+      </w:pPr>
+      <w:r>
+        <w:rPr>
+          <w:rFonts w:ascii="Times New Roman" w:hAnsi="Times New Roman"/>
+          <w:color w:val="000000"/>
+        </w:rPr>
+        <w:t>The intelligent functionality of the system is implemented using custom software agents.</w:t>
+      </w:r>
+    </w:p>
+    <w:p>
+      <w:pPr>
+        <w:spacing w:after="160" w:line="360" w:lineRule="auto"/>
+        <w:jc w:val="both"/>
+      </w:pPr>
+      <w:r>
+        <w:rPr>
+          <w:rFonts w:ascii="Times New Roman" w:hAnsi="Times New Roman"/>
+          <w:b/>
+          <w:color w:val="000000"/>
+        </w:rPr>
+        <w:t>Telemetry Monitor Agent</w:t>
+        <w:br/>
+      </w:r>
+      <w:r>
+        <w:rPr>
+          <w:rFonts w:ascii="Times New Roman" w:hAnsi="Times New Roman"/>
+          <w:color w:val="000000"/>
+        </w:rPr>
+      </w:r>
+    </w:p>
+    <w:p>
+      <w:pPr>
+        <w:spacing w:after="160" w:line="360" w:lineRule="auto"/>
+        <w:jc w:val="both"/>
+      </w:pPr>
+      <w:r>
+        <w:rPr>
+          <w:rFonts w:ascii="Times New Roman" w:hAnsi="Times New Roman"/>
+          <w:color w:val="000000"/>
+        </w:rPr>
+        <w:t>The Telemetry Monitor Agent automatically analyzes threat events by calculating heuristic risk scores (0-100) while considering packet velocity, IP reputation, attack signatures, and MITRE ATT&amp;CK technique mapping.</w:t>
+      </w:r>
+    </w:p>
+    <w:p>
+      <w:r>
+        <w:br w:type="page"/>
+      </w:r>
+    </w:p>
+    <w:p>
+      <w:pPr>
+        <w:spacing w:after="160" w:line="360" w:lineRule="auto"/>
+        <w:jc w:val="both"/>
+      </w:pPr>
+      <w:r>
+        <w:rPr>
+          <w:rFonts w:ascii="Times New Roman" w:hAnsi="Times New Roman"/>
+          <w:b/>
+          <w:color w:val="000000"/>
+        </w:rPr>
+        <w:t>Autonomous Quarantine Agent</w:t>
+        <w:br/>
+      </w:r>
+      <w:r>
+        <w:rPr>
+          <w:rFonts w:ascii="Times New Roman" w:hAnsi="Times New Roman"/>
+          <w:color w:val="000000"/>
+        </w:rPr>
+      </w:r>
+    </w:p>
+    <w:p>
+      <w:pPr>
+        <w:spacing w:after="160" w:line="360" w:lineRule="auto"/>
+        <w:jc w:val="both"/>
+      </w:pPr>
+      <w:r>
+        <w:rPr>
+          <w:rFonts w:ascii="Times New Roman" w:hAnsi="Times New Roman"/>
+          <w:color w:val="000000"/>
+        </w:rPr>
+        <w:t>The Autonomous Quarantine Agent verifies generated security events by checking risk score thresholds (score &gt;= 75), enforcing active firewall IP quarantine, validating manual revoke requests, and generating AI remediation advice before finalizing incident status.</w:t>
+      </w:r>
+    </w:p>
+    <w:p>
+      <w:pPr>
+        <w:spacing w:before="280" w:after="120"/>
+      </w:pPr>
+      <w:r>
+        <w:rPr>
+          <w:rFonts w:ascii="Times New Roman" w:hAnsi="Times New Roman"/>
+          <w:b/>
+          <w:color w:val="000000"/>
+          <w:sz w:val="26"/>
+        </w:rPr>
+        <w:t>4. Database Technologies</w:t>
+      </w:r>
+    </w:p>
+    <w:p>
+      <w:pPr>
+        <w:spacing w:after="160" w:line="360" w:lineRule="auto"/>
+        <w:jc w:val="both"/>
+      </w:pPr>
+      <w:r>
+        <w:rPr>
+          <w:rFonts w:ascii="Times New Roman" w:hAnsi="Times New Roman"/>
+          <w:color w:val="000000"/>
+        </w:rPr>
+        <w:t>The database stores all application data securely and allows efficient retrieval of security incident information.</w:t>
+      </w:r>
+    </w:p>
+    <w:p>
+      <w:pPr>
+        <w:spacing w:after="160" w:line="360" w:lineRule="auto"/>
+        <w:jc w:val="both"/>
+      </w:pPr>
+      <w:r>
+        <w:rPr>
+          <w:rFonts w:ascii="Times New Roman" w:hAnsi="Times New Roman"/>
+          <w:b/>
+          <w:color w:val="000000"/>
+        </w:rPr>
+        <w:t>SQLAlchemy ORM</w:t>
+        <w:br/>
+      </w:r>
+      <w:r>
+        <w:rPr>
+          <w:rFonts w:ascii="Times New Roman" w:hAnsi="Times New Roman"/>
+          <w:color w:val="000000"/>
+        </w:rPr>
+      </w:r>
+    </w:p>
+    <w:p>
+      <w:pPr>
+        <w:spacing w:after="160" w:line="360" w:lineRule="auto"/>
+        <w:jc w:val="both"/>
+      </w:pPr>
+      <w:r>
+        <w:rPr>
+          <w:rFonts w:ascii="Times New Roman" w:hAnsi="Times New Roman"/>
+          <w:color w:val="000000"/>
+        </w:rPr>
+        <w:t>SQLAlchemy acts as the Object Relational Mapper (ORM), allowing Python programs to interact with database tables without writing raw SQL queries manually.</w:t>
+      </w:r>
+    </w:p>
+    <w:p>
+      <w:pPr>
+        <w:spacing w:after="160" w:line="360" w:lineRule="auto"/>
+        <w:jc w:val="both"/>
+      </w:pPr>
+      <w:r>
+        <w:rPr>
+          <w:rFonts w:ascii="Times New Roman" w:hAnsi="Times New Roman"/>
+          <w:b/>
+          <w:color w:val="000000"/>
+        </w:rPr>
+        <w:t>SQLite</w:t>
+        <w:br/>
+      </w:r>
+      <w:r>
+        <w:rPr>
+          <w:rFonts w:ascii="Times New Roman" w:hAnsi="Times New Roman"/>
+          <w:color w:val="000000"/>
+        </w:rPr>
+      </w:r>
+    </w:p>
+    <w:p>
+      <w:pPr>
+        <w:spacing w:after="160" w:line="360" w:lineRule="auto"/>
+        <w:jc w:val="both"/>
+      </w:pPr>
+      <w:r>
+        <w:rPr>
+          <w:rFonts w:ascii="Times New Roman" w:hAnsi="Times New Roman"/>
+          <w:color w:val="000000"/>
+        </w:rPr>
+        <w:t>SQLite is used as the local development database. It stores administrator details, SOC incidents, perimeter logs, and blocked IP quarantine records during development and testing.</w:t>
+      </w:r>
+    </w:p>
+    <w:p>
+      <w:pPr>
+        <w:spacing w:after="160" w:line="360" w:lineRule="auto"/>
+        <w:jc w:val="both"/>
+      </w:pPr>
+      <w:r>
+        <w:rPr>
+          <w:rFonts w:ascii="Times New Roman" w:hAnsi="Times New Roman"/>
+          <w:b/>
+          <w:color w:val="000000"/>
+        </w:rPr>
+        <w:t>PostgreSQL / Vercel Storage</w:t>
+        <w:br/>
+      </w:r>
+      <w:r>
+        <w:rPr>
+          <w:rFonts w:ascii="Times New Roman" w:hAnsi="Times New Roman"/>
+          <w:color w:val="000000"/>
+        </w:rPr>
+      </w:r>
+    </w:p>
+    <w:p>
+      <w:pPr>
+        <w:spacing w:after="160" w:line="360" w:lineRule="auto"/>
+        <w:jc w:val="both"/>
+      </w:pPr>
+      <w:r>
+        <w:rPr>
+          <w:rFonts w:ascii="Times New Roman" w:hAnsi="Times New Roman"/>
+          <w:color w:val="000000"/>
+        </w:rPr>
+        <w:t>PostgreSQL hosted on cloud infrastructure is used as the production database after deployment. It securely stores application data in the cloud and supports multi-user access.</w:t>
+      </w:r>
+    </w:p>
+    <w:p>
+      <w:pPr>
+        <w:spacing w:before="280" w:after="120"/>
+      </w:pPr>
+      <w:r>
+        <w:rPr>
+          <w:rFonts w:ascii="Times New Roman" w:hAnsi="Times New Roman"/>
+          <w:b/>
+          <w:color w:val="000000"/>
+          <w:sz w:val="26"/>
+        </w:rPr>
+        <w:t>5. Export &amp; API Documentation Technologies</w:t>
+      </w:r>
+    </w:p>
+    <w:p>
+      <w:pPr>
+        <w:spacing w:after="160" w:line="360" w:lineRule="auto"/>
+        <w:jc w:val="both"/>
+      </w:pPr>
+      <w:r>
+        <w:rPr>
+          <w:rFonts w:ascii="Times New Roman" w:hAnsi="Times New Roman"/>
+          <w:b/>
+          <w:color w:val="000000"/>
+        </w:rPr>
+        <w:t>Swagger / OpenAPI</w:t>
+        <w:br/>
+      </w:r>
+      <w:r>
+        <w:rPr>
+          <w:rFonts w:ascii="Times New Roman" w:hAnsi="Times New Roman"/>
+          <w:color w:val="000000"/>
+        </w:rPr>
+      </w:r>
+    </w:p>
+    <w:p>
+      <w:pPr>
+        <w:spacing w:after="160" w:line="360" w:lineRule="auto"/>
+        <w:jc w:val="both"/>
+      </w:pPr>
+      <w:r>
+        <w:rPr>
+          <w:rFonts w:ascii="Times New Roman" w:hAnsi="Times New Roman"/>
+          <w:color w:val="000000"/>
+        </w:rPr>
+        <w:t>FastAPI automatically generates interactive OpenAPI Swagger documentation at `/docs`, enabling administrators to inspect and execute API endpoints directly from the browser.</w:t>
+      </w:r>
+    </w:p>
+    <w:p>
+      <w:pPr>
+        <w:spacing w:before="280" w:after="120"/>
+      </w:pPr>
+      <w:r>
+        <w:rPr>
+          <w:rFonts w:ascii="Times New Roman" w:hAnsi="Times New Roman"/>
+          <w:b/>
+          <w:color w:val="000000"/>
+          <w:sz w:val="26"/>
+        </w:rPr>
+        <w:t>6. Development Tools</w:t>
+      </w:r>
+    </w:p>
+    <w:p>
+      <w:pPr>
+        <w:spacing w:after="160" w:line="360" w:lineRule="auto"/>
+        <w:jc w:val="both"/>
+      </w:pPr>
+      <w:r>
+        <w:rPr>
+          <w:rFonts w:ascii="Times New Roman" w:hAnsi="Times New Roman"/>
+          <w:color w:val="000000"/>
+        </w:rPr>
+        <w:t>The following tools were used during the development of the project:</w:t>
+      </w:r>
+    </w:p>
+    <w:p>
+      <w:pPr>
+        <w:spacing w:after="160" w:line="360" w:lineRule="auto"/>
+        <w:jc w:val="both"/>
+      </w:pPr>
+      <w:r>
+        <w:rPr>
+          <w:rFonts w:ascii="Times New Roman" w:hAnsi="Times New Roman"/>
+          <w:color w:val="000000"/>
+        </w:rPr>
+        <w:t>Visual Studio Code (VS Code) – Used as the primary code editor.</w:t>
+      </w:r>
+    </w:p>
+    <w:p>
+      <w:pPr>
+        <w:spacing w:after="160" w:line="360" w:lineRule="auto"/>
+        <w:jc w:val="both"/>
+      </w:pPr>
+      <w:r>
+        <w:rPr>
+          <w:rFonts w:ascii="Times New Roman" w:hAnsi="Times New Roman"/>
+          <w:color w:val="000000"/>
+        </w:rPr>
+        <w:t>Git &amp; GitHub – Used for version control and source code management.</w:t>
+      </w:r>
+    </w:p>
+    <w:p>
+      <w:pPr>
+        <w:spacing w:after="160" w:line="360" w:lineRule="auto"/>
+        <w:jc w:val="both"/>
+      </w:pPr>
+      <w:r>
+        <w:rPr>
+          <w:rFonts w:ascii="Times New Roman" w:hAnsi="Times New Roman"/>
+          <w:color w:val="000000"/>
+        </w:rPr>
+        <w:t>Python Virtual Environment (venv) – Used to manage project dependencies.</w:t>
+      </w:r>
+    </w:p>
+    <w:p>
+      <w:pPr>
+        <w:spacing w:after="160" w:line="360" w:lineRule="auto"/>
+        <w:jc w:val="both"/>
+      </w:pPr>
+      <w:r>
+        <w:rPr>
+          <w:rFonts w:ascii="Times New Roman" w:hAnsi="Times New Roman"/>
+          <w:color w:val="000000"/>
+        </w:rPr>
+        <w:t>Requirements.txt – Maintains the list of Python packages required by the application.</w:t>
+      </w:r>
+    </w:p>
+    <w:p>
+      <w:pPr>
+        <w:spacing w:before="280" w:after="120"/>
+      </w:pPr>
+      <w:r>
+        <w:rPr>
+          <w:rFonts w:ascii="Times New Roman" w:hAnsi="Times New Roman"/>
+          <w:b/>
+          <w:color w:val="000000"/>
+          <w:sz w:val="26"/>
+        </w:rPr>
+        <w:t>7. Deployment Technologies</w:t>
+      </w:r>
+    </w:p>
+    <w:p>
+      <w:pPr>
+        <w:spacing w:after="160" w:line="360" w:lineRule="auto"/>
+        <w:jc w:val="both"/>
+      </w:pPr>
+      <w:r>
+        <w:rPr>
+          <w:rFonts w:ascii="Times New Roman" w:hAnsi="Times New Roman"/>
+          <w:color w:val="000000"/>
+        </w:rPr>
+        <w:t>The application is designed for both local execution and cloud deployment.</w:t>
+      </w:r>
+    </w:p>
+    <w:p>
+      <w:r>
+        <w:br w:type="page"/>
+      </w:r>
+    </w:p>
+    <w:p>
+      <w:pPr>
+        <w:spacing w:after="160" w:line="360" w:lineRule="auto"/>
+        <w:jc w:val="both"/>
+      </w:pPr>
+      <w:r>
+        <w:rPr>
+          <w:rFonts w:ascii="Times New Roman" w:hAnsi="Times New Roman"/>
+          <w:color w:val="000000"/>
+        </w:rPr>
+        <w:t>SQLite is used during local development.</w:t>
+      </w:r>
+    </w:p>
+    <w:p>
+      <w:pPr>
+        <w:spacing w:after="160" w:line="360" w:lineRule="auto"/>
+        <w:jc w:val="both"/>
+      </w:pPr>
+      <w:r>
+        <w:rPr>
+          <w:rFonts w:ascii="Times New Roman" w:hAnsi="Times New Roman"/>
+          <w:color w:val="000000"/>
+        </w:rPr>
+        <w:t>PostgreSQL / Vercel Storage is used as the production database.</w:t>
+      </w:r>
+    </w:p>
+    <w:p>
+      <w:pPr>
+        <w:spacing w:after="160" w:line="360" w:lineRule="auto"/>
+        <w:jc w:val="both"/>
+      </w:pPr>
+      <w:r>
+        <w:rPr>
+          <w:rFonts w:ascii="Times New Roman" w:hAnsi="Times New Roman"/>
+          <w:color w:val="000000"/>
+        </w:rPr>
+        <w:t>Vercel Cloud Platform is used to deploy the full-stack FastAPI and React application online.</w:t>
+      </w:r>
+    </w:p>
+    <w:p>
+      <w:pPr>
+        <w:spacing w:after="160" w:line="360" w:lineRule="auto"/>
+        <w:jc w:val="both"/>
+      </w:pPr>
+      <w:r>
+        <w:rPr>
+          <w:rFonts w:ascii="Times New Roman" w:hAnsi="Times New Roman"/>
+          <w:color w:val="000000"/>
+        </w:rPr>
+        <w:t>Environment variables are managed using the .env configuration file.</w:t>
+      </w:r>
+    </w:p>
+    <w:p>
+      <w:pPr>
+        <w:spacing w:before="280" w:after="280"/>
         <w:jc w:val="center"/>
       </w:pPr>
       <w:r>
         <w:drawing>
           <wp:inline xmlns:a="http://schemas.openxmlformats.org/drawingml/2006/main" xmlns:pic="http://schemas.openxmlformats.org/drawingml/2006/picture">
-            <wp:extent cx="5486400" cy="3317358"/>
+            <wp:extent cx="5303520" cy="3535680"/>
             <wp:docPr id="2" name="Picture 2"/>
             <wp:cNvGraphicFramePr>
               <a:graphicFrameLocks noChangeAspect="1"/>
@@ -1312,7 +1413,7 @@
               <a:graphicData uri="http://schemas.openxmlformats.org/drawingml/2006/picture">
                 <pic:pic>
                   <pic:nvPicPr>
-                    <pic:cNvPr id="0" name="workflow_diagram.png"/>
+                    <pic:cNvPr id="0" name="sample_flow_diagram.png"/>
                     <pic:cNvPicPr/>
                   </pic:nvPicPr>
                   <pic:blipFill>
@@ -1324,7 +1425,7 @@
                   <pic:spPr>
                     <a:xfrm>
                       <a:off x="0" y="0"/>
-                      <a:ext cx="5486400" cy="3317358"/>
+                      <a:ext cx="5303520" cy="3535680"/>
                     </a:xfrm>
                     <a:prstGeom prst="rect"/>
                   </pic:spPr>
@@ -1336,495 +1437,260 @@
       </w:r>
     </w:p>
     <w:p>
-      <w:pPr>
-        <w:spacing w:after="200"/>
-        <w:jc w:val="center"/>
-      </w:pPr>
       <w:r>
-        <w:rPr>
-          <w:rFonts w:ascii="Calibri" w:hAnsi="Calibri"/>
-          <w:i/>
-          <w:color w:val="555555"/>
-          <w:sz w:val="19"/>
-        </w:rPr>
-        <w:t>Figure 2: Agent Workflow — From Telemetry Ingestion to SOC Output</w:t>
+        <w:br w:type="page"/>
       </w:r>
     </w:p>
     <w:p>
       <w:pPr>
-        <w:spacing w:before="200" w:after="60"/>
+        <w:spacing w:before="360" w:after="240"/>
       </w:pPr>
       <w:r>
         <w:rPr>
-          <w:rFonts w:ascii="Calibri" w:hAnsi="Calibri"/>
+          <w:rFonts w:ascii="Times New Roman" w:hAnsi="Times New Roman"/>
           <w:b/>
-          <w:color w:val="005F8E"/>
-          <w:sz w:val="24"/>
+          <w:color w:val="000000"/>
+          <w:sz w:val="32"/>
         </w:rPr>
-        <w:t>Agent 1 — Telemetry Monitor &amp; Threat Detection Agent</w:t>
+        <w:t>Agents Used</w:t>
       </w:r>
     </w:p>
     <w:p>
       <w:pPr>
-        <w:spacing w:before="0" w:after="120" w:line="288" w:lineRule="auto"/>
+        <w:spacing w:after="160" w:line="360" w:lineRule="auto"/>
         <w:jc w:val="both"/>
       </w:pPr>
       <w:r>
         <w:rPr>
-          <w:rFonts w:ascii="Calibri" w:hAnsi="Calibri"/>
+          <w:rFonts w:ascii="Times New Roman" w:hAnsi="Times New Roman"/>
+          <w:color w:val="000000"/>
         </w:rPr>
-        <w:t>Continuously inspects incoming network log events, extracts IP details, computes a heuristic risk score (0–100), and assigns a MITRE ATT&amp;CK tactic/technique tag. Produces a structured SOC Incident payload persisted to the database and streamed live to the frontend dashboard.</w:t>
+        <w:t>The Agentic AI Based SentinelGPT System uses two intelligent software agents to automate the threat detection and response process. Each agent performs a specific task independently, making the system more accurate, efficient, and reliable. The Telemetry Monitor Agent is responsible for analyzing security events and calculating risk scores, while the Autonomous Quarantine Agent verifies that generated threat assessments satisfy all security rules before quarantine is finalized. These agents work together to produce a zero-latency defense workflow with minimal human intervention.</w:t>
       </w:r>
     </w:p>
     <w:p>
       <w:pPr>
-        <w:spacing w:before="200" w:after="60"/>
+        <w:spacing w:before="280" w:after="120"/>
       </w:pPr>
       <w:r>
         <w:rPr>
-          <w:rFonts w:ascii="Calibri" w:hAnsi="Calibri"/>
+          <w:rFonts w:ascii="Times New Roman" w:hAnsi="Times New Roman"/>
           <w:b/>
-          <w:color w:val="005F8E"/>
-          <w:sz w:val="24"/>
+          <w:color w:val="000000"/>
+          <w:sz w:val="26"/>
         </w:rPr>
-        <w:t>Agent 2 — Autonomous Quarantine &amp; Validation Agent</w:t>
+        <w:t>1. Telemetry Monitor Agent</w:t>
       </w:r>
     </w:p>
     <w:p>
       <w:pPr>
-        <w:spacing w:before="0" w:after="120" w:line="288" w:lineRule="auto"/>
+        <w:spacing w:after="160" w:line="360" w:lineRule="auto"/>
         <w:jc w:val="both"/>
       </w:pPr>
       <w:r>
         <w:rPr>
-          <w:rFonts w:ascii="Calibri" w:hAnsi="Calibri"/>
+          <w:rFonts w:ascii="Times New Roman" w:hAnsi="Times New Roman"/>
+          <w:color w:val="000000"/>
         </w:rPr>
-        <w:t>Evaluates every incident against the severity threshold (≥75 = Critical/High). Qualifying incidents are automatically written to the Blocked IPs table, quarantining the offending IP. The agent validates revoke requests and generates AI-driven remediation advice to prevent false-positive lockouts.</w:t>
+        <w:t>The Telemetry Monitor Agent is responsible for automatically evaluating threat telemetry based on network inputs provided by system monitoring feeds. It receives inputs such as source IP address, target URL, payload signature, request frequency, and attack type. The agent intelligently calculates risk scores (0-100) and maps threats to MITRE ATT&amp;CK techniques while following predefined security policies.</w:t>
       </w:r>
     </w:p>
     <w:p>
       <w:pPr>
-        <w:spacing w:before="320" w:after="100"/>
-        <w:pBdr>
-          <w:bottom w:val="single" w:sz="6" w:space="1" w:color="003366"/>
-        </w:pBdr>
+        <w:spacing w:before="280" w:after="120"/>
       </w:pPr>
       <w:r>
         <w:rPr>
-          <w:rFonts w:ascii="Calibri" w:hAnsi="Calibri"/>
+          <w:rFonts w:ascii="Times New Roman" w:hAnsi="Times New Roman"/>
           <w:b/>
-          <w:color w:val="002750"/>
-          <w:sz w:val="30"/>
+          <w:color w:val="000000"/>
+          <w:sz w:val="26"/>
         </w:rPr>
-        <w:t>7.  Algorithms Used</w:t>
+        <w:t>Responsibilities</w:t>
       </w:r>
     </w:p>
     <w:p>
       <w:pPr>
-        <w:pStyle w:val="ListBullet"/>
-        <w:spacing w:before="0" w:after="60" w:line="276" w:lineRule="auto"/>
-        <w:ind w:left="432"/>
+        <w:spacing w:after="160" w:line="360" w:lineRule="auto"/>
         <w:jc w:val="both"/>
       </w:pPr>
       <w:r>
         <w:rPr>
-          <w:rFonts w:ascii="Calibri" w:hAnsi="Calibri"/>
-          <w:b/>
-          <w:color w:val="002750"/>
+          <w:rFonts w:ascii="Times New Roman" w:hAnsi="Times New Roman"/>
+          <w:color w:val="000000"/>
         </w:rPr>
-        <w:t xml:space="preserve">Heuristic Threat Scoring: </w:t>
-      </w:r>
-      <w:r>
-        <w:rPr>
-          <w:rFonts w:ascii="Calibri" w:hAnsi="Calibri"/>
-        </w:rPr>
-        <w:t>Evaluates request velocity, payload anomaly patterns, and IP reputation to produce a normalized 0–100 risk score without relying solely on static signatures.</w:t>
+        <w:t>Reads network telemetry and security log events.</w:t>
       </w:r>
     </w:p>
     <w:p>
       <w:pPr>
-        <w:pStyle w:val="ListBullet"/>
-        <w:spacing w:before="0" w:after="60" w:line="276" w:lineRule="auto"/>
-        <w:ind w:left="432"/>
+        <w:spacing w:after="160" w:line="360" w:lineRule="auto"/>
         <w:jc w:val="both"/>
       </w:pPr>
       <w:r>
         <w:rPr>
-          <w:rFonts w:ascii="Calibri" w:hAnsi="Calibri"/>
-          <w:b/>
-          <w:color w:val="002750"/>
+          <w:rFonts w:ascii="Times New Roman" w:hAnsi="Times New Roman"/>
+          <w:color w:val="000000"/>
         </w:rPr>
-        <w:t xml:space="preserve">Severity Matrix Classifier: </w:t>
-      </w:r>
-      <w:r>
-        <w:rPr>
-          <w:rFonts w:ascii="Calibri" w:hAnsi="Calibri"/>
-        </w:rPr>
-        <w:t>Maps scores to Critical (≥75), High (60–74), Medium (40–59), and Low (&lt;40) priority tiers — driving the automated quarantine and alerting logic.</w:t>
+        <w:t>Calculates heuristic anomaly risk scores (0-100).</w:t>
       </w:r>
     </w:p>
     <w:p>
       <w:pPr>
-        <w:pStyle w:val="ListBullet"/>
-        <w:spacing w:before="0" w:after="60" w:line="276" w:lineRule="auto"/>
-        <w:ind w:left="432"/>
+        <w:spacing w:after="160" w:line="360" w:lineRule="auto"/>
         <w:jc w:val="both"/>
       </w:pPr>
       <w:r>
         <w:rPr>
-          <w:rFonts w:ascii="Calibri" w:hAnsi="Calibri"/>
-          <w:b/>
-          <w:color w:val="002750"/>
+          <w:rFonts w:ascii="Times New Roman" w:hAnsi="Times New Roman"/>
+          <w:color w:val="000000"/>
         </w:rPr>
-        <w:t xml:space="preserve">Velocity Rate Anomaly Detector: </w:t>
-      </w:r>
-      <w:r>
-        <w:rPr>
-          <w:rFonts w:ascii="Calibri" w:hAnsi="Calibri"/>
-        </w:rPr>
-        <w:t>Monitors burst traffic spikes per IP over sliding time windows to detect active DDoS attacks and port-scan sweeps.</w:t>
+        <w:t>Gives priority to critical vulnerability vectors.</w:t>
       </w:r>
     </w:p>
     <w:p>
       <w:pPr>
-        <w:spacing w:before="320" w:after="100"/>
-        <w:pBdr>
-          <w:bottom w:val="single" w:sz="6" w:space="1" w:color="003366"/>
-        </w:pBdr>
+        <w:spacing w:after="160" w:line="360" w:lineRule="auto"/>
+        <w:jc w:val="both"/>
       </w:pPr>
       <w:r>
         <w:rPr>
-          <w:rFonts w:ascii="Calibri" w:hAnsi="Calibri"/>
-          <w:b/>
-          <w:color w:val="002750"/>
-          <w:sz w:val="30"/>
+          <w:rFonts w:ascii="Times New Roman" w:hAnsi="Times New Roman"/>
+          <w:color w:val="000000"/>
         </w:rPr>
-        <w:t>8.  Implementation Phases</w:t>
+        <w:t>Maps threat behaviors to MITRE ATT&amp;CK tactics.</w:t>
       </w:r>
     </w:p>
     <w:p>
       <w:pPr>
-        <w:pStyle w:val="ListBullet"/>
-        <w:spacing w:before="0" w:after="60" w:line="276" w:lineRule="auto"/>
-        <w:ind w:left="432"/>
+        <w:spacing w:after="160" w:line="360" w:lineRule="auto"/>
         <w:jc w:val="both"/>
       </w:pPr>
       <w:r>
         <w:rPr>
-          <w:rFonts w:ascii="Calibri" w:hAnsi="Calibri"/>
-          <w:b/>
-          <w:color w:val="002750"/>
+          <w:rFonts w:ascii="Times New Roman" w:hAnsi="Times New Roman"/>
+          <w:color w:val="000000"/>
         </w:rPr>
-        <w:t>Phase 1 — Requirement Analysis:</w:t>
-      </w:r>
-      <w:r>
-        <w:rPr>
-          <w:rFonts w:ascii="Calibri" w:hAnsi="Calibri"/>
-        </w:rPr>
-        <w:t xml:space="preserve"> Identified SOC pain points, defined scoring metrics, mapped MITRE ATT&amp;CK coverage.</w:t>
+        <w:t>Prevents duplicate log processing.</w:t>
       </w:r>
     </w:p>
     <w:p>
       <w:pPr>
-        <w:pStyle w:val="ListBullet"/>
-        <w:spacing w:before="0" w:after="60" w:line="276" w:lineRule="auto"/>
-        <w:ind w:left="432"/>
+        <w:spacing w:after="160" w:line="360" w:lineRule="auto"/>
         <w:jc w:val="both"/>
       </w:pPr>
       <w:r>
         <w:rPr>
-          <w:rFonts w:ascii="Calibri" w:hAnsi="Calibri"/>
-          <w:b/>
-          <w:color w:val="002750"/>
+          <w:rFonts w:ascii="Times New Roman" w:hAnsi="Times New Roman"/>
+          <w:color w:val="000000"/>
         </w:rPr>
-        <w:t>Phase 2 — System Design:</w:t>
-      </w:r>
-      <w:r>
-        <w:rPr>
-          <w:rFonts w:ascii="Calibri" w:hAnsi="Calibri"/>
-        </w:rPr>
-        <w:t xml:space="preserve"> Architected decoupled React SPA + FastAPI serverless backend; finalized API contracts.</w:t>
+        <w:t>Generates complete SOC incident payloads automatically.</w:t>
       </w:r>
     </w:p>
     <w:p>
       <w:pPr>
-        <w:pStyle w:val="ListBullet"/>
-        <w:spacing w:before="0" w:after="60" w:line="276" w:lineRule="auto"/>
-        <w:ind w:left="432"/>
-        <w:jc w:val="both"/>
+        <w:spacing w:before="280" w:after="120"/>
       </w:pPr>
       <w:r>
         <w:rPr>
-          <w:rFonts w:ascii="Calibri" w:hAnsi="Calibri"/>
+          <w:rFonts w:ascii="Times New Roman" w:hAnsi="Times New Roman"/>
           <w:b/>
-          <w:color w:val="002750"/>
+          <w:color w:val="000000"/>
+          <w:sz w:val="26"/>
         </w:rPr>
-        <w:t>Phase 3 — Database Schema:</w:t>
-      </w:r>
-      <w:r>
-        <w:rPr>
-          <w:rFonts w:ascii="Calibri" w:hAnsi="Calibri"/>
-        </w:rPr>
-        <w:t xml:space="preserve"> Designed ORM models — Users, SOC Incidents, Perimeter Logs, Blocked IPs.</w:t>
+        <w:t>2. Autonomous Quarantine Agent</w:t>
       </w:r>
     </w:p>
     <w:p>
       <w:pPr>
-        <w:pStyle w:val="ListBullet"/>
-        <w:spacing w:before="0" w:after="60" w:line="276" w:lineRule="auto"/>
-        <w:ind w:left="432"/>
+        <w:spacing w:after="160" w:line="360" w:lineRule="auto"/>
         <w:jc w:val="both"/>
       </w:pPr>
       <w:r>
         <w:rPr>
-          <w:rFonts w:ascii="Calibri" w:hAnsi="Calibri"/>
-          <w:b/>
-          <w:color w:val="002750"/>
+          <w:rFonts w:ascii="Times New Roman" w:hAnsi="Times New Roman"/>
+          <w:color w:val="000000"/>
         </w:rPr>
-        <w:t>Phase 4 — Frontend Development:</w:t>
-      </w:r>
-      <w:r>
-        <w:rPr>
-          <w:rFonts w:ascii="Calibri" w:hAnsi="Calibri"/>
-        </w:rPr>
-        <w:t xml:space="preserve"> Built glassmorphic components — ThreatChart, RiskGauge, BlockedIPs, Login, Dashboard.</w:t>
+        <w:t>The Autonomous Quarantine Agent verifies threat assessments generated by the Telemetry Monitor Agent. It checks whether all security constraints have been satisfied before an IP quarantine is finalized. If any high-risk threat (score &gt;= 75) is detected, the agent automatically isolates the IP into the quarantine table.</w:t>
       </w:r>
     </w:p>
     <w:p>
       <w:pPr>
-        <w:pStyle w:val="ListBullet"/>
-        <w:spacing w:before="0" w:after="60" w:line="276" w:lineRule="auto"/>
-        <w:ind w:left="432"/>
-        <w:jc w:val="both"/>
+        <w:spacing w:before="280" w:after="120"/>
       </w:pPr>
       <w:r>
         <w:rPr>
-          <w:rFonts w:ascii="Calibri" w:hAnsi="Calibri"/>
+          <w:rFonts w:ascii="Times New Roman" w:hAnsi="Times New Roman"/>
           <w:b/>
-          <w:color w:val="002750"/>
+          <w:color w:val="000000"/>
+          <w:sz w:val="26"/>
         </w:rPr>
-        <w:t>Phase 5 — Backend &amp; JWT Auth:</w:t>
-      </w:r>
-      <w:r>
-        <w:rPr>
-          <w:rFonts w:ascii="Calibri" w:hAnsi="Calibri"/>
-        </w:rPr>
-        <w:t xml:space="preserve"> Implemented REST routes (/api/snapshot, /api/block_ip, /api/sim_threat) with HS256 JWT.</w:t>
+        <w:t>Responsibilities</w:t>
       </w:r>
     </w:p>
     <w:p>
       <w:pPr>
-        <w:pStyle w:val="ListBullet"/>
-        <w:spacing w:before="0" w:after="60" w:line="276" w:lineRule="auto"/>
-        <w:ind w:left="432"/>
+        <w:spacing w:after="160" w:line="360" w:lineRule="auto"/>
         <w:jc w:val="both"/>
       </w:pPr>
       <w:r>
         <w:rPr>
-          <w:rFonts w:ascii="Calibri" w:hAnsi="Calibri"/>
-          <w:b/>
-          <w:color w:val="002750"/>
+          <w:rFonts w:ascii="Times New Roman" w:hAnsi="Times New Roman"/>
+          <w:color w:val="000000"/>
         </w:rPr>
-        <w:t>Phase 6 — Agentic AI Dev:</w:t>
-      </w:r>
-      <w:r>
-        <w:rPr>
-          <w:rFonts w:ascii="Calibri" w:hAnsi="Calibri"/>
-        </w:rPr>
-        <w:t xml:space="preserve"> Programmed Telemetry Monitor Agent and Autonomous Quarantine Agent workflows.</w:t>
+        <w:t>Validates priority scores for each security incident.</w:t>
       </w:r>
     </w:p>
     <w:p>
       <w:pPr>
-        <w:pStyle w:val="ListBullet"/>
-        <w:spacing w:before="0" w:after="60" w:line="276" w:lineRule="auto"/>
-        <w:ind w:left="432"/>
+        <w:spacing w:after="160" w:line="360" w:lineRule="auto"/>
         <w:jc w:val="both"/>
       </w:pPr>
       <w:r>
         <w:rPr>
-          <w:rFonts w:ascii="Calibri" w:hAnsi="Calibri"/>
-          <w:b/>
-          <w:color w:val="002750"/>
+          <w:rFonts w:ascii="Times New Roman" w:hAnsi="Times New Roman"/>
+          <w:color w:val="000000"/>
         </w:rPr>
-        <w:t>Phase 7 — Integration Testing:</w:t>
-      </w:r>
-      <w:r>
-        <w:rPr>
-          <w:rFonts w:ascii="Calibri" w:hAnsi="Calibri"/>
-        </w:rPr>
-        <w:t xml:space="preserve"> Simulated threat injection to verify scoring accuracy, quarantine triggers, and revocation.</w:t>
+        <w:t>Enforces automated IP firewall quarantine.</w:t>
       </w:r>
     </w:p>
     <w:p>
       <w:pPr>
-        <w:pStyle w:val="ListBullet"/>
-        <w:spacing w:before="0" w:after="60" w:line="276" w:lineRule="auto"/>
-        <w:ind w:left="432"/>
+        <w:spacing w:after="160" w:line="360" w:lineRule="auto"/>
         <w:jc w:val="both"/>
       </w:pPr>
       <w:r>
         <w:rPr>
-          <w:rFonts w:ascii="Calibri" w:hAnsi="Calibri"/>
-          <w:b/>
-          <w:color w:val="002750"/>
+          <w:rFonts w:ascii="Times New Roman" w:hAnsi="Times New Roman"/>
+          <w:color w:val="000000"/>
         </w:rPr>
-        <w:t>Phase 8 — Cloud Deployment:</w:t>
-      </w:r>
-      <w:r>
-        <w:rPr>
-          <w:rFonts w:ascii="Calibri" w:hAnsi="Calibri"/>
-        </w:rPr>
-        <w:t xml:space="preserve"> Deployed full-stack to Vercel Serverless; verified Swagger docs in production.</w:t>
+        <w:t>Verifies quarantine revocation requests.</w:t>
       </w:r>
     </w:p>
     <w:p>
       <w:pPr>
-        <w:spacing w:before="320" w:after="100"/>
-        <w:pBdr>
-          <w:bottom w:val="single" w:sz="6" w:space="1" w:color="003366"/>
-        </w:pBdr>
+        <w:spacing w:after="160" w:line="360" w:lineRule="auto"/>
+        <w:jc w:val="both"/>
       </w:pPr>
       <w:r>
         <w:rPr>
-          <w:rFonts w:ascii="Calibri" w:hAnsi="Calibri"/>
-          <w:b/>
-          <w:color w:val="002750"/>
-          <w:sz w:val="30"/>
+          <w:rFonts w:ascii="Times New Roman" w:hAnsi="Times New Roman"/>
+          <w:color w:val="000000"/>
         </w:rPr>
-        <w:t>9.  Applications</w:t>
+        <w:t>Validates user authorization and JWT tokens.</w:t>
       </w:r>
     </w:p>
     <w:p>
       <w:pPr>
-        <w:pStyle w:val="ListBullet"/>
-        <w:spacing w:before="0" w:after="60" w:line="276" w:lineRule="auto"/>
-        <w:ind w:left="432"/>
+        <w:spacing w:after="160" w:line="360" w:lineRule="auto"/>
         <w:jc w:val="both"/>
       </w:pPr>
       <w:r>
         <w:rPr>
-          <w:rFonts w:ascii="Calibri" w:hAnsi="Calibri"/>
-          <w:b/>
-          <w:color w:val="002750"/>
+          <w:rFonts w:ascii="Times New Roman" w:hAnsi="Times New Roman"/>
+          <w:color w:val="000000"/>
         </w:rPr>
-        <w:t>Enterprise SOC Operations:</w:t>
-      </w:r>
-      <w:r>
-        <w:rPr>
-          <w:rFonts w:ascii="Calibri" w:hAnsi="Calibri"/>
-        </w:rPr>
-        <w:t xml:space="preserve"> Continuous perimeter monitoring and automated response for dedicated security teams.</w:t>
-      </w:r>
-    </w:p>
-    <w:p>
-      <w:pPr>
-        <w:pStyle w:val="ListBullet"/>
-        <w:spacing w:before="0" w:after="60" w:line="276" w:lineRule="auto"/>
-        <w:ind w:left="432"/>
-        <w:jc w:val="both"/>
-      </w:pPr>
-      <w:r>
-        <w:rPr>
-          <w:rFonts w:ascii="Calibri" w:hAnsi="Calibri"/>
-          <w:b/>
-          <w:color w:val="002750"/>
-        </w:rPr>
-        <w:t>Financial Institutions:</w:t>
-      </w:r>
-      <w:r>
-        <w:rPr>
-          <w:rFonts w:ascii="Calibri" w:hAnsi="Calibri"/>
-        </w:rPr>
-        <w:t xml:space="preserve"> Protects banking portals from credential stuffing, brute-force, and fraud attempts.</w:t>
-      </w:r>
-    </w:p>
-    <w:p>
-      <w:pPr>
-        <w:pStyle w:val="ListBullet"/>
-        <w:spacing w:before="0" w:after="60" w:line="276" w:lineRule="auto"/>
-        <w:ind w:left="432"/>
-        <w:jc w:val="both"/>
-      </w:pPr>
-      <w:r>
-        <w:rPr>
-          <w:rFonts w:ascii="Calibri" w:hAnsi="Calibri"/>
-          <w:b/>
-          <w:color w:val="002750"/>
-        </w:rPr>
-        <w:t>Cloud Service Providers:</w:t>
-      </w:r>
-      <w:r>
-        <w:rPr>
-          <w:rFonts w:ascii="Calibri" w:hAnsi="Calibri"/>
-        </w:rPr>
-        <w:t xml:space="preserve"> Safeguards serverless APIs and microservices from unauthorized probes and exploits.</w:t>
-      </w:r>
-    </w:p>
-    <w:p>
-      <w:pPr>
-        <w:pStyle w:val="ListBullet"/>
-        <w:spacing w:before="0" w:after="60" w:line="276" w:lineRule="auto"/>
-        <w:ind w:left="432"/>
-        <w:jc w:val="both"/>
-      </w:pPr>
-      <w:r>
-        <w:rPr>
-          <w:rFonts w:ascii="Calibri" w:hAnsi="Calibri"/>
-          <w:b/>
-          <w:color w:val="002750"/>
-        </w:rPr>
-        <w:t>Healthcare Networks:</w:t>
-      </w:r>
-      <w:r>
-        <w:rPr>
-          <w:rFonts w:ascii="Calibri" w:hAnsi="Calibri"/>
-        </w:rPr>
-        <w:t xml:space="preserve"> Secures patient data endpoints against ransomware and malware payload injection.</w:t>
-      </w:r>
-    </w:p>
-    <w:p>
-      <w:pPr>
-        <w:pStyle w:val="ListBullet"/>
-        <w:spacing w:before="0" w:after="60" w:line="276" w:lineRule="auto"/>
-        <w:ind w:left="432"/>
-        <w:jc w:val="both"/>
-      </w:pPr>
-      <w:r>
-        <w:rPr>
-          <w:rFonts w:ascii="Calibri" w:hAnsi="Calibri"/>
-          <w:b/>
-          <w:color w:val="002750"/>
-        </w:rPr>
-        <w:t>E-Commerce Platforms:</w:t>
-      </w:r>
-      <w:r>
-        <w:rPr>
-          <w:rFonts w:ascii="Calibri" w:hAnsi="Calibri"/>
-        </w:rPr>
-        <w:t xml:space="preserve"> Prevents DDoS and SQL injection attacks during high-traffic sales events.</w:t>
-      </w:r>
-    </w:p>
-    <w:p>
-      <w:pPr>
-        <w:pStyle w:val="ListBullet"/>
-        <w:spacing w:before="0" w:after="60" w:line="276" w:lineRule="auto"/>
-        <w:ind w:left="432"/>
-        <w:jc w:val="both"/>
-      </w:pPr>
-      <w:r>
-        <w:rPr>
-          <w:rFonts w:ascii="Calibri" w:hAnsi="Calibri"/>
-          <w:b/>
-          <w:color w:val="002750"/>
-        </w:rPr>
-        <w:t>Academic Institutions:</w:t>
-      </w:r>
-      <w:r>
-        <w:rPr>
-          <w:rFonts w:ascii="Calibri" w:hAnsi="Calibri"/>
-        </w:rPr>
-        <w:t xml:space="preserve"> Monitors campus networks and prevents faculty/student account hijacking.</w:t>
+        <w:t>Approves quarantine actions only after successful validation.</w:t>
       </w:r>
     </w:p>
     <w:p>
@@ -1834,977 +1700,1002 @@
     </w:p>
     <w:p>
       <w:pPr>
-        <w:spacing w:before="320" w:after="100"/>
-        <w:pBdr>
-          <w:bottom w:val="single" w:sz="6" w:space="1" w:color="003366"/>
-        </w:pBdr>
+        <w:spacing w:before="360" w:after="240"/>
       </w:pPr>
       <w:r>
         <w:rPr>
-          <w:rFonts w:ascii="Calibri" w:hAnsi="Calibri"/>
+          <w:rFonts w:ascii="Times New Roman" w:hAnsi="Times New Roman"/>
           <w:b/>
-          <w:color w:val="002750"/>
-          <w:sz w:val="30"/>
+          <w:color w:val="000000"/>
+          <w:sz w:val="32"/>
         </w:rPr>
-        <w:t>10.  User Interface Screenshots</w:t>
+        <w:t>Working of Agents</w:t>
       </w:r>
     </w:p>
     <w:p>
       <w:pPr>
-        <w:spacing w:before="0" w:after="120" w:line="288" w:lineRule="auto"/>
+        <w:spacing w:after="160" w:line="360" w:lineRule="auto"/>
+        <w:jc w:val="both"/>
       </w:pPr>
       <w:r>
         <w:rPr>
-          <w:rFonts w:ascii="Calibri" w:hAnsi="Calibri"/>
+          <w:rFonts w:ascii="Times New Roman" w:hAnsi="Times New Roman"/>
+          <w:color w:val="000000"/>
         </w:rPr>
-        <w:t>The following figures depict the live operational screens of the SentinelGPT system:</w:t>
-      </w:r>
-    </w:p>
-    <w:tbl>
-      <w:tblPr>
-        <w:tblW w:type="auto" w:w="0"/>
-        <w:jc w:val="center"/>
-        <w:tblLook w:firstColumn="1" w:firstRow="1" w:lastColumn="0" w:lastRow="0" w:noHBand="0" w:noVBand="1" w:val="04A0"/>
-      </w:tblPr>
-      <w:tblGrid>
-        <w:gridCol w:w="4464"/>
-        <w:gridCol w:w="4464"/>
-      </w:tblGrid>
-      <w:tr>
-        <w:tc>
-          <w:tcPr>
-            <w:tcW w:type="dxa" w:w="4464"/>
-            <w:tcBorders>
-              <w:top w:val="none"/>
-              <w:bottom w:val="none"/>
-              <w:left w:val="none"/>
-              <w:right w:val="none"/>
-            </w:tcBorders>
-          </w:tcPr>
-          <w:p>
-            <w:pPr>
-              <w:spacing w:before="120" w:after="40"/>
-              <w:jc w:val="center"/>
-            </w:pPr>
-            <w:r>
-              <w:drawing>
-                <wp:inline xmlns:a="http://schemas.openxmlformats.org/drawingml/2006/main" xmlns:pic="http://schemas.openxmlformats.org/drawingml/2006/picture">
-                  <wp:extent cx="2697480" cy="1281303"/>
-                  <wp:docPr id="3" name="Picture 3"/>
-                  <wp:cNvGraphicFramePr>
-                    <a:graphicFrameLocks noChangeAspect="1"/>
-                  </wp:cNvGraphicFramePr>
-                  <a:graphic>
-                    <a:graphicData uri="http://schemas.openxmlformats.org/drawingml/2006/picture">
-                      <pic:pic>
-                        <pic:nvPicPr>
-                          <pic:cNvPr id="0" name="dashboard.png"/>
-                          <pic:cNvPicPr/>
-                        </pic:nvPicPr>
-                        <pic:blipFill>
-                          <a:blip r:embed="rId11"/>
-                          <a:stretch>
-                            <a:fillRect/>
-                          </a:stretch>
-                        </pic:blipFill>
-                        <pic:spPr>
-                          <a:xfrm>
-                            <a:off x="0" y="0"/>
-                            <a:ext cx="2697480" cy="1281303"/>
-                          </a:xfrm>
-                          <a:prstGeom prst="rect"/>
-                        </pic:spPr>
-                      </pic:pic>
-                    </a:graphicData>
-                  </a:graphic>
-                </wp:inline>
-              </w:drawing>
-            </w:r>
-          </w:p>
-        </w:tc>
-        <w:tc>
-          <w:tcPr>
-            <w:tcW w:type="dxa" w:w="4464"/>
-            <w:tcBorders>
-              <w:top w:val="none"/>
-              <w:bottom w:val="none"/>
-              <w:left w:val="none"/>
-              <w:right w:val="none"/>
-            </w:tcBorders>
-          </w:tcPr>
-          <w:p>
-            <w:pPr>
-              <w:spacing w:before="120" w:after="40"/>
-              <w:jc w:val="center"/>
-            </w:pPr>
-            <w:r>
-              <w:drawing>
-                <wp:inline xmlns:a="http://schemas.openxmlformats.org/drawingml/2006/main" xmlns:pic="http://schemas.openxmlformats.org/drawingml/2006/picture">
-                  <wp:extent cx="2697480" cy="1281303"/>
-                  <wp:docPr id="4" name="Picture 4"/>
-                  <wp:cNvGraphicFramePr>
-                    <a:graphicFrameLocks noChangeAspect="1"/>
-                  </wp:cNvGraphicFramePr>
-                  <a:graphic>
-                    <a:graphicData uri="http://schemas.openxmlformats.org/drawingml/2006/picture">
-                      <pic:pic>
-                        <pic:nvPicPr>
-                          <pic:cNvPr id="0" name="login_page.png"/>
-                          <pic:cNvPicPr/>
-                        </pic:nvPicPr>
-                        <pic:blipFill>
-                          <a:blip r:embed="rId12"/>
-                          <a:stretch>
-                            <a:fillRect/>
-                          </a:stretch>
-                        </pic:blipFill>
-                        <pic:spPr>
-                          <a:xfrm>
-                            <a:off x="0" y="0"/>
-                            <a:ext cx="2697480" cy="1281303"/>
-                          </a:xfrm>
-                          <a:prstGeom prst="rect"/>
-                        </pic:spPr>
-                      </pic:pic>
-                    </a:graphicData>
-                  </a:graphic>
-                </wp:inline>
-              </w:drawing>
-            </w:r>
-          </w:p>
-        </w:tc>
-      </w:tr>
-      <w:tr>
-        <w:tc>
-          <w:tcPr>
-            <w:tcW w:type="dxa" w:w="4464"/>
-            <w:tcBorders>
-              <w:top w:val="none"/>
-              <w:bottom w:val="none"/>
-              <w:left w:val="none"/>
-              <w:right w:val="none"/>
-            </w:tcBorders>
-          </w:tcPr>
-          <w:p>
-            <w:pPr>
-              <w:spacing w:after="160"/>
-              <w:jc w:val="center"/>
-            </w:pPr>
-            <w:r>
-              <w:rPr>
-                <w:i/>
-                <w:color w:val="555555"/>
-                <w:sz w:val="19"/>
-              </w:rPr>
-              <w:t>Fig 3: SentinelGPT SOC Operations Dashboard</w:t>
-            </w:r>
-          </w:p>
-        </w:tc>
-        <w:tc>
-          <w:tcPr>
-            <w:tcW w:type="dxa" w:w="4464"/>
-            <w:tcBorders>
-              <w:top w:val="none"/>
-              <w:bottom w:val="none"/>
-              <w:left w:val="none"/>
-              <w:right w:val="none"/>
-            </w:tcBorders>
-          </w:tcPr>
-          <w:p>
-            <w:pPr>
-              <w:spacing w:after="160"/>
-              <w:jc w:val="center"/>
-            </w:pPr>
-            <w:r>
-              <w:rPr>
-                <w:i/>
-                <w:color w:val="555555"/>
-                <w:sz w:val="19"/>
-              </w:rPr>
-              <w:t>Fig 4: Operator Authentication Portal</w:t>
-            </w:r>
-          </w:p>
-        </w:tc>
-      </w:tr>
-    </w:tbl>
-    <w:tbl>
-      <w:tblPr>
-        <w:tblW w:type="auto" w:w="0"/>
-        <w:jc w:val="center"/>
-        <w:tblLook w:firstColumn="1" w:firstRow="1" w:lastColumn="0" w:lastRow="0" w:noHBand="0" w:noVBand="1" w:val="04A0"/>
-      </w:tblPr>
-      <w:tblGrid>
-        <w:gridCol w:w="4464"/>
-        <w:gridCol w:w="4464"/>
-      </w:tblGrid>
-      <w:tr>
-        <w:tc>
-          <w:tcPr>
-            <w:tcW w:type="dxa" w:w="4464"/>
-            <w:tcBorders>
-              <w:top w:val="none"/>
-              <w:bottom w:val="none"/>
-              <w:left w:val="none"/>
-              <w:right w:val="none"/>
-            </w:tcBorders>
-          </w:tcPr>
-          <w:p>
-            <w:pPr>
-              <w:spacing w:before="120" w:after="40"/>
-              <w:jc w:val="center"/>
-            </w:pPr>
-            <w:r>
-              <w:drawing>
-                <wp:inline xmlns:a="http://schemas.openxmlformats.org/drawingml/2006/main" xmlns:pic="http://schemas.openxmlformats.org/drawingml/2006/picture">
-                  <wp:extent cx="2697480" cy="1281303"/>
-                  <wp:docPr id="5" name="Picture 5"/>
-                  <wp:cNvGraphicFramePr>
-                    <a:graphicFrameLocks noChangeAspect="1"/>
-                  </wp:cNvGraphicFramePr>
-                  <a:graphic>
-                    <a:graphicData uri="http://schemas.openxmlformats.org/drawingml/2006/picture">
-                      <pic:pic>
-                        <pic:nvPicPr>
-                          <pic:cNvPr id="0" name="ai_chat.png"/>
-                          <pic:cNvPicPr/>
-                        </pic:nvPicPr>
-                        <pic:blipFill>
-                          <a:blip r:embed="rId13"/>
-                          <a:stretch>
-                            <a:fillRect/>
-                          </a:stretch>
-                        </pic:blipFill>
-                        <pic:spPr>
-                          <a:xfrm>
-                            <a:off x="0" y="0"/>
-                            <a:ext cx="2697480" cy="1281303"/>
-                          </a:xfrm>
-                          <a:prstGeom prst="rect"/>
-                        </pic:spPr>
-                      </pic:pic>
-                    </a:graphicData>
-                  </a:graphic>
-                </wp:inline>
-              </w:drawing>
-            </w:r>
-          </w:p>
-        </w:tc>
-        <w:tc>
-          <w:tcPr>
-            <w:tcW w:type="dxa" w:w="4464"/>
-            <w:tcBorders>
-              <w:top w:val="none"/>
-              <w:bottom w:val="none"/>
-              <w:left w:val="none"/>
-              <w:right w:val="none"/>
-            </w:tcBorders>
-          </w:tcPr>
-          <w:p>
-            <w:pPr>
-              <w:spacing w:before="120" w:after="40"/>
-              <w:jc w:val="center"/>
-            </w:pPr>
-            <w:r>
-              <w:drawing>
-                <wp:inline xmlns:a="http://schemas.openxmlformats.org/drawingml/2006/main" xmlns:pic="http://schemas.openxmlformats.org/drawingml/2006/picture">
-                  <wp:extent cx="2697480" cy="1281303"/>
-                  <wp:docPr id="6" name="Picture 6"/>
-                  <wp:cNvGraphicFramePr>
-                    <a:graphicFrameLocks noChangeAspect="1"/>
-                  </wp:cNvGraphicFramePr>
-                  <a:graphic>
-                    <a:graphicData uri="http://schemas.openxmlformats.org/drawingml/2006/picture">
-                      <pic:pic>
-                        <pic:nvPicPr>
-                          <pic:cNvPr id="0" name="file_scanner.png"/>
-                          <pic:cNvPicPr/>
-                        </pic:nvPicPr>
-                        <pic:blipFill>
-                          <a:blip r:embed="rId14"/>
-                          <a:stretch>
-                            <a:fillRect/>
-                          </a:stretch>
-                        </pic:blipFill>
-                        <pic:spPr>
-                          <a:xfrm>
-                            <a:off x="0" y="0"/>
-                            <a:ext cx="2697480" cy="1281303"/>
-                          </a:xfrm>
-                          <a:prstGeom prst="rect"/>
-                        </pic:spPr>
-                      </pic:pic>
-                    </a:graphicData>
-                  </a:graphic>
-                </wp:inline>
-              </w:drawing>
-            </w:r>
-          </w:p>
-        </w:tc>
-      </w:tr>
-      <w:tr>
-        <w:tc>
-          <w:tcPr>
-            <w:tcW w:type="dxa" w:w="4464"/>
-            <w:tcBorders>
-              <w:top w:val="none"/>
-              <w:bottom w:val="none"/>
-              <w:left w:val="none"/>
-              <w:right w:val="none"/>
-            </w:tcBorders>
-          </w:tcPr>
-          <w:p>
-            <w:pPr>
-              <w:spacing w:after="160"/>
-              <w:jc w:val="center"/>
-            </w:pPr>
-            <w:r>
-              <w:rPr>
-                <w:i/>
-                <w:color w:val="555555"/>
-                <w:sz w:val="19"/>
-              </w:rPr>
-              <w:t>Fig 5: AI Threat Triage Assistant</w:t>
-            </w:r>
-          </w:p>
-        </w:tc>
-        <w:tc>
-          <w:tcPr>
-            <w:tcW w:type="dxa" w:w="4464"/>
-            <w:tcBorders>
-              <w:top w:val="none"/>
-              <w:bottom w:val="none"/>
-              <w:left w:val="none"/>
-              <w:right w:val="none"/>
-            </w:tcBorders>
-          </w:tcPr>
-          <w:p>
-            <w:pPr>
-              <w:spacing w:after="160"/>
-              <w:jc w:val="center"/>
-            </w:pPr>
-            <w:r>
-              <w:rPr>
-                <w:i/>
-                <w:color w:val="555555"/>
-                <w:sz w:val="19"/>
-              </w:rPr>
-              <w:t>Fig 6: Heuristic Payload File Scanner</w:t>
-            </w:r>
-          </w:p>
-        </w:tc>
-      </w:tr>
-    </w:tbl>
-    <w:p>
-      <w:pPr>
-        <w:spacing w:before="320" w:after="100"/>
-        <w:pBdr>
-          <w:bottom w:val="single" w:sz="6" w:space="1" w:color="003366"/>
-        </w:pBdr>
-      </w:pPr>
-      <w:r>
-        <w:rPr>
-          <w:rFonts w:ascii="Calibri" w:hAnsi="Calibri"/>
-          <w:b/>
-          <w:color w:val="002750"/>
-          <w:sz w:val="30"/>
-        </w:rPr>
-        <w:t>11.  REST API Endpoints</w:t>
+        <w:t>The system ingests network telemetry through web API endpoints or monitoring scripts. The Telemetry Monitor Agent creates threat assessments automatically based on heuristic rules. After generation, the Autonomous Quarantine Agent verifies the incident by checking all security constraints. If validation confirms a critical threat (score &gt;= 75), the offending IP is stored in the Blocked IPs table and displayed on the dashboard. Otherwise, the threat status remains monitored until further activity is detected.</w:t>
       </w:r>
     </w:p>
     <w:p>
       <w:pPr>
-        <w:spacing w:before="0" w:after="120" w:line="288" w:lineRule="auto"/>
-        <w:jc w:val="both"/>
+        <w:spacing w:before="280" w:after="120"/>
       </w:pPr>
       <w:r>
         <w:rPr>
-          <w:rFonts w:ascii="Calibri" w:hAnsi="Calibri"/>
+          <w:rFonts w:ascii="Times New Roman" w:hAnsi="Times New Roman"/>
+          <w:b/>
+          <w:color w:val="000000"/>
+          <w:sz w:val="26"/>
         </w:rPr>
-        <w:t>The backend exposes the following endpoints for telemetry, quarantine control, and authentication:</w:t>
-      </w:r>
-    </w:p>
-    <w:tbl>
-      <w:tblPr>
-        <w:tblStyle w:val="TableGrid"/>
-        <w:tblW w:type="auto" w:w="0"/>
-        <w:jc w:val="center"/>
-        <w:tblLook w:firstColumn="1" w:firstRow="1" w:lastColumn="0" w:lastRow="0" w:noHBand="0" w:noVBand="1" w:val="04A0"/>
-      </w:tblPr>
-      <w:tblGrid>
-        <w:gridCol w:w="2976"/>
-        <w:gridCol w:w="2976"/>
-        <w:gridCol w:w="2976"/>
-      </w:tblGrid>
-      <w:tr>
-        <w:tc>
-          <w:tcPr>
-            <w:tcW w:type="dxa" w:w="2976"/>
-            <w:shd w:val="clear" w:color="auto" w:fill="003366"/>
-          </w:tcPr>
-          <w:p>
-            <w:r>
-              <w:rPr>
-                <w:rFonts w:ascii="Calibri" w:hAnsi="Calibri"/>
-                <w:b/>
-                <w:color w:val="FFFFFF"/>
-              </w:rPr>
-              <w:t>Endpoint</w:t>
-            </w:r>
-          </w:p>
-        </w:tc>
-        <w:tc>
-          <w:tcPr>
-            <w:tcW w:type="dxa" w:w="2976"/>
-            <w:shd w:val="clear" w:color="auto" w:fill="003366"/>
-          </w:tcPr>
-          <w:p>
-            <w:r>
-              <w:rPr>
-                <w:rFonts w:ascii="Calibri" w:hAnsi="Calibri"/>
-                <w:b/>
-                <w:color w:val="FFFFFF"/>
-              </w:rPr>
-              <w:t>Method</w:t>
-            </w:r>
-          </w:p>
-        </w:tc>
-        <w:tc>
-          <w:tcPr>
-            <w:tcW w:type="dxa" w:w="2976"/>
-            <w:shd w:val="clear" w:color="auto" w:fill="003366"/>
-          </w:tcPr>
-          <w:p>
-            <w:r>
-              <w:rPr>
-                <w:rFonts w:ascii="Calibri" w:hAnsi="Calibri"/>
-                <w:b/>
-                <w:color w:val="FFFFFF"/>
-              </w:rPr>
-              <w:t>Description</w:t>
-            </w:r>
-          </w:p>
-        </w:tc>
-      </w:tr>
-      <w:tr>
-        <w:tc>
-          <w:tcPr>
-            <w:tcW w:type="dxa" w:w="2976"/>
-            <w:shd w:val="clear" w:color="auto" w:fill="EEF4FB"/>
-          </w:tcPr>
-          <w:p>
-            <w:r>
-              <w:rPr>
-                <w:rFonts w:ascii="Calibri" w:hAnsi="Calibri"/>
-              </w:rPr>
-              <w:t>/api/login</w:t>
-            </w:r>
-          </w:p>
-        </w:tc>
-        <w:tc>
-          <w:tcPr>
-            <w:tcW w:type="dxa" w:w="2976"/>
-            <w:shd w:val="clear" w:color="auto" w:fill="EEF4FB"/>
-          </w:tcPr>
-          <w:p>
-            <w:r>
-              <w:rPr>
-                <w:rFonts w:ascii="Calibri" w:hAnsi="Calibri"/>
-              </w:rPr>
-              <w:t>POST</w:t>
-            </w:r>
-          </w:p>
-        </w:tc>
-        <w:tc>
-          <w:tcPr>
-            <w:tcW w:type="dxa" w:w="2976"/>
-            <w:shd w:val="clear" w:color="auto" w:fill="EEF4FB"/>
-          </w:tcPr>
-          <w:p>
-            <w:r>
-              <w:rPr>
-                <w:rFonts w:ascii="Calibri" w:hAnsi="Calibri"/>
-              </w:rPr>
-              <w:t>Authenticates operator; returns 8-hour JWT token</w:t>
-            </w:r>
-          </w:p>
-        </w:tc>
-      </w:tr>
-      <w:tr>
-        <w:tc>
-          <w:tcPr>
-            <w:tcW w:type="dxa" w:w="2976"/>
-          </w:tcPr>
-          <w:p>
-            <w:r>
-              <w:rPr>
-                <w:rFonts w:ascii="Calibri" w:hAnsi="Calibri"/>
-              </w:rPr>
-              <w:t>/api/register</w:t>
-            </w:r>
-          </w:p>
-        </w:tc>
-        <w:tc>
-          <w:tcPr>
-            <w:tcW w:type="dxa" w:w="2976"/>
-          </w:tcPr>
-          <w:p>
-            <w:r>
-              <w:rPr>
-                <w:rFonts w:ascii="Calibri" w:hAnsi="Calibri"/>
-              </w:rPr>
-              <w:t>POST</w:t>
-            </w:r>
-          </w:p>
-        </w:tc>
-        <w:tc>
-          <w:tcPr>
-            <w:tcW w:type="dxa" w:w="2976"/>
-          </w:tcPr>
-          <w:p>
-            <w:r>
-              <w:rPr>
-                <w:rFonts w:ascii="Calibri" w:hAnsi="Calibri"/>
-              </w:rPr>
-              <w:t>Creates new operator account with hashed password</w:t>
-            </w:r>
-          </w:p>
-        </w:tc>
-      </w:tr>
-      <w:tr>
-        <w:tc>
-          <w:tcPr>
-            <w:tcW w:type="dxa" w:w="2976"/>
-            <w:shd w:val="clear" w:color="auto" w:fill="EEF4FB"/>
-          </w:tcPr>
-          <w:p>
-            <w:r>
-              <w:rPr>
-                <w:rFonts w:ascii="Calibri" w:hAnsi="Calibri"/>
-              </w:rPr>
-              <w:t>/api/snapshot</w:t>
-            </w:r>
-          </w:p>
-        </w:tc>
-        <w:tc>
-          <w:tcPr>
-            <w:tcW w:type="dxa" w:w="2976"/>
-            <w:shd w:val="clear" w:color="auto" w:fill="EEF4FB"/>
-          </w:tcPr>
-          <w:p>
-            <w:r>
-              <w:rPr>
-                <w:rFonts w:ascii="Calibri" w:hAnsi="Calibri"/>
-              </w:rPr>
-              <w:t>GET</w:t>
-            </w:r>
-          </w:p>
-        </w:tc>
-        <w:tc>
-          <w:tcPr>
-            <w:tcW w:type="dxa" w:w="2976"/>
-            <w:shd w:val="clear" w:color="auto" w:fill="EEF4FB"/>
-          </w:tcPr>
-          <w:p>
-            <w:r>
-              <w:rPr>
-                <w:rFonts w:ascii="Calibri" w:hAnsi="Calibri"/>
-              </w:rPr>
-              <w:t>Returns telemetry snapshot, incident logs &amp; quarantine list</w:t>
-            </w:r>
-          </w:p>
-        </w:tc>
-      </w:tr>
-      <w:tr>
-        <w:tc>
-          <w:tcPr>
-            <w:tcW w:type="dxa" w:w="2976"/>
-          </w:tcPr>
-          <w:p>
-            <w:r>
-              <w:rPr>
-                <w:rFonts w:ascii="Calibri" w:hAnsi="Calibri"/>
-              </w:rPr>
-              <w:t>/api/block_ip</w:t>
-            </w:r>
-          </w:p>
-        </w:tc>
-        <w:tc>
-          <w:tcPr>
-            <w:tcW w:type="dxa" w:w="2976"/>
-          </w:tcPr>
-          <w:p>
-            <w:r>
-              <w:rPr>
-                <w:rFonts w:ascii="Calibri" w:hAnsi="Calibri"/>
-              </w:rPr>
-              <w:t>POST</w:t>
-            </w:r>
-          </w:p>
-        </w:tc>
-        <w:tc>
-          <w:tcPr>
-            <w:tcW w:type="dxa" w:w="2976"/>
-          </w:tcPr>
-          <w:p>
-            <w:r>
-              <w:rPr>
-                <w:rFonts w:ascii="Calibri" w:hAnsi="Calibri"/>
-              </w:rPr>
-              <w:t>Adds target IP address to active firewall quarantine</w:t>
-            </w:r>
-          </w:p>
-        </w:tc>
-      </w:tr>
-      <w:tr>
-        <w:tc>
-          <w:tcPr>
-            <w:tcW w:type="dxa" w:w="2976"/>
-            <w:shd w:val="clear" w:color="auto" w:fill="EEF4FB"/>
-          </w:tcPr>
-          <w:p>
-            <w:r>
-              <w:rPr>
-                <w:rFonts w:ascii="Calibri" w:hAnsi="Calibri"/>
-              </w:rPr>
-              <w:t>/api/unblock_ip</w:t>
-            </w:r>
-          </w:p>
-        </w:tc>
-        <w:tc>
-          <w:tcPr>
-            <w:tcW w:type="dxa" w:w="2976"/>
-            <w:shd w:val="clear" w:color="auto" w:fill="EEF4FB"/>
-          </w:tcPr>
-          <w:p>
-            <w:r>
-              <w:rPr>
-                <w:rFonts w:ascii="Calibri" w:hAnsi="Calibri"/>
-              </w:rPr>
-              <w:t>POST</w:t>
-            </w:r>
-          </w:p>
-        </w:tc>
-        <w:tc>
-          <w:tcPr>
-            <w:tcW w:type="dxa" w:w="2976"/>
-            <w:shd w:val="clear" w:color="auto" w:fill="EEF4FB"/>
-          </w:tcPr>
-          <w:p>
-            <w:r>
-              <w:rPr>
-                <w:rFonts w:ascii="Calibri" w:hAnsi="Calibri"/>
-              </w:rPr>
-              <w:t>Revokes quarantine for target IP address</w:t>
-            </w:r>
-          </w:p>
-        </w:tc>
-      </w:tr>
-      <w:tr>
-        <w:tc>
-          <w:tcPr>
-            <w:tcW w:type="dxa" w:w="2976"/>
-          </w:tcPr>
-          <w:p>
-            <w:r>
-              <w:rPr>
-                <w:rFonts w:ascii="Calibri" w:hAnsi="Calibri"/>
-              </w:rPr>
-              <w:t>/api/export</w:t>
-            </w:r>
-          </w:p>
-        </w:tc>
-        <w:tc>
-          <w:tcPr>
-            <w:tcW w:type="dxa" w:w="2976"/>
-          </w:tcPr>
-          <w:p>
-            <w:r>
-              <w:rPr>
-                <w:rFonts w:ascii="Calibri" w:hAnsi="Calibri"/>
-              </w:rPr>
-              <w:t>GET</w:t>
-            </w:r>
-          </w:p>
-        </w:tc>
-        <w:tc>
-          <w:tcPr>
-            <w:tcW w:type="dxa" w:w="2976"/>
-          </w:tcPr>
-          <w:p>
-            <w:r>
-              <w:rPr>
-                <w:rFonts w:ascii="Calibri" w:hAnsi="Calibri"/>
-              </w:rPr>
-              <w:t>Downloads full incident history as JSON</w:t>
-            </w:r>
-          </w:p>
-        </w:tc>
-      </w:tr>
-    </w:tbl>
-    <w:p>
-      <w:pPr>
-        <w:spacing w:before="320" w:after="100"/>
-        <w:pBdr>
-          <w:bottom w:val="single" w:sz="6" w:space="1" w:color="003366"/>
-        </w:pBdr>
-      </w:pPr>
-      <w:r>
-        <w:rPr>
-          <w:rFonts w:ascii="Calibri" w:hAnsi="Calibri"/>
-          <w:b/>
-          <w:color w:val="002750"/>
-          <w:sz w:val="30"/>
-        </w:rPr>
-        <w:t>12.  Conclusion</w:t>
+        <w:t>Architecture:</w:t>
       </w:r>
     </w:p>
     <w:p>
       <w:pPr>
-        <w:spacing w:before="0" w:after="120" w:line="288" w:lineRule="auto"/>
-        <w:jc w:val="both"/>
+        <w:spacing w:before="280" w:after="280"/>
+        <w:jc w:val="center"/>
       </w:pPr>
       <w:r>
-        <w:rPr>
-          <w:rFonts w:ascii="Calibri" w:hAnsi="Calibri"/>
-        </w:rPr>
-        <w:t>SentinelGPT demonstrates that integrating Agentic AI with a modern full-stack serverless architecture can transform traditional reactive security operations into a proactive, automated cyber defense system. By replacing manual log review with autonomous software agents, the platform eliminates alert fatigue, reduces incident response latency to near zero, and provides continuous 24/7 network perimeter protection — establishing a strong foundation for next-generation AI-powered cybersecurity frameworks.</w:t>
+        <w:drawing>
+          <wp:inline xmlns:a="http://schemas.openxmlformats.org/drawingml/2006/main" xmlns:pic="http://schemas.openxmlformats.org/drawingml/2006/picture">
+            <wp:extent cx="5303520" cy="3535680"/>
+            <wp:docPr id="3" name="Picture 3"/>
+            <wp:cNvGraphicFramePr>
+              <a:graphicFrameLocks noChangeAspect="1"/>
+            </wp:cNvGraphicFramePr>
+            <a:graphic>
+              <a:graphicData uri="http://schemas.openxmlformats.org/drawingml/2006/picture">
+                <pic:pic>
+                  <pic:nvPicPr>
+                    <pic:cNvPr id="0" name="sample_flow_diagram.png"/>
+                    <pic:cNvPicPr/>
+                  </pic:nvPicPr>
+                  <pic:blipFill>
+                    <a:blip r:embed="rId10"/>
+                    <a:stretch>
+                      <a:fillRect/>
+                    </a:stretch>
+                  </pic:blipFill>
+                  <pic:spPr>
+                    <a:xfrm>
+                      <a:off x="0" y="0"/>
+                      <a:ext cx="5303520" cy="3535680"/>
+                    </a:xfrm>
+                    <a:prstGeom prst="rect"/>
+                  </pic:spPr>
+                </pic:pic>
+              </a:graphicData>
+            </a:graphic>
+          </wp:inline>
+        </w:drawing>
       </w:r>
     </w:p>
     <w:p>
-      <w:pPr>
-        <w:spacing w:before="320" w:after="100"/>
-        <w:pBdr>
-          <w:bottom w:val="single" w:sz="6" w:space="1" w:color="003366"/>
-        </w:pBdr>
-      </w:pPr>
       <w:r>
-        <w:rPr>
-          <w:rFonts w:ascii="Calibri" w:hAnsi="Calibri"/>
-          <w:b/>
-          <w:color w:val="002750"/>
-          <w:sz w:val="30"/>
-        </w:rPr>
-        <w:t>13.  References</w:t>
+        <w:br w:type="page"/>
       </w:r>
     </w:p>
     <w:p>
       <w:pPr>
-        <w:pStyle w:val="ListBullet"/>
-        <w:spacing w:before="0" w:after="60" w:line="276" w:lineRule="auto"/>
-        <w:ind w:left="432"/>
-        <w:jc w:val="both"/>
+        <w:spacing w:before="360" w:after="240"/>
       </w:pPr>
       <w:r>
         <w:rPr>
-          <w:rFonts w:ascii="Calibri" w:hAnsi="Calibri"/>
+          <w:rFonts w:ascii="Times New Roman" w:hAnsi="Times New Roman"/>
           <w:b/>
-          <w:color w:val="002750"/>
+          <w:color w:val="000000"/>
+          <w:sz w:val="32"/>
         </w:rPr>
-        <w:t xml:space="preserve">[1]  </w:t>
-      </w:r>
-      <w:r>
-        <w:rPr>
-          <w:rFonts w:ascii="Calibri" w:hAnsi="Calibri"/>
-        </w:rPr>
-        <w:t>FastAPI Documentation — https://fastapi.tiangolo.com/</w:t>
+        <w:t>Implementation</w:t>
       </w:r>
     </w:p>
     <w:p>
       <w:pPr>
-        <w:pStyle w:val="ListBullet"/>
-        <w:spacing w:before="0" w:after="60" w:line="276" w:lineRule="auto"/>
-        <w:ind w:left="432"/>
+        <w:spacing w:after="160" w:line="360" w:lineRule="auto"/>
         <w:jc w:val="both"/>
       </w:pPr>
       <w:r>
         <w:rPr>
-          <w:rFonts w:ascii="Calibri" w:hAnsi="Calibri"/>
-          <w:b/>
-          <w:color w:val="002750"/>
+          <w:rFonts w:ascii="Times New Roman" w:hAnsi="Times New Roman"/>
+          <w:color w:val="000000"/>
         </w:rPr>
-        <w:t xml:space="preserve">[2]  </w:t>
-      </w:r>
-      <w:r>
-        <w:rPr>
-          <w:rFonts w:ascii="Calibri" w:hAnsi="Calibri"/>
-        </w:rPr>
-        <w:t>React 19 Docs — https://react.dev/</w:t>
+        <w:t>The development of the Agentic AI Based SentinelGPT System was carried out in several phases. Each phase focused on a specific part of the system to ensure a structured and efficient development process.</w:t>
       </w:r>
     </w:p>
     <w:p>
       <w:pPr>
-        <w:pStyle w:val="ListBullet"/>
-        <w:spacing w:before="0" w:after="60" w:line="276" w:lineRule="auto"/>
-        <w:ind w:left="432"/>
-        <w:jc w:val="both"/>
+        <w:spacing w:before="280" w:after="120"/>
       </w:pPr>
       <w:r>
         <w:rPr>
-          <w:rFonts w:ascii="Calibri" w:hAnsi="Calibri"/>
+          <w:rFonts w:ascii="Times New Roman" w:hAnsi="Times New Roman"/>
           <w:b/>
-          <w:color w:val="002750"/>
+          <w:color w:val="000000"/>
+          <w:sz w:val="26"/>
         </w:rPr>
-        <w:t xml:space="preserve">[3]  </w:t>
-      </w:r>
-      <w:r>
-        <w:rPr>
-          <w:rFonts w:ascii="Calibri" w:hAnsi="Calibri"/>
-        </w:rPr>
-        <w:t>MITRE ATT&amp;CK Framework — https://attack.mitre.org/</w:t>
+        <w:t>Phases:</w:t>
       </w:r>
     </w:p>
     <w:p>
       <w:pPr>
-        <w:pStyle w:val="ListBullet"/>
-        <w:spacing w:before="0" w:after="60" w:line="276" w:lineRule="auto"/>
-        <w:ind w:left="432"/>
-        <w:jc w:val="both"/>
+        <w:spacing w:before="280" w:after="120"/>
       </w:pPr>
       <w:r>
         <w:rPr>
-          <w:rFonts w:ascii="Calibri" w:hAnsi="Calibri"/>
+          <w:rFonts w:ascii="Times New Roman" w:hAnsi="Times New Roman"/>
           <w:b/>
-          <w:color w:val="002750"/>
+          <w:color w:val="000000"/>
+          <w:sz w:val="26"/>
         </w:rPr>
-        <w:t xml:space="preserve">[4]  </w:t>
-      </w:r>
-      <w:r>
-        <w:rPr>
-          <w:rFonts w:ascii="Calibri" w:hAnsi="Calibri"/>
-        </w:rPr>
-        <w:t>SQLAlchemy ORM — https://docs.sqlalchemy.org/</w:t>
+        <w:t>Phase 1: Requirement Analysis</w:t>
       </w:r>
     </w:p>
     <w:p>
       <w:pPr>
-        <w:pStyle w:val="ListBullet"/>
-        <w:spacing w:before="0" w:after="60" w:line="276" w:lineRule="auto"/>
-        <w:ind w:left="432"/>
+        <w:spacing w:after="160" w:line="360" w:lineRule="auto"/>
         <w:jc w:val="both"/>
       </w:pPr>
       <w:r>
         <w:rPr>
-          <w:rFonts w:ascii="Calibri" w:hAnsi="Calibri"/>
-          <w:b/>
-          <w:color w:val="002750"/>
+          <w:rFonts w:ascii="Times New Roman" w:hAnsi="Times New Roman"/>
+          <w:color w:val="000000"/>
         </w:rPr>
-        <w:t xml:space="preserve">[5]  </w:t>
-      </w:r>
-      <w:r>
-        <w:rPr>
-          <w:rFonts w:ascii="Calibri" w:hAnsi="Calibri"/>
-        </w:rPr>
-        <w:t>Vercel Platform Docs — https://vercel.com/docs</w:t>
+        <w:t>The first phase involved identifying the problems in traditional security operations and gathering system requirements. The functional and non-functional requirements were analyzed, including threat detection, risk scoring, MITRE ATT&amp;CK mapping, quarantine enforcement, dashboard management, and JSON log export.</w:t>
       </w:r>
     </w:p>
     <w:p>
       <w:pPr>
-        <w:pStyle w:val="ListBullet"/>
-        <w:spacing w:before="0" w:after="60" w:line="276" w:lineRule="auto"/>
-        <w:ind w:left="432"/>
-        <w:jc w:val="both"/>
+        <w:spacing w:before="280" w:after="120"/>
       </w:pPr>
       <w:r>
         <w:rPr>
-          <w:rFonts w:ascii="Calibri" w:hAnsi="Calibri"/>
+          <w:rFonts w:ascii="Times New Roman" w:hAnsi="Times New Roman"/>
           <w:b/>
-          <w:color w:val="002750"/>
+          <w:color w:val="000000"/>
+          <w:sz w:val="26"/>
         </w:rPr>
-        <w:t xml:space="preserve">[6]  </w:t>
-      </w:r>
-      <w:r>
-        <w:rPr>
-          <w:rFonts w:ascii="Calibri" w:hAnsi="Calibri"/>
-        </w:rPr>
-        <w:t>Russell, S. &amp; Norvig, P. (2021). Artificial Intelligence: A Modern Approach (4th ed.). Pearson.</w:t>
+        <w:t>Phase 2: System Design</w:t>
       </w:r>
     </w:p>
     <w:p>
       <w:pPr>
-        <w:spacing w:before="320" w:after="100"/>
-        <w:pBdr>
-          <w:bottom w:val="single" w:sz="6" w:space="1" w:color="003366"/>
-        </w:pBdr>
+        <w:spacing w:after="160" w:line="360" w:lineRule="auto"/>
+        <w:jc w:val="both"/>
       </w:pPr>
       <w:r>
         <w:rPr>
-          <w:rFonts w:ascii="Calibri" w:hAnsi="Calibri"/>
-          <w:b/>
-          <w:color w:val="002750"/>
-          <w:sz w:val="30"/>
+          <w:rFonts w:ascii="Times New Roman" w:hAnsi="Times New Roman"/>
+          <w:color w:val="000000"/>
         </w:rPr>
-        <w:t>14.  Live Deployment &amp; GitHub Links</w:t>
+        <w:t>In this phase, the overall architecture of the system was designed. The frontend React SPA, backend FastAPI controller, database models, agent workflows, and API modules were planned. The database schema, user interface layouts, and security workflows were also finalized.</w:t>
       </w:r>
     </w:p>
     <w:p>
       <w:pPr>
-        <w:pStyle w:val="ListBullet"/>
-        <w:spacing w:before="0" w:after="60" w:line="276" w:lineRule="auto"/>
-        <w:ind w:left="432"/>
-        <w:jc w:val="both"/>
+        <w:spacing w:before="280" w:after="120"/>
       </w:pPr>
       <w:r>
         <w:rPr>
-          <w:rFonts w:ascii="Calibri" w:hAnsi="Calibri"/>
+          <w:rFonts w:ascii="Times New Roman" w:hAnsi="Times New Roman"/>
           <w:b/>
-          <w:color w:val="002750"/>
+          <w:color w:val="000000"/>
+          <w:sz w:val="26"/>
         </w:rPr>
-        <w:t xml:space="preserve">Single Live Dashboard Link:  </w:t>
+        <w:t>Phase 3: Database Design</w:t>
       </w:r>
+    </w:p>
+    <w:p>
+      <w:pPr>
+        <w:spacing w:after="160" w:line="360" w:lineRule="auto"/>
+        <w:jc w:val="both"/>
+      </w:pPr>
       <w:r>
         <w:rPr>
-          <w:rFonts w:ascii="Calibri" w:hAnsi="Calibri"/>
+          <w:rFonts w:ascii="Times New Roman" w:hAnsi="Times New Roman"/>
+          <w:color w:val="000000"/>
+        </w:rPr>
+        <w:t>The database was designed using SQLAlchemy ORM. Four tables were created:</w:t>
+      </w:r>
+    </w:p>
+    <w:p>
+      <w:pPr>
+        <w:spacing w:after="160" w:line="360" w:lineRule="auto"/>
+        <w:jc w:val="both"/>
+      </w:pPr>
+      <w:r>
+        <w:rPr>
+          <w:rFonts w:ascii="Times New Roman" w:hAnsi="Times New Roman"/>
+          <w:color w:val="000000"/>
+        </w:rPr>
+        <w:t>Users Table – Stores administrator login credentials and user roles.</w:t>
+      </w:r>
+    </w:p>
+    <w:p>
+      <w:pPr>
+        <w:spacing w:after="160" w:line="360" w:lineRule="auto"/>
+        <w:jc w:val="both"/>
+      </w:pPr>
+      <w:r>
+        <w:rPr>
+          <w:rFonts w:ascii="Times New Roman" w:hAnsi="Times New Roman"/>
+          <w:color w:val="000000"/>
+        </w:rPr>
+        <w:t>SOC Incidents Table – Stores threat configurations, risk scores, and MITRE ATT&amp;CK data.</w:t>
+      </w:r>
+    </w:p>
+    <w:p>
+      <w:pPr>
+        <w:spacing w:after="160" w:line="360" w:lineRule="auto"/>
+        <w:jc w:val="both"/>
+      </w:pPr>
+      <w:r>
+        <w:rPr>
+          <w:rFonts w:ascii="Times New Roman" w:hAnsi="Times New Roman"/>
+          <w:color w:val="000000"/>
+        </w:rPr>
+        <w:t>Perimeter Logs Table – Stores raw network traffic and endpoint request metrics.</w:t>
+      </w:r>
+    </w:p>
+    <w:p>
+      <w:pPr>
+        <w:spacing w:after="160" w:line="360" w:lineRule="auto"/>
+        <w:jc w:val="both"/>
+      </w:pPr>
+      <w:r>
+        <w:rPr>
+          <w:rFonts w:ascii="Times New Roman" w:hAnsi="Times New Roman"/>
+          <w:color w:val="000000"/>
+        </w:rPr>
+        <w:t>Blocked IPs Table – Stores active firewall quarantine records and revocation timestamps.</w:t>
+      </w:r>
+    </w:p>
+    <w:p>
+      <w:pPr>
+        <w:spacing w:after="160" w:line="360" w:lineRule="auto"/>
+        <w:jc w:val="both"/>
+      </w:pPr>
+      <w:r>
+        <w:rPr>
+          <w:rFonts w:ascii="Times New Roman" w:hAnsi="Times New Roman"/>
+          <w:color w:val="000000"/>
+        </w:rPr>
+        <w:t>SQLite was used for local development, while cloud-hosted PostgreSQL was planned for production deployment.</w:t>
+      </w:r>
+    </w:p>
+    <w:p>
+      <w:pPr>
+        <w:spacing w:before="280" w:after="120"/>
+      </w:pPr>
+      <w:r>
+        <w:rPr>
+          <w:rFonts w:ascii="Times New Roman" w:hAnsi="Times New Roman"/>
+          <w:b/>
+          <w:color w:val="000000"/>
+          <w:sz w:val="26"/>
+        </w:rPr>
+        <w:t>Phase 4: Frontend Development</w:t>
+      </w:r>
+    </w:p>
+    <w:p>
+      <w:pPr>
+        <w:spacing w:after="160" w:line="360" w:lineRule="auto"/>
+        <w:jc w:val="both"/>
+      </w:pPr>
+      <w:r>
+        <w:rPr>
+          <w:rFonts w:ascii="Times New Roman" w:hAnsi="Times New Roman"/>
+          <w:color w:val="000000"/>
+        </w:rPr>
+        <w:t>The user interface was developed using HTML5, CSS3, JavaScript, and React 19. Pages such as Login, Dashboard, Threat History, Blocked IPs, AI Assistant Chat, and File Scanner were created to provide an easy-to-use interface for security operators.</w:t>
+      </w:r>
+    </w:p>
+    <w:p>
+      <w:pPr>
+        <w:spacing w:before="280" w:after="120"/>
+      </w:pPr>
+      <w:r>
+        <w:rPr>
+          <w:rFonts w:ascii="Times New Roman" w:hAnsi="Times New Roman"/>
+          <w:b/>
+          <w:color w:val="000000"/>
+          <w:sz w:val="26"/>
+        </w:rPr>
+        <w:t>Phase 5: Backend Development</w:t>
+      </w:r>
+    </w:p>
+    <w:p>
+      <w:pPr>
+        <w:spacing w:after="160" w:line="360" w:lineRule="auto"/>
+        <w:jc w:val="both"/>
+      </w:pPr>
+      <w:r>
+        <w:rPr>
+          <w:rFonts w:ascii="Times New Roman" w:hAnsi="Times New Roman"/>
+          <w:color w:val="000000"/>
+        </w:rPr>
+        <w:t>The backend was implemented using Python, FastAPI, and Uvicorn. API routes were developed for administrator authentication, telemetry snapshot retrieval, IP quarantine enforcement, threat simulation, and JSON log export.</w:t>
+      </w:r>
+    </w:p>
+    <w:p>
+      <w:r>
+        <w:br w:type="page"/>
+      </w:r>
+    </w:p>
+    <w:p>
+      <w:pPr>
+        <w:spacing w:before="280" w:after="120"/>
+      </w:pPr>
+      <w:r>
+        <w:rPr>
+          <w:rFonts w:ascii="Times New Roman" w:hAnsi="Times New Roman"/>
+          <w:b/>
+          <w:color w:val="000000"/>
+          <w:sz w:val="26"/>
+        </w:rPr>
+        <w:t>Phase 6: Agent Development</w:t>
+      </w:r>
+    </w:p>
+    <w:p>
+      <w:pPr>
+        <w:spacing w:after="160" w:line="360" w:lineRule="auto"/>
+        <w:jc w:val="both"/>
+      </w:pPr>
+      <w:r>
+        <w:rPr>
+          <w:rFonts w:ascii="Times New Roman" w:hAnsi="Times New Roman"/>
+          <w:color w:val="000000"/>
+        </w:rPr>
+        <w:t>The intelligent software agents were developed during this phase.</w:t>
+      </w:r>
+    </w:p>
+    <w:p>
+      <w:pPr>
+        <w:spacing w:after="160" w:line="360" w:lineRule="auto"/>
+        <w:jc w:val="both"/>
+      </w:pPr>
+      <w:r>
+        <w:rPr>
+          <w:rFonts w:ascii="Times New Roman" w:hAnsi="Times New Roman"/>
+          <w:color w:val="000000"/>
+        </w:rPr>
+        <w:t>The Telemetry Monitor Agent automatically calculates threat scores by evaluating packet rates and attack signatures while avoiding duplicate alerts.</w:t>
+      </w:r>
+    </w:p>
+    <w:p>
+      <w:pPr>
+        <w:spacing w:after="160" w:line="360" w:lineRule="auto"/>
+        <w:jc w:val="both"/>
+      </w:pPr>
+      <w:r>
+        <w:rPr>
+          <w:rFonts w:ascii="Times New Roman" w:hAnsi="Times New Roman"/>
+          <w:color w:val="000000"/>
+        </w:rPr>
+        <w:t>The Autonomous Quarantine Agent verifies generated security events by checking risk thresholds, enforcing firewall isolation, and supporting manual revocation.</w:t>
+      </w:r>
+    </w:p>
+    <w:p>
+      <w:pPr>
+        <w:spacing w:before="280" w:after="120"/>
+      </w:pPr>
+      <w:r>
+        <w:rPr>
+          <w:rFonts w:ascii="Times New Roman" w:hAnsi="Times New Roman"/>
+          <w:b/>
+          <w:color w:val="000000"/>
+          <w:sz w:val="26"/>
+        </w:rPr>
+        <w:t>Phase 7: Threat Generation and Validation</w:t>
+      </w:r>
+    </w:p>
+    <w:p>
+      <w:pPr>
+        <w:spacing w:after="160" w:line="360" w:lineRule="auto"/>
+        <w:jc w:val="both"/>
+      </w:pPr>
+      <w:r>
+        <w:rPr>
+          <w:rFonts w:ascii="Times New Roman" w:hAnsi="Times New Roman"/>
+          <w:color w:val="000000"/>
+        </w:rPr>
+        <w:t>After evaluating telemetry details, the Telemetry Monitor Agent creates incident records based on security models. The Autonomous Quarantine Agent then verifies the threat to ensure all security rules are satisfied. Only validated threats are processed for automated quarantine.</w:t>
+      </w:r>
+    </w:p>
+    <w:p>
+      <w:pPr>
+        <w:spacing w:before="280" w:after="120"/>
+      </w:pPr>
+      <w:r>
+        <w:rPr>
+          <w:rFonts w:ascii="Times New Roman" w:hAnsi="Times New Roman"/>
+          <w:b/>
+          <w:color w:val="000000"/>
+          <w:sz w:val="26"/>
+        </w:rPr>
+        <w:t>Phase 8: Testing and Debugging</w:t>
+      </w:r>
+    </w:p>
+    <w:p>
+      <w:pPr>
+        <w:spacing w:after="160" w:line="360" w:lineRule="auto"/>
+        <w:jc w:val="both"/>
+      </w:pPr>
+      <w:r>
+        <w:rPr>
+          <w:rFonts w:ascii="Times New Roman" w:hAnsi="Times New Roman"/>
+          <w:color w:val="000000"/>
+        </w:rPr>
+        <w:t>The system was tested to verify all functionalities, including administrator login, telemetry visualization, manual IP blocking, quarantine revocation, threat simulation, and database operations. Errors and scoring inconsistencies were identified and corrected to improve system reliability.</w:t>
+      </w:r>
+    </w:p>
+    <w:p>
+      <w:pPr>
+        <w:spacing w:before="280" w:after="120"/>
+      </w:pPr>
+      <w:r>
+        <w:rPr>
+          <w:rFonts w:ascii="Times New Roman" w:hAnsi="Times New Roman"/>
+          <w:b/>
+          <w:color w:val="000000"/>
+          <w:sz w:val="26"/>
+        </w:rPr>
+        <w:t>Phase 9: Deployment</w:t>
+      </w:r>
+    </w:p>
+    <w:p>
+      <w:pPr>
+        <w:spacing w:after="160" w:line="360" w:lineRule="auto"/>
+        <w:jc w:val="both"/>
+      </w:pPr>
+      <w:r>
+        <w:rPr>
+          <w:rFonts w:ascii="Times New Roman" w:hAnsi="Times New Roman"/>
+          <w:color w:val="000000"/>
+        </w:rPr>
+        <w:t>The application was prepared for deployment using Vercel Cloud Platform as the hosting provider. Environment variables were configured, and the system was made accessible online through a web browser.</w:t>
+      </w:r>
+    </w:p>
+    <w:p>
+      <w:pPr>
+        <w:spacing w:before="360" w:after="240"/>
+      </w:pPr>
+      <w:r>
+        <w:rPr>
+          <w:rFonts w:ascii="Times New Roman" w:hAnsi="Times New Roman"/>
+          <w:b/>
+          <w:color w:val="000000"/>
+          <w:sz w:val="32"/>
+        </w:rPr>
+        <w:t>Applications</w:t>
+      </w:r>
+    </w:p>
+    <w:p>
+      <w:pPr>
+        <w:spacing w:after="160" w:line="360" w:lineRule="auto"/>
+        <w:jc w:val="both"/>
+      </w:pPr>
+      <w:r>
+        <w:rPr>
+          <w:rFonts w:ascii="Times New Roman" w:hAnsi="Times New Roman"/>
+          <w:color w:val="000000"/>
+        </w:rPr>
+        <w:t>The Agentic AI Based SentinelGPT System can be used in various enterprise and institutional environments to simplify and automate cyber threat monitoring. By reducing manual effort and ensuring real-time threat quarantine, the system improves operational efficiency and security accuracy.</w:t>
+      </w:r>
+    </w:p>
+    <w:p>
+      <w:pPr>
+        <w:spacing w:before="280" w:after="120"/>
+      </w:pPr>
+      <w:r>
+        <w:rPr>
+          <w:rFonts w:ascii="Times New Roman" w:hAnsi="Times New Roman"/>
+          <w:b/>
+          <w:color w:val="000000"/>
+          <w:sz w:val="26"/>
+        </w:rPr>
+        <w:t>Applications</w:t>
+      </w:r>
+    </w:p>
+    <w:p>
+      <w:pPr>
+        <w:spacing w:before="280" w:after="120"/>
+      </w:pPr>
+      <w:r>
+        <w:rPr>
+          <w:rFonts w:ascii="Times New Roman" w:hAnsi="Times New Roman"/>
+          <w:b/>
+          <w:color w:val="000000"/>
+          <w:sz w:val="26"/>
+        </w:rPr>
+        <w:t>1. Enterprise SOC Centers</w:t>
+      </w:r>
+    </w:p>
+    <w:p>
+      <w:pPr>
+        <w:spacing w:after="160" w:line="360" w:lineRule="auto"/>
+        <w:jc w:val="both"/>
+      </w:pPr>
+      <w:r>
+        <w:rPr>
+          <w:rFonts w:ascii="Times New Roman" w:hAnsi="Times New Roman"/>
+          <w:color w:val="000000"/>
+        </w:rPr>
+        <w:t>The system can be used to monitor enterprise network perimeters, analyze incoming traffic logs, and execute automated IP quarantine without manual analyst delay.</w:t>
+      </w:r>
+    </w:p>
+    <w:p>
+      <w:pPr>
+        <w:spacing w:before="280" w:after="120"/>
+      </w:pPr>
+      <w:r>
+        <w:rPr>
+          <w:rFonts w:ascii="Times New Roman" w:hAnsi="Times New Roman"/>
+          <w:b/>
+          <w:color w:val="000000"/>
+          <w:sz w:val="26"/>
+        </w:rPr>
+        <w:t>2. Financial Institutions</w:t>
+      </w:r>
+    </w:p>
+    <w:p>
+      <w:pPr>
+        <w:spacing w:after="160" w:line="360" w:lineRule="auto"/>
+        <w:jc w:val="both"/>
+      </w:pPr>
+      <w:r>
+        <w:rPr>
+          <w:rFonts w:ascii="Times New Roman" w:hAnsi="Times New Roman"/>
+          <w:color w:val="000000"/>
+        </w:rPr>
+        <w:t>It helps banks and payment gateways automatically detect credential stuffing and brute-force attacks while maintaining continuous security compliance.</w:t>
+      </w:r>
+    </w:p>
+    <w:p>
+      <w:r>
+        <w:br w:type="page"/>
+      </w:r>
+    </w:p>
+    <w:p>
+      <w:pPr>
+        <w:spacing w:before="280" w:after="120"/>
+      </w:pPr>
+      <w:r>
+        <w:rPr>
+          <w:rFonts w:ascii="Times New Roman" w:hAnsi="Times New Roman"/>
+          <w:b/>
+          <w:color w:val="000000"/>
+          <w:sz w:val="26"/>
+        </w:rPr>
+        <w:t>3. Cloud Infrastructure Providers</w:t>
+      </w:r>
+    </w:p>
+    <w:p>
+      <w:pPr>
+        <w:spacing w:after="160" w:line="360" w:lineRule="auto"/>
+        <w:jc w:val="both"/>
+      </w:pPr>
+      <w:r>
+        <w:rPr>
+          <w:rFonts w:ascii="Times New Roman" w:hAnsi="Times New Roman"/>
+          <w:color w:val="000000"/>
+        </w:rPr>
+        <w:t>Cloud hosting platforms can use the system to manage complex security requirements across microservices, ensuring real-time threat detection across distributed servers.</w:t>
+      </w:r>
+    </w:p>
+    <w:p>
+      <w:pPr>
+        <w:spacing w:before="280" w:after="120"/>
+      </w:pPr>
+      <w:r>
+        <w:rPr>
+          <w:rFonts w:ascii="Times New Roman" w:hAnsi="Times New Roman"/>
+          <w:b/>
+          <w:color w:val="000000"/>
+          <w:sz w:val="26"/>
+        </w:rPr>
+        <w:t>4. Healthcare Networks</w:t>
+      </w:r>
+    </w:p>
+    <w:p>
+      <w:pPr>
+        <w:spacing w:after="160" w:line="360" w:lineRule="auto"/>
+        <w:jc w:val="both"/>
+      </w:pPr>
+      <w:r>
+        <w:rPr>
+          <w:rFonts w:ascii="Times New Roman" w:hAnsi="Times New Roman"/>
+          <w:color w:val="000000"/>
+        </w:rPr>
+        <w:t>Hospitals and healthcare organizations can use the system to secure patient data endpoints, protecting electronic health records from unauthorized malware or ransomware probes.</w:t>
+      </w:r>
+    </w:p>
+    <w:p>
+      <w:pPr>
+        <w:spacing w:before="280" w:after="120"/>
+      </w:pPr>
+      <w:r>
+        <w:rPr>
+          <w:rFonts w:ascii="Times New Roman" w:hAnsi="Times New Roman"/>
+          <w:b/>
+          <w:color w:val="000000"/>
+          <w:sz w:val="26"/>
+        </w:rPr>
+        <w:t>5. E-Commerce Platforms</w:t>
+      </w:r>
+    </w:p>
+    <w:p>
+      <w:pPr>
+        <w:spacing w:after="160" w:line="360" w:lineRule="auto"/>
+        <w:jc w:val="both"/>
+      </w:pPr>
+      <w:r>
+        <w:rPr>
+          <w:rFonts w:ascii="Times New Roman" w:hAnsi="Times New Roman"/>
+          <w:color w:val="000000"/>
+        </w:rPr>
+        <w:t>Online retailers can use the system to organize threat monitoring during peak sales events, preventing DDoS disruptions and SQL injection attacks.</w:t>
+      </w:r>
+    </w:p>
+    <w:p>
+      <w:pPr>
+        <w:spacing w:before="280" w:after="120"/>
+      </w:pPr>
+      <w:r>
+        <w:rPr>
+          <w:rFonts w:ascii="Times New Roman" w:hAnsi="Times New Roman"/>
+          <w:b/>
+          <w:color w:val="000000"/>
+          <w:sz w:val="26"/>
+        </w:rPr>
+        <w:t>6. Educational Organizations</w:t>
+      </w:r>
+    </w:p>
+    <w:p>
+      <w:pPr>
+        <w:spacing w:after="160" w:line="360" w:lineRule="auto"/>
+        <w:jc w:val="both"/>
+      </w:pPr>
+      <w:r>
+        <w:rPr>
+          <w:rFonts w:ascii="Times New Roman" w:hAnsi="Times New Roman"/>
+          <w:color w:val="000000"/>
+        </w:rPr>
+        <w:t>Universities and certification centers can use the system to protect student portals and administrative databases from credential theft.</w:t>
+      </w:r>
+    </w:p>
+    <w:p>
+      <w:pPr>
+        <w:spacing w:before="280" w:after="120"/>
+      </w:pPr>
+      <w:r>
+        <w:rPr>
+          <w:rFonts w:ascii="Times New Roman" w:hAnsi="Times New Roman"/>
+          <w:b/>
+          <w:color w:val="000000"/>
+          <w:sz w:val="26"/>
+        </w:rPr>
+        <w:t>7. Academic Administration</w:t>
+      </w:r>
+    </w:p>
+    <w:p>
+      <w:pPr>
+        <w:spacing w:after="160" w:line="360" w:lineRule="auto"/>
+        <w:jc w:val="both"/>
+      </w:pPr>
+      <w:r>
+        <w:rPr>
+          <w:rFonts w:ascii="Times New Roman" w:hAnsi="Times New Roman"/>
+          <w:color w:val="000000"/>
+        </w:rPr>
+        <w:t>The system assists IT administrators in monitoring, editing, revoking, and exporting threat data through a centralized dashboard, reducing manual work and improving security readiness.</w:t>
+      </w:r>
+    </w:p>
+    <w:p>
+      <w:pPr>
+        <w:spacing w:before="360" w:after="240"/>
+      </w:pPr>
+      <w:r>
+        <w:rPr>
+          <w:rFonts w:ascii="Times New Roman" w:hAnsi="Times New Roman"/>
+          <w:b/>
+          <w:color w:val="000000"/>
+          <w:sz w:val="32"/>
+        </w:rPr>
+        <w:t>Conclusion</w:t>
+      </w:r>
+    </w:p>
+    <w:p>
+      <w:pPr>
+        <w:spacing w:after="160" w:line="360" w:lineRule="auto"/>
+        <w:jc w:val="both"/>
+      </w:pPr>
+      <w:r>
+        <w:rPr>
+          <w:rFonts w:ascii="Times New Roman" w:hAnsi="Times New Roman"/>
+          <w:color w:val="000000"/>
+        </w:rPr>
+        <w:t>The Agentic AI Based SentinelGPT System provides an efficient and intelligent solution for automating cyber threat detection and security management. By replacing manual log review with autonomous software agents, the system reduces administrative effort, eliminates response latency, and improves the overall accuracy of threat mitigation. The Telemetry Monitor Agent automatically calculates risk scores based on heuristic security models, while the Autonomous Quarantine Agent verifies that all security constraints, including IP isolation, MITRE ATT&amp;CK mapping, and user authorization, are satisfied before incident status is finalized.</w:t>
+      </w:r>
+    </w:p>
+    <w:p>
+      <w:pPr>
+        <w:spacing w:after="160" w:line="360" w:lineRule="auto"/>
+        <w:jc w:val="both"/>
+      </w:pPr>
+      <w:r>
+        <w:rPr>
+          <w:rFonts w:ascii="Times New Roman" w:hAnsi="Times New Roman"/>
+          <w:color w:val="000000"/>
+        </w:rPr>
+        <w:t>The system offers a user-friendly web interface that enables administrators to monitor, analyze, quarantine, and manage security events with ease. It also maintains agent logs for transparency and supports JSON log export for convenient SIEM integration. Built using FastAPI, Python, SQLAlchemy, HTML5, CSS3, JavaScript, React 19, SQLite, and Vercel, the application is scalable, reliable, and suitable for organizations of different sizes. Overall, the project demonstrates how an agent-based approach can simplify cybersecurity operations, reduce human errors, save time, and provide an effective, modern solution for enterprise cyber defense.</w:t>
+      </w:r>
+    </w:p>
+    <w:p>
+      <w:r>
+        <w:br w:type="page"/>
+      </w:r>
+    </w:p>
+    <w:p>
+      <w:pPr>
+        <w:spacing w:before="360" w:after="240"/>
+      </w:pPr>
+      <w:r>
+        <w:rPr>
+          <w:rFonts w:ascii="Times New Roman" w:hAnsi="Times New Roman"/>
+          <w:b/>
+          <w:color w:val="000000"/>
+          <w:sz w:val="32"/>
+        </w:rPr>
+        <w:t>References</w:t>
+      </w:r>
+    </w:p>
+    <w:p>
+      <w:pPr>
+        <w:spacing w:after="160" w:line="360" w:lineRule="auto"/>
+        <w:jc w:val="both"/>
+      </w:pPr>
+      <w:r>
+        <w:rPr>
+          <w:rFonts w:ascii="Times New Roman" w:hAnsi="Times New Roman"/>
+          <w:color w:val="000000"/>
+        </w:rPr>
+        <w:t>FastAPI Documentation. FastAPI. Available at: https://fastapi.tiangolo.com/</w:t>
+      </w:r>
+    </w:p>
+    <w:p>
+      <w:pPr>
+        <w:spacing w:after="160" w:line="360" w:lineRule="auto"/>
+        <w:jc w:val="both"/>
+      </w:pPr>
+      <w:r>
+        <w:rPr>
+          <w:rFonts w:ascii="Times New Roman" w:hAnsi="Times New Roman"/>
+          <w:color w:val="000000"/>
+        </w:rPr>
+        <w:t>SQLAlchemy Documentation. SQLAlchemy ORM. Available at: https://docs.sqlalchemy.org/</w:t>
+      </w:r>
+    </w:p>
+    <w:p>
+      <w:pPr>
+        <w:spacing w:after="160" w:line="360" w:lineRule="auto"/>
+        <w:jc w:val="both"/>
+      </w:pPr>
+      <w:r>
+        <w:rPr>
+          <w:rFonts w:ascii="Times New Roman" w:hAnsi="Times New Roman"/>
+          <w:color w:val="000000"/>
+        </w:rPr>
+        <w:t>Python Software Foundation. Python 3 Documentation. Available at: https://docs.python.org/3/</w:t>
+      </w:r>
+    </w:p>
+    <w:p>
+      <w:pPr>
+        <w:spacing w:after="160" w:line="360" w:lineRule="auto"/>
+        <w:jc w:val="both"/>
+      </w:pPr>
+      <w:r>
+        <w:rPr>
+          <w:rFonts w:ascii="Times New Roman" w:hAnsi="Times New Roman"/>
+          <w:color w:val="000000"/>
+        </w:rPr>
+        <w:t>Uvicorn Documentation. The ASGI Server. Available at: https://www.uvicorn.org/</w:t>
+      </w:r>
+    </w:p>
+    <w:p>
+      <w:pPr>
+        <w:spacing w:after="160" w:line="360" w:lineRule="auto"/>
+        <w:jc w:val="both"/>
+      </w:pPr>
+      <w:r>
+        <w:rPr>
+          <w:rFonts w:ascii="Times New Roman" w:hAnsi="Times New Roman"/>
+          <w:color w:val="000000"/>
+        </w:rPr>
+        <w:t>React Documentation. React 19 User Interface Library. Available at: https://react.dev/</w:t>
+      </w:r>
+    </w:p>
+    <w:p>
+      <w:pPr>
+        <w:spacing w:after="160" w:line="360" w:lineRule="auto"/>
+        <w:jc w:val="both"/>
+      </w:pPr>
+      <w:r>
+        <w:rPr>
+          <w:rFonts w:ascii="Times New Roman" w:hAnsi="Times New Roman"/>
+          <w:color w:val="000000"/>
+        </w:rPr>
+        <w:t>Vite Documentation. Vite Next Generation Frontend Tooling. Available at: https://vitejs.dev/</w:t>
+      </w:r>
+    </w:p>
+    <w:p>
+      <w:pPr>
+        <w:spacing w:after="160" w:line="360" w:lineRule="auto"/>
+        <w:jc w:val="both"/>
+      </w:pPr>
+      <w:r>
+        <w:rPr>
+          <w:rFonts w:ascii="Times New Roman" w:hAnsi="Times New Roman"/>
+          <w:color w:val="000000"/>
+        </w:rPr>
+        <w:t>MDN Web Docs. HTML5, CSS3 and JavaScript Documentation. Available at: https://developer.mozilla.org/</w:t>
+      </w:r>
+    </w:p>
+    <w:p>
+      <w:pPr>
+        <w:spacing w:after="160" w:line="360" w:lineRule="auto"/>
+        <w:jc w:val="both"/>
+      </w:pPr>
+      <w:r>
+        <w:rPr>
+          <w:rFonts w:ascii="Times New Roman" w:hAnsi="Times New Roman"/>
+          <w:color w:val="000000"/>
+        </w:rPr>
+        <w:t>MITRE ATT&amp;CK Framework. Enterprise Tactics and Techniques. Available at: https://attack.mitre.org/</w:t>
+      </w:r>
+    </w:p>
+    <w:p>
+      <w:pPr>
+        <w:spacing w:after="160" w:line="360" w:lineRule="auto"/>
+        <w:jc w:val="both"/>
+      </w:pPr>
+      <w:r>
+        <w:rPr>
+          <w:rFonts w:ascii="Times New Roman" w:hAnsi="Times New Roman"/>
+          <w:color w:val="000000"/>
+        </w:rPr>
+        <w:t>SQLite Documentation. SQLite Official Documentation. Available at: https://www.sqlite.org/docs.html</w:t>
+      </w:r>
+    </w:p>
+    <w:p>
+      <w:pPr>
+        <w:spacing w:after="160" w:line="360" w:lineRule="auto"/>
+        <w:jc w:val="both"/>
+      </w:pPr>
+      <w:r>
+        <w:rPr>
+          <w:rFonts w:ascii="Times New Roman" w:hAnsi="Times New Roman"/>
+          <w:color w:val="000000"/>
+        </w:rPr>
+        <w:t>Vercel Documentation. Deploying Serverless Applications. Available at: https://vercel.com/docs</w:t>
+      </w:r>
+    </w:p>
+    <w:p>
+      <w:pPr>
+        <w:spacing w:after="160" w:line="360" w:lineRule="auto"/>
+        <w:jc w:val="both"/>
+      </w:pPr>
+      <w:r>
+        <w:rPr>
+          <w:rFonts w:ascii="Times New Roman" w:hAnsi="Times New Roman"/>
+          <w:color w:val="000000"/>
+        </w:rPr>
+        <w:t>Russell, S., &amp; Norvig, P. (2021). Artificial Intelligence: A Modern Approach (4th ed.). Pearson.</w:t>
+      </w:r>
+    </w:p>
+    <w:p>
+      <w:pPr>
+        <w:spacing w:after="160" w:line="360" w:lineRule="auto"/>
+        <w:jc w:val="both"/>
+      </w:pPr>
+      <w:r>
+        <w:rPr>
+          <w:rFonts w:ascii="Times New Roman" w:hAnsi="Times New Roman"/>
+          <w:color w:val="000000"/>
+        </w:rPr>
+        <w:t>Wooldridge, M. (2009). An Introduction to MultiAgent Systems (2nd ed.). John Wiley &amp; Sons.</w:t>
+      </w:r>
+    </w:p>
+    <w:p>
+      <w:pPr>
+        <w:spacing w:before="360" w:after="240"/>
+      </w:pPr>
+      <w:r>
+        <w:rPr>
+          <w:rFonts w:ascii="Times New Roman" w:hAnsi="Times New Roman"/>
+          <w:b/>
+          <w:color w:val="000000"/>
+          <w:sz w:val="32"/>
+        </w:rPr>
+        <w:t>Live Website</w:t>
+      </w:r>
+    </w:p>
+    <w:p>
+      <w:pPr>
+        <w:spacing w:after="160" w:line="360" w:lineRule="auto"/>
+        <w:jc w:val="both"/>
+      </w:pPr>
+      <w:r>
+        <w:rPr>
+          <w:rFonts w:ascii="Times New Roman" w:hAnsi="Times New Roman"/>
+          <w:color w:val="000000"/>
+        </w:rPr>
+        <w:t>The application is cloud-ready. To deploy, one sets the DATABASE_URL to a production database instance and ensures the build environment installs all Python dependencies. For example, on Vercel or Cloud platforms, one can configure a Python build and deployment command. The app automatically initializes its database tables on startup and creates a default admin account (prompting to login with secure credentials).</w:t>
+      </w:r>
+    </w:p>
+    <w:p>
+      <w:pPr>
+        <w:spacing w:after="160" w:line="360" w:lineRule="auto"/>
+        <w:jc w:val="both"/>
+      </w:pPr>
+      <w:r>
+        <w:rPr>
+          <w:rFonts w:ascii="Times New Roman" w:hAnsi="Times New Roman"/>
+          <w:color w:val="000000"/>
+        </w:rPr>
+        <w:t>A live instance of this project is available at:</w:t>
+      </w:r>
+    </w:p>
+    <w:p>
+      <w:pPr>
+        <w:spacing w:after="160" w:line="360" w:lineRule="auto"/>
+        <w:jc w:val="both"/>
+      </w:pPr>
+      <w:r>
+        <w:rPr>
+          <w:rFonts w:ascii="Times New Roman" w:hAnsi="Times New Roman"/>
+          <w:color w:val="000000"/>
         </w:rPr>
         <w:t>https://sentinelgpt-ai.vercel.app</w:t>
       </w:r>
     </w:p>
     <w:p>
       <w:pPr>
-        <w:pStyle w:val="ListBullet"/>
-        <w:spacing w:before="0" w:after="60" w:line="276" w:lineRule="auto"/>
-        <w:ind w:left="432"/>
+        <w:spacing w:after="160" w:line="360" w:lineRule="auto"/>
         <w:jc w:val="both"/>
       </w:pPr>
       <w:r>
         <w:rPr>
-          <w:rFonts w:ascii="Calibri" w:hAnsi="Calibri"/>
-          <w:b/>
-          <w:color w:val="002750"/>
+          <w:rFonts w:ascii="Times New Roman" w:hAnsi="Times New Roman"/>
+          <w:color w:val="000000"/>
         </w:rPr>
-        <w:t xml:space="preserve">Interactive Swagger API Docs: </w:t>
-      </w:r>
-      <w:r>
-        <w:rPr>
-          <w:rFonts w:ascii="Calibri" w:hAnsi="Calibri"/>
-        </w:rPr>
-        <w:t>https://sentinelgpt-ai.vercel.app/docs</w:t>
+        <w:t>The official GitHub repository for source code verification is available at:</w:t>
       </w:r>
     </w:p>
     <w:p>
       <w:pPr>
-        <w:pStyle w:val="ListBullet"/>
-        <w:spacing w:before="0" w:after="60" w:line="276" w:lineRule="auto"/>
-        <w:ind w:left="432"/>
+        <w:spacing w:after="160" w:line="360" w:lineRule="auto"/>
         <w:jc w:val="both"/>
       </w:pPr>
       <w:r>
         <w:rPr>
-          <w:rFonts w:ascii="Calibri" w:hAnsi="Calibri"/>
-          <w:b/>
-          <w:color w:val="002750"/>
-        </w:rPr>
-        <w:t xml:space="preserve">Official GitHub Repository:   </w:t>
-      </w:r>
-      <w:r>
-        <w:rPr>
-          <w:rFonts w:ascii="Calibri" w:hAnsi="Calibri"/>
+          <w:rFonts w:ascii="Times New Roman" w:hAnsi="Times New Roman"/>
+          <w:color w:val="000000"/>
         </w:rPr>
         <w:t>https://github.com/Pravallika2025/sentigraud-ai-.git</w:t>
       </w:r>
     </w:p>
     <w:sectPr>
       <w:pgSz w:w="12240" w:h="15840"/>
-      <w:pgMar w:top="1440" w:right="1656" w:bottom="1440" w:left="1656" w:header="720" w:footer="720" w:gutter="0"/>
+      <w:pgMar w:top="1440" w:right="1440" w:bottom="1440" w:left="1440" w:header="720" w:footer="720" w:gutter="0"/>
       <w:cols w:space="720"/>
       <w:docGrid w:linePitch="360"/>
     </w:sectPr>
@@ -3176,9 +3067,9 @@
     <w:qFormat/>
     <w:rsid w:val="00FC693F"/>
     <w:rPr>
-      <w:rFonts w:ascii="Calibri" w:hAnsi="Calibri"/>
-      <w:color w:val="222222"/>
-      <w:sz w:val="22"/>
+      <w:rFonts w:ascii="Times New Roman" w:hAnsi="Times New Roman"/>
+      <w:color w:val="000000"/>
+      <w:sz w:val="24"/>
     </w:rPr>
   </w:style>
   <w:style w:type="paragraph" w:styleId="Header">

</xml_diff>

<commit_message>
Adjust Page 3 comparison table to 8 points and center image alignments
</commit_message>
<xml_diff>
--- a/docs/SentinelGPT_Project_Report.docx
+++ b/docs/SentinelGPT_Project_Report.docx
@@ -59,7 +59,7 @@
     </w:p>
     <w:p>
       <w:pPr>
-        <w:spacing w:before="360" w:after="240"/>
+        <w:spacing w:before="320" w:after="200"/>
       </w:pPr>
       <w:r>
         <w:rPr>
@@ -73,7 +73,7 @@
     </w:p>
     <w:p>
       <w:pPr>
-        <w:spacing w:after="160" w:line="360" w:lineRule="auto"/>
+        <w:spacing w:after="120" w:line="360" w:lineRule="auto"/>
         <w:jc w:val="both"/>
       </w:pPr>
       <w:r>
@@ -86,7 +86,7 @@
     </w:p>
     <w:p>
       <w:pPr>
-        <w:spacing w:after="160" w:line="360" w:lineRule="auto"/>
+        <w:spacing w:after="120" w:line="360" w:lineRule="auto"/>
         <w:jc w:val="both"/>
       </w:pPr>
       <w:r>
@@ -99,7 +99,7 @@
     </w:p>
     <w:p>
       <w:pPr>
-        <w:spacing w:after="160" w:line="360" w:lineRule="auto"/>
+        <w:spacing w:after="120" w:line="360" w:lineRule="auto"/>
         <w:jc w:val="both"/>
       </w:pPr>
       <w:r>
@@ -112,7 +112,7 @@
     </w:p>
     <w:p>
       <w:pPr>
-        <w:spacing w:after="160" w:line="360" w:lineRule="auto"/>
+        <w:spacing w:after="120" w:line="360" w:lineRule="auto"/>
         <w:jc w:val="both"/>
       </w:pPr>
       <w:r>
@@ -130,7 +130,7 @@
     </w:p>
     <w:p>
       <w:pPr>
-        <w:spacing w:before="360" w:after="240"/>
+        <w:spacing w:before="320" w:after="200"/>
       </w:pPr>
       <w:r>
         <w:rPr>
@@ -144,7 +144,7 @@
     </w:p>
     <w:p>
       <w:pPr>
-        <w:spacing w:after="160" w:line="360" w:lineRule="auto"/>
+        <w:spacing w:after="120" w:line="360" w:lineRule="auto"/>
         <w:jc w:val="both"/>
       </w:pPr>
       <w:r>
@@ -370,28 +370,6 @@
           </w:p>
         </w:tc>
       </w:tr>
-      <w:tr>
-        <w:tc>
-          <w:tcPr>
-            <w:tcW w:type="dxa" w:w="4680"/>
-          </w:tcPr>
-          <w:p>
-            <w:r>
-              <w:t>Security reports often require manual formatting before sharing with executive teams.</w:t>
-            </w:r>
-          </w:p>
-        </w:tc>
-        <w:tc>
-          <w:tcPr>
-            <w:tcW w:type="dxa" w:w="4680"/>
-          </w:tcPr>
-          <w:p>
-            <w:r>
-              <w:t>Generates structured JSON incident logs and interactive reports that can be exported directly.</w:t>
-            </w:r>
-          </w:p>
-        </w:tc>
-      </w:tr>
     </w:tbl>
     <w:p>
       <w:r>
@@ -400,7 +378,7 @@
     </w:p>
     <w:p>
       <w:pPr>
-        <w:spacing w:before="360" w:after="240"/>
+        <w:spacing w:before="320" w:after="200"/>
       </w:pPr>
       <w:r>
         <w:rPr>
@@ -414,7 +392,7 @@
     </w:p>
     <w:p>
       <w:pPr>
-        <w:spacing w:after="160" w:line="360" w:lineRule="auto"/>
+        <w:spacing w:after="120" w:line="360" w:lineRule="auto"/>
         <w:jc w:val="both"/>
       </w:pPr>
       <w:r>
@@ -427,7 +405,7 @@
     </w:p>
     <w:p>
       <w:pPr>
-        <w:spacing w:after="160" w:line="360" w:lineRule="auto"/>
+        <w:spacing w:after="120" w:line="360" w:lineRule="auto"/>
         <w:jc w:val="both"/>
       </w:pPr>
       <w:r>
@@ -440,7 +418,7 @@
     </w:p>
     <w:p>
       <w:pPr>
-        <w:spacing w:after="160" w:line="360" w:lineRule="auto"/>
+        <w:spacing w:after="120" w:line="360" w:lineRule="auto"/>
         <w:jc w:val="both"/>
       </w:pPr>
       <w:r>
@@ -453,7 +431,7 @@
     </w:p>
     <w:p>
       <w:pPr>
-        <w:spacing w:after="160" w:line="360" w:lineRule="auto"/>
+        <w:spacing w:after="120" w:line="360" w:lineRule="auto"/>
         <w:jc w:val="both"/>
       </w:pPr>
       <w:r>
@@ -466,7 +444,7 @@
     </w:p>
     <w:p>
       <w:pPr>
-        <w:spacing w:after="160" w:line="360" w:lineRule="auto"/>
+        <w:spacing w:after="120" w:line="360" w:lineRule="auto"/>
         <w:jc w:val="both"/>
       </w:pPr>
       <w:r>
@@ -484,7 +462,7 @@
     </w:p>
     <w:p>
       <w:pPr>
-        <w:spacing w:before="360" w:after="240"/>
+        <w:spacing w:before="320" w:after="200"/>
       </w:pPr>
       <w:r>
         <w:rPr>
@@ -498,7 +476,7 @@
     </w:p>
     <w:p>
       <w:pPr>
-        <w:spacing w:after="160" w:line="360" w:lineRule="auto"/>
+        <w:spacing w:after="120" w:line="360" w:lineRule="auto"/>
         <w:jc w:val="both"/>
       </w:pPr>
       <w:r>
@@ -511,7 +489,7 @@
     </w:p>
     <w:p>
       <w:pPr>
-        <w:spacing w:after="160" w:line="360" w:lineRule="auto"/>
+        <w:spacing w:after="120" w:line="360" w:lineRule="auto"/>
         <w:jc w:val="both"/>
       </w:pPr>
       <w:r>
@@ -524,7 +502,7 @@
     </w:p>
     <w:p>
       <w:pPr>
-        <w:spacing w:after="160" w:line="360" w:lineRule="auto"/>
+        <w:spacing w:after="120" w:line="360" w:lineRule="auto"/>
         <w:jc w:val="both"/>
       </w:pPr>
       <w:r>
@@ -537,7 +515,7 @@
     </w:p>
     <w:p>
       <w:pPr>
-        <w:spacing w:after="160" w:line="360" w:lineRule="auto"/>
+        <w:spacing w:after="120" w:line="360" w:lineRule="auto"/>
         <w:jc w:val="both"/>
       </w:pPr>
       <w:r>
@@ -550,7 +528,7 @@
     </w:p>
     <w:p>
       <w:pPr>
-        <w:spacing w:after="160" w:line="360" w:lineRule="auto"/>
+        <w:spacing w:after="120" w:line="360" w:lineRule="auto"/>
         <w:jc w:val="both"/>
       </w:pPr>
       <w:r>
@@ -563,7 +541,7 @@
     </w:p>
     <w:p>
       <w:pPr>
-        <w:spacing w:after="160" w:line="360" w:lineRule="auto"/>
+        <w:spacing w:after="120" w:line="360" w:lineRule="auto"/>
         <w:jc w:val="both"/>
       </w:pPr>
       <w:r>
@@ -576,7 +554,7 @@
     </w:p>
     <w:p>
       <w:pPr>
-        <w:spacing w:after="160" w:line="360" w:lineRule="auto"/>
+        <w:spacing w:after="120" w:line="360" w:lineRule="auto"/>
         <w:jc w:val="both"/>
       </w:pPr>
       <w:r>
@@ -594,13 +572,13 @@
     </w:p>
     <w:p>
       <w:pPr>
-        <w:spacing w:before="280" w:after="280"/>
+        <w:spacing w:before="240" w:after="240"/>
         <w:jc w:val="center"/>
       </w:pPr>
       <w:r>
         <w:drawing>
           <wp:inline xmlns:a="http://schemas.openxmlformats.org/drawingml/2006/main" xmlns:pic="http://schemas.openxmlformats.org/drawingml/2006/picture">
-            <wp:extent cx="5303520" cy="3677107"/>
+            <wp:extent cx="5029200" cy="3492500"/>
             <wp:docPr id="1" name="Picture 1"/>
             <wp:cNvGraphicFramePr>
               <a:graphicFrameLocks noChangeAspect="1"/>
@@ -621,7 +599,7 @@
                   <pic:spPr>
                     <a:xfrm>
                       <a:off x="0" y="0"/>
-                      <a:ext cx="5303520" cy="3677107"/>
+                      <a:ext cx="5029200" cy="3492500"/>
                     </a:xfrm>
                     <a:prstGeom prst="rect"/>
                   </pic:spPr>
@@ -634,7 +612,7 @@
     </w:p>
     <w:p>
       <w:pPr>
-        <w:spacing w:before="360" w:after="240"/>
+        <w:spacing w:before="320" w:after="200"/>
       </w:pPr>
       <w:r>
         <w:rPr>
@@ -648,7 +626,7 @@
     </w:p>
     <w:p>
       <w:pPr>
-        <w:spacing w:after="160" w:line="360" w:lineRule="auto"/>
+        <w:spacing w:after="120" w:line="360" w:lineRule="auto"/>
         <w:jc w:val="both"/>
       </w:pPr>
       <w:r>
@@ -661,7 +639,7 @@
     </w:p>
     <w:p>
       <w:pPr>
-        <w:spacing w:before="280" w:after="120"/>
+        <w:spacing w:before="240" w:after="80"/>
       </w:pPr>
       <w:r>
         <w:rPr>
@@ -675,7 +653,7 @@
     </w:p>
     <w:p>
       <w:pPr>
-        <w:spacing w:after="160" w:line="360" w:lineRule="auto"/>
+        <w:spacing w:after="120" w:line="360" w:lineRule="auto"/>
         <w:jc w:val="both"/>
       </w:pPr>
       <w:r>
@@ -688,7 +666,7 @@
     </w:p>
     <w:p>
       <w:pPr>
-        <w:spacing w:after="160" w:line="360" w:lineRule="auto"/>
+        <w:spacing w:after="120" w:line="360" w:lineRule="auto"/>
         <w:jc w:val="both"/>
       </w:pPr>
       <w:r>
@@ -709,7 +687,7 @@
     </w:p>
     <w:p>
       <w:pPr>
-        <w:spacing w:after="160" w:line="360" w:lineRule="auto"/>
+        <w:spacing w:after="120" w:line="360" w:lineRule="auto"/>
         <w:jc w:val="both"/>
       </w:pPr>
       <w:r>
@@ -727,7 +705,7 @@
     </w:p>
     <w:p>
       <w:pPr>
-        <w:spacing w:after="160" w:line="360" w:lineRule="auto"/>
+        <w:spacing w:after="120" w:line="360" w:lineRule="auto"/>
         <w:jc w:val="both"/>
       </w:pPr>
       <w:r>
@@ -748,7 +726,7 @@
     </w:p>
     <w:p>
       <w:pPr>
-        <w:spacing w:after="160" w:line="360" w:lineRule="auto"/>
+        <w:spacing w:after="120" w:line="360" w:lineRule="auto"/>
         <w:jc w:val="both"/>
       </w:pPr>
       <w:r>
@@ -761,7 +739,7 @@
     </w:p>
     <w:p>
       <w:pPr>
-        <w:spacing w:after="160" w:line="360" w:lineRule="auto"/>
+        <w:spacing w:after="120" w:line="360" w:lineRule="auto"/>
         <w:jc w:val="both"/>
       </w:pPr>
       <w:r>
@@ -782,7 +760,7 @@
     </w:p>
     <w:p>
       <w:pPr>
-        <w:spacing w:after="160" w:line="360" w:lineRule="auto"/>
+        <w:spacing w:after="120" w:line="360" w:lineRule="auto"/>
         <w:jc w:val="both"/>
       </w:pPr>
       <w:r>
@@ -795,7 +773,7 @@
     </w:p>
     <w:p>
       <w:pPr>
-        <w:spacing w:after="160" w:line="360" w:lineRule="auto"/>
+        <w:spacing w:after="120" w:line="360" w:lineRule="auto"/>
         <w:jc w:val="both"/>
       </w:pPr>
       <w:r>
@@ -816,7 +794,7 @@
     </w:p>
     <w:p>
       <w:pPr>
-        <w:spacing w:after="160" w:line="360" w:lineRule="auto"/>
+        <w:spacing w:after="120" w:line="360" w:lineRule="auto"/>
         <w:jc w:val="both"/>
       </w:pPr>
       <w:r>
@@ -829,7 +807,7 @@
     </w:p>
     <w:p>
       <w:pPr>
-        <w:spacing w:before="280" w:after="120"/>
+        <w:spacing w:before="240" w:after="80"/>
       </w:pPr>
       <w:r>
         <w:rPr>
@@ -843,7 +821,7 @@
     </w:p>
     <w:p>
       <w:pPr>
-        <w:spacing w:after="160" w:line="360" w:lineRule="auto"/>
+        <w:spacing w:after="120" w:line="360" w:lineRule="auto"/>
         <w:jc w:val="both"/>
       </w:pPr>
       <w:r>
@@ -856,7 +834,7 @@
     </w:p>
     <w:p>
       <w:pPr>
-        <w:spacing w:after="160" w:line="360" w:lineRule="auto"/>
+        <w:spacing w:after="120" w:line="360" w:lineRule="auto"/>
         <w:jc w:val="both"/>
       </w:pPr>
       <w:r>
@@ -877,7 +855,7 @@
     </w:p>
     <w:p>
       <w:pPr>
-        <w:spacing w:after="160" w:line="360" w:lineRule="auto"/>
+        <w:spacing w:after="120" w:line="360" w:lineRule="auto"/>
         <w:jc w:val="both"/>
       </w:pPr>
       <w:r>
@@ -890,7 +868,7 @@
     </w:p>
     <w:p>
       <w:pPr>
-        <w:spacing w:after="160" w:line="360" w:lineRule="auto"/>
+        <w:spacing w:after="120" w:line="360" w:lineRule="auto"/>
         <w:jc w:val="both"/>
       </w:pPr>
       <w:r>
@@ -911,7 +889,7 @@
     </w:p>
     <w:p>
       <w:pPr>
-        <w:spacing w:after="160" w:line="360" w:lineRule="auto"/>
+        <w:spacing w:after="120" w:line="360" w:lineRule="auto"/>
         <w:jc w:val="both"/>
       </w:pPr>
       <w:r>
@@ -924,7 +902,7 @@
     </w:p>
     <w:p>
       <w:pPr>
-        <w:spacing w:after="160" w:line="360" w:lineRule="auto"/>
+        <w:spacing w:after="120" w:line="360" w:lineRule="auto"/>
         <w:jc w:val="both"/>
       </w:pPr>
       <w:r>
@@ -945,7 +923,7 @@
     </w:p>
     <w:p>
       <w:pPr>
-        <w:spacing w:after="160" w:line="360" w:lineRule="auto"/>
+        <w:spacing w:after="120" w:line="360" w:lineRule="auto"/>
         <w:jc w:val="both"/>
       </w:pPr>
       <w:r>
@@ -958,7 +936,7 @@
     </w:p>
     <w:p>
       <w:pPr>
-        <w:spacing w:before="280" w:after="120"/>
+        <w:spacing w:before="240" w:after="80"/>
       </w:pPr>
       <w:r>
         <w:rPr>
@@ -972,7 +950,7 @@
     </w:p>
     <w:p>
       <w:pPr>
-        <w:spacing w:after="160" w:line="360" w:lineRule="auto"/>
+        <w:spacing w:after="120" w:line="360" w:lineRule="auto"/>
         <w:jc w:val="both"/>
       </w:pPr>
       <w:r>
@@ -985,7 +963,7 @@
     </w:p>
     <w:p>
       <w:pPr>
-        <w:spacing w:after="160" w:line="360" w:lineRule="auto"/>
+        <w:spacing w:after="120" w:line="360" w:lineRule="auto"/>
         <w:jc w:val="both"/>
       </w:pPr>
       <w:r>
@@ -1006,7 +984,7 @@
     </w:p>
     <w:p>
       <w:pPr>
-        <w:spacing w:after="160" w:line="360" w:lineRule="auto"/>
+        <w:spacing w:after="120" w:line="360" w:lineRule="auto"/>
         <w:jc w:val="both"/>
       </w:pPr>
       <w:r>
@@ -1024,7 +1002,7 @@
     </w:p>
     <w:p>
       <w:pPr>
-        <w:spacing w:after="160" w:line="360" w:lineRule="auto"/>
+        <w:spacing w:after="120" w:line="360" w:lineRule="auto"/>
         <w:jc w:val="both"/>
       </w:pPr>
       <w:r>
@@ -1045,7 +1023,7 @@
     </w:p>
     <w:p>
       <w:pPr>
-        <w:spacing w:after="160" w:line="360" w:lineRule="auto"/>
+        <w:spacing w:after="120" w:line="360" w:lineRule="auto"/>
         <w:jc w:val="both"/>
       </w:pPr>
       <w:r>
@@ -1058,7 +1036,7 @@
     </w:p>
     <w:p>
       <w:pPr>
-        <w:spacing w:before="280" w:after="120"/>
+        <w:spacing w:before="240" w:after="80"/>
       </w:pPr>
       <w:r>
         <w:rPr>
@@ -1072,7 +1050,7 @@
     </w:p>
     <w:p>
       <w:pPr>
-        <w:spacing w:after="160" w:line="360" w:lineRule="auto"/>
+        <w:spacing w:after="120" w:line="360" w:lineRule="auto"/>
         <w:jc w:val="both"/>
       </w:pPr>
       <w:r>
@@ -1085,7 +1063,7 @@
     </w:p>
     <w:p>
       <w:pPr>
-        <w:spacing w:after="160" w:line="360" w:lineRule="auto"/>
+        <w:spacing w:after="120" w:line="360" w:lineRule="auto"/>
         <w:jc w:val="both"/>
       </w:pPr>
       <w:r>
@@ -1106,7 +1084,7 @@
     </w:p>
     <w:p>
       <w:pPr>
-        <w:spacing w:after="160" w:line="360" w:lineRule="auto"/>
+        <w:spacing w:after="120" w:line="360" w:lineRule="auto"/>
         <w:jc w:val="both"/>
       </w:pPr>
       <w:r>
@@ -1119,7 +1097,7 @@
     </w:p>
     <w:p>
       <w:pPr>
-        <w:spacing w:after="160" w:line="360" w:lineRule="auto"/>
+        <w:spacing w:after="120" w:line="360" w:lineRule="auto"/>
         <w:jc w:val="both"/>
       </w:pPr>
       <w:r>
@@ -1140,7 +1118,7 @@
     </w:p>
     <w:p>
       <w:pPr>
-        <w:spacing w:after="160" w:line="360" w:lineRule="auto"/>
+        <w:spacing w:after="120" w:line="360" w:lineRule="auto"/>
         <w:jc w:val="both"/>
       </w:pPr>
       <w:r>
@@ -1153,7 +1131,7 @@
     </w:p>
     <w:p>
       <w:pPr>
-        <w:spacing w:after="160" w:line="360" w:lineRule="auto"/>
+        <w:spacing w:after="120" w:line="360" w:lineRule="auto"/>
         <w:jc w:val="both"/>
       </w:pPr>
       <w:r>
@@ -1174,7 +1152,7 @@
     </w:p>
     <w:p>
       <w:pPr>
-        <w:spacing w:after="160" w:line="360" w:lineRule="auto"/>
+        <w:spacing w:after="120" w:line="360" w:lineRule="auto"/>
         <w:jc w:val="both"/>
       </w:pPr>
       <w:r>
@@ -1187,7 +1165,7 @@
     </w:p>
     <w:p>
       <w:pPr>
-        <w:spacing w:before="280" w:after="120"/>
+        <w:spacing w:before="240" w:after="80"/>
       </w:pPr>
       <w:r>
         <w:rPr>
@@ -1201,7 +1179,7 @@
     </w:p>
     <w:p>
       <w:pPr>
-        <w:spacing w:after="160" w:line="360" w:lineRule="auto"/>
+        <w:spacing w:after="120" w:line="360" w:lineRule="auto"/>
         <w:jc w:val="both"/>
       </w:pPr>
       <w:r>
@@ -1222,7 +1200,7 @@
     </w:p>
     <w:p>
       <w:pPr>
-        <w:spacing w:after="160" w:line="360" w:lineRule="auto"/>
+        <w:spacing w:after="120" w:line="360" w:lineRule="auto"/>
         <w:jc w:val="both"/>
       </w:pPr>
       <w:r>
@@ -1235,7 +1213,7 @@
     </w:p>
     <w:p>
       <w:pPr>
-        <w:spacing w:before="280" w:after="120"/>
+        <w:spacing w:before="240" w:after="80"/>
       </w:pPr>
       <w:r>
         <w:rPr>
@@ -1249,7 +1227,7 @@
     </w:p>
     <w:p>
       <w:pPr>
-        <w:spacing w:after="160" w:line="360" w:lineRule="auto"/>
+        <w:spacing w:after="120" w:line="360" w:lineRule="auto"/>
         <w:jc w:val="both"/>
       </w:pPr>
       <w:r>
@@ -1262,7 +1240,7 @@
     </w:p>
     <w:p>
       <w:pPr>
-        <w:spacing w:after="160" w:line="360" w:lineRule="auto"/>
+        <w:spacing w:after="120" w:line="360" w:lineRule="auto"/>
         <w:jc w:val="both"/>
       </w:pPr>
       <w:r>
@@ -1275,7 +1253,7 @@
     </w:p>
     <w:p>
       <w:pPr>
-        <w:spacing w:after="160" w:line="360" w:lineRule="auto"/>
+        <w:spacing w:after="120" w:line="360" w:lineRule="auto"/>
         <w:jc w:val="both"/>
       </w:pPr>
       <w:r>
@@ -1288,7 +1266,7 @@
     </w:p>
     <w:p>
       <w:pPr>
-        <w:spacing w:after="160" w:line="360" w:lineRule="auto"/>
+        <w:spacing w:after="120" w:line="360" w:lineRule="auto"/>
         <w:jc w:val="both"/>
       </w:pPr>
       <w:r>
@@ -1301,7 +1279,7 @@
     </w:p>
     <w:p>
       <w:pPr>
-        <w:spacing w:after="160" w:line="360" w:lineRule="auto"/>
+        <w:spacing w:after="120" w:line="360" w:lineRule="auto"/>
         <w:jc w:val="both"/>
       </w:pPr>
       <w:r>
@@ -1314,7 +1292,7 @@
     </w:p>
     <w:p>
       <w:pPr>
-        <w:spacing w:before="280" w:after="120"/>
+        <w:spacing w:before="240" w:after="80"/>
       </w:pPr>
       <w:r>
         <w:rPr>
@@ -1328,7 +1306,7 @@
     </w:p>
     <w:p>
       <w:pPr>
-        <w:spacing w:after="160" w:line="360" w:lineRule="auto"/>
+        <w:spacing w:after="120" w:line="360" w:lineRule="auto"/>
         <w:jc w:val="both"/>
       </w:pPr>
       <w:r>
@@ -1346,7 +1324,7 @@
     </w:p>
     <w:p>
       <w:pPr>
-        <w:spacing w:after="160" w:line="360" w:lineRule="auto"/>
+        <w:spacing w:after="120" w:line="360" w:lineRule="auto"/>
         <w:jc w:val="both"/>
       </w:pPr>
       <w:r>
@@ -1359,7 +1337,7 @@
     </w:p>
     <w:p>
       <w:pPr>
-        <w:spacing w:after="160" w:line="360" w:lineRule="auto"/>
+        <w:spacing w:after="120" w:line="360" w:lineRule="auto"/>
         <w:jc w:val="both"/>
       </w:pPr>
       <w:r>
@@ -1372,7 +1350,7 @@
     </w:p>
     <w:p>
       <w:pPr>
-        <w:spacing w:after="160" w:line="360" w:lineRule="auto"/>
+        <w:spacing w:after="120" w:line="360" w:lineRule="auto"/>
         <w:jc w:val="both"/>
       </w:pPr>
       <w:r>
@@ -1385,7 +1363,7 @@
     </w:p>
     <w:p>
       <w:pPr>
-        <w:spacing w:after="160" w:line="360" w:lineRule="auto"/>
+        <w:spacing w:after="120" w:line="360" w:lineRule="auto"/>
         <w:jc w:val="both"/>
       </w:pPr>
       <w:r>
@@ -1398,13 +1376,13 @@
     </w:p>
     <w:p>
       <w:pPr>
-        <w:spacing w:before="280" w:after="280"/>
+        <w:spacing w:before="240" w:after="240"/>
         <w:jc w:val="center"/>
       </w:pPr>
       <w:r>
         <w:drawing>
           <wp:inline xmlns:a="http://schemas.openxmlformats.org/drawingml/2006/main" xmlns:pic="http://schemas.openxmlformats.org/drawingml/2006/picture">
-            <wp:extent cx="5303520" cy="3535680"/>
+            <wp:extent cx="5029200" cy="3352800"/>
             <wp:docPr id="2" name="Picture 2"/>
             <wp:cNvGraphicFramePr>
               <a:graphicFrameLocks noChangeAspect="1"/>
@@ -1425,7 +1403,7 @@
                   <pic:spPr>
                     <a:xfrm>
                       <a:off x="0" y="0"/>
-                      <a:ext cx="5303520" cy="3535680"/>
+                      <a:ext cx="5029200" cy="3352800"/>
                     </a:xfrm>
                     <a:prstGeom prst="rect"/>
                   </pic:spPr>
@@ -1443,7 +1421,7 @@
     </w:p>
     <w:p>
       <w:pPr>
-        <w:spacing w:before="360" w:after="240"/>
+        <w:spacing w:before="320" w:after="200"/>
       </w:pPr>
       <w:r>
         <w:rPr>
@@ -1457,7 +1435,7 @@
     </w:p>
     <w:p>
       <w:pPr>
-        <w:spacing w:after="160" w:line="360" w:lineRule="auto"/>
+        <w:spacing w:after="120" w:line="360" w:lineRule="auto"/>
         <w:jc w:val="both"/>
       </w:pPr>
       <w:r>
@@ -1470,7 +1448,7 @@
     </w:p>
     <w:p>
       <w:pPr>
-        <w:spacing w:before="280" w:after="120"/>
+        <w:spacing w:before="240" w:after="80"/>
       </w:pPr>
       <w:r>
         <w:rPr>
@@ -1484,7 +1462,7 @@
     </w:p>
     <w:p>
       <w:pPr>
-        <w:spacing w:after="160" w:line="360" w:lineRule="auto"/>
+        <w:spacing w:after="120" w:line="360" w:lineRule="auto"/>
         <w:jc w:val="both"/>
       </w:pPr>
       <w:r>
@@ -1497,7 +1475,7 @@
     </w:p>
     <w:p>
       <w:pPr>
-        <w:spacing w:before="280" w:after="120"/>
+        <w:spacing w:before="240" w:after="80"/>
       </w:pPr>
       <w:r>
         <w:rPr>
@@ -1511,7 +1489,7 @@
     </w:p>
     <w:p>
       <w:pPr>
-        <w:spacing w:after="160" w:line="360" w:lineRule="auto"/>
+        <w:spacing w:after="120" w:line="360" w:lineRule="auto"/>
         <w:jc w:val="both"/>
       </w:pPr>
       <w:r>
@@ -1524,7 +1502,7 @@
     </w:p>
     <w:p>
       <w:pPr>
-        <w:spacing w:after="160" w:line="360" w:lineRule="auto"/>
+        <w:spacing w:after="120" w:line="360" w:lineRule="auto"/>
         <w:jc w:val="both"/>
       </w:pPr>
       <w:r>
@@ -1537,7 +1515,7 @@
     </w:p>
     <w:p>
       <w:pPr>
-        <w:spacing w:after="160" w:line="360" w:lineRule="auto"/>
+        <w:spacing w:after="120" w:line="360" w:lineRule="auto"/>
         <w:jc w:val="both"/>
       </w:pPr>
       <w:r>
@@ -1550,7 +1528,7 @@
     </w:p>
     <w:p>
       <w:pPr>
-        <w:spacing w:after="160" w:line="360" w:lineRule="auto"/>
+        <w:spacing w:after="120" w:line="360" w:lineRule="auto"/>
         <w:jc w:val="both"/>
       </w:pPr>
       <w:r>
@@ -1563,7 +1541,7 @@
     </w:p>
     <w:p>
       <w:pPr>
-        <w:spacing w:after="160" w:line="360" w:lineRule="auto"/>
+        <w:spacing w:after="120" w:line="360" w:lineRule="auto"/>
         <w:jc w:val="both"/>
       </w:pPr>
       <w:r>
@@ -1576,7 +1554,7 @@
     </w:p>
     <w:p>
       <w:pPr>
-        <w:spacing w:after="160" w:line="360" w:lineRule="auto"/>
+        <w:spacing w:after="120" w:line="360" w:lineRule="auto"/>
         <w:jc w:val="both"/>
       </w:pPr>
       <w:r>
@@ -1589,7 +1567,7 @@
     </w:p>
     <w:p>
       <w:pPr>
-        <w:spacing w:before="280" w:after="120"/>
+        <w:spacing w:before="240" w:after="80"/>
       </w:pPr>
       <w:r>
         <w:rPr>
@@ -1603,7 +1581,7 @@
     </w:p>
     <w:p>
       <w:pPr>
-        <w:spacing w:after="160" w:line="360" w:lineRule="auto"/>
+        <w:spacing w:after="120" w:line="360" w:lineRule="auto"/>
         <w:jc w:val="both"/>
       </w:pPr>
       <w:r>
@@ -1616,7 +1594,7 @@
     </w:p>
     <w:p>
       <w:pPr>
-        <w:spacing w:before="280" w:after="120"/>
+        <w:spacing w:before="240" w:after="80"/>
       </w:pPr>
       <w:r>
         <w:rPr>
@@ -1630,7 +1608,7 @@
     </w:p>
     <w:p>
       <w:pPr>
-        <w:spacing w:after="160" w:line="360" w:lineRule="auto"/>
+        <w:spacing w:after="120" w:line="360" w:lineRule="auto"/>
         <w:jc w:val="both"/>
       </w:pPr>
       <w:r>
@@ -1643,7 +1621,7 @@
     </w:p>
     <w:p>
       <w:pPr>
-        <w:spacing w:after="160" w:line="360" w:lineRule="auto"/>
+        <w:spacing w:after="120" w:line="360" w:lineRule="auto"/>
         <w:jc w:val="both"/>
       </w:pPr>
       <w:r>
@@ -1656,7 +1634,7 @@
     </w:p>
     <w:p>
       <w:pPr>
-        <w:spacing w:after="160" w:line="360" w:lineRule="auto"/>
+        <w:spacing w:after="120" w:line="360" w:lineRule="auto"/>
         <w:jc w:val="both"/>
       </w:pPr>
       <w:r>
@@ -1669,7 +1647,7 @@
     </w:p>
     <w:p>
       <w:pPr>
-        <w:spacing w:after="160" w:line="360" w:lineRule="auto"/>
+        <w:spacing w:after="120" w:line="360" w:lineRule="auto"/>
         <w:jc w:val="both"/>
       </w:pPr>
       <w:r>
@@ -1682,7 +1660,7 @@
     </w:p>
     <w:p>
       <w:pPr>
-        <w:spacing w:after="160" w:line="360" w:lineRule="auto"/>
+        <w:spacing w:after="120" w:line="360" w:lineRule="auto"/>
         <w:jc w:val="both"/>
       </w:pPr>
       <w:r>
@@ -1700,7 +1678,7 @@
     </w:p>
     <w:p>
       <w:pPr>
-        <w:spacing w:before="360" w:after="240"/>
+        <w:spacing w:before="320" w:after="200"/>
       </w:pPr>
       <w:r>
         <w:rPr>
@@ -1714,7 +1692,7 @@
     </w:p>
     <w:p>
       <w:pPr>
-        <w:spacing w:after="160" w:line="360" w:lineRule="auto"/>
+        <w:spacing w:after="120" w:line="360" w:lineRule="auto"/>
         <w:jc w:val="both"/>
       </w:pPr>
       <w:r>
@@ -1727,7 +1705,7 @@
     </w:p>
     <w:p>
       <w:pPr>
-        <w:spacing w:before="280" w:after="120"/>
+        <w:spacing w:before="240" w:after="80"/>
       </w:pPr>
       <w:r>
         <w:rPr>
@@ -1741,13 +1719,13 @@
     </w:p>
     <w:p>
       <w:pPr>
-        <w:spacing w:before="280" w:after="280"/>
+        <w:spacing w:before="240" w:after="240"/>
         <w:jc w:val="center"/>
       </w:pPr>
       <w:r>
         <w:drawing>
           <wp:inline xmlns:a="http://schemas.openxmlformats.org/drawingml/2006/main" xmlns:pic="http://schemas.openxmlformats.org/drawingml/2006/picture">
-            <wp:extent cx="5303520" cy="3535680"/>
+            <wp:extent cx="5029200" cy="3352800"/>
             <wp:docPr id="3" name="Picture 3"/>
             <wp:cNvGraphicFramePr>
               <a:graphicFrameLocks noChangeAspect="1"/>
@@ -1768,7 +1746,7 @@
                   <pic:spPr>
                     <a:xfrm>
                       <a:off x="0" y="0"/>
-                      <a:ext cx="5303520" cy="3535680"/>
+                      <a:ext cx="5029200" cy="3352800"/>
                     </a:xfrm>
                     <a:prstGeom prst="rect"/>
                   </pic:spPr>
@@ -1786,7 +1764,7 @@
     </w:p>
     <w:p>
       <w:pPr>
-        <w:spacing w:before="360" w:after="240"/>
+        <w:spacing w:before="320" w:after="200"/>
       </w:pPr>
       <w:r>
         <w:rPr>
@@ -1800,7 +1778,7 @@
     </w:p>
     <w:p>
       <w:pPr>
-        <w:spacing w:after="160" w:line="360" w:lineRule="auto"/>
+        <w:spacing w:after="120" w:line="360" w:lineRule="auto"/>
         <w:jc w:val="both"/>
       </w:pPr>
       <w:r>
@@ -1813,7 +1791,7 @@
     </w:p>
     <w:p>
       <w:pPr>
-        <w:spacing w:before="280" w:after="120"/>
+        <w:spacing w:before="240" w:after="80"/>
       </w:pPr>
       <w:r>
         <w:rPr>
@@ -1827,7 +1805,7 @@
     </w:p>
     <w:p>
       <w:pPr>
-        <w:spacing w:before="280" w:after="120"/>
+        <w:spacing w:before="240" w:after="80"/>
       </w:pPr>
       <w:r>
         <w:rPr>
@@ -1841,7 +1819,7 @@
     </w:p>
     <w:p>
       <w:pPr>
-        <w:spacing w:after="160" w:line="360" w:lineRule="auto"/>
+        <w:spacing w:after="120" w:line="360" w:lineRule="auto"/>
         <w:jc w:val="both"/>
       </w:pPr>
       <w:r>
@@ -1854,7 +1832,7 @@
     </w:p>
     <w:p>
       <w:pPr>
-        <w:spacing w:before="280" w:after="120"/>
+        <w:spacing w:before="240" w:after="80"/>
       </w:pPr>
       <w:r>
         <w:rPr>
@@ -1868,7 +1846,7 @@
     </w:p>
     <w:p>
       <w:pPr>
-        <w:spacing w:after="160" w:line="360" w:lineRule="auto"/>
+        <w:spacing w:after="120" w:line="360" w:lineRule="auto"/>
         <w:jc w:val="both"/>
       </w:pPr>
       <w:r>
@@ -1881,7 +1859,7 @@
     </w:p>
     <w:p>
       <w:pPr>
-        <w:spacing w:before="280" w:after="120"/>
+        <w:spacing w:before="240" w:after="80"/>
       </w:pPr>
       <w:r>
         <w:rPr>
@@ -1895,7 +1873,7 @@
     </w:p>
     <w:p>
       <w:pPr>
-        <w:spacing w:after="160" w:line="360" w:lineRule="auto"/>
+        <w:spacing w:after="120" w:line="360" w:lineRule="auto"/>
         <w:jc w:val="both"/>
       </w:pPr>
       <w:r>
@@ -1908,7 +1886,7 @@
     </w:p>
     <w:p>
       <w:pPr>
-        <w:spacing w:after="160" w:line="360" w:lineRule="auto"/>
+        <w:spacing w:after="120" w:line="360" w:lineRule="auto"/>
         <w:jc w:val="both"/>
       </w:pPr>
       <w:r>
@@ -1921,7 +1899,7 @@
     </w:p>
     <w:p>
       <w:pPr>
-        <w:spacing w:after="160" w:line="360" w:lineRule="auto"/>
+        <w:spacing w:after="120" w:line="360" w:lineRule="auto"/>
         <w:jc w:val="both"/>
       </w:pPr>
       <w:r>
@@ -1934,7 +1912,7 @@
     </w:p>
     <w:p>
       <w:pPr>
-        <w:spacing w:after="160" w:line="360" w:lineRule="auto"/>
+        <w:spacing w:after="120" w:line="360" w:lineRule="auto"/>
         <w:jc w:val="both"/>
       </w:pPr>
       <w:r>
@@ -1947,7 +1925,7 @@
     </w:p>
     <w:p>
       <w:pPr>
-        <w:spacing w:after="160" w:line="360" w:lineRule="auto"/>
+        <w:spacing w:after="120" w:line="360" w:lineRule="auto"/>
         <w:jc w:val="both"/>
       </w:pPr>
       <w:r>
@@ -1960,7 +1938,7 @@
     </w:p>
     <w:p>
       <w:pPr>
-        <w:spacing w:after="160" w:line="360" w:lineRule="auto"/>
+        <w:spacing w:after="120" w:line="360" w:lineRule="auto"/>
         <w:jc w:val="both"/>
       </w:pPr>
       <w:r>
@@ -1973,7 +1951,7 @@
     </w:p>
     <w:p>
       <w:pPr>
-        <w:spacing w:before="280" w:after="120"/>
+        <w:spacing w:before="240" w:after="80"/>
       </w:pPr>
       <w:r>
         <w:rPr>
@@ -1987,7 +1965,7 @@
     </w:p>
     <w:p>
       <w:pPr>
-        <w:spacing w:after="160" w:line="360" w:lineRule="auto"/>
+        <w:spacing w:after="120" w:line="360" w:lineRule="auto"/>
         <w:jc w:val="both"/>
       </w:pPr>
       <w:r>
@@ -2000,7 +1978,7 @@
     </w:p>
     <w:p>
       <w:pPr>
-        <w:spacing w:before="280" w:after="120"/>
+        <w:spacing w:before="240" w:after="80"/>
       </w:pPr>
       <w:r>
         <w:rPr>
@@ -2014,7 +1992,7 @@
     </w:p>
     <w:p>
       <w:pPr>
-        <w:spacing w:after="160" w:line="360" w:lineRule="auto"/>
+        <w:spacing w:after="120" w:line="360" w:lineRule="auto"/>
         <w:jc w:val="both"/>
       </w:pPr>
       <w:r>
@@ -2032,7 +2010,7 @@
     </w:p>
     <w:p>
       <w:pPr>
-        <w:spacing w:before="280" w:after="120"/>
+        <w:spacing w:before="240" w:after="80"/>
       </w:pPr>
       <w:r>
         <w:rPr>
@@ -2046,7 +2024,7 @@
     </w:p>
     <w:p>
       <w:pPr>
-        <w:spacing w:after="160" w:line="360" w:lineRule="auto"/>
+        <w:spacing w:after="120" w:line="360" w:lineRule="auto"/>
         <w:jc w:val="both"/>
       </w:pPr>
       <w:r>
@@ -2059,7 +2037,7 @@
     </w:p>
     <w:p>
       <w:pPr>
-        <w:spacing w:after="160" w:line="360" w:lineRule="auto"/>
+        <w:spacing w:after="120" w:line="360" w:lineRule="auto"/>
         <w:jc w:val="both"/>
       </w:pPr>
       <w:r>
@@ -2072,7 +2050,7 @@
     </w:p>
     <w:p>
       <w:pPr>
-        <w:spacing w:after="160" w:line="360" w:lineRule="auto"/>
+        <w:spacing w:after="120" w:line="360" w:lineRule="auto"/>
         <w:jc w:val="both"/>
       </w:pPr>
       <w:r>
@@ -2085,7 +2063,7 @@
     </w:p>
     <w:p>
       <w:pPr>
-        <w:spacing w:before="280" w:after="120"/>
+        <w:spacing w:before="240" w:after="80"/>
       </w:pPr>
       <w:r>
         <w:rPr>
@@ -2099,7 +2077,7 @@
     </w:p>
     <w:p>
       <w:pPr>
-        <w:spacing w:after="160" w:line="360" w:lineRule="auto"/>
+        <w:spacing w:after="120" w:line="360" w:lineRule="auto"/>
         <w:jc w:val="both"/>
       </w:pPr>
       <w:r>
@@ -2112,7 +2090,7 @@
     </w:p>
     <w:p>
       <w:pPr>
-        <w:spacing w:before="280" w:after="120"/>
+        <w:spacing w:before="240" w:after="80"/>
       </w:pPr>
       <w:r>
         <w:rPr>
@@ -2126,7 +2104,7 @@
     </w:p>
     <w:p>
       <w:pPr>
-        <w:spacing w:after="160" w:line="360" w:lineRule="auto"/>
+        <w:spacing w:after="120" w:line="360" w:lineRule="auto"/>
         <w:jc w:val="both"/>
       </w:pPr>
       <w:r>
@@ -2139,7 +2117,7 @@
     </w:p>
     <w:p>
       <w:pPr>
-        <w:spacing w:before="280" w:after="120"/>
+        <w:spacing w:before="240" w:after="80"/>
       </w:pPr>
       <w:r>
         <w:rPr>
@@ -2153,7 +2131,7 @@
     </w:p>
     <w:p>
       <w:pPr>
-        <w:spacing w:after="160" w:line="360" w:lineRule="auto"/>
+        <w:spacing w:after="120" w:line="360" w:lineRule="auto"/>
         <w:jc w:val="both"/>
       </w:pPr>
       <w:r>
@@ -2166,7 +2144,7 @@
     </w:p>
     <w:p>
       <w:pPr>
-        <w:spacing w:before="360" w:after="240"/>
+        <w:spacing w:before="320" w:after="200"/>
       </w:pPr>
       <w:r>
         <w:rPr>
@@ -2180,7 +2158,7 @@
     </w:p>
     <w:p>
       <w:pPr>
-        <w:spacing w:after="160" w:line="360" w:lineRule="auto"/>
+        <w:spacing w:after="120" w:line="360" w:lineRule="auto"/>
         <w:jc w:val="both"/>
       </w:pPr>
       <w:r>
@@ -2193,7 +2171,7 @@
     </w:p>
     <w:p>
       <w:pPr>
-        <w:spacing w:before="280" w:after="120"/>
+        <w:spacing w:before="240" w:after="80"/>
       </w:pPr>
       <w:r>
         <w:rPr>
@@ -2207,7 +2185,7 @@
     </w:p>
     <w:p>
       <w:pPr>
-        <w:spacing w:before="280" w:after="120"/>
+        <w:spacing w:before="240" w:after="80"/>
       </w:pPr>
       <w:r>
         <w:rPr>
@@ -2221,7 +2199,7 @@
     </w:p>
     <w:p>
       <w:pPr>
-        <w:spacing w:after="160" w:line="360" w:lineRule="auto"/>
+        <w:spacing w:after="120" w:line="360" w:lineRule="auto"/>
         <w:jc w:val="both"/>
       </w:pPr>
       <w:r>
@@ -2234,7 +2212,7 @@
     </w:p>
     <w:p>
       <w:pPr>
-        <w:spacing w:before="280" w:after="120"/>
+        <w:spacing w:before="240" w:after="80"/>
       </w:pPr>
       <w:r>
         <w:rPr>
@@ -2248,7 +2226,7 @@
     </w:p>
     <w:p>
       <w:pPr>
-        <w:spacing w:after="160" w:line="360" w:lineRule="auto"/>
+        <w:spacing w:after="120" w:line="360" w:lineRule="auto"/>
         <w:jc w:val="both"/>
       </w:pPr>
       <w:r>
@@ -2266,7 +2244,7 @@
     </w:p>
     <w:p>
       <w:pPr>
-        <w:spacing w:before="280" w:after="120"/>
+        <w:spacing w:before="240" w:after="80"/>
       </w:pPr>
       <w:r>
         <w:rPr>
@@ -2280,7 +2258,7 @@
     </w:p>
     <w:p>
       <w:pPr>
-        <w:spacing w:after="160" w:line="360" w:lineRule="auto"/>
+        <w:spacing w:after="120" w:line="360" w:lineRule="auto"/>
         <w:jc w:val="both"/>
       </w:pPr>
       <w:r>
@@ -2293,7 +2271,7 @@
     </w:p>
     <w:p>
       <w:pPr>
-        <w:spacing w:before="280" w:after="120"/>
+        <w:spacing w:before="240" w:after="80"/>
       </w:pPr>
       <w:r>
         <w:rPr>
@@ -2307,7 +2285,7 @@
     </w:p>
     <w:p>
       <w:pPr>
-        <w:spacing w:after="160" w:line="360" w:lineRule="auto"/>
+        <w:spacing w:after="120" w:line="360" w:lineRule="auto"/>
         <w:jc w:val="both"/>
       </w:pPr>
       <w:r>
@@ -2320,7 +2298,7 @@
     </w:p>
     <w:p>
       <w:pPr>
-        <w:spacing w:before="280" w:after="120"/>
+        <w:spacing w:before="240" w:after="80"/>
       </w:pPr>
       <w:r>
         <w:rPr>
@@ -2334,7 +2312,7 @@
     </w:p>
     <w:p>
       <w:pPr>
-        <w:spacing w:after="160" w:line="360" w:lineRule="auto"/>
+        <w:spacing w:after="120" w:line="360" w:lineRule="auto"/>
         <w:jc w:val="both"/>
       </w:pPr>
       <w:r>
@@ -2347,7 +2325,7 @@
     </w:p>
     <w:p>
       <w:pPr>
-        <w:spacing w:before="280" w:after="120"/>
+        <w:spacing w:before="240" w:after="80"/>
       </w:pPr>
       <w:r>
         <w:rPr>
@@ -2361,7 +2339,7 @@
     </w:p>
     <w:p>
       <w:pPr>
-        <w:spacing w:after="160" w:line="360" w:lineRule="auto"/>
+        <w:spacing w:after="120" w:line="360" w:lineRule="auto"/>
         <w:jc w:val="both"/>
       </w:pPr>
       <w:r>
@@ -2374,7 +2352,7 @@
     </w:p>
     <w:p>
       <w:pPr>
-        <w:spacing w:before="280" w:after="120"/>
+        <w:spacing w:before="240" w:after="80"/>
       </w:pPr>
       <w:r>
         <w:rPr>
@@ -2388,7 +2366,7 @@
     </w:p>
     <w:p>
       <w:pPr>
-        <w:spacing w:after="160" w:line="360" w:lineRule="auto"/>
+        <w:spacing w:after="120" w:line="360" w:lineRule="auto"/>
         <w:jc w:val="both"/>
       </w:pPr>
       <w:r>
@@ -2401,7 +2379,7 @@
     </w:p>
     <w:p>
       <w:pPr>
-        <w:spacing w:before="360" w:after="240"/>
+        <w:spacing w:before="320" w:after="200"/>
       </w:pPr>
       <w:r>
         <w:rPr>
@@ -2415,7 +2393,7 @@
     </w:p>
     <w:p>
       <w:pPr>
-        <w:spacing w:after="160" w:line="360" w:lineRule="auto"/>
+        <w:spacing w:after="120" w:line="360" w:lineRule="auto"/>
         <w:jc w:val="both"/>
       </w:pPr>
       <w:r>
@@ -2428,7 +2406,7 @@
     </w:p>
     <w:p>
       <w:pPr>
-        <w:spacing w:after="160" w:line="360" w:lineRule="auto"/>
+        <w:spacing w:after="120" w:line="360" w:lineRule="auto"/>
         <w:jc w:val="both"/>
       </w:pPr>
       <w:r>
@@ -2446,7 +2424,7 @@
     </w:p>
     <w:p>
       <w:pPr>
-        <w:spacing w:before="360" w:after="240"/>
+        <w:spacing w:before="320" w:after="200"/>
       </w:pPr>
       <w:r>
         <w:rPr>
@@ -2460,7 +2438,7 @@
     </w:p>
     <w:p>
       <w:pPr>
-        <w:spacing w:after="160" w:line="360" w:lineRule="auto"/>
+        <w:spacing w:after="120" w:line="360" w:lineRule="auto"/>
         <w:jc w:val="both"/>
       </w:pPr>
       <w:r>
@@ -2473,7 +2451,7 @@
     </w:p>
     <w:p>
       <w:pPr>
-        <w:spacing w:after="160" w:line="360" w:lineRule="auto"/>
+        <w:spacing w:after="120" w:line="360" w:lineRule="auto"/>
         <w:jc w:val="both"/>
       </w:pPr>
       <w:r>
@@ -2486,7 +2464,7 @@
     </w:p>
     <w:p>
       <w:pPr>
-        <w:spacing w:after="160" w:line="360" w:lineRule="auto"/>
+        <w:spacing w:after="120" w:line="360" w:lineRule="auto"/>
         <w:jc w:val="both"/>
       </w:pPr>
       <w:r>
@@ -2499,7 +2477,7 @@
     </w:p>
     <w:p>
       <w:pPr>
-        <w:spacing w:after="160" w:line="360" w:lineRule="auto"/>
+        <w:spacing w:after="120" w:line="360" w:lineRule="auto"/>
         <w:jc w:val="both"/>
       </w:pPr>
       <w:r>
@@ -2512,7 +2490,7 @@
     </w:p>
     <w:p>
       <w:pPr>
-        <w:spacing w:after="160" w:line="360" w:lineRule="auto"/>
+        <w:spacing w:after="120" w:line="360" w:lineRule="auto"/>
         <w:jc w:val="both"/>
       </w:pPr>
       <w:r>
@@ -2525,7 +2503,7 @@
     </w:p>
     <w:p>
       <w:pPr>
-        <w:spacing w:after="160" w:line="360" w:lineRule="auto"/>
+        <w:spacing w:after="120" w:line="360" w:lineRule="auto"/>
         <w:jc w:val="both"/>
       </w:pPr>
       <w:r>
@@ -2538,7 +2516,7 @@
     </w:p>
     <w:p>
       <w:pPr>
-        <w:spacing w:after="160" w:line="360" w:lineRule="auto"/>
+        <w:spacing w:after="120" w:line="360" w:lineRule="auto"/>
         <w:jc w:val="both"/>
       </w:pPr>
       <w:r>
@@ -2551,7 +2529,7 @@
     </w:p>
     <w:p>
       <w:pPr>
-        <w:spacing w:after="160" w:line="360" w:lineRule="auto"/>
+        <w:spacing w:after="120" w:line="360" w:lineRule="auto"/>
         <w:jc w:val="both"/>
       </w:pPr>
       <w:r>
@@ -2564,7 +2542,7 @@
     </w:p>
     <w:p>
       <w:pPr>
-        <w:spacing w:after="160" w:line="360" w:lineRule="auto"/>
+        <w:spacing w:after="120" w:line="360" w:lineRule="auto"/>
         <w:jc w:val="both"/>
       </w:pPr>
       <w:r>
@@ -2577,7 +2555,7 @@
     </w:p>
     <w:p>
       <w:pPr>
-        <w:spacing w:after="160" w:line="360" w:lineRule="auto"/>
+        <w:spacing w:after="120" w:line="360" w:lineRule="auto"/>
         <w:jc w:val="both"/>
       </w:pPr>
       <w:r>
@@ -2590,7 +2568,7 @@
     </w:p>
     <w:p>
       <w:pPr>
-        <w:spacing w:after="160" w:line="360" w:lineRule="auto"/>
+        <w:spacing w:after="120" w:line="360" w:lineRule="auto"/>
         <w:jc w:val="both"/>
       </w:pPr>
       <w:r>
@@ -2603,7 +2581,7 @@
     </w:p>
     <w:p>
       <w:pPr>
-        <w:spacing w:after="160" w:line="360" w:lineRule="auto"/>
+        <w:spacing w:after="120" w:line="360" w:lineRule="auto"/>
         <w:jc w:val="both"/>
       </w:pPr>
       <w:r>
@@ -2616,7 +2594,7 @@
     </w:p>
     <w:p>
       <w:pPr>
-        <w:spacing w:before="360" w:after="240"/>
+        <w:spacing w:before="320" w:after="200"/>
       </w:pPr>
       <w:r>
         <w:rPr>
@@ -2630,7 +2608,7 @@
     </w:p>
     <w:p>
       <w:pPr>
-        <w:spacing w:after="160" w:line="360" w:lineRule="auto"/>
+        <w:spacing w:after="120" w:line="360" w:lineRule="auto"/>
         <w:jc w:val="both"/>
       </w:pPr>
       <w:r>
@@ -2643,7 +2621,7 @@
     </w:p>
     <w:p>
       <w:pPr>
-        <w:spacing w:after="160" w:line="360" w:lineRule="auto"/>
+        <w:spacing w:after="120" w:line="360" w:lineRule="auto"/>
         <w:jc w:val="both"/>
       </w:pPr>
       <w:r>
@@ -2656,7 +2634,7 @@
     </w:p>
     <w:p>
       <w:pPr>
-        <w:spacing w:after="160" w:line="360" w:lineRule="auto"/>
+        <w:spacing w:after="120" w:line="360" w:lineRule="auto"/>
         <w:jc w:val="both"/>
       </w:pPr>
       <w:r>
@@ -2669,7 +2647,7 @@
     </w:p>
     <w:p>
       <w:pPr>
-        <w:spacing w:after="160" w:line="360" w:lineRule="auto"/>
+        <w:spacing w:after="120" w:line="360" w:lineRule="auto"/>
         <w:jc w:val="both"/>
       </w:pPr>
       <w:r>
@@ -2682,7 +2660,7 @@
     </w:p>
     <w:p>
       <w:pPr>
-        <w:spacing w:after="160" w:line="360" w:lineRule="auto"/>
+        <w:spacing w:after="120" w:line="360" w:lineRule="auto"/>
         <w:jc w:val="both"/>
       </w:pPr>
       <w:r>

</xml_diff>